<commit_message>
VLC nutzt per Ton erkannte Vorspann-Zeiten; Anleitung aktualisiert (Pfeile, Naechste Folge 40 s, Vorspann-Lernen) + Generator im Repo
Co-Authored-By: Claude Opus 5.5 <noreply@anthropic.com>
Claude-Session: https://claude.ai/code/session_01CaJqjA6T7wr6qkboQBX5Ep
</commit_message>
<xml_diff>
--- a/docs/PowerIPTV-Anleitung.docx
+++ b/docs/PowerIPTV-Anleitung.docx
@@ -49,7 +49,7 @@
         <w:rPr>
           <w:color w:val="666666"/>
         </w:rPr>
-        <w:t xml:space="preserve">Stand: Version 1.1.5x · Oktober 2026</w:t>
+        <w:t xml:space="preserve">Stand: Version 1.1.61 · Oktober 2026</w:t>
       </w:r>
     </w:p>
     <w:p>
@@ -968,9 +968,228 @@
         <w:spacing w:after="120"/>
       </w:pPr>
       <w:r>
-        <w:t xml:space="preserve">Beide Player (Standard und VLC) sehen gleich aus: oben Titel und Optionen, in der Mitte ⏪ 10 s, Play/Pause, ⏩ 10 s, unten der Zeitstrahl. Die Leisten verschwinden 5 Sekunden nach der letzten Bedienung.</w:t>
-      </w:r>
-    </w:p>
+        <w:t xml:space="preserve">Beide Player (Standard und VLC) sehen gleich aus: oben Titel und Optionen, in der Mitte die Steuerung, unten der Zeitstrahl. Die Leisten verschwinden 5 Sekunden nach der letzten Bedienung.</w:t>
+      </w:r>
+    </w:p>
+    <w:tbl>
+      <w:tblPr>
+        <w:tblW w:type="dxa" w:w="9026"/>
+        <w:tblBorders>
+          <w:top w:val="single" w:color="auto" w:sz="4"/>
+          <w:left w:val="single" w:color="auto" w:sz="4"/>
+          <w:bottom w:val="single" w:color="auto" w:sz="4"/>
+          <w:right w:val="single" w:color="auto" w:sz="4"/>
+          <w:insideH w:val="single" w:color="auto" w:sz="4"/>
+          <w:insideV w:val="single" w:color="auto" w:sz="4"/>
+        </w:tblBorders>
+      </w:tblPr>
+      <w:tblGrid>
+        <w:gridCol w:w="2200"/>
+        <w:gridCol w:w="6826"/>
+      </w:tblGrid>
+      <w:tr>
+        <w:trPr>
+          <w:tblHeader/>
+        </w:trPr>
+        <w:tc>
+          <w:tcPr>
+            <w:tcW w:type="dxa" w:w="2200"/>
+            <w:shd w:fill="1E3A5F" w:color="auto" w:val="clear"/>
+            <w:tcMar>
+              <w:top w:type="dxa" w:w="60"/>
+              <w:left w:type="dxa" w:w="100"/>
+              <w:bottom w:type="dxa" w:w="60"/>
+              <w:right w:type="dxa" w:w="100"/>
+            </w:tcMar>
+          </w:tcPr>
+          <w:p>
+            <w:r>
+              <w:rPr>
+                <w:b/>
+                <w:bCs/>
+                <w:color w:val="FFFFFF"/>
+                <w:sz w:val="20"/>
+                <w:szCs w:val="20"/>
+              </w:rPr>
+              <w:t xml:space="preserve">Inhalt</w:t>
+            </w:r>
+          </w:p>
+        </w:tc>
+        <w:tc>
+          <w:tcPr>
+            <w:tcW w:type="dxa" w:w="6826"/>
+            <w:shd w:fill="1E3A5F" w:color="auto" w:val="clear"/>
+            <w:tcMar>
+              <w:top w:type="dxa" w:w="60"/>
+              <w:left w:type="dxa" w:w="100"/>
+              <w:bottom w:type="dxa" w:w="60"/>
+              <w:right w:type="dxa" w:w="100"/>
+            </w:tcMar>
+          </w:tcPr>
+          <w:p>
+            <w:r>
+              <w:rPr>
+                <w:b/>
+                <w:bCs/>
+                <w:color w:val="FFFFFF"/>
+                <w:sz w:val="20"/>
+                <w:szCs w:val="20"/>
+              </w:rPr>
+              <w:t xml:space="preserve">Pfeile in der Mitte</w:t>
+            </w:r>
+          </w:p>
+        </w:tc>
+      </w:tr>
+      <w:tr>
+        <w:trPr>
+          <w:tblHeader w:val="false"/>
+        </w:trPr>
+        <w:tc>
+          <w:tcPr>
+            <w:tcW w:type="dxa" w:w="2200"/>
+            <w:tcMar>
+              <w:top w:type="dxa" w:w="60"/>
+              <w:left w:type="dxa" w:w="100"/>
+              <w:bottom w:type="dxa" w:w="60"/>
+              <w:right w:type="dxa" w:w="100"/>
+            </w:tcMar>
+          </w:tcPr>
+          <w:p>
+            <w:r>
+              <w:rPr>
+                <w:b/>
+                <w:bCs/>
+                <w:sz w:val="20"/>
+                <w:szCs w:val="20"/>
+              </w:rPr>
+              <w:t xml:space="preserve">Live-TV</w:t>
+            </w:r>
+          </w:p>
+        </w:tc>
+        <w:tc>
+          <w:tcPr>
+            <w:tcW w:type="dxa" w:w="6826"/>
+            <w:tcMar>
+              <w:top w:type="dxa" w:w="60"/>
+              <w:left w:type="dxa" w:w="100"/>
+              <w:bottom w:type="dxa" w:w="60"/>
+              <w:right w:type="dxa" w:w="100"/>
+            </w:tcMar>
+          </w:tcPr>
+          <w:p>
+            <w:r>
+              <w:rPr>
+                <w:b w:val="false"/>
+                <w:bCs w:val="false"/>
+                <w:sz w:val="20"/>
+                <w:szCs w:val="20"/>
+              </w:rPr>
+              <w:t xml:space="preserve">⏮ voriger Sender · ⏸ · ⏭ nächster Sender (kein Spulen bei Live)</w:t>
+            </w:r>
+          </w:p>
+        </w:tc>
+      </w:tr>
+      <w:tr>
+        <w:trPr>
+          <w:tblHeader w:val="false"/>
+        </w:trPr>
+        <w:tc>
+          <w:tcPr>
+            <w:tcW w:type="dxa" w:w="2200"/>
+            <w:shd w:fill="EEF5FA" w:color="auto" w:val="clear"/>
+            <w:tcMar>
+              <w:top w:type="dxa" w:w="60"/>
+              <w:left w:type="dxa" w:w="100"/>
+              <w:bottom w:type="dxa" w:w="60"/>
+              <w:right w:type="dxa" w:w="100"/>
+            </w:tcMar>
+          </w:tcPr>
+          <w:p>
+            <w:r>
+              <w:rPr>
+                <w:b/>
+                <w:bCs/>
+                <w:sz w:val="20"/>
+                <w:szCs w:val="20"/>
+              </w:rPr>
+              <w:t xml:space="preserve">Serie</w:t>
+            </w:r>
+          </w:p>
+        </w:tc>
+        <w:tc>
+          <w:tcPr>
+            <w:tcW w:type="dxa" w:w="6826"/>
+            <w:shd w:fill="EEF5FA" w:color="auto" w:val="clear"/>
+            <w:tcMar>
+              <w:top w:type="dxa" w:w="60"/>
+              <w:left w:type="dxa" w:w="100"/>
+              <w:bottom w:type="dxa" w:w="60"/>
+              <w:right w:type="dxa" w:w="100"/>
+            </w:tcMar>
+          </w:tcPr>
+          <w:p>
+            <w:r>
+              <w:rPr>
+                <w:b w:val="false"/>
+                <w:bCs w:val="false"/>
+                <w:sz w:val="20"/>
+                <w:szCs w:val="20"/>
+              </w:rPr>
+              <w:t xml:space="preserve">⏮ vorige Folge · ⟲ 10 s · ⏸ · ⟳ 10 s · ⏭ nächste Folge</w:t>
+            </w:r>
+          </w:p>
+        </w:tc>
+      </w:tr>
+      <w:tr>
+        <w:trPr>
+          <w:tblHeader w:val="false"/>
+        </w:trPr>
+        <w:tc>
+          <w:tcPr>
+            <w:tcW w:type="dxa" w:w="2200"/>
+            <w:tcMar>
+              <w:top w:type="dxa" w:w="60"/>
+              <w:left w:type="dxa" w:w="100"/>
+              <w:bottom w:type="dxa" w:w="60"/>
+              <w:right w:type="dxa" w:w="100"/>
+            </w:tcMar>
+          </w:tcPr>
+          <w:p>
+            <w:r>
+              <w:rPr>
+                <w:b/>
+                <w:bCs/>
+                <w:sz w:val="20"/>
+                <w:szCs w:val="20"/>
+              </w:rPr>
+              <w:t xml:space="preserve">Film</w:t>
+            </w:r>
+          </w:p>
+        </w:tc>
+        <w:tc>
+          <w:tcPr>
+            <w:tcW w:type="dxa" w:w="6826"/>
+            <w:tcMar>
+              <w:top w:type="dxa" w:w="60"/>
+              <w:left w:type="dxa" w:w="100"/>
+              <w:bottom w:type="dxa" w:w="60"/>
+              <w:right w:type="dxa" w:w="100"/>
+            </w:tcMar>
+          </w:tcPr>
+          <w:p>
+            <w:r>
+              <w:rPr>
+                <w:b w:val="false"/>
+                <w:bCs w:val="false"/>
+                <w:sz w:val="20"/>
+                <w:szCs w:val="20"/>
+              </w:rPr>
+              <w:t xml:space="preserve">⟲ 10 s zurück · ⏸ · ⟳ 10 s vor</w:t>
+            </w:r>
+          </w:p>
+        </w:tc>
+      </w:tr>
+    </w:tbl>
     <w:tbl>
       <w:tblPr>
         <w:tblW w:type="dxa" w:w="9026"/>
@@ -1472,7 +1691,7 @@
                 <w:sz w:val="20"/>
                 <w:szCs w:val="20"/>
               </w:rPr>
-              <w:t xml:space="preserve">Knöpfe ⏮ / ⏭</w:t>
+              <w:t xml:space="preserve">Pfeile ⏮ / ⏭ in der Mitte</w:t>
             </w:r>
           </w:p>
         </w:tc>
@@ -1522,7 +1741,7 @@
                 <w:sz w:val="20"/>
                 <w:szCs w:val="20"/>
               </w:rPr>
-              <w:t xml:space="preserve">Senderliste (Live)</w:t>
+              <w:t xml:space="preserve">Nächste Folge / Intro</w:t>
             </w:r>
           </w:p>
         </w:tc>
@@ -1544,7 +1763,7 @@
                 <w:sz w:val="20"/>
                 <w:szCs w:val="20"/>
               </w:rPr>
-              <w:t xml:space="preserve">Listen-Symbol oben</w:t>
+              <w:t xml:space="preserve">Knopf antippen</w:t>
             </w:r>
           </w:p>
         </w:tc>
@@ -1566,7 +1785,7 @@
                 <w:sz w:val="20"/>
                 <w:szCs w:val="20"/>
               </w:rPr>
-              <w:t xml:space="preserve">←</w:t>
+              <w:t xml:space="preserve">OK, solange der Knopf sichtbar ist</w:t>
             </w:r>
           </w:p>
         </w:tc>
@@ -1594,7 +1813,7 @@
                 <w:sz w:val="20"/>
                 <w:szCs w:val="20"/>
               </w:rPr>
-              <w:t xml:space="preserve">Letzter Sender (Live)</w:t>
+              <w:t xml:space="preserve">Senderliste (Live)</w:t>
             </w:r>
           </w:p>
         </w:tc>
@@ -1617,7 +1836,7 @@
                 <w:sz w:val="20"/>
                 <w:szCs w:val="20"/>
               </w:rPr>
-              <w:t xml:space="preserve">Pfeil-Symbol oben</w:t>
+              <w:t xml:space="preserve">Listen-Symbol oben</w:t>
             </w:r>
           </w:p>
         </w:tc>
@@ -1640,7 +1859,7 @@
                 <w:sz w:val="20"/>
                 <w:szCs w:val="20"/>
               </w:rPr>
-              <w:t xml:space="preserve">→</w:t>
+              <w:t xml:space="preserve">←</w:t>
             </w:r>
           </w:p>
         </w:tc>
@@ -1667,7 +1886,7 @@
                 <w:sz w:val="20"/>
                 <w:szCs w:val="20"/>
               </w:rPr>
-              <w:t xml:space="preserve">Bildformat schnell</w:t>
+              <w:t xml:space="preserve">Letzter Sender (Live)</w:t>
             </w:r>
           </w:p>
         </w:tc>
@@ -1689,7 +1908,7 @@
                 <w:sz w:val="20"/>
                 <w:szCs w:val="20"/>
               </w:rPr>
-              <w:t xml:space="preserve">Zahnrad → Bildformat</w:t>
+              <w:t xml:space="preserve">Pfeil-Symbol oben</w:t>
             </w:r>
           </w:p>
         </w:tc>
@@ -1711,7 +1930,7 @@
                 <w:sz w:val="20"/>
                 <w:szCs w:val="20"/>
               </w:rPr>
-              <w:t xml:space="preserve">Blaue Taste</w:t>
+              <w:t xml:space="preserve">→</w:t>
             </w:r>
           </w:p>
         </w:tc>
@@ -1739,7 +1958,7 @@
                 <w:sz w:val="20"/>
                 <w:szCs w:val="20"/>
               </w:rPr>
-              <w:t xml:space="preserve">Player schließen</w:t>
+              <w:t xml:space="preserve">Bildformat schnell</w:t>
             </w:r>
           </w:p>
         </w:tc>
@@ -1762,7 +1981,7 @@
                 <w:sz w:val="20"/>
                 <w:szCs w:val="20"/>
               </w:rPr>
-              <w:t xml:space="preserve">Zurück-Pfeil</w:t>
+              <w:t xml:space="preserve">Zahnrad → Bildformat</w:t>
             </w:r>
           </w:p>
         </w:tc>
@@ -1785,6 +2004,77 @@
                 <w:sz w:val="20"/>
                 <w:szCs w:val="20"/>
               </w:rPr>
+              <w:t xml:space="preserve">Blaue Taste</w:t>
+            </w:r>
+          </w:p>
+        </w:tc>
+      </w:tr>
+      <w:tr>
+        <w:trPr>
+          <w:tblHeader w:val="false"/>
+        </w:trPr>
+        <w:tc>
+          <w:tcPr>
+            <w:tcW w:type="dxa" w:w="2600"/>
+            <w:tcMar>
+              <w:top w:type="dxa" w:w="60"/>
+              <w:left w:type="dxa" w:w="100"/>
+              <w:bottom w:type="dxa" w:w="60"/>
+              <w:right w:type="dxa" w:w="100"/>
+            </w:tcMar>
+          </w:tcPr>
+          <w:p>
+            <w:r>
+              <w:rPr>
+                <w:b/>
+                <w:bCs/>
+                <w:sz w:val="20"/>
+                <w:szCs w:val="20"/>
+              </w:rPr>
+              <w:t xml:space="preserve">Player schließen</w:t>
+            </w:r>
+          </w:p>
+        </w:tc>
+        <w:tc>
+          <w:tcPr>
+            <w:tcW w:type="dxa" w:w="3200"/>
+            <w:tcMar>
+              <w:top w:type="dxa" w:w="60"/>
+              <w:left w:type="dxa" w:w="100"/>
+              <w:bottom w:type="dxa" w:w="60"/>
+              <w:right w:type="dxa" w:w="100"/>
+            </w:tcMar>
+          </w:tcPr>
+          <w:p>
+            <w:r>
+              <w:rPr>
+                <w:b w:val="false"/>
+                <w:bCs w:val="false"/>
+                <w:sz w:val="20"/>
+                <w:szCs w:val="20"/>
+              </w:rPr>
+              <w:t xml:space="preserve">Zurück-Pfeil</w:t>
+            </w:r>
+          </w:p>
+        </w:tc>
+        <w:tc>
+          <w:tcPr>
+            <w:tcW w:type="dxa" w:w="3226"/>
+            <w:tcMar>
+              <w:top w:type="dxa" w:w="60"/>
+              <w:left w:type="dxa" w:w="100"/>
+              <w:bottom w:type="dxa" w:w="60"/>
+              <w:right w:type="dxa" w:w="100"/>
+            </w:tcMar>
+          </w:tcPr>
+          <w:p>
+            <w:r>
+              <w:rPr>
+                <w:b w:val="false"/>
+                <w:bCs w:val="false"/>
+                <w:sz w:val="20"/>
+                <w:szCs w:val="20"/>
+              </w:rPr>
               <w:t xml:space="preserve">Zurück (bei ausgeblendeter Leiste)</w:t>
             </w:r>
           </w:p>
@@ -1946,7 +2236,7 @@
         <w:t xml:space="preserve">Nächste Folge: </w:t>
       </w:r>
       <w:r>
-        <w:t xml:space="preserve">20 Sekunden vor Ende erscheint „Nächste Folge in … s“. OK/„Jetzt abspielen“ startet sofort, Zurück/„Abbrechen“ bleibt bei der Folge.</w:t>
+        <w:t xml:space="preserve">40 Sekunden vor Ende erscheint „Nächste Folge in … s“. OK/„Jetzt abspielen“ startet sofort, Zurück/„Abbrechen“ bleibt bei der Folge.</w:t>
       </w:r>
     </w:p>
     <w:p>
@@ -1966,7 +2256,7 @@
         <w:t xml:space="preserve">Intro überspringen: </w:t>
       </w:r>
       <w:r>
-        <w:t xml:space="preserve">In den ersten Minuten einer Folge springt der Knopf (bzw. OK) 85 Sekunden weiter.</w:t>
+        <w:t xml:space="preserve">Der Knopf erscheint für 7 Sekunden; OK auf der Fernbedienung löst ihn aus. Die App lernt den Vorspann jeder Serie selbst (siehe unten).</w:t>
       </w:r>
     </w:p>
     <w:p>
@@ -2027,6 +2317,91 @@
       </w:r>
       <w:r>
         <w:t xml:space="preserve">Für die offizielle FSK bei fast allen Titeln einen kostenlosen TMDB-Schlüssel unter Einstellungen → Altersfreigaben eintragen.</w:t>
+      </w:r>
+    </w:p>
+    <w:p>
+      <w:pPr>
+        <w:pStyle w:val="Heading2"/>
+        <w:spacing w:after="120" w:before="240"/>
+      </w:pPr>
+      <w:r>
+        <w:t xml:space="preserve">Wie die App den Vorspann lernt</w:t>
+      </w:r>
+    </w:p>
+    <w:p>
+      <w:pPr>
+        <w:spacing w:after="120"/>
+      </w:pPr>
+      <w:r>
+        <w:t xml:space="preserve">Es gibt zwei Verfahren, die sich ergänzen:</w:t>
+      </w:r>
+    </w:p>
+    <w:p>
+      <w:pPr>
+        <w:pStyle w:val="ListParagraph"/>
+        <w:numPr>
+          <w:ilvl w:val="0"/>
+          <w:numId w:val="5"/>
+        </w:numPr>
+        <w:spacing w:after="60"/>
+      </w:pPr>
+      <w:r>
+        <w:rPr>
+          <w:b/>
+          <w:bCs/>
+        </w:rPr>
+        <w:t xml:space="preserve">Ton-Erkennung (automatisch, Standard-Player): </w:t>
+      </w:r>
+      <w:r>
+        <w:t xml:space="preserve">Die App hört in den ersten 10 Minuten jeder Folge mit und bildet einen Ton-Fingerabdruck. Nach zwei Folgen kennt sie die Vorspann-Musik. Ab der dritten Folge erkennt sie den Vorspann live, egal wo er beginnt, und springt genau an sein Ende. Erkennt sie ihn einmal nicht, lernt sie neu (z.B. neue Staffel).</w:t>
+      </w:r>
+    </w:p>
+    <w:p>
+      <w:pPr>
+        <w:pStyle w:val="ListParagraph"/>
+        <w:numPr>
+          <w:ilvl w:val="0"/>
+          <w:numId w:val="5"/>
+        </w:numPr>
+        <w:spacing w:after="60"/>
+      </w:pPr>
+      <w:r>
+        <w:rPr>
+          <w:b/>
+          <w:bCs/>
+        </w:rPr>
+        <w:t xml:space="preserve">Lernen durch Vorspulen (beide Player): </w:t>
+      </w:r>
+      <w:r>
+        <w:t xml:space="preserve">Spulst du in den ersten 10 Minuten über den Vorspann (20 s bis 5 Min.), merkt sich die App Beginn und Ende. In den nächsten Folgen erscheint der Knopf genau dort.</w:t>
+      </w:r>
+    </w:p>
+    <w:p>
+      <w:pPr>
+        <w:pStyle w:val="ListParagraph"/>
+        <w:numPr>
+          <w:ilvl w:val="0"/>
+          <w:numId w:val="5"/>
+        </w:numPr>
+        <w:spacing w:after="60"/>
+      </w:pPr>
+      <w:r>
+        <w:rPr>
+          <w:b/>
+          <w:bCs/>
+        </w:rPr>
+        <w:t xml:space="preserve">Zusammenspiel: </w:t>
+      </w:r>
+      <w:r>
+        <w:t xml:space="preserve">Per Ton erkannte Vorspann-Zeiten werden zusätzlich gespeichert – so profitiert auch der VLC-Player davon.</w:t>
+      </w:r>
+    </w:p>
+    <w:p>
+      <w:pPr>
+        <w:spacing w:after="120"/>
+      </w:pPr>
+      <w:r>
+        <w:t xml:space="preserve">Grenzen: Serien ohne wiederkehrende Vorspann-Musik werden nicht automatisch erkannt. Bei Dolby-Durchleitung an einen AV-Receiver hört die App den Ton nicht mit – dann gilt das Lernen durch Vorspulen.</w:t>
       </w:r>
     </w:p>
     <w:p>

</xml_diff>

<commit_message>
Gesehen-Markierung: gruener Haken bei fertig geschauten Filmen/Folgen, Fortschrittsbalken bei angefangenen; manuell umschaltbar; Anleitung aktualisiert
Co-Authored-By: Claude Opus 5.5 <noreply@anthropic.com>
Claude-Session: https://claude.ai/code/session_01CaJqjA6T7wr6qkboQBX5Ep
</commit_message>
<xml_diff>
--- a/docs/PowerIPTV-Anleitung.docx
+++ b/docs/PowerIPTV-Anleitung.docx
@@ -49,7 +49,7 @@
         <w:rPr>
           <w:color w:val="666666"/>
         </w:rPr>
-        <w:t xml:space="preserve">Stand: Version 1.1.61 · Oktober 2026</w:t>
+        <w:t xml:space="preserve">Stand: Version 1.1.63 · Oktober 2026</w:t>
       </w:r>
     </w:p>
     <w:p>
@@ -2257,6 +2257,26 @@
       </w:r>
       <w:r>
         <w:t xml:space="preserve">Der Knopf erscheint für 7 Sekunden; OK auf der Fernbedienung löst ihn aus. Die App lernt den Vorspann jeder Serie selbst (siehe unten).</w:t>
+      </w:r>
+    </w:p>
+    <w:p>
+      <w:pPr>
+        <w:pStyle w:val="ListParagraph"/>
+        <w:numPr>
+          <w:ilvl w:val="0"/>
+          <w:numId w:val="5"/>
+        </w:numPr>
+        <w:spacing w:after="60"/>
+      </w:pPr>
+      <w:r>
+        <w:rPr>
+          <w:b/>
+          <w:bCs/>
+        </w:rPr>
+        <w:t xml:space="preserve">Gesehen-Markierung: </w:t>
+      </w:r>
+      <w:r>
+        <w:t xml:space="preserve">Fertig geschaute Filme und Folgen bekommen einen grünen Haken (✓), angefangene einen Fortschrittsbalken – in der Übersicht, in der Suche und bei den Folgen. Von Hand umschalten: beim Film über „Gesehen/Ungesehen“ auf der Detailseite, bei Folgen durch langes Drücken (TV: OK gedrückt halten).</w:t>
       </w:r>
     </w:p>
     <w:p>

</xml_diff>

<commit_message>
VLC fluessiger: keine erzwungene yadif-Entflechtung mehr, Leistungsmodus (Auto/Schnell/Qualitaet, TV-Sticks automatisch schnell), groesserer Puffer und lockere Taktsynchronisation bei Live; Anleitung aktualisiert
Co-Authored-By: Claude Opus 5.5 <noreply@anthropic.com>
Claude-Session: https://claude.ai/code/session_01CaJqjA6T7wr6qkboQBX5Ep
</commit_message>
<xml_diff>
--- a/docs/PowerIPTV-Anleitung.docx
+++ b/docs/PowerIPTV-Anleitung.docx
@@ -49,7 +49,7 @@
         <w:rPr>
           <w:color w:val="666666"/>
         </w:rPr>
-        <w:t xml:space="preserve">Stand: Version 1.1.63 · Oktober 2026</w:t>
+        <w:t xml:space="preserve">Stand: Version 1.1.64 · Oktober 2026</w:t>
       </w:r>
     </w:p>
     <w:p>
@@ -2849,7 +2849,7 @@
                 <w:sz w:val="20"/>
                 <w:szCs w:val="20"/>
               </w:rPr>
-              <w:t xml:space="preserve">Automatisch / Standard / VLC, Bildwiederholrate (AFR), Bildformat, Vorschaubilder beim Spulen</w:t>
+              <w:t xml:space="preserve">Automatisch / Standard / VLC, VLC-Leistung (Automatisch / Schnell / Qualität), Bildwiederholrate (AFR), Bildformat, Vorschaubilder beim Spulen</w:t>
             </w:r>
           </w:p>
         </w:tc>
@@ -3326,7 +3326,7 @@
                 <w:sz w:val="20"/>
                 <w:szCs w:val="20"/>
               </w:rPr>
-              <w:t xml:space="preserve">Nur Ton, kein Bild</w:t>
+              <w:t xml:space="preserve">VLC ruckelt oder hängt</w:t>
             </w:r>
           </w:p>
         </w:tc>
@@ -3348,7 +3348,7 @@
                 <w:sz w:val="20"/>
                 <w:szCs w:val="20"/>
               </w:rPr>
-              <w:t xml:space="preserve">Der Sender nutzt ein altes Format – die App wechselt automatisch zu VLC. Sonst Einstellungen → Player → VLC.</w:t>
+              <w:t xml:space="preserve">Einstellungen → Player → VLC-Leistung auf „Schnell“ stellen (bei TV-Sticks automatisch).</w:t>
             </w:r>
           </w:p>
         </w:tc>
@@ -3376,7 +3376,7 @@
                 <w:sz w:val="20"/>
                 <w:szCs w:val="20"/>
               </w:rPr>
-              <w:t xml:space="preserve">Bild bleibt bei Aufnahme stehen</w:t>
+              <w:t xml:space="preserve">Nur Ton, kein Bild</w:t>
             </w:r>
           </w:p>
         </w:tc>
@@ -3399,7 +3399,7 @@
                 <w:sz w:val="20"/>
                 <w:szCs w:val="20"/>
               </w:rPr>
-              <w:t xml:space="preserve">Der Zugang erlaubt nur eine Verbindung. Den aufgenommenen Sender schauen oder die Aufnahme stoppen.</w:t>
+              <w:t xml:space="preserve">Der Sender nutzt ein altes Format – die App wechselt automatisch zu VLC. Sonst Einstellungen → Player → VLC.</w:t>
             </w:r>
           </w:p>
         </w:tc>
@@ -3426,7 +3426,7 @@
                 <w:sz w:val="20"/>
                 <w:szCs w:val="20"/>
               </w:rPr>
-              <w:t xml:space="preserve">Update lässt sich nicht installieren</w:t>
+              <w:t xml:space="preserve">Bild bleibt bei Aufnahme stehen</w:t>
             </w:r>
           </w:p>
         </w:tc>
@@ -3448,7 +3448,7 @@
                 <w:sz w:val="20"/>
                 <w:szCs w:val="20"/>
               </w:rPr>
-              <w:t xml:space="preserve">Immer die APK aus den Releases verwenden (gleiche Signatur).</w:t>
+              <w:t xml:space="preserve">Der Zugang erlaubt nur eine Verbindung. Den aufgenommenen Sender schauen oder die Aufnahme stoppen.</w:t>
             </w:r>
           </w:p>
         </w:tc>
@@ -3476,7 +3476,7 @@
                 <w:sz w:val="20"/>
                 <w:szCs w:val="20"/>
               </w:rPr>
-              <w:t xml:space="preserve">Cast findet den Fernseher nicht</w:t>
+              <w:t xml:space="preserve">Update lässt sich nicht installieren</w:t>
             </w:r>
           </w:p>
         </w:tc>
@@ -3499,7 +3499,7 @@
                 <w:sz w:val="20"/>
                 <w:szCs w:val="20"/>
               </w:rPr>
-              <w:t xml:space="preserve">Samsung- und Fire-TV-Geräte können kein Google Cast – „Bildschirm spiegeln“ nutzen.</w:t>
+              <w:t xml:space="preserve">Immer die APK aus den Releases verwenden (gleiche Signatur).</w:t>
             </w:r>
           </w:p>
         </w:tc>
@@ -3526,6 +3526,56 @@
                 <w:sz w:val="20"/>
                 <w:szCs w:val="20"/>
               </w:rPr>
+              <w:t xml:space="preserve">Cast findet den Fernseher nicht</w:t>
+            </w:r>
+          </w:p>
+        </w:tc>
+        <w:tc>
+          <w:tcPr>
+            <w:tcW w:type="dxa" w:w="6026"/>
+            <w:tcMar>
+              <w:top w:type="dxa" w:w="60"/>
+              <w:left w:type="dxa" w:w="100"/>
+              <w:bottom w:type="dxa" w:w="60"/>
+              <w:right w:type="dxa" w:w="100"/>
+            </w:tcMar>
+          </w:tcPr>
+          <w:p>
+            <w:r>
+              <w:rPr>
+                <w:b w:val="false"/>
+                <w:bCs w:val="false"/>
+                <w:sz w:val="20"/>
+                <w:szCs w:val="20"/>
+              </w:rPr>
+              <w:t xml:space="preserve">Samsung- und Fire-TV-Geräte können kein Google Cast – „Bildschirm spiegeln“ nutzen.</w:t>
+            </w:r>
+          </w:p>
+        </w:tc>
+      </w:tr>
+      <w:tr>
+        <w:trPr>
+          <w:tblHeader w:val="false"/>
+        </w:trPr>
+        <w:tc>
+          <w:tcPr>
+            <w:tcW w:type="dxa" w:w="3000"/>
+            <w:shd w:fill="EEF5FA" w:color="auto" w:val="clear"/>
+            <w:tcMar>
+              <w:top w:type="dxa" w:w="60"/>
+              <w:left w:type="dxa" w:w="100"/>
+              <w:bottom w:type="dxa" w:w="60"/>
+              <w:right w:type="dxa" w:w="100"/>
+            </w:tcMar>
+          </w:tcPr>
+          <w:p>
+            <w:r>
+              <w:rPr>
+                <w:b/>
+                <w:bCs/>
+                <w:sz w:val="20"/>
+                <w:szCs w:val="20"/>
+              </w:rPr>
               <w:t xml:space="preserve">Senderliste veraltet</w:t>
             </w:r>
           </w:p>
@@ -3533,6 +3583,7 @@
         <w:tc>
           <w:tcPr>
             <w:tcW w:type="dxa" w:w="6026"/>
+            <w:shd w:fill="EEF5FA" w:color="auto" w:val="clear"/>
             <w:tcMar>
               <w:top w:type="dxa" w:w="60"/>
               <w:left w:type="dxa" w:w="100"/>

</xml_diff>

<commit_message>
VLC: mehrfaches Spulen wird gebuendelt (ein Sprung 0,6 s nach dem letzten Tastendruck) statt vieler einzelner Spruenge – kein Haengen mehr; Anleitung aktualisiert
Co-Authored-By: Claude Opus 5.5 <noreply@anthropic.com>
Claude-Session: https://claude.ai/code/session_01CaJqjA6T7wr6qkboQBX5Ep
</commit_message>
<xml_diff>
--- a/docs/PowerIPTV-Anleitung.docx
+++ b/docs/PowerIPTV-Anleitung.docx
@@ -49,7 +49,7 @@
         <w:rPr>
           <w:color w:val="666666"/>
         </w:rPr>
-        <w:t xml:space="preserve">Stand: Version 1.1.64 · Oktober 2026</w:t>
+        <w:t xml:space="preserve">Stand: Version 1.1.65 · Oktober 2026</w:t>
       </w:r>
     </w:p>
     <w:p>
@@ -1424,7 +1424,7 @@
                 <w:sz w:val="20"/>
                 <w:szCs w:val="20"/>
               </w:rPr>
-              <w:t xml:space="preserve">→ / ←</w:t>
+              <w:t xml:space="preserve">→ / ← (mehrmals drücken = Sprünge addieren sich)</w:t>
             </w:r>
           </w:p>
         </w:tc>

</xml_diff>

<commit_message>
Multi-View: schlanke Player (kleiner Puffer, Ton nur im aktiven Fenster, max. 720p bei 4 Fenstern, Auto-Neuverbindung) gegen Einfrieren; Bedienknoepfe blenden sich aus und verdecken keine Senderlogos; Anleitung aktualisiert
Co-Authored-By: Claude Opus 5.5 <noreply@anthropic.com>
Claude-Session: https://claude.ai/code/session_01CaJqjA6T7wr6qkboQBX5Ep
</commit_message>
<xml_diff>
--- a/docs/PowerIPTV-Anleitung.docx
+++ b/docs/PowerIPTV-Anleitung.docx
@@ -49,7 +49,7 @@
         <w:rPr>
           <w:color w:val="666666"/>
         </w:rPr>
-        <w:t xml:space="preserve">Stand: Version 1.1.65 · Oktober 2026</w:t>
+        <w:t xml:space="preserve">Stand: Version 1.1.66 · Oktober 2026</w:t>
       </w:r>
     </w:p>
     <w:p>
@@ -2724,7 +2724,27 @@
         <w:t xml:space="preserve">Multi-View: </w:t>
       </w:r>
       <w:r>
-        <w:t xml:space="preserve">Mehrere Sender gleichzeitig; Bild-in-Bild auf dem Handy beim Verlassen der App.</w:t>
+        <w:t xml:space="preserve">Bis zu 4 Sender gleichzeitig (Kachel „Multi-View“). Leeres Fenster antippen = Sender wählen; Fenster antippen = dessen Ton hören (blauer Rahmen); lange drücken = Sender wechseln. Die Bedienknöpfe blenden sich nach 4 Sekunden aus und kommen mit einem Tipp zurück. Unten: Umschalten zwischen 2 und 4 Fenstern. Hinweis: 4 Sender in Full-HD brauchen eine schnelle Internetleitung (ca. 40 MBit/s) und zählen beim Anbieter als 4 Verbindungen.</w:t>
+      </w:r>
+    </w:p>
+    <w:p>
+      <w:pPr>
+        <w:pStyle w:val="ListParagraph"/>
+        <w:numPr>
+          <w:ilvl w:val="0"/>
+          <w:numId w:val="5"/>
+        </w:numPr>
+        <w:spacing w:after="60"/>
+      </w:pPr>
+      <w:r>
+        <w:rPr>
+          <w:b/>
+          <w:bCs/>
+        </w:rPr>
+        <w:t xml:space="preserve">Bild-in-Bild: </w:t>
+      </w:r>
+      <w:r>
+        <w:t xml:space="preserve">Auf dem Handy läuft der Sender beim Verlassen der App im kleinen Fenster weiter.</w:t>
       </w:r>
     </w:p>
     <w:p>

</xml_diff>

<commit_message>
Multi-View: erkennt Verbindungslimit des Zugangs – bei zu wenig Verbindungen laufen nur die zuletzt angetippten Fenster, die anderen pausieren mit letztem Bild; Anzeige 'Streams x / y'; Anleitung aktualisiert
Co-Authored-By: Claude Opus 5.5 <noreply@anthropic.com>
Claude-Session: https://claude.ai/code/session_01CaJqjA6T7wr6qkboQBX5Ep
</commit_message>
<xml_diff>
--- a/docs/PowerIPTV-Anleitung.docx
+++ b/docs/PowerIPTV-Anleitung.docx
@@ -49,7 +49,7 @@
         <w:rPr>
           <w:color w:val="666666"/>
         </w:rPr>
-        <w:t xml:space="preserve">Stand: Version 1.1.66 · Oktober 2026</w:t>
+        <w:t xml:space="preserve">Stand: Version 1.1.67 · Oktober 2026</w:t>
       </w:r>
     </w:p>
     <w:p>
@@ -2724,7 +2724,7 @@
         <w:t xml:space="preserve">Multi-View: </w:t>
       </w:r>
       <w:r>
-        <w:t xml:space="preserve">Bis zu 4 Sender gleichzeitig (Kachel „Multi-View“). Leeres Fenster antippen = Sender wählen; Fenster antippen = dessen Ton hören (blauer Rahmen); lange drücken = Sender wechseln. Die Bedienknöpfe blenden sich nach 4 Sekunden aus und kommen mit einem Tipp zurück. Unten: Umschalten zwischen 2 und 4 Fenstern. Hinweis: 4 Sender in Full-HD brauchen eine schnelle Internetleitung (ca. 40 MBit/s) und zählen beim Anbieter als 4 Verbindungen.</w:t>
+        <w:t xml:space="preserve">Bis zu 4 Sender gleichzeitig (Kachel „Multi-View“). Leeres Fenster antippen = Sender wählen; Fenster antippen = dessen Ton hören (blauer Rahmen); lange drücken = Sender wechseln. Die Bedienknöpfe blenden sich nach 4 Sekunden aus und kommen mit einem Tipp zurück. Unten: Umschalten zwischen 2 und 4 Fenstern. Die App erkennt, wie viele Streams dein Zugang gleichzeitig erlaubt (Anzeige „Streams: x / y“): Reicht das Limit nicht für alle Fenster, laufen nur die zuletzt angetippten – die übrigen zeigen „Pausiert (Limit des Zugangs)“ mit dem letzten Bild und starten beim Antippen. Laufende Aufnahmen zählen mit. Hinweis: 4 Sender in Full-HD brauchen eine schnelle Internetleitung (ca. 40 MBit/s).</w:t>
       </w:r>
     </w:p>
     <w:p>

</xml_diff>

<commit_message>
Programmfuehrer: Sprachfilter (wie Live/Filme/Serien); Favoriten ueberall: Herz im Player, lange druecken auf Poster, Sender (auch EPG), Suche, Weiterschauen/Zuletzt gesehen; Herz-Markierung; Anleitung aktualisiert
Co-Authored-By: Claude Opus 5.5 <noreply@anthropic.com>
Claude-Session: https://claude.ai/code/session_01CaJqjA6T7wr6qkboQBX5Ep
</commit_message>
<xml_diff>
--- a/docs/PowerIPTV-Anleitung.docx
+++ b/docs/PowerIPTV-Anleitung.docx
@@ -49,7 +49,7 @@
         <w:rPr>
           <w:color w:val="666666"/>
         </w:rPr>
-        <w:t xml:space="preserve">Stand: Version 1.1.67 · Oktober 2026</w:t>
+        <w:t xml:space="preserve">Stand: Version 1.1.68 · Oktober 2026</w:t>
       </w:r>
     </w:p>
     <w:p>
@@ -2527,7 +2527,7 @@
         <w:spacing w:after="120"/>
       </w:pPr>
       <w:r>
-        <w:t xml:space="preserve">Die Kachel „Programm“ zeigt ein Zeitraster aller Sender. Eine Sendung antippen öffnet die Optionen:</w:t>
+        <w:t xml:space="preserve">Die Kachel „Programm“ zeigt ein Zeitraster aller Sender. Über „🌐 Sprache“ ganz links lassen sich die Kategorien nach Sprache filtern (gleiche Einstellung wie bei Live TV, Filmen und Serien). Einen Sender lange drücken = Favorit. Eine Sendung antippen öffnet die Optionen:</w:t>
       </w:r>
     </w:p>
     <w:p>
@@ -2615,7 +2615,7 @@
         <w:t xml:space="preserve">Favoriten: </w:t>
       </w:r>
       <w:r>
-        <w:t xml:space="preserve">Herz-Symbol auf der Detailseite oder im Player.</w:t>
+        <w:t xml:space="preserve">Überall möglich: Herz auf der Detailseite und im Player (oben), oder lange drücken (TV: OK halten) auf ein Poster, einen Sender, im Programmführer, in der Suche, bei „Weiterschauen“/„Zuletzt gesehen“. Favoriten tragen ein rotes Herz.</w:t>
       </w:r>
     </w:p>
     <w:p>

</xml_diff>

<commit_message>
Kindersicherung: gilt jetzt ueberall (Verlauf, Weiterschauen, Favoriten, Detailseiten, Abspielen, EPG) inkl. PIN-Abfrage; klarer Status AKTIV/AUS. Langes Druecken: Menue mit Favorit, Teilen (nur Titel) und Aus Liste entfernen; Anleitung aktualisiert
Co-Authored-By: Claude Opus 5.5 <noreply@anthropic.com>
Claude-Session: https://claude.ai/code/session_01CaJqjA6T7wr6qkboQBX5Ep
</commit_message>
<xml_diff>
--- a/docs/PowerIPTV-Anleitung.docx
+++ b/docs/PowerIPTV-Anleitung.docx
@@ -49,7 +49,7 @@
         <w:rPr>
           <w:color w:val="666666"/>
         </w:rPr>
-        <w:t xml:space="preserve">Stand: Version 1.1.68 · Oktober 2026</w:t>
+        <w:t xml:space="preserve">Stand: Version 1.1.69 · Oktober 2026</w:t>
       </w:r>
     </w:p>
     <w:p>
@@ -2632,6 +2632,26 @@
           <w:b/>
           <w:bCs/>
         </w:rPr>
+        <w:t xml:space="preserve">Menü bei langem Drücken: </w:t>
+      </w:r>
+      <w:r>
+        <w:t xml:space="preserve">Zu Favoriten hinzufügen/entfernen, Teilen (WhatsApp &amp; Co. – geteilt wird nur der Titel, nie der Stream-Link mit deinen Zugangsdaten) und bei „Weiterschauen“/„Zuletzt gesehen“ zusätzlich „Aus Liste entfernen“ (der Titel selbst bleibt erhalten).</w:t>
+      </w:r>
+    </w:p>
+    <w:p>
+      <w:pPr>
+        <w:pStyle w:val="ListParagraph"/>
+        <w:numPr>
+          <w:ilvl w:val="0"/>
+          <w:numId w:val="5"/>
+        </w:numPr>
+        <w:spacing w:after="60"/>
+      </w:pPr>
+      <w:r>
+        <w:rPr>
+          <w:b/>
+          <w:bCs/>
+        </w:rPr>
         <w:t xml:space="preserve">Eigene Listen: </w:t>
       </w:r>
       <w:r>
@@ -3020,7 +3040,7 @@
                 <w:sz w:val="20"/>
                 <w:szCs w:val="20"/>
               </w:rPr>
-              <w:t xml:space="preserve">PIN, gesperrte Kategorien, Erwachseneninhalte ausblenden</w:t>
+              <w:t xml:space="preserve">Erst mit festgelegter PIN aktiv (grüner Hinweis „AKTIV“ oben). Sperrt Kategorien, Erwachseneninhalte automatisch und gilt überall – auch in Verlauf, Weiterschauen, Favoriten, Suche und Programmführer.</w:t>
             </w:r>
           </w:p>
         </w:tc>

</xml_diff>

<commit_message>
Startbildschirm: PowerIPTV mittig, eigener Start-Klang (abschaltbar in den Einstellungen); Anleitung aktualisiert
Co-Authored-By: Claude Opus 5.5 <noreply@anthropic.com>
Claude-Session: https://claude.ai/code/session_01CaJqjA6T7wr6qkboQBX5Ep
</commit_message>
<xml_diff>
--- a/docs/PowerIPTV-Anleitung.docx
+++ b/docs/PowerIPTV-Anleitung.docx
@@ -49,7 +49,7 @@
         <w:rPr>
           <w:color w:val="666666"/>
         </w:rPr>
-        <w:t xml:space="preserve">Stand: Version 1.1.69 · Oktober 2026</w:t>
+        <w:t xml:space="preserve">Stand: Version 1.1.70 · Oktober 2026</w:t>
       </w:r>
     </w:p>
     <w:p>
@@ -2889,7 +2889,7 @@
                 <w:sz w:val="20"/>
                 <w:szCs w:val="20"/>
               </w:rPr>
-              <w:t xml:space="preserve">Automatisch / Standard / VLC, VLC-Leistung (Automatisch / Schnell / Qualität), Bildwiederholrate (AFR), Bildformat, Vorschaubilder beim Spulen</w:t>
+              <w:t xml:space="preserve">Start-Klang an/aus, Automatisch / Standard / VLC, VLC-Leistung (Automatisch / Schnell / Qualität), Bildwiederholrate (AFR), Bildformat, Vorschaubilder beim Spulen</w:t>
             </w:r>
           </w:p>
         </w:tc>

</xml_diff>

<commit_message>
Start-Klang: Variante A (Kino), Logo-Animation auf den Schlag abgestimmt
Co-Authored-By: Claude Opus 5.5 <noreply@anthropic.com>
Claude-Session: https://claude.ai/code/session_01CaJqjA6T7wr6qkboQBX5Ep
</commit_message>
<xml_diff>
--- a/docs/PowerIPTV-Anleitung.docx
+++ b/docs/PowerIPTV-Anleitung.docx
@@ -49,7 +49,7 @@
         <w:rPr>
           <w:color w:val="666666"/>
         </w:rPr>
-        <w:t xml:space="preserve">Stand: Version 1.1.70 · Oktober 2026</w:t>
+        <w:t xml:space="preserve">Stand: Version 1.1.71 · Oktober 2026</w:t>
       </w:r>
     </w:p>
     <w:p>
@@ -2889,7 +2889,7 @@
                 <w:sz w:val="20"/>
                 <w:szCs w:val="20"/>
               </w:rPr>
-              <w:t xml:space="preserve">Start-Klang an/aus, Automatisch / Standard / VLC, VLC-Leistung (Automatisch / Schnell / Qualität), Bildwiederholrate (AFR), Bildformat, Vorschaubilder beim Spulen</w:t>
+              <w:t xml:space="preserve">Start-Klang an/aus (kurzer Kino-Klang beim App-Start, das Logo erscheint auf den Schlag), Automatisch / Standard / VLC, VLC-Leistung (Automatisch / Schnell / Qualität), Bildwiederholrate (AFR), Bildformat, Vorschaubilder beim Spulen</w:t>
             </w:r>
           </w:p>
         </w:tc>

</xml_diff>

<commit_message>
Windows-App (Ordner Windows/) + Benutzer-Schnellwechsel
- Neue Windows-Version: Compose Desktop mit VLC-Player (VLC wird mitgeliefert),
  Zugaenge (Xtream/M3U, Passwort per DPAPI verschluesselt), Live TV/Filme/Serien
  mit Kategorien, Suche, Details, Episoden, Favoriten, Weiterschauen,
  naechste Folge, Senderliste, Tastenkuerzel, Kino-Startklang
- Xtream/M3U-Logik wird mit der Android-App geteilt
- GitHub-Build erzeugt Windows-Installer (.exe/.msi) + portable ZIP im Release
- Handy-Startseite: Schriftzug ersetzt durch Benutzer-Maennchen zum schnellen Wechseln
- Benutzer wechseln: aktiver Zugang markiert, Zurueck fuehrt zur Startseite
- Anleitung: Kapitel Windows, Benutzerwechsel

Co-Authored-By: Claude Opus 5.5 <noreply@anthropic.com>
Claude-Session: https://claude.ai/code/session_01CaJqjA6T7wr6qkboQBX5Ep
</commit_message>
<xml_diff>
--- a/docs/PowerIPTV-Anleitung.docx
+++ b/docs/PowerIPTV-Anleitung.docx
@@ -49,7 +49,7 @@
         <w:rPr>
           <w:color w:val="666666"/>
         </w:rPr>
-        <w:t xml:space="preserve">Stand: Version 1.1.71 · Oktober 2026</w:t>
+        <w:t xml:space="preserve">Stand: Version 1.1.72 · Oktober 2026</w:t>
       </w:r>
     </w:p>
     <w:p>
@@ -103,7 +103,7 @@
         <w:spacing w:after="120"/>
       </w:pPr>
       <w:r>
-        <w:t xml:space="preserve">PowerIPTV ist ein IPTV-Player für Live-TV, Filme und Serien deines Anbieters (Xtream Codes oder M3U). Eine einzige App-Datei läuft auf Handy, Tablet, Fire TV und Android TV und passt die Oberfläche automatisch an.</w:t>
+        <w:t xml:space="preserve">PowerIPTV ist ein IPTV-Player für Live-TV, Filme und Serien deines Anbieters (Xtream Codes oder M3U). Eine einzige App-Datei läuft auf Handy, Tablet, Fire TV und Android TV und passt die Oberfläche automatisch an. Zusätzlich gibt es eine eigene Version für Windows-PCs (Kapitel 14).</w:t>
       </w:r>
     </w:p>
     <w:tbl>
@@ -652,6 +652,23 @@
     </w:p>
     <w:p>
       <w:pPr>
+        <w:pStyle w:val="Heading2"/>
+        <w:spacing w:after="120" w:before="240"/>
+      </w:pPr>
+      <w:r>
+        <w:t xml:space="preserve">Windows-PC</w:t>
+      </w:r>
+    </w:p>
+    <w:p>
+      <w:pPr>
+        <w:spacing w:after="120"/>
+      </w:pPr>
+      <w:r>
+        <w:t xml:space="preserve">Siehe Kapitel 14 – dort steht die Installation der Windows-Version.</w:t>
+      </w:r>
+    </w:p>
+    <w:p>
+      <w:pPr>
         <w:pStyle w:val="Heading1"/>
         <w:spacing w:after="160" w:before="360"/>
       </w:pPr>
@@ -759,6 +776,26 @@
           <w:b/>
           <w:bCs/>
         </w:rPr>
+        <w:t xml:space="preserve">Benutzer-Männchen (oben neben dem Logo): </w:t>
+      </w:r>
+      <w:r>
+        <w:t xml:space="preserve">antippen → Liste aller Zugänge; der aktive ist blau mit Haken markiert. Ein Tipp auf einen anderen Zugang wechselt sofort. Bearbeiten und Löschen gibt es nur unter „Benutzer wechseln“.</w:t>
+      </w:r>
+    </w:p>
+    <w:p>
+      <w:pPr>
+        <w:pStyle w:val="ListParagraph"/>
+        <w:numPr>
+          <w:ilvl w:val="0"/>
+          <w:numId w:val="5"/>
+        </w:numPr>
+        <w:spacing w:after="60"/>
+      </w:pPr>
+      <w:r>
+        <w:rPr>
+          <w:b/>
+          <w:bCs/>
+        </w:rPr>
         <w:t xml:space="preserve">Große Kacheln: </w:t>
       </w:r>
       <w:r>
@@ -823,6 +860,26 @@
       </w:r>
       <w:r>
         <w:t xml:space="preserve">getrennt nach Live TV, Filme und Serien. Ein Tipp auf „Alle anzeigen ›“ öffnet die große Übersicht mit Reitern; lange drücken entfernt einen Eintrag.</w:t>
+      </w:r>
+    </w:p>
+    <w:p>
+      <w:pPr>
+        <w:pStyle w:val="ListParagraph"/>
+        <w:numPr>
+          <w:ilvl w:val="0"/>
+          <w:numId w:val="5"/>
+        </w:numPr>
+        <w:spacing w:after="60"/>
+      </w:pPr>
+      <w:r>
+        <w:rPr>
+          <w:b/>
+          <w:bCs/>
+        </w:rPr>
+        <w:t xml:space="preserve">Benutzer wechseln (Kachel): </w:t>
+      </w:r>
+      <w:r>
+        <w:t xml:space="preserve">zeigt alle Zugänge zum Bearbeiten, Löschen und Neu-Anlegen. Der aktive Zugang ist blau umrandet und mit „AKTIV“ markiert. Mit der Zurück-Taste (oder dem Pfeil oben) geht es ohne Wechsel zurück zur Startseite.</w:t>
       </w:r>
     </w:p>
     <w:p>
@@ -3645,6 +3702,728 @@
         </w:tc>
       </w:tr>
     </w:tbl>
+    <w:p>
+      <w:pPr>
+        <w:pStyle w:val="Heading1"/>
+        <w:spacing w:after="160" w:before="360"/>
+      </w:pPr>
+      <w:r>
+        <w:t xml:space="preserve">14. PowerIPTV für Windows</w:t>
+      </w:r>
+    </w:p>
+    <w:p>
+      <w:pPr>
+        <w:spacing w:after="120"/>
+      </w:pPr>
+      <w:r>
+        <w:t xml:space="preserve">Für den Windows-PC gibt es eine eigene Version mit gleicher Optik – angepasst an Maus und Tastatur. Der Player (VLC) ist bereits enthalten, es muss nichts zusätzlich installiert werden.</w:t>
+      </w:r>
+    </w:p>
+    <w:p>
+      <w:pPr>
+        <w:pStyle w:val="Heading2"/>
+        <w:spacing w:after="120" w:before="240"/>
+      </w:pPr>
+      <w:r>
+        <w:t xml:space="preserve">Installieren</w:t>
+      </w:r>
+    </w:p>
+    <w:p>
+      <w:pPr>
+        <w:pStyle w:val="ListParagraph"/>
+        <w:numPr>
+          <w:ilvl w:val="0"/>
+          <w:numId w:val="6"/>
+        </w:numPr>
+        <w:spacing w:after="60"/>
+      </w:pPr>
+      <w:r>
+        <w:t xml:space="preserve">Auf GitHub unter „Releases“ die neueste Version öffnen (fester Link: …/releases/latest/download/Portiva-Windows-Setup.exe).</w:t>
+      </w:r>
+    </w:p>
+    <w:p>
+      <w:pPr>
+        <w:pStyle w:val="ListParagraph"/>
+        <w:numPr>
+          <w:ilvl w:val="0"/>
+          <w:numId w:val="6"/>
+        </w:numPr>
+        <w:spacing w:after="60"/>
+      </w:pPr>
+      <w:r>
+        <w:t xml:space="preserve">„Portiva-Windows-Setup-v1.1.X.exe“ herunterladen und doppelklicken.</w:t>
+      </w:r>
+    </w:p>
+    <w:p>
+      <w:pPr>
+        <w:pStyle w:val="ListParagraph"/>
+        <w:numPr>
+          <w:ilvl w:val="0"/>
+          <w:numId w:val="6"/>
+        </w:numPr>
+        <w:spacing w:after="60"/>
+      </w:pPr>
+      <w:r>
+        <w:t xml:space="preserve">Warnt Windows („Der Computer wurde durch Windows geschützt“): „Weitere Informationen“ → „Trotzdem ausführen“.</w:t>
+      </w:r>
+    </w:p>
+    <w:p>
+      <w:pPr>
+        <w:pStyle w:val="ListParagraph"/>
+        <w:numPr>
+          <w:ilvl w:val="0"/>
+          <w:numId w:val="6"/>
+        </w:numPr>
+        <w:spacing w:after="60"/>
+      </w:pPr>
+      <w:r>
+        <w:t xml:space="preserve">Danach startet Portiva über das Startmenü oder die Desktop-Verknüpfung.</w:t>
+      </w:r>
+    </w:p>
+    <w:p>
+      <w:pPr>
+        <w:spacing w:after="120"/>
+      </w:pPr>
+      <w:r>
+        <w:t xml:space="preserve">Ohne Installation: „Portiva-Windows-Portable-…zip“ entpacken und „Portiva.exe“ starten. Updates: einfach die neue Setup-Datei ausführen – Zugänge, Favoriten und Verlauf bleiben erhalten.</w:t>
+      </w:r>
+    </w:p>
+    <w:p>
+      <w:pPr>
+        <w:pStyle w:val="Heading2"/>
+        <w:spacing w:after="120" w:before="240"/>
+      </w:pPr>
+      <w:r>
+        <w:t xml:space="preserve">Bedienung</w:t>
+      </w:r>
+    </w:p>
+    <w:p>
+      <w:pPr>
+        <w:pStyle w:val="ListParagraph"/>
+        <w:numPr>
+          <w:ilvl w:val="0"/>
+          <w:numId w:val="5"/>
+        </w:numPr>
+        <w:spacing w:after="60"/>
+      </w:pPr>
+      <w:r>
+        <w:rPr>
+          <w:b/>
+          <w:bCs/>
+        </w:rPr>
+        <w:t xml:space="preserve">Linke Leiste: </w:t>
+      </w:r>
+      <w:r>
+        <w:t xml:space="preserve">Start, Live TV, Filme, Serien, Favoriten, Suche, Einstellungen und der aktive Zugang.</w:t>
+      </w:r>
+    </w:p>
+    <w:p>
+      <w:pPr>
+        <w:pStyle w:val="ListParagraph"/>
+        <w:numPr>
+          <w:ilvl w:val="0"/>
+          <w:numId w:val="5"/>
+        </w:numPr>
+        <w:spacing w:after="60"/>
+      </w:pPr>
+      <w:r>
+        <w:rPr>
+          <w:b/>
+          <w:bCs/>
+        </w:rPr>
+        <w:t xml:space="preserve">Rechtsklick </w:t>
+      </w:r>
+      <w:r>
+        <w:t xml:space="preserve">auf Sender, Film, Serie oder Folge: Favorit, gesehen markieren, aus „Weiterschauen“ entfernen.</w:t>
+      </w:r>
+    </w:p>
+    <w:p>
+      <w:pPr>
+        <w:pStyle w:val="ListParagraph"/>
+        <w:numPr>
+          <w:ilvl w:val="0"/>
+          <w:numId w:val="5"/>
+        </w:numPr>
+        <w:spacing w:after="60"/>
+      </w:pPr>
+      <w:r>
+        <w:rPr>
+          <w:b/>
+          <w:bCs/>
+        </w:rPr>
+        <w:t xml:space="preserve">Startseite: </w:t>
+      </w:r>
+      <w:r>
+        <w:t xml:space="preserve">Kacheln, Weiterschauen, zuletzt gesehene Sender, Favoriten; oben Ablaufdatum und Streams des Zugangs.</w:t>
+      </w:r>
+    </w:p>
+    <w:p>
+      <w:pPr>
+        <w:pStyle w:val="ListParagraph"/>
+        <w:numPr>
+          <w:ilvl w:val="0"/>
+          <w:numId w:val="5"/>
+        </w:numPr>
+        <w:spacing w:after="60"/>
+      </w:pPr>
+      <w:r>
+        <w:rPr>
+          <w:b/>
+          <w:bCs/>
+        </w:rPr>
+        <w:t xml:space="preserve">Player: </w:t>
+      </w:r>
+      <w:r>
+        <w:t xml:space="preserve">Klick = Pause, Doppelklick = Vollbild, Mausrad = Lautstärke. Zahnrad: Bildformat, Tonspur, Untertitel, Geschwindigkeit. Bei Serien „Nächste Folge“ 40 Sekunden vor Schluss.</w:t>
+      </w:r>
+    </w:p>
+    <w:tbl>
+      <w:tblPr>
+        <w:tblW w:type="dxa" w:w="9026"/>
+        <w:tblBorders>
+          <w:top w:val="single" w:color="auto" w:sz="4"/>
+          <w:left w:val="single" w:color="auto" w:sz="4"/>
+          <w:bottom w:val="single" w:color="auto" w:sz="4"/>
+          <w:right w:val="single" w:color="auto" w:sz="4"/>
+          <w:insideH w:val="single" w:color="auto" w:sz="4"/>
+          <w:insideV w:val="single" w:color="auto" w:sz="4"/>
+        </w:tblBorders>
+      </w:tblPr>
+      <w:tblGrid>
+        <w:gridCol w:w="3000"/>
+        <w:gridCol w:w="6026"/>
+      </w:tblGrid>
+      <w:tr>
+        <w:trPr>
+          <w:tblHeader/>
+        </w:trPr>
+        <w:tc>
+          <w:tcPr>
+            <w:tcW w:type="dxa" w:w="3000"/>
+            <w:shd w:fill="1E3A5F" w:color="auto" w:val="clear"/>
+            <w:tcMar>
+              <w:top w:type="dxa" w:w="60"/>
+              <w:left w:type="dxa" w:w="100"/>
+              <w:bottom w:type="dxa" w:w="60"/>
+              <w:right w:type="dxa" w:w="100"/>
+            </w:tcMar>
+          </w:tcPr>
+          <w:p>
+            <w:r>
+              <w:rPr>
+                <w:b/>
+                <w:bCs/>
+                <w:color w:val="FFFFFF"/>
+                <w:sz w:val="20"/>
+                <w:szCs w:val="20"/>
+              </w:rPr>
+              <w:t xml:space="preserve">Taste</w:t>
+            </w:r>
+          </w:p>
+        </w:tc>
+        <w:tc>
+          <w:tcPr>
+            <w:tcW w:type="dxa" w:w="6026"/>
+            <w:shd w:fill="1E3A5F" w:color="auto" w:val="clear"/>
+            <w:tcMar>
+              <w:top w:type="dxa" w:w="60"/>
+              <w:left w:type="dxa" w:w="100"/>
+              <w:bottom w:type="dxa" w:w="60"/>
+              <w:right w:type="dxa" w:w="100"/>
+            </w:tcMar>
+          </w:tcPr>
+          <w:p>
+            <w:r>
+              <w:rPr>
+                <w:b/>
+                <w:bCs/>
+                <w:color w:val="FFFFFF"/>
+                <w:sz w:val="20"/>
+                <w:szCs w:val="20"/>
+              </w:rPr>
+              <w:t xml:space="preserve">Funktion</w:t>
+            </w:r>
+          </w:p>
+        </w:tc>
+      </w:tr>
+      <w:tr>
+        <w:trPr>
+          <w:tblHeader w:val="false"/>
+        </w:trPr>
+        <w:tc>
+          <w:tcPr>
+            <w:tcW w:type="dxa" w:w="3000"/>
+            <w:tcMar>
+              <w:top w:type="dxa" w:w="60"/>
+              <w:left w:type="dxa" w:w="100"/>
+              <w:bottom w:type="dxa" w:w="60"/>
+              <w:right w:type="dxa" w:w="100"/>
+            </w:tcMar>
+          </w:tcPr>
+          <w:p>
+            <w:r>
+              <w:rPr>
+                <w:b/>
+                <w:bCs/>
+                <w:sz w:val="20"/>
+                <w:szCs w:val="20"/>
+              </w:rPr>
+              <w:t xml:space="preserve">Leertaste / K</w:t>
+            </w:r>
+          </w:p>
+        </w:tc>
+        <w:tc>
+          <w:tcPr>
+            <w:tcW w:type="dxa" w:w="6026"/>
+            <w:tcMar>
+              <w:top w:type="dxa" w:w="60"/>
+              <w:left w:type="dxa" w:w="100"/>
+              <w:bottom w:type="dxa" w:w="60"/>
+              <w:right w:type="dxa" w:w="100"/>
+            </w:tcMar>
+          </w:tcPr>
+          <w:p>
+            <w:r>
+              <w:rPr>
+                <w:b w:val="false"/>
+                <w:bCs w:val="false"/>
+                <w:sz w:val="20"/>
+                <w:szCs w:val="20"/>
+              </w:rPr>
+              <w:t xml:space="preserve">Pause / Weiter</w:t>
+            </w:r>
+          </w:p>
+        </w:tc>
+      </w:tr>
+      <w:tr>
+        <w:trPr>
+          <w:tblHeader w:val="false"/>
+        </w:trPr>
+        <w:tc>
+          <w:tcPr>
+            <w:tcW w:type="dxa" w:w="3000"/>
+            <w:shd w:fill="EEF5FA" w:color="auto" w:val="clear"/>
+            <w:tcMar>
+              <w:top w:type="dxa" w:w="60"/>
+              <w:left w:type="dxa" w:w="100"/>
+              <w:bottom w:type="dxa" w:w="60"/>
+              <w:right w:type="dxa" w:w="100"/>
+            </w:tcMar>
+          </w:tcPr>
+          <w:p>
+            <w:r>
+              <w:rPr>
+                <w:b/>
+                <w:bCs/>
+                <w:sz w:val="20"/>
+                <w:szCs w:val="20"/>
+              </w:rPr>
+              <w:t xml:space="preserve">← / →</w:t>
+            </w:r>
+          </w:p>
+        </w:tc>
+        <w:tc>
+          <w:tcPr>
+            <w:tcW w:type="dxa" w:w="6026"/>
+            <w:shd w:fill="EEF5FA" w:color="auto" w:val="clear"/>
+            <w:tcMar>
+              <w:top w:type="dxa" w:w="60"/>
+              <w:left w:type="dxa" w:w="100"/>
+              <w:bottom w:type="dxa" w:w="60"/>
+              <w:right w:type="dxa" w:w="100"/>
+            </w:tcMar>
+          </w:tcPr>
+          <w:p>
+            <w:r>
+              <w:rPr>
+                <w:b w:val="false"/>
+                <w:bCs w:val="false"/>
+                <w:sz w:val="20"/>
+                <w:szCs w:val="20"/>
+              </w:rPr>
+              <w:t xml:space="preserve">10 Sekunden zurück / vor (mit Umschalt: 1 Minute)</w:t>
+            </w:r>
+          </w:p>
+        </w:tc>
+      </w:tr>
+      <w:tr>
+        <w:trPr>
+          <w:tblHeader w:val="false"/>
+        </w:trPr>
+        <w:tc>
+          <w:tcPr>
+            <w:tcW w:type="dxa" w:w="3000"/>
+            <w:tcMar>
+              <w:top w:type="dxa" w:w="60"/>
+              <w:left w:type="dxa" w:w="100"/>
+              <w:bottom w:type="dxa" w:w="60"/>
+              <w:right w:type="dxa" w:w="100"/>
+            </w:tcMar>
+          </w:tcPr>
+          <w:p>
+            <w:r>
+              <w:rPr>
+                <w:b/>
+                <w:bCs/>
+                <w:sz w:val="20"/>
+                <w:szCs w:val="20"/>
+              </w:rPr>
+              <w:t xml:space="preserve">↑ / ↓</w:t>
+            </w:r>
+          </w:p>
+        </w:tc>
+        <w:tc>
+          <w:tcPr>
+            <w:tcW w:type="dxa" w:w="6026"/>
+            <w:tcMar>
+              <w:top w:type="dxa" w:w="60"/>
+              <w:left w:type="dxa" w:w="100"/>
+              <w:bottom w:type="dxa" w:w="60"/>
+              <w:right w:type="dxa" w:w="100"/>
+            </w:tcMar>
+          </w:tcPr>
+          <w:p>
+            <w:r>
+              <w:rPr>
+                <w:b w:val="false"/>
+                <w:bCs w:val="false"/>
+                <w:sz w:val="20"/>
+                <w:szCs w:val="20"/>
+              </w:rPr>
+              <w:t xml:space="preserve">Lautstärke; bei Live TV: Sender wechseln</w:t>
+            </w:r>
+          </w:p>
+        </w:tc>
+      </w:tr>
+      <w:tr>
+        <w:trPr>
+          <w:tblHeader w:val="false"/>
+        </w:trPr>
+        <w:tc>
+          <w:tcPr>
+            <w:tcW w:type="dxa" w:w="3000"/>
+            <w:shd w:fill="EEF5FA" w:color="auto" w:val="clear"/>
+            <w:tcMar>
+              <w:top w:type="dxa" w:w="60"/>
+              <w:left w:type="dxa" w:w="100"/>
+              <w:bottom w:type="dxa" w:w="60"/>
+              <w:right w:type="dxa" w:w="100"/>
+            </w:tcMar>
+          </w:tcPr>
+          <w:p>
+            <w:r>
+              <w:rPr>
+                <w:b/>
+                <w:bCs/>
+                <w:sz w:val="20"/>
+                <w:szCs w:val="20"/>
+              </w:rPr>
+              <w:t xml:space="preserve">Bild ↑ / Bild ↓</w:t>
+            </w:r>
+          </w:p>
+        </w:tc>
+        <w:tc>
+          <w:tcPr>
+            <w:tcW w:type="dxa" w:w="6026"/>
+            <w:shd w:fill="EEF5FA" w:color="auto" w:val="clear"/>
+            <w:tcMar>
+              <w:top w:type="dxa" w:w="60"/>
+              <w:left w:type="dxa" w:w="100"/>
+              <w:bottom w:type="dxa" w:w="60"/>
+              <w:right w:type="dxa" w:w="100"/>
+            </w:tcMar>
+          </w:tcPr>
+          <w:p>
+            <w:r>
+              <w:rPr>
+                <w:b w:val="false"/>
+                <w:bCs w:val="false"/>
+                <w:sz w:val="20"/>
+                <w:szCs w:val="20"/>
+              </w:rPr>
+              <w:t xml:space="preserve">Sender wechseln</w:t>
+            </w:r>
+          </w:p>
+        </w:tc>
+      </w:tr>
+      <w:tr>
+        <w:trPr>
+          <w:tblHeader w:val="false"/>
+        </w:trPr>
+        <w:tc>
+          <w:tcPr>
+            <w:tcW w:type="dxa" w:w="3000"/>
+            <w:tcMar>
+              <w:top w:type="dxa" w:w="60"/>
+              <w:left w:type="dxa" w:w="100"/>
+              <w:bottom w:type="dxa" w:w="60"/>
+              <w:right w:type="dxa" w:w="100"/>
+            </w:tcMar>
+          </w:tcPr>
+          <w:p>
+            <w:r>
+              <w:rPr>
+                <w:b/>
+                <w:bCs/>
+                <w:sz w:val="20"/>
+                <w:szCs w:val="20"/>
+              </w:rPr>
+              <w:t xml:space="preserve">M</w:t>
+            </w:r>
+          </w:p>
+        </w:tc>
+        <w:tc>
+          <w:tcPr>
+            <w:tcW w:type="dxa" w:w="6026"/>
+            <w:tcMar>
+              <w:top w:type="dxa" w:w="60"/>
+              <w:left w:type="dxa" w:w="100"/>
+              <w:bottom w:type="dxa" w:w="60"/>
+              <w:right w:type="dxa" w:w="100"/>
+            </w:tcMar>
+          </w:tcPr>
+          <w:p>
+            <w:r>
+              <w:rPr>
+                <w:b w:val="false"/>
+                <w:bCs w:val="false"/>
+                <w:sz w:val="20"/>
+                <w:szCs w:val="20"/>
+              </w:rPr>
+              <w:t xml:space="preserve">Ton aus / an</w:t>
+            </w:r>
+          </w:p>
+        </w:tc>
+      </w:tr>
+      <w:tr>
+        <w:trPr>
+          <w:tblHeader w:val="false"/>
+        </w:trPr>
+        <w:tc>
+          <w:tcPr>
+            <w:tcW w:type="dxa" w:w="3000"/>
+            <w:shd w:fill="EEF5FA" w:color="auto" w:val="clear"/>
+            <w:tcMar>
+              <w:top w:type="dxa" w:w="60"/>
+              <w:left w:type="dxa" w:w="100"/>
+              <w:bottom w:type="dxa" w:w="60"/>
+              <w:right w:type="dxa" w:w="100"/>
+            </w:tcMar>
+          </w:tcPr>
+          <w:p>
+            <w:r>
+              <w:rPr>
+                <w:b/>
+                <w:bCs/>
+                <w:sz w:val="20"/>
+                <w:szCs w:val="20"/>
+              </w:rPr>
+              <w:t xml:space="preserve">F, F11, Doppelklick</w:t>
+            </w:r>
+          </w:p>
+        </w:tc>
+        <w:tc>
+          <w:tcPr>
+            <w:tcW w:type="dxa" w:w="6026"/>
+            <w:shd w:fill="EEF5FA" w:color="auto" w:val="clear"/>
+            <w:tcMar>
+              <w:top w:type="dxa" w:w="60"/>
+              <w:left w:type="dxa" w:w="100"/>
+              <w:bottom w:type="dxa" w:w="60"/>
+              <w:right w:type="dxa" w:w="100"/>
+            </w:tcMar>
+          </w:tcPr>
+          <w:p>
+            <w:r>
+              <w:rPr>
+                <w:b w:val="false"/>
+                <w:bCs w:val="false"/>
+                <w:sz w:val="20"/>
+                <w:szCs w:val="20"/>
+              </w:rPr>
+              <w:t xml:space="preserve">Vollbild an / aus</w:t>
+            </w:r>
+          </w:p>
+        </w:tc>
+      </w:tr>
+      <w:tr>
+        <w:trPr>
+          <w:tblHeader w:val="false"/>
+        </w:trPr>
+        <w:tc>
+          <w:tcPr>
+            <w:tcW w:type="dxa" w:w="3000"/>
+            <w:tcMar>
+              <w:top w:type="dxa" w:w="60"/>
+              <w:left w:type="dxa" w:w="100"/>
+              <w:bottom w:type="dxa" w:w="60"/>
+              <w:right w:type="dxa" w:w="100"/>
+            </w:tcMar>
+          </w:tcPr>
+          <w:p>
+            <w:r>
+              <w:rPr>
+                <w:b/>
+                <w:bCs/>
+                <w:sz w:val="20"/>
+                <w:szCs w:val="20"/>
+              </w:rPr>
+              <w:t xml:space="preserve">L</w:t>
+            </w:r>
+          </w:p>
+        </w:tc>
+        <w:tc>
+          <w:tcPr>
+            <w:tcW w:type="dxa" w:w="6026"/>
+            <w:tcMar>
+              <w:top w:type="dxa" w:w="60"/>
+              <w:left w:type="dxa" w:w="100"/>
+              <w:bottom w:type="dxa" w:w="60"/>
+              <w:right w:type="dxa" w:w="100"/>
+            </w:tcMar>
+          </w:tcPr>
+          <w:p>
+            <w:r>
+              <w:rPr>
+                <w:b w:val="false"/>
+                <w:bCs w:val="false"/>
+                <w:sz w:val="20"/>
+                <w:szCs w:val="20"/>
+              </w:rPr>
+              <w:t xml:space="preserve">Senderliste (Live TV)</w:t>
+            </w:r>
+          </w:p>
+        </w:tc>
+      </w:tr>
+      <w:tr>
+        <w:trPr>
+          <w:tblHeader w:val="false"/>
+        </w:trPr>
+        <w:tc>
+          <w:tcPr>
+            <w:tcW w:type="dxa" w:w="3000"/>
+            <w:shd w:fill="EEF5FA" w:color="auto" w:val="clear"/>
+            <w:tcMar>
+              <w:top w:type="dxa" w:w="60"/>
+              <w:left w:type="dxa" w:w="100"/>
+              <w:bottom w:type="dxa" w:w="60"/>
+              <w:right w:type="dxa" w:w="100"/>
+            </w:tcMar>
+          </w:tcPr>
+          <w:p>
+            <w:r>
+              <w:rPr>
+                <w:b/>
+                <w:bCs/>
+                <w:sz w:val="20"/>
+                <w:szCs w:val="20"/>
+              </w:rPr>
+              <w:t xml:space="preserve">N</w:t>
+            </w:r>
+          </w:p>
+        </w:tc>
+        <w:tc>
+          <w:tcPr>
+            <w:tcW w:type="dxa" w:w="6026"/>
+            <w:shd w:fill="EEF5FA" w:color="auto" w:val="clear"/>
+            <w:tcMar>
+              <w:top w:type="dxa" w:w="60"/>
+              <w:left w:type="dxa" w:w="100"/>
+              <w:bottom w:type="dxa" w:w="60"/>
+              <w:right w:type="dxa" w:w="100"/>
+            </w:tcMar>
+          </w:tcPr>
+          <w:p>
+            <w:r>
+              <w:rPr>
+                <w:b w:val="false"/>
+                <w:bCs w:val="false"/>
+                <w:sz w:val="20"/>
+                <w:szCs w:val="20"/>
+              </w:rPr>
+              <w:t xml:space="preserve">Nächste Folge</w:t>
+            </w:r>
+          </w:p>
+        </w:tc>
+      </w:tr>
+      <w:tr>
+        <w:trPr>
+          <w:tblHeader w:val="false"/>
+        </w:trPr>
+        <w:tc>
+          <w:tcPr>
+            <w:tcW w:type="dxa" w:w="3000"/>
+            <w:tcMar>
+              <w:top w:type="dxa" w:w="60"/>
+              <w:left w:type="dxa" w:w="100"/>
+              <w:bottom w:type="dxa" w:w="60"/>
+              <w:right w:type="dxa" w:w="100"/>
+            </w:tcMar>
+          </w:tcPr>
+          <w:p>
+            <w:r>
+              <w:rPr>
+                <w:b/>
+                <w:bCs/>
+                <w:sz w:val="20"/>
+                <w:szCs w:val="20"/>
+              </w:rPr>
+              <w:t xml:space="preserve">Esc</w:t>
+            </w:r>
+          </w:p>
+        </w:tc>
+        <w:tc>
+          <w:tcPr>
+            <w:tcW w:type="dxa" w:w="6026"/>
+            <w:tcMar>
+              <w:top w:type="dxa" w:w="60"/>
+              <w:left w:type="dxa" w:w="100"/>
+              <w:bottom w:type="dxa" w:w="60"/>
+              <w:right w:type="dxa" w:w="100"/>
+            </w:tcMar>
+          </w:tcPr>
+          <w:p>
+            <w:r>
+              <w:rPr>
+                <w:b w:val="false"/>
+                <w:bCs w:val="false"/>
+                <w:sz w:val="20"/>
+                <w:szCs w:val="20"/>
+              </w:rPr>
+              <w:t xml:space="preserve">Vollbild verlassen bzw. Player schließen</w:t>
+            </w:r>
+          </w:p>
+        </w:tc>
+      </w:tr>
+    </w:tbl>
+    <w:p>
+      <w:pPr>
+        <w:pBdr>
+          <w:left w:val="single" w:color="1E88B8" w:sz="18" w:space="8"/>
+        </w:pBdr>
+        <w:spacing w:after="160" w:before="80"/>
+        <w:ind w:left="240"/>
+      </w:pPr>
+      <w:r>
+        <w:rPr>
+          <w:b/>
+          <w:bCs/>
+          <w:color w:val="1E88B8"/>
+        </w:rPr>
+        <w:t xml:space="preserve">Tipp: </w:t>
+      </w:r>
+      <w:r>
+        <w:t xml:space="preserve">Dein Passwort wird mit dem Windows-Datenschutz (DPAPI) verschlüsselt gespeichert – nur dein Windows-Konto auf diesem PC kann es lesen. Alle Daten liegen unter %APPDATA%\Portiva.</w:t>
+      </w:r>
+    </w:p>
+    <w:p>
+      <w:pPr>
+        <w:spacing w:after="120"/>
+      </w:pPr>
+      <w:r>
+        <w:t xml:space="preserve">Noch nicht in der Windows-Version (folgt): Programmführer, Multi-View, Aufnahmen, Kindersicherung und Backup-Übernahme vom Handy.</w:t>
+      </w:r>
+    </w:p>
     <w:sectPr>
       <w:footerReference w:type="default" r:id="rId7"/>
       <w:pgSz w:w="11906" w:h="16838" w:orient="portrait"/>
@@ -3909,6 +4688,18 @@
       </w:pPr>
     </w:lvl>
   </w:abstractNum>
+  <w:abstractNum w:abstractNumId="7" w15:restartNumberingAfterBreak="0">
+    <w:multiLevelType w:val="hybridMultilevel"/>
+    <w:lvl w:ilvl="0" w15:tentative="1">
+      <w:start w:val="1"/>
+      <w:numFmt w:val="decimal"/>
+      <w:lvlText w:val="%1."/>
+      <w:lvlJc w:val="left"/>
+      <w:pPr>
+        <w:ind w:left="540" w:hanging="270"/>
+      </w:pPr>
+    </w:lvl>
+  </w:abstractNum>
   <w:num w:numId="1">
     <w:abstractNumId w:val="1"/>
     <w:lvlOverride w:ilvl="0">
@@ -3935,6 +4726,12 @@
   </w:num>
   <w:num w:numId="5">
     <w:abstractNumId w:val="2"/>
+    <w:lvlOverride w:ilvl="0">
+      <w:startOverride w:val="1"/>
+    </w:lvlOverride>
+  </w:num>
+  <w:num w:numId="6">
+    <w:abstractNumId w:val="6"/>
     <w:lvlOverride w:ilvl="0">
       <w:startOverride w:val="1"/>
     </w:lvlOverride>

</xml_diff>

<commit_message>
Windows: echtes Vollbild, Kategorien wie Android, Startseiten-Kacheln, Benutzer-Maennchen; AKTIV einzeilig
- Vollbild als randloses Fenster ueber den ganzen Bildschirm (ohne Titel-/Taskleiste),
  Stream laeuft beim Umschalten weiter; Taste Z = Zoomen (Kino-Balken weg)
- Kategorie-Spalte 1:1 wie Android: Sprache (DE/EN …), Favoriten/Zuletzt gesehen/Alle,
  Anheften/Ausblenden per Rechtsklick, Suche Nur hier/Ueberall, Filter & Sortierung
- Kategorie-Regeln und Filter-Dialog werden jetzt von Android und Windows geteilt
- Windows-Startseite: Kachel-Raster wie Android, Zuletzt gesehen Filme/Serien, Benutzer-Schnellwechsel
- Android + Windows: Abzeichen AKTIV bleibt in einer Zeile
- CLAUDE.md: Aenderungen immer in allen Varianten; Anleitung aktualisiert

Co-Authored-By: Claude Opus 5.5 <noreply@anthropic.com>
Claude-Session: https://claude.ai/code/session_01CaJqjA6T7wr6qkboQBX5Ep
</commit_message>
<xml_diff>
--- a/docs/PowerIPTV-Anleitung.docx
+++ b/docs/PowerIPTV-Anleitung.docx
@@ -49,7 +49,7 @@
         <w:rPr>
           <w:color w:val="666666"/>
         </w:rPr>
-        <w:t xml:space="preserve">Stand: Version 1.1.72 · Oktober 2026</w:t>
+        <w:t xml:space="preserve">Stand: Version 1.1.74 · Oktober 2026</w:t>
       </w:r>
     </w:p>
     <w:p>
@@ -3831,30 +3831,70 @@
           <w:b/>
           <w:bCs/>
         </w:rPr>
+        <w:t xml:space="preserve">Startseite: </w:t>
+      </w:r>
+      <w:r>
+        <w:t xml:space="preserve">wie am Handy: große Kacheln, darunter die kleinen Kacheln (Suche, Playlist aktualisieren, Favoriten, Benutzer wechseln, Einstellungen …), Weiterschauen und „Zuletzt gesehen“ für Live TV, Filme und Serien. Oben rechts das Benutzer-Männchen zum schnellen Wechseln. Mit „bald“ markierte Kacheln folgen mit den nächsten Updates.</w:t>
+      </w:r>
+    </w:p>
+    <w:p>
+      <w:pPr>
+        <w:pStyle w:val="ListParagraph"/>
+        <w:numPr>
+          <w:ilvl w:val="0"/>
+          <w:numId w:val="5"/>
+        </w:numPr>
+        <w:spacing w:after="60"/>
+      </w:pPr>
+      <w:r>
+        <w:rPr>
+          <w:b/>
+          <w:bCs/>
+        </w:rPr>
+        <w:t xml:space="preserve">Kategorien: </w:t>
+      </w:r>
+      <w:r>
+        <w:t xml:space="preserve">genau wie in der Android-App – Sprache (Globus, z.B. DE/EN), Kategorie-Filter (Trichter), Favoriten, Zuletzt gesehen, Alle. Rechtsklick auf eine Kategorie: oben anheften oder ausblenden. Rechts daneben: Suche („Nur hier“/„Überall“), Filter &amp; Sortierung (Bewertung, Jahr, Genre).</w:t>
+      </w:r>
+    </w:p>
+    <w:p>
+      <w:pPr>
+        <w:pStyle w:val="ListParagraph"/>
+        <w:numPr>
+          <w:ilvl w:val="0"/>
+          <w:numId w:val="5"/>
+        </w:numPr>
+        <w:spacing w:after="60"/>
+      </w:pPr>
+      <w:r>
+        <w:rPr>
+          <w:b/>
+          <w:bCs/>
+        </w:rPr>
+        <w:t xml:space="preserve">Vollbild: </w:t>
+      </w:r>
+      <w:r>
+        <w:t xml:space="preserve">F, F11 oder Doppelklick – deckt den ganzen Bildschirm ab (ohne Titel- und Taskleiste). Esc beendet das Vollbild. Kino-Filme haben oben und unten schwarze Balken; Taste Z (Zoomen) füllt den Bildschirm.</w:t>
+      </w:r>
+    </w:p>
+    <w:p>
+      <w:pPr>
+        <w:pStyle w:val="ListParagraph"/>
+        <w:numPr>
+          <w:ilvl w:val="0"/>
+          <w:numId w:val="5"/>
+        </w:numPr>
+        <w:spacing w:after="60"/>
+      </w:pPr>
+      <w:r>
+        <w:rPr>
+          <w:b/>
+          <w:bCs/>
+        </w:rPr>
         <w:t xml:space="preserve">Rechtsklick </w:t>
       </w:r>
       <w:r>
         <w:t xml:space="preserve">auf Sender, Film, Serie oder Folge: Favorit, gesehen markieren, aus „Weiterschauen“ entfernen.</w:t>
-      </w:r>
-    </w:p>
-    <w:p>
-      <w:pPr>
-        <w:pStyle w:val="ListParagraph"/>
-        <w:numPr>
-          <w:ilvl w:val="0"/>
-          <w:numId w:val="5"/>
-        </w:numPr>
-        <w:spacing w:after="60"/>
-      </w:pPr>
-      <w:r>
-        <w:rPr>
-          <w:b/>
-          <w:bCs/>
-        </w:rPr>
-        <w:t xml:space="preserve">Startseite: </w:t>
-      </w:r>
-      <w:r>
-        <w:t xml:space="preserve">Kacheln, Weiterschauen, zuletzt gesehene Sender, Favoriten; oben Ablaufdatum und Streams des Zugangs.</w:t>
       </w:r>
     </w:p>
     <w:p>
@@ -4218,7 +4258,7 @@
                 <w:sz w:val="20"/>
                 <w:szCs w:val="20"/>
               </w:rPr>
-              <w:t xml:space="preserve">F, F11, Doppelklick</w:t>
+              <w:t xml:space="preserve">Z</w:t>
             </w:r>
           </w:p>
         </w:tc>
@@ -4241,7 +4281,7 @@
                 <w:sz w:val="20"/>
                 <w:szCs w:val="20"/>
               </w:rPr>
-              <w:t xml:space="preserve">Vollbild an / aus</w:t>
+              <w:t xml:space="preserve">Zoomen an / aus (schwarze Balken weg)</w:t>
             </w:r>
           </w:p>
         </w:tc>
@@ -4268,7 +4308,7 @@
                 <w:sz w:val="20"/>
                 <w:szCs w:val="20"/>
               </w:rPr>
-              <w:t xml:space="preserve">L</w:t>
+              <w:t xml:space="preserve">F, F11, Doppelklick</w:t>
             </w:r>
           </w:p>
         </w:tc>
@@ -4290,7 +4330,7 @@
                 <w:sz w:val="20"/>
                 <w:szCs w:val="20"/>
               </w:rPr>
-              <w:t xml:space="preserve">Senderliste (Live TV)</w:t>
+              <w:t xml:space="preserve">Vollbild an / aus</w:t>
             </w:r>
           </w:p>
         </w:tc>
@@ -4318,7 +4358,7 @@
                 <w:sz w:val="20"/>
                 <w:szCs w:val="20"/>
               </w:rPr>
-              <w:t xml:space="preserve">N</w:t>
+              <w:t xml:space="preserve">L</w:t>
             </w:r>
           </w:p>
         </w:tc>
@@ -4341,7 +4381,7 @@
                 <w:sz w:val="20"/>
                 <w:szCs w:val="20"/>
               </w:rPr>
-              <w:t xml:space="preserve">Nächste Folge</w:t>
+              <w:t xml:space="preserve">Senderliste (Live TV)</w:t>
             </w:r>
           </w:p>
         </w:tc>
@@ -4368,6 +4408,56 @@
                 <w:sz w:val="20"/>
                 <w:szCs w:val="20"/>
               </w:rPr>
+              <w:t xml:space="preserve">N</w:t>
+            </w:r>
+          </w:p>
+        </w:tc>
+        <w:tc>
+          <w:tcPr>
+            <w:tcW w:type="dxa" w:w="6026"/>
+            <w:tcMar>
+              <w:top w:type="dxa" w:w="60"/>
+              <w:left w:type="dxa" w:w="100"/>
+              <w:bottom w:type="dxa" w:w="60"/>
+              <w:right w:type="dxa" w:w="100"/>
+            </w:tcMar>
+          </w:tcPr>
+          <w:p>
+            <w:r>
+              <w:rPr>
+                <w:b w:val="false"/>
+                <w:bCs w:val="false"/>
+                <w:sz w:val="20"/>
+                <w:szCs w:val="20"/>
+              </w:rPr>
+              <w:t xml:space="preserve">Nächste Folge</w:t>
+            </w:r>
+          </w:p>
+        </w:tc>
+      </w:tr>
+      <w:tr>
+        <w:trPr>
+          <w:tblHeader w:val="false"/>
+        </w:trPr>
+        <w:tc>
+          <w:tcPr>
+            <w:tcW w:type="dxa" w:w="3000"/>
+            <w:shd w:fill="EEF5FA" w:color="auto" w:val="clear"/>
+            <w:tcMar>
+              <w:top w:type="dxa" w:w="60"/>
+              <w:left w:type="dxa" w:w="100"/>
+              <w:bottom w:type="dxa" w:w="60"/>
+              <w:right w:type="dxa" w:w="100"/>
+            </w:tcMar>
+          </w:tcPr>
+          <w:p>
+            <w:r>
+              <w:rPr>
+                <w:b/>
+                <w:bCs/>
+                <w:sz w:val="20"/>
+                <w:szCs w:val="20"/>
+              </w:rPr>
               <w:t xml:space="preserve">Esc</w:t>
             </w:r>
           </w:p>
@@ -4375,6 +4465,7 @@
         <w:tc>
           <w:tcPr>
             <w:tcW w:type="dxa" w:w="6026"/>
+            <w:shd w:fill="EEF5FA" w:color="auto" w:val="clear"/>
             <w:tcMar>
               <w:top w:type="dxa" w:w="60"/>
               <w:left w:type="dxa" w:w="100"/>

</xml_diff>

<commit_message>
Windows: TV-Guide (EPG) mit Catch-up und Erinnerungen, Jetzt/Danach im Player
- EPG-Lader (XMLTV) ist jetzt plattformunabhaengig und wird von Android und Windows geteilt
- Windows: Zeitraster wie Android (Sprache, Favoriten, Gruppen), Live ansehen,
  Timeshift/Catch-up, Erinnerungen 5 Min. vorher (Windows-Benachrichtigung + Hinweis)
- Senderliste und Player zeigen Jetzt/Danach
- Anleitung aktualisiert

Co-Authored-By: Claude Opus 5.5 <noreply@anthropic.com>
Claude-Session: https://claude.ai/code/session_01CaJqjA6T7wr6qkboQBX5Ep
</commit_message>
<xml_diff>
--- a/docs/PowerIPTV-Anleitung.docx
+++ b/docs/PowerIPTV-Anleitung.docx
@@ -49,7 +49,7 @@
         <w:rPr>
           <w:color w:val="666666"/>
         </w:rPr>
-        <w:t xml:space="preserve">Stand: Version 1.1.74 · Oktober 2026</w:t>
+        <w:t xml:space="preserve">Stand: Version 1.1.75 · Oktober 2026</w:t>
       </w:r>
     </w:p>
     <w:p>
@@ -4509,10 +4509,30 @@
     </w:p>
     <w:p>
       <w:pPr>
+        <w:pStyle w:val="ListParagraph"/>
+        <w:numPr>
+          <w:ilvl w:val="0"/>
+          <w:numId w:val="5"/>
+        </w:numPr>
+        <w:spacing w:after="60"/>
+      </w:pPr>
+      <w:r>
+        <w:rPr>
+          <w:b/>
+          <w:bCs/>
+        </w:rPr>
+        <w:t xml:space="preserve">TV-Guide (EPG): </w:t>
+      </w:r>
+      <w:r>
+        <w:t xml:space="preserve">linke Leiste „TV-Guide“ oder Kachel – Zeitraster wie am Handy (Sprache, Favoriten, Gruppen). Sendung anklicken: Live ansehen, von Beginn an/Catch-up (bei Archiv-Sendern), 🔔 Erinnern. Die Erinnerung erscheint 5 Minuten vorher als Windows-Benachrichtigung und als Hinweis mit „Jetzt ansehen“ (Portiva muss dafür geöffnet sein). In der Senderliste und im Player steht, was gerade läuft und was danach kommt.</w:t>
+      </w:r>
+    </w:p>
+    <w:p>
+      <w:pPr>
         <w:spacing w:after="120"/>
       </w:pPr>
       <w:r>
-        <w:t xml:space="preserve">Noch nicht in der Windows-Version (folgt): Programmführer, Multi-View, Aufnahmen, Kindersicherung und Backup-Übernahme vom Handy.</w:t>
+        <w:t xml:space="preserve">Noch nicht in der Windows-Version (folgt): Multi-View, Aufnahmen, Downloads, KI-Empfehlungen, VPN, Kindersicherung und Backup-Übernahme vom Handy.</w:t>
       </w:r>
     </w:p>
     <w:sectPr>

</xml_diff>

<commit_message>
Update-Funktion ueber GitHub (Android + Windows), Playlist alle 24 h auch bei laufender App
- Geteilter UpdateChecker: prueft die GitHub-Releases (oeffentlich, kein Konto noetig)
- Android: Kachel Update, Hinweis auf der Startseite, APK laden und Installer oeffnen
  (FileProvider, Berechtigung Apps installieren), automatische Pruefung alle 24 h abschaltbar
- Windows: gleiche Kachel/Seite, Setup laden, starten und Portiva fuer die Installation beenden
- Playlist + TV-Guide werden stuendlich auf 24-h-Alter geprueft und automatisch aktualisiert
- Android-Einstellungen zeigen die echte Versionsnummer
- Anleitung aktualisiert

Co-Authored-By: Claude Opus 5.5 <noreply@anthropic.com>
Claude-Session: https://claude.ai/code/session_01CaJqjA6T7wr6qkboQBX5Ep
</commit_message>
<xml_diff>
--- a/docs/PowerIPTV-Anleitung.docx
+++ b/docs/PowerIPTV-Anleitung.docx
@@ -49,7 +49,7 @@
         <w:rPr>
           <w:color w:val="666666"/>
         </w:rPr>
-        <w:t xml:space="preserve">Stand: Version 1.1.76 · Oktober 2026</w:t>
+        <w:t xml:space="preserve">Stand: Version 1.1.77 · Oktober 2026</w:t>
       </w:r>
     </w:p>
     <w:p>
@@ -656,6 +656,91 @@
         <w:spacing w:after="120" w:before="240"/>
       </w:pPr>
       <w:r>
+        <w:t xml:space="preserve">Updates direkt in der App</w:t>
+      </w:r>
+    </w:p>
+    <w:p>
+      <w:pPr>
+        <w:spacing w:after="120"/>
+      </w:pPr>
+      <w:r>
+        <w:t xml:space="preserve">Portiva prüft alle 24 Stunden selbst bei GitHub, ob es eine neue Version gibt (ohne Play Store, ohne GitHub-Konto). Gibt es eine, erscheint ein Hinweis auf der Startseite und die Kachel „Update verfügbar!“.</w:t>
+      </w:r>
+    </w:p>
+    <w:p>
+      <w:pPr>
+        <w:pStyle w:val="ListParagraph"/>
+        <w:numPr>
+          <w:ilvl w:val="0"/>
+          <w:numId w:val="4"/>
+        </w:numPr>
+        <w:spacing w:after="60"/>
+      </w:pPr>
+      <w:r>
+        <w:t xml:space="preserve">Kachel „Update“ (ganz unten bei den kleinen Kacheln) öffnen.</w:t>
+      </w:r>
+    </w:p>
+    <w:p>
+      <w:pPr>
+        <w:pStyle w:val="ListParagraph"/>
+        <w:numPr>
+          <w:ilvl w:val="0"/>
+          <w:numId w:val="4"/>
+        </w:numPr>
+        <w:spacing w:after="60"/>
+      </w:pPr>
+      <w:r>
+        <w:t xml:space="preserve">„Jetzt herunterladen &amp; installieren“ antippen.</w:t>
+      </w:r>
+    </w:p>
+    <w:p>
+      <w:pPr>
+        <w:pStyle w:val="ListParagraph"/>
+        <w:numPr>
+          <w:ilvl w:val="0"/>
+          <w:numId w:val="4"/>
+        </w:numPr>
+        <w:spacing w:after="60"/>
+      </w:pPr>
+      <w:r>
+        <w:t xml:space="preserve">Beim ersten Mal fragt Android, ob Portiva Apps installieren darf → erlauben, zurück und erneut antippen.</w:t>
+      </w:r>
+    </w:p>
+    <w:p>
+      <w:pPr>
+        <w:pStyle w:val="ListParagraph"/>
+        <w:numPr>
+          <w:ilvl w:val="0"/>
+          <w:numId w:val="4"/>
+        </w:numPr>
+        <w:spacing w:after="60"/>
+      </w:pPr>
+      <w:r>
+        <w:t xml:space="preserve">Den Android-Installer mit „Aktualisieren“ bestätigen – Zugänge, Favoriten und Einstellungen bleiben erhalten.</w:t>
+      </w:r>
+    </w:p>
+    <w:p>
+      <w:pPr>
+        <w:spacing w:after="120"/>
+      </w:pPr>
+      <w:r>
+        <w:t xml:space="preserve">Unter „Update“ lässt sich die automatische Prüfung abschalten und jederzeit manuell „Nach Updates suchen“. Unter Windows lädt Portiva das neue Setup, schließt sich kurz und der Installer aktualisiert die App.</w:t>
+      </w:r>
+    </w:p>
+    <w:p>
+      <w:pPr>
+        <w:spacing w:after="120"/>
+      </w:pPr>
+      <w:r>
+        <w:t xml:space="preserve">Playlist und TV-Guide werden ebenfalls automatisch alle 24 Stunden aktualisiert – auch wenn die App länger geöffnet bleibt. Sofort geht es über die zwei Pfeile oben.</w:t>
+      </w:r>
+    </w:p>
+    <w:p>
+      <w:pPr>
+        <w:pStyle w:val="Heading2"/>
+        <w:spacing w:after="120" w:before="240"/>
+      </w:pPr>
+      <w:r>
         <w:t xml:space="preserve">Windows-PC</w:t>
       </w:r>
     </w:p>
@@ -681,7 +766,7 @@
         <w:pStyle w:val="ListParagraph"/>
         <w:numPr>
           <w:ilvl w:val="0"/>
-          <w:numId w:val="4"/>
+          <w:numId w:val="5"/>
         </w:numPr>
         <w:spacing w:after="60"/>
       </w:pPr>
@@ -694,7 +779,7 @@
         <w:pStyle w:val="ListParagraph"/>
         <w:numPr>
           <w:ilvl w:val="0"/>
-          <w:numId w:val="4"/>
+          <w:numId w:val="5"/>
         </w:numPr>
         <w:spacing w:after="60"/>
       </w:pPr>
@@ -737,7 +822,7 @@
         <w:pStyle w:val="ListParagraph"/>
         <w:numPr>
           <w:ilvl w:val="0"/>
-          <w:numId w:val="4"/>
+          <w:numId w:val="5"/>
         </w:numPr>
         <w:spacing w:after="60"/>
       </w:pPr>
@@ -767,7 +852,7 @@
         <w:pStyle w:val="ListParagraph"/>
         <w:numPr>
           <w:ilvl w:val="0"/>
-          <w:numId w:val="5"/>
+          <w:numId w:val="6"/>
         </w:numPr>
         <w:spacing w:after="60"/>
       </w:pPr>
@@ -787,7 +872,7 @@
         <w:pStyle w:val="ListParagraph"/>
         <w:numPr>
           <w:ilvl w:val="0"/>
-          <w:numId w:val="5"/>
+          <w:numId w:val="6"/>
         </w:numPr>
         <w:spacing w:after="60"/>
       </w:pPr>
@@ -807,7 +892,7 @@
         <w:pStyle w:val="ListParagraph"/>
         <w:numPr>
           <w:ilvl w:val="0"/>
-          <w:numId w:val="5"/>
+          <w:numId w:val="6"/>
         </w:numPr>
         <w:spacing w:after="60"/>
       </w:pPr>
@@ -827,7 +912,7 @@
         <w:pStyle w:val="ListParagraph"/>
         <w:numPr>
           <w:ilvl w:val="0"/>
-          <w:numId w:val="5"/>
+          <w:numId w:val="6"/>
         </w:numPr>
         <w:spacing w:after="60"/>
       </w:pPr>
@@ -847,7 +932,7 @@
         <w:pStyle w:val="ListParagraph"/>
         <w:numPr>
           <w:ilvl w:val="0"/>
-          <w:numId w:val="5"/>
+          <w:numId w:val="6"/>
         </w:numPr>
         <w:spacing w:after="60"/>
       </w:pPr>
@@ -867,7 +952,7 @@
         <w:pStyle w:val="ListParagraph"/>
         <w:numPr>
           <w:ilvl w:val="0"/>
-          <w:numId w:val="5"/>
+          <w:numId w:val="6"/>
         </w:numPr>
         <w:spacing w:after="60"/>
       </w:pPr>
@@ -887,7 +972,7 @@
         <w:pStyle w:val="ListParagraph"/>
         <w:numPr>
           <w:ilvl w:val="0"/>
-          <w:numId w:val="5"/>
+          <w:numId w:val="6"/>
         </w:numPr>
         <w:spacing w:after="60"/>
       </w:pPr>
@@ -916,7 +1001,7 @@
         <w:pStyle w:val="ListParagraph"/>
         <w:numPr>
           <w:ilvl w:val="0"/>
-          <w:numId w:val="5"/>
+          <w:numId w:val="6"/>
         </w:numPr>
         <w:spacing w:after="60"/>
       </w:pPr>
@@ -936,7 +1021,7 @@
         <w:pStyle w:val="ListParagraph"/>
         <w:numPr>
           <w:ilvl w:val="0"/>
-          <w:numId w:val="5"/>
+          <w:numId w:val="6"/>
         </w:numPr>
         <w:spacing w:after="60"/>
       </w:pPr>
@@ -956,7 +1041,7 @@
         <w:pStyle w:val="ListParagraph"/>
         <w:numPr>
           <w:ilvl w:val="0"/>
-          <w:numId w:val="5"/>
+          <w:numId w:val="6"/>
         </w:numPr>
         <w:spacing w:after="60"/>
       </w:pPr>
@@ -976,7 +1061,7 @@
         <w:pStyle w:val="ListParagraph"/>
         <w:numPr>
           <w:ilvl w:val="0"/>
-          <w:numId w:val="5"/>
+          <w:numId w:val="6"/>
         </w:numPr>
         <w:spacing w:after="60"/>
       </w:pPr>
@@ -996,7 +1081,7 @@
         <w:pStyle w:val="ListParagraph"/>
         <w:numPr>
           <w:ilvl w:val="0"/>
-          <w:numId w:val="5"/>
+          <w:numId w:val="6"/>
         </w:numPr>
         <w:spacing w:after="60"/>
       </w:pPr>
@@ -2172,7 +2257,7 @@
         <w:pStyle w:val="ListParagraph"/>
         <w:numPr>
           <w:ilvl w:val="0"/>
-          <w:numId w:val="5"/>
+          <w:numId w:val="6"/>
         </w:numPr>
         <w:spacing w:after="60"/>
       </w:pPr>
@@ -2192,7 +2277,7 @@
         <w:pStyle w:val="ListParagraph"/>
         <w:numPr>
           <w:ilvl w:val="0"/>
-          <w:numId w:val="5"/>
+          <w:numId w:val="6"/>
         </w:numPr>
         <w:spacing w:after="60"/>
       </w:pPr>
@@ -2212,7 +2297,7 @@
         <w:pStyle w:val="ListParagraph"/>
         <w:numPr>
           <w:ilvl w:val="0"/>
-          <w:numId w:val="5"/>
+          <w:numId w:val="6"/>
         </w:numPr>
         <w:spacing w:after="60"/>
       </w:pPr>
@@ -2232,7 +2317,7 @@
         <w:pStyle w:val="ListParagraph"/>
         <w:numPr>
           <w:ilvl w:val="0"/>
-          <w:numId w:val="5"/>
+          <w:numId w:val="6"/>
         </w:numPr>
         <w:spacing w:after="60"/>
       </w:pPr>
@@ -2252,7 +2337,7 @@
         <w:pStyle w:val="ListParagraph"/>
         <w:numPr>
           <w:ilvl w:val="0"/>
-          <w:numId w:val="5"/>
+          <w:numId w:val="6"/>
         </w:numPr>
         <w:spacing w:after="60"/>
       </w:pPr>
@@ -2281,7 +2366,7 @@
         <w:pStyle w:val="ListParagraph"/>
         <w:numPr>
           <w:ilvl w:val="0"/>
-          <w:numId w:val="5"/>
+          <w:numId w:val="6"/>
         </w:numPr>
         <w:spacing w:after="60"/>
       </w:pPr>
@@ -2301,7 +2386,7 @@
         <w:pStyle w:val="ListParagraph"/>
         <w:numPr>
           <w:ilvl w:val="0"/>
-          <w:numId w:val="5"/>
+          <w:numId w:val="6"/>
         </w:numPr>
         <w:spacing w:after="60"/>
       </w:pPr>
@@ -2321,7 +2406,7 @@
         <w:pStyle w:val="ListParagraph"/>
         <w:numPr>
           <w:ilvl w:val="0"/>
-          <w:numId w:val="5"/>
+          <w:numId w:val="6"/>
         </w:numPr>
         <w:spacing w:after="60"/>
       </w:pPr>
@@ -2341,7 +2426,7 @@
         <w:pStyle w:val="ListParagraph"/>
         <w:numPr>
           <w:ilvl w:val="0"/>
-          <w:numId w:val="5"/>
+          <w:numId w:val="6"/>
         </w:numPr>
         <w:spacing w:after="60"/>
       </w:pPr>
@@ -2361,7 +2446,7 @@
         <w:pStyle w:val="ListParagraph"/>
         <w:numPr>
           <w:ilvl w:val="0"/>
-          <w:numId w:val="5"/>
+          <w:numId w:val="6"/>
         </w:numPr>
         <w:spacing w:after="60"/>
       </w:pPr>
@@ -2381,7 +2466,7 @@
         <w:pStyle w:val="ListParagraph"/>
         <w:numPr>
           <w:ilvl w:val="0"/>
-          <w:numId w:val="5"/>
+          <w:numId w:val="6"/>
         </w:numPr>
         <w:spacing w:after="60"/>
       </w:pPr>
@@ -2438,7 +2523,7 @@
         <w:pStyle w:val="ListParagraph"/>
         <w:numPr>
           <w:ilvl w:val="0"/>
-          <w:numId w:val="5"/>
+          <w:numId w:val="6"/>
         </w:numPr>
         <w:spacing w:after="60"/>
       </w:pPr>
@@ -2458,7 +2543,7 @@
         <w:pStyle w:val="ListParagraph"/>
         <w:numPr>
           <w:ilvl w:val="0"/>
-          <w:numId w:val="5"/>
+          <w:numId w:val="6"/>
         </w:numPr>
         <w:spacing w:after="60"/>
       </w:pPr>
@@ -2478,7 +2563,7 @@
         <w:pStyle w:val="ListParagraph"/>
         <w:numPr>
           <w:ilvl w:val="0"/>
-          <w:numId w:val="5"/>
+          <w:numId w:val="6"/>
         </w:numPr>
         <w:spacing w:after="60"/>
       </w:pPr>
@@ -2515,7 +2600,7 @@
         <w:pStyle w:val="ListParagraph"/>
         <w:numPr>
           <w:ilvl w:val="0"/>
-          <w:numId w:val="5"/>
+          <w:numId w:val="6"/>
         </w:numPr>
         <w:spacing w:after="60"/>
       </w:pPr>
@@ -2535,7 +2620,7 @@
         <w:pStyle w:val="ListParagraph"/>
         <w:numPr>
           <w:ilvl w:val="0"/>
-          <w:numId w:val="5"/>
+          <w:numId w:val="6"/>
         </w:numPr>
         <w:spacing w:after="60"/>
       </w:pPr>
@@ -2555,7 +2640,7 @@
         <w:pStyle w:val="ListParagraph"/>
         <w:numPr>
           <w:ilvl w:val="0"/>
-          <w:numId w:val="5"/>
+          <w:numId w:val="6"/>
         </w:numPr>
         <w:spacing w:after="60"/>
       </w:pPr>
@@ -2575,7 +2660,7 @@
         <w:pStyle w:val="ListParagraph"/>
         <w:numPr>
           <w:ilvl w:val="0"/>
-          <w:numId w:val="5"/>
+          <w:numId w:val="6"/>
         </w:numPr>
         <w:spacing w:after="60"/>
       </w:pPr>
@@ -2612,7 +2697,7 @@
         <w:pStyle w:val="ListParagraph"/>
         <w:numPr>
           <w:ilvl w:val="0"/>
-          <w:numId w:val="5"/>
+          <w:numId w:val="6"/>
         </w:numPr>
         <w:spacing w:after="60"/>
       </w:pPr>
@@ -2625,7 +2710,7 @@
         <w:pStyle w:val="ListParagraph"/>
         <w:numPr>
           <w:ilvl w:val="0"/>
-          <w:numId w:val="5"/>
+          <w:numId w:val="6"/>
         </w:numPr>
         <w:spacing w:after="60"/>
       </w:pPr>
@@ -2638,7 +2723,7 @@
         <w:pStyle w:val="ListParagraph"/>
         <w:numPr>
           <w:ilvl w:val="0"/>
-          <w:numId w:val="5"/>
+          <w:numId w:val="6"/>
         </w:numPr>
         <w:spacing w:after="60"/>
       </w:pPr>
@@ -2658,7 +2743,7 @@
         <w:pStyle w:val="ListParagraph"/>
         <w:numPr>
           <w:ilvl w:val="0"/>
-          <w:numId w:val="5"/>
+          <w:numId w:val="6"/>
         </w:numPr>
         <w:spacing w:after="60"/>
       </w:pPr>
@@ -2680,7 +2765,7 @@
         <w:pStyle w:val="ListParagraph"/>
         <w:numPr>
           <w:ilvl w:val="0"/>
-          <w:numId w:val="5"/>
+          <w:numId w:val="6"/>
         </w:numPr>
         <w:spacing w:after="60"/>
       </w:pPr>
@@ -2700,7 +2785,7 @@
         <w:pStyle w:val="ListParagraph"/>
         <w:numPr>
           <w:ilvl w:val="0"/>
-          <w:numId w:val="5"/>
+          <w:numId w:val="6"/>
         </w:numPr>
         <w:spacing w:after="60"/>
       </w:pPr>
@@ -2720,7 +2805,7 @@
         <w:pStyle w:val="ListParagraph"/>
         <w:numPr>
           <w:ilvl w:val="0"/>
-          <w:numId w:val="5"/>
+          <w:numId w:val="6"/>
         </w:numPr>
         <w:spacing w:after="60"/>
       </w:pPr>
@@ -2740,7 +2825,7 @@
         <w:pStyle w:val="ListParagraph"/>
         <w:numPr>
           <w:ilvl w:val="0"/>
-          <w:numId w:val="5"/>
+          <w:numId w:val="6"/>
         </w:numPr>
         <w:spacing w:after="60"/>
       </w:pPr>
@@ -2769,7 +2854,7 @@
         <w:pStyle w:val="ListParagraph"/>
         <w:numPr>
           <w:ilvl w:val="0"/>
-          <w:numId w:val="5"/>
+          <w:numId w:val="6"/>
         </w:numPr>
         <w:spacing w:after="60"/>
       </w:pPr>
@@ -2789,7 +2874,7 @@
         <w:pStyle w:val="ListParagraph"/>
         <w:numPr>
           <w:ilvl w:val="0"/>
-          <w:numId w:val="5"/>
+          <w:numId w:val="6"/>
         </w:numPr>
         <w:spacing w:after="60"/>
       </w:pPr>
@@ -2809,7 +2894,7 @@
         <w:pStyle w:val="ListParagraph"/>
         <w:numPr>
           <w:ilvl w:val="0"/>
-          <w:numId w:val="5"/>
+          <w:numId w:val="6"/>
         </w:numPr>
         <w:spacing w:after="60"/>
       </w:pPr>
@@ -2829,7 +2914,7 @@
         <w:pStyle w:val="ListParagraph"/>
         <w:numPr>
           <w:ilvl w:val="0"/>
-          <w:numId w:val="5"/>
+          <w:numId w:val="6"/>
         </w:numPr>
         <w:spacing w:after="60"/>
       </w:pPr>
@@ -3753,7 +3838,7 @@
         <w:pStyle w:val="ListParagraph"/>
         <w:numPr>
           <w:ilvl w:val="0"/>
-          <w:numId w:val="6"/>
+          <w:numId w:val="7"/>
         </w:numPr>
         <w:spacing w:after="60"/>
       </w:pPr>
@@ -3766,7 +3851,7 @@
         <w:pStyle w:val="ListParagraph"/>
         <w:numPr>
           <w:ilvl w:val="0"/>
-          <w:numId w:val="6"/>
+          <w:numId w:val="7"/>
         </w:numPr>
         <w:spacing w:after="60"/>
       </w:pPr>
@@ -3779,7 +3864,7 @@
         <w:pStyle w:val="ListParagraph"/>
         <w:numPr>
           <w:ilvl w:val="0"/>
-          <w:numId w:val="6"/>
+          <w:numId w:val="7"/>
         </w:numPr>
         <w:spacing w:after="60"/>
       </w:pPr>
@@ -3792,7 +3877,7 @@
         <w:pStyle w:val="ListParagraph"/>
         <w:numPr>
           <w:ilvl w:val="0"/>
-          <w:numId w:val="6"/>
+          <w:numId w:val="7"/>
         </w:numPr>
         <w:spacing w:after="60"/>
       </w:pPr>
@@ -3822,7 +3907,7 @@
         <w:pStyle w:val="ListParagraph"/>
         <w:numPr>
           <w:ilvl w:val="0"/>
-          <w:numId w:val="5"/>
+          <w:numId w:val="6"/>
         </w:numPr>
         <w:spacing w:after="60"/>
       </w:pPr>
@@ -3842,7 +3927,7 @@
         <w:pStyle w:val="ListParagraph"/>
         <w:numPr>
           <w:ilvl w:val="0"/>
-          <w:numId w:val="5"/>
+          <w:numId w:val="6"/>
         </w:numPr>
         <w:spacing w:after="60"/>
       </w:pPr>
@@ -3862,7 +3947,7 @@
         <w:pStyle w:val="ListParagraph"/>
         <w:numPr>
           <w:ilvl w:val="0"/>
-          <w:numId w:val="5"/>
+          <w:numId w:val="6"/>
         </w:numPr>
         <w:spacing w:after="60"/>
       </w:pPr>
@@ -3882,7 +3967,7 @@
         <w:pStyle w:val="ListParagraph"/>
         <w:numPr>
           <w:ilvl w:val="0"/>
-          <w:numId w:val="5"/>
+          <w:numId w:val="6"/>
         </w:numPr>
         <w:spacing w:after="60"/>
       </w:pPr>
@@ -3902,7 +3987,7 @@
         <w:pStyle w:val="ListParagraph"/>
         <w:numPr>
           <w:ilvl w:val="0"/>
-          <w:numId w:val="5"/>
+          <w:numId w:val="6"/>
         </w:numPr>
         <w:spacing w:after="60"/>
       </w:pPr>
@@ -3922,7 +4007,7 @@
         <w:pStyle w:val="ListParagraph"/>
         <w:numPr>
           <w:ilvl w:val="0"/>
-          <w:numId w:val="5"/>
+          <w:numId w:val="6"/>
         </w:numPr>
         <w:spacing w:after="60"/>
       </w:pPr>
@@ -4681,7 +4766,7 @@
         <w:pStyle w:val="ListParagraph"/>
         <w:numPr>
           <w:ilvl w:val="0"/>
-          <w:numId w:val="5"/>
+          <w:numId w:val="6"/>
         </w:numPr>
         <w:spacing w:after="60"/>
       </w:pPr>
@@ -4718,7 +4803,7 @@
         <w:pStyle w:val="ListParagraph"/>
         <w:numPr>
           <w:ilvl w:val="0"/>
-          <w:numId w:val="5"/>
+          <w:numId w:val="6"/>
         </w:numPr>
         <w:spacing w:after="60"/>
       </w:pPr>
@@ -4738,7 +4823,7 @@
         <w:pStyle w:val="ListParagraph"/>
         <w:numPr>
           <w:ilvl w:val="0"/>
-          <w:numId w:val="5"/>
+          <w:numId w:val="6"/>
         </w:numPr>
         <w:spacing w:after="60"/>
       </w:pPr>
@@ -4758,7 +4843,7 @@
         <w:pStyle w:val="ListParagraph"/>
         <w:numPr>
           <w:ilvl w:val="0"/>
-          <w:numId w:val="5"/>
+          <w:numId w:val="6"/>
         </w:numPr>
         <w:spacing w:after="60"/>
       </w:pPr>
@@ -4778,7 +4863,7 @@
         <w:pStyle w:val="ListParagraph"/>
         <w:numPr>
           <w:ilvl w:val="0"/>
-          <w:numId w:val="5"/>
+          <w:numId w:val="6"/>
         </w:numPr>
         <w:spacing w:after="60"/>
       </w:pPr>
@@ -4798,7 +4883,7 @@
         <w:pStyle w:val="ListParagraph"/>
         <w:numPr>
           <w:ilvl w:val="0"/>
-          <w:numId w:val="5"/>
+          <w:numId w:val="6"/>
         </w:numPr>
         <w:spacing w:after="60"/>
       </w:pPr>
@@ -4818,7 +4903,7 @@
         <w:pStyle w:val="ListParagraph"/>
         <w:numPr>
           <w:ilvl w:val="0"/>
-          <w:numId w:val="5"/>
+          <w:numId w:val="6"/>
         </w:numPr>
         <w:spacing w:after="60"/>
       </w:pPr>
@@ -4838,7 +4923,7 @@
         <w:pStyle w:val="ListParagraph"/>
         <w:numPr>
           <w:ilvl w:val="0"/>
-          <w:numId w:val="5"/>
+          <w:numId w:val="6"/>
         </w:numPr>
         <w:spacing w:after="60"/>
       </w:pPr>
@@ -4858,7 +4943,7 @@
         <w:pStyle w:val="ListParagraph"/>
         <w:numPr>
           <w:ilvl w:val="0"/>
-          <w:numId w:val="5"/>
+          <w:numId w:val="6"/>
         </w:numPr>
         <w:spacing w:after="60"/>
       </w:pPr>
@@ -4878,7 +4963,7 @@
         <w:pStyle w:val="ListParagraph"/>
         <w:numPr>
           <w:ilvl w:val="0"/>
-          <w:numId w:val="5"/>
+          <w:numId w:val="6"/>
         </w:numPr>
         <w:spacing w:after="60"/>
       </w:pPr>
@@ -4898,7 +4983,7 @@
         <w:pStyle w:val="ListParagraph"/>
         <w:numPr>
           <w:ilvl w:val="0"/>
-          <w:numId w:val="5"/>
+          <w:numId w:val="6"/>
         </w:numPr>
         <w:spacing w:after="60"/>
       </w:pPr>
@@ -4918,7 +5003,7 @@
         <w:pStyle w:val="ListParagraph"/>
         <w:numPr>
           <w:ilvl w:val="0"/>
-          <w:numId w:val="5"/>
+          <w:numId w:val="6"/>
         </w:numPr>
         <w:spacing w:after="60"/>
       </w:pPr>
@@ -4931,6 +5016,26 @@
       </w:r>
       <w:r>
         <w:t xml:space="preserve">bearbeiten (Stift) und löschen wie am Handy; Passwörter mit dem Windows-Datenschutz verschlüsselt.</w:t>
+      </w:r>
+    </w:p>
+    <w:p>
+      <w:pPr>
+        <w:pStyle w:val="ListParagraph"/>
+        <w:numPr>
+          <w:ilvl w:val="0"/>
+          <w:numId w:val="6"/>
+        </w:numPr>
+        <w:spacing w:after="60"/>
+      </w:pPr>
+      <w:r>
+        <w:rPr>
+          <w:b/>
+          <w:bCs/>
+        </w:rPr>
+        <w:t xml:space="preserve">Update: </w:t>
+      </w:r>
+      <w:r>
+        <w:t xml:space="preserve">Kachel „Update“ – wie am Handy: prüft alle 24 Stunden bei GitHub, lädt das neue Setup und installiert es (Portiva schließt sich dafür kurz).</w:t>
       </w:r>
     </w:p>
     <w:sectPr>
@@ -5209,6 +5314,18 @@
       </w:pPr>
     </w:lvl>
   </w:abstractNum>
+  <w:abstractNum w:abstractNumId="8" w15:restartNumberingAfterBreak="0">
+    <w:multiLevelType w:val="hybridMultilevel"/>
+    <w:lvl w:ilvl="0" w15:tentative="1">
+      <w:start w:val="1"/>
+      <w:numFmt w:val="decimal"/>
+      <w:lvlText w:val="%1."/>
+      <w:lvlJc w:val="left"/>
+      <w:pPr>
+        <w:ind w:left="540" w:hanging="270"/>
+      </w:pPr>
+    </w:lvl>
+  </w:abstractNum>
   <w:num w:numId="1">
     <w:abstractNumId w:val="1"/>
     <w:lvlOverride w:ilvl="0">
@@ -5228,18 +5345,24 @@
     </w:lvlOverride>
   </w:num>
   <w:num w:numId="4">
+    <w:abstractNumId w:val="7"/>
+    <w:lvlOverride w:ilvl="0">
+      <w:startOverride w:val="1"/>
+    </w:lvlOverride>
+  </w:num>
+  <w:num w:numId="5">
     <w:abstractNumId w:val="5"/>
     <w:lvlOverride w:ilvl="0">
       <w:startOverride w:val="1"/>
     </w:lvlOverride>
   </w:num>
-  <w:num w:numId="5">
+  <w:num w:numId="6">
     <w:abstractNumId w:val="2"/>
     <w:lvlOverride w:ilvl="0">
       <w:startOverride w:val="1"/>
     </w:lvlOverride>
   </w:num>
-  <w:num w:numId="6">
+  <w:num w:numId="7">
     <w:abstractNumId w:val="6"/>
     <w:lvlOverride w:ilvl="0">
       <w:startOverride w:val="1"/>

</xml_diff>

<commit_message>
Kachel Update: ein Klick prueft, laedt und installiert automatisch (Android + Windows)
Co-Authored-By: Claude Opus 5.5 <noreply@anthropic.com>
Claude-Session: https://claude.ai/code/session_01CaJqjA6T7wr6qkboQBX5Ep
</commit_message>
<xml_diff>
--- a/docs/PowerIPTV-Anleitung.docx
+++ b/docs/PowerIPTV-Anleitung.docx
@@ -49,7 +49,7 @@
         <w:rPr>
           <w:color w:val="666666"/>
         </w:rPr>
-        <w:t xml:space="preserve">Stand: Version 1.1.77 · Oktober 2026</w:t>
+        <w:t xml:space="preserve">Stand: Version 1.1.78 · Oktober 2026</w:t>
       </w:r>
     </w:p>
     <w:p>
@@ -677,20 +677,7 @@
         <w:spacing w:after="60"/>
       </w:pPr>
       <w:r>
-        <w:t xml:space="preserve">Kachel „Update“ (ganz unten bei den kleinen Kacheln) öffnen.</w:t>
-      </w:r>
-    </w:p>
-    <w:p>
-      <w:pPr>
-        <w:pStyle w:val="ListParagraph"/>
-        <w:numPr>
-          <w:ilvl w:val="0"/>
-          <w:numId w:val="4"/>
-        </w:numPr>
-        <w:spacing w:after="60"/>
-      </w:pPr>
-      <w:r>
-        <w:t xml:space="preserve">„Jetzt herunterladen &amp; installieren“ antippen.</w:t>
+        <w:t xml:space="preserve">Kachel „Update“ (unten neben „Einstellungen“) antippen – Portiva sucht sofort nach der neuesten Version, lädt sie herunter und startet die Installation automatisch.</w:t>
       </w:r>
     </w:p>
     <w:p>
@@ -5035,7 +5022,7 @@
         <w:t xml:space="preserve">Update: </w:t>
       </w:r>
       <w:r>
-        <w:t xml:space="preserve">Kachel „Update“ – wie am Handy: prüft alle 24 Stunden bei GitHub, lädt das neue Setup und installiert es (Portiva schließt sich dafür kurz).</w:t>
+        <w:t xml:space="preserve">Kachel „Update“ neben „Einstellungen“ – ein Klick: sucht bei GitHub, lädt das neue Setup und installiert es (Portiva schließt sich dafür kurz). Zusätzlich automatische Prüfung alle 24 Stunden.</w:t>
       </w:r>
     </w:p>
     <w:sectPr>

</xml_diff>

<commit_message>
Ton bei DTS-Filmen + Spul-Vorschau auch bei 1 Verbindung (Android + Windows)
- Standard-Player: keine abspielbare Tonspur (DTS/TrueHD) -> automatisch VLC
- Audiospur-Menue zeigt auch Spuren, die nur VLC kann (Auswahl wechselt auf VLC)
- Spul-Vorschau Ein-Verbindungs-Modus: Film haelt beim Ziehen kurz an,
  danach Zielstelle mit gleicher Tonspur (nie zwei Verbindungen gleichzeitig)
- Anleitung 1.1.80

Co-Authored-By: Claude Opus 5.5 <noreply@anthropic.com>
Claude-Session: https://claude.ai/code/session_01CaJqjA6T7wr6qkboQBX5Ep
</commit_message>
<xml_diff>
--- a/docs/PowerIPTV-Anleitung.docx
+++ b/docs/PowerIPTV-Anleitung.docx
@@ -49,7 +49,7 @@
         <w:rPr>
           <w:color w:val="666666"/>
         </w:rPr>
-        <w:t xml:space="preserve">Stand: Version 1.1.79 · Oktober 2026</w:t>
+        <w:t xml:space="preserve">Stand: Version 1.1.80 · Oktober 2026</w:t>
       </w:r>
     </w:p>
     <w:p>
@@ -2465,7 +2465,7 @@
         <w:t xml:space="preserve">Vorschaubilder beim Spulen: </w:t>
       </w:r>
       <w:r>
-        <w:t xml:space="preserve">Beim Ziehen über den Zeitstrahl. Erlaubt der Anbieter keine zweite Verbindung, schaltet sich die Funktion automatisch ab.</w:t>
+        <w:t xml:space="preserve">Beim Ziehen über den Zeitstrahl. Erlaubt dein Zugang nur 1 Verbindung, hält der Film beim Ziehen kurz an und läuft danach an der Zielstelle mit derselben Tonspur weiter – so sind nie zwei Verbindungen gleichzeitig offen. „Immer parallel“ (Einstellungen → Player) lässt den Film weiterlaufen, braucht aber eine 2. Verbindung.</w:t>
       </w:r>
     </w:p>
     <w:p>
@@ -3537,7 +3537,7 @@
                 <w:sz w:val="20"/>
                 <w:szCs w:val="20"/>
               </w:rPr>
-              <w:t xml:space="preserve">Behoben ab 1.1.79: Bei Zugängen mit nur 1 Stream lädt die App beim Spulen keine Vorschaubilder mehr (die 2. Verbindung ließ den Anbieter den Film abbrechen). Hängt das Bild trotzdem länger als 10 Sekunden, lädt der Player den Stream automatisch an derselben Stelle neu.</w:t>
+              <w:t xml:space="preserve">Behoben ab 1.1.79: Bei Zugängen mit nur 1 Stream öffnet die Vorschau keine 2. Verbindung mehr. Ab 1.1.80 gibt es die Vorschaubilder dort trotzdem wieder: Der Film hält beim Ziehen kurz an. Hängt das Bild länger als 10 Sekunden, lädt der Player den Stream automatisch an derselben Stelle neu.</w:t>
             </w:r>
           </w:p>
         </w:tc>
@@ -3565,7 +3565,7 @@
                 <w:sz w:val="20"/>
                 <w:szCs w:val="20"/>
               </w:rPr>
-              <w:t xml:space="preserve">Live TV stockt</w:t>
+              <w:t xml:space="preserve">Film läuft ohne Ton</w:t>
             </w:r>
           </w:p>
         </w:tc>
@@ -3588,7 +3588,7 @@
                 <w:sz w:val="20"/>
                 <w:szCs w:val="20"/>
               </w:rPr>
-              <w:t xml:space="preserve">Beide Player puffern Live TV jetzt größer (Standard-Player bis 60 s, nach einem Aussetzer erst mit 6 s Vorrat weiter; VLC 4 s) und verbinden sich nach Unterbrechungen automatisch neu. Unter Windows: Einstellungen → Player → Puffer „Groß“.</w:t>
+              <w:t xml:space="preserve">Behoben ab 1.1.80: Viele Filme haben DTS- oder TrueHD-Ton, den der Standard-Player auf den meisten Handys/Tablets nicht abspielen kann. Portiva erkennt das und wechselt automatisch auf VLC (spielt DTS ab). Im Player-Zahnrad unter „Audiospur“ wählst du die Sprache (z. B. Deutsch / Englisch); Spuren mit „(mit VLC)“ wechseln beim Antippen auf VLC.</w:t>
             </w:r>
           </w:p>
         </w:tc>
@@ -3615,7 +3615,7 @@
                 <w:sz w:val="20"/>
                 <w:szCs w:val="20"/>
               </w:rPr>
-              <w:t xml:space="preserve">Wann wird VLC benutzt?</w:t>
+              <w:t xml:space="preserve">Live TV stockt</w:t>
             </w:r>
           </w:p>
         </w:tc>
@@ -3637,7 +3637,7 @@
                 <w:sz w:val="20"/>
                 <w:szCs w:val="20"/>
               </w:rPr>
-              <w:t xml:space="preserve">Im Modus „Automatisch“ startet immer zuerst der Standard-Player. Nur wenn er einen bestimmten Stream nicht abspielen kann (z.B. seltene Ton- oder Bildformate), wechselt die App für genau diesen Titel zu VLC.</w:t>
+              <w:t xml:space="preserve">Beide Player puffern Live TV jetzt größer (Standard-Player bis 60 s, nach einem Aussetzer erst mit 6 s Vorrat weiter; VLC 4 s) und verbinden sich nach Unterbrechungen automatisch neu. Unter Windows: Einstellungen → Player → Puffer „Groß“.</w:t>
             </w:r>
           </w:p>
         </w:tc>
@@ -3665,7 +3665,7 @@
                 <w:sz w:val="20"/>
                 <w:szCs w:val="20"/>
               </w:rPr>
-              <w:t xml:space="preserve">VLC ruckelt oder hängt</w:t>
+              <w:t xml:space="preserve">Wann wird VLC benutzt?</w:t>
             </w:r>
           </w:p>
         </w:tc>
@@ -3688,7 +3688,7 @@
                 <w:sz w:val="20"/>
                 <w:szCs w:val="20"/>
               </w:rPr>
-              <w:t xml:space="preserve">Einstellungen → Player → VLC-Leistung auf „Schnell“ stellen (bei TV-Sticks automatisch).</w:t>
+              <w:t xml:space="preserve">Im Modus „Automatisch“ startet immer zuerst der Standard-Player. Nur wenn er einen bestimmten Stream nicht abspielen kann (z.B. seltene Ton- oder Bildformate), wechselt die App für genau diesen Titel zu VLC.</w:t>
             </w:r>
           </w:p>
         </w:tc>
@@ -3715,7 +3715,7 @@
                 <w:sz w:val="20"/>
                 <w:szCs w:val="20"/>
               </w:rPr>
-              <w:t xml:space="preserve">Nur Ton, kein Bild</w:t>
+              <w:t xml:space="preserve">VLC ruckelt oder hängt</w:t>
             </w:r>
           </w:p>
         </w:tc>
@@ -3737,7 +3737,7 @@
                 <w:sz w:val="20"/>
                 <w:szCs w:val="20"/>
               </w:rPr>
-              <w:t xml:space="preserve">Der Sender nutzt ein altes Format – die App wechselt automatisch zu VLC. Sonst Einstellungen → Player → VLC.</w:t>
+              <w:t xml:space="preserve">Einstellungen → Player → VLC-Leistung auf „Schnell“ stellen (bei TV-Sticks automatisch).</w:t>
             </w:r>
           </w:p>
         </w:tc>
@@ -3765,7 +3765,7 @@
                 <w:sz w:val="20"/>
                 <w:szCs w:val="20"/>
               </w:rPr>
-              <w:t xml:space="preserve">Bild bleibt bei Aufnahme stehen</w:t>
+              <w:t xml:space="preserve">Nur Ton, kein Bild</w:t>
             </w:r>
           </w:p>
         </w:tc>
@@ -3788,7 +3788,7 @@
                 <w:sz w:val="20"/>
                 <w:szCs w:val="20"/>
               </w:rPr>
-              <w:t xml:space="preserve">Der Zugang erlaubt nur eine Verbindung. Den aufgenommenen Sender schauen oder die Aufnahme stoppen.</w:t>
+              <w:t xml:space="preserve">Der Sender nutzt ein altes Format – die App wechselt automatisch zu VLC. Sonst Einstellungen → Player → VLC.</w:t>
             </w:r>
           </w:p>
         </w:tc>
@@ -3815,7 +3815,7 @@
                 <w:sz w:val="20"/>
                 <w:szCs w:val="20"/>
               </w:rPr>
-              <w:t xml:space="preserve">Update lässt sich nicht installieren</w:t>
+              <w:t xml:space="preserve">Bild bleibt bei Aufnahme stehen</w:t>
             </w:r>
           </w:p>
         </w:tc>
@@ -3837,7 +3837,7 @@
                 <w:sz w:val="20"/>
                 <w:szCs w:val="20"/>
               </w:rPr>
-              <w:t xml:space="preserve">Immer die APK aus den Releases verwenden (gleiche Signatur).</w:t>
+              <w:t xml:space="preserve">Der Zugang erlaubt nur eine Verbindung. Den aufgenommenen Sender schauen oder die Aufnahme stoppen.</w:t>
             </w:r>
           </w:p>
         </w:tc>
@@ -3865,7 +3865,7 @@
                 <w:sz w:val="20"/>
                 <w:szCs w:val="20"/>
               </w:rPr>
-              <w:t xml:space="preserve">Cast findet den Fernseher nicht</w:t>
+              <w:t xml:space="preserve">Update lässt sich nicht installieren</w:t>
             </w:r>
           </w:p>
         </w:tc>
@@ -3888,7 +3888,7 @@
                 <w:sz w:val="20"/>
                 <w:szCs w:val="20"/>
               </w:rPr>
-              <w:t xml:space="preserve">Samsung- und Fire-TV-Geräte können kein Google Cast – „Bildschirm spiegeln“ nutzen.</w:t>
+              <w:t xml:space="preserve">Immer die APK aus den Releases verwenden (gleiche Signatur).</w:t>
             </w:r>
           </w:p>
         </w:tc>
@@ -3915,6 +3915,56 @@
                 <w:sz w:val="20"/>
                 <w:szCs w:val="20"/>
               </w:rPr>
+              <w:t xml:space="preserve">Cast findet den Fernseher nicht</w:t>
+            </w:r>
+          </w:p>
+        </w:tc>
+        <w:tc>
+          <w:tcPr>
+            <w:tcW w:type="dxa" w:w="6026"/>
+            <w:tcMar>
+              <w:top w:type="dxa" w:w="60"/>
+              <w:left w:type="dxa" w:w="100"/>
+              <w:bottom w:type="dxa" w:w="60"/>
+              <w:right w:type="dxa" w:w="100"/>
+            </w:tcMar>
+          </w:tcPr>
+          <w:p>
+            <w:r>
+              <w:rPr>
+                <w:b w:val="false"/>
+                <w:bCs w:val="false"/>
+                <w:sz w:val="20"/>
+                <w:szCs w:val="20"/>
+              </w:rPr>
+              <w:t xml:space="preserve">Samsung- und Fire-TV-Geräte können kein Google Cast – „Bildschirm spiegeln“ nutzen.</w:t>
+            </w:r>
+          </w:p>
+        </w:tc>
+      </w:tr>
+      <w:tr>
+        <w:trPr>
+          <w:tblHeader w:val="false"/>
+        </w:trPr>
+        <w:tc>
+          <w:tcPr>
+            <w:tcW w:type="dxa" w:w="3000"/>
+            <w:shd w:fill="EEF5FA" w:color="auto" w:val="clear"/>
+            <w:tcMar>
+              <w:top w:type="dxa" w:w="60"/>
+              <w:left w:type="dxa" w:w="100"/>
+              <w:bottom w:type="dxa" w:w="60"/>
+              <w:right w:type="dxa" w:w="100"/>
+            </w:tcMar>
+          </w:tcPr>
+          <w:p>
+            <w:r>
+              <w:rPr>
+                <w:b/>
+                <w:bCs/>
+                <w:sz w:val="20"/>
+                <w:szCs w:val="20"/>
+              </w:rPr>
               <w:t xml:space="preserve">Senderliste veraltet</w:t>
             </w:r>
           </w:p>
@@ -3922,6 +3972,7 @@
         <w:tc>
           <w:tcPr>
             <w:tcW w:type="dxa" w:w="6026"/>
+            <w:shd w:fill="EEF5FA" w:color="auto" w:val="clear"/>
             <w:tcMar>
               <w:top w:type="dxa" w:w="60"/>
               <w:left w:type="dxa" w:w="100"/>

</xml_diff>

<commit_message>
Samsung Smart TV (Tizen 4.0, Chromium 56): neue App im Ordner "Tizen Samsung"
- Echte Tizen-Web-App mit AVPlay (Hardware-Decoder), Fernbedienung inkl. Media-/Farb-/Zifferntasten
- Zugaenge (Xtream/M3U), Startseite, Live TV/Filme/Serien mit Kategorien+Sprache, Details,
  Player (Puffer, Neuverbinden, Waechter, Tonspur, Untertitel, Bildformat, naechste Folge,
  Intro ueberspringen, Sleep-Timer, Senderliste, Umschalten), TV-Guide mit Catch-up und Erinnerungen,
  Suche, Favoriten/Verlauf, Kindersicherung, KI-Empfehlungen, Update-Pruefung
- esbuild -> chrome56, nur Flexbox; CI baut PowerIPTV-Tizen-ZIP (+ optional signierte .wgt per Secrets)
- Anleitung Kapitel 15 mit Tizen-Studio-Download + Entwicklermodus (1.1.81)

Co-Authored-By: Claude Opus 5.5 <noreply@anthropic.com>
Claude-Session: https://claude.ai/code/session_01CaJqjA6T7wr6qkboQBX5Ep
</commit_message>
<xml_diff>
--- a/docs/PowerIPTV-Anleitung.docx
+++ b/docs/PowerIPTV-Anleitung.docx
@@ -49,7 +49,7 @@
         <w:rPr>
           <w:color w:val="666666"/>
         </w:rPr>
-        <w:t xml:space="preserve">Stand: Version 1.1.80 · Oktober 2026</w:t>
+        <w:t xml:space="preserve">Stand: Version 1.1.81 · Oktober 2026</w:t>
       </w:r>
     </w:p>
     <w:p>
@@ -103,7 +103,7 @@
         <w:spacing w:after="120"/>
       </w:pPr>
       <w:r>
-        <w:t xml:space="preserve">PowerIPTV ist ein IPTV-Player für Live-TV, Filme und Serien deines Anbieters (Xtream Codes oder M3U). Eine einzige App-Datei läuft auf Handy, Tablet, Fire TV und Android TV und passt die Oberfläche automatisch an. Zusätzlich gibt es eine eigene Version für Windows-PCs (Kapitel 14).</w:t>
+        <w:t xml:space="preserve">PowerIPTV ist ein IPTV-Player für Live-TV, Filme und Serien deines Anbieters (Xtream Codes oder M3U). Eine einzige App-Datei läuft auf Handy, Tablet, Fire TV und Android TV und passt die Oberfläche automatisch an. Zusätzlich gibt es eine eigene Version für Windows-PCs (Kapitel 14) und für Samsung Smart TVs ab 2018 (Kapitel 15).</w:t>
       </w:r>
     </w:p>
     <w:tbl>
@@ -737,6 +737,23 @@
       </w:pPr>
       <w:r>
         <w:t xml:space="preserve">Siehe Kapitel 14 – dort steht die Installation der Windows-Version.</w:t>
+      </w:r>
+    </w:p>
+    <w:p>
+      <w:pPr>
+        <w:pStyle w:val="Heading2"/>
+        <w:spacing w:after="120" w:before="240"/>
+      </w:pPr>
+      <w:r>
+        <w:t xml:space="preserve">Samsung Smart TV</w:t>
+      </w:r>
+    </w:p>
+    <w:p>
+      <w:pPr>
+        <w:spacing w:after="120"/>
+      </w:pPr>
+      <w:r>
+        <w:t xml:space="preserve">Siehe Kapitel 15 – Installation über den Entwicklermodus des Fernsehers (einmalig mit dem PC).</w:t>
       </w:r>
     </w:p>
     <w:p>
@@ -5223,6 +5240,766 @@
       </w:r>
       <w:r>
         <w:t xml:space="preserve">Kachel „Update“ neben „Einstellungen“ – ein Klick: sucht bei GitHub, lädt das neue Setup und installiert es (Portiva schließt sich dafür kurz). Zusätzlich automatische Prüfung alle 24 Stunden.</w:t>
+      </w:r>
+    </w:p>
+    <w:p>
+      <w:r>
+        <w:br w:type="page"/>
+      </w:r>
+    </w:p>
+    <w:p>
+      <w:pPr>
+        <w:pStyle w:val="Heading1"/>
+        <w:spacing w:after="160" w:before="360"/>
+      </w:pPr>
+      <w:r>
+        <w:t xml:space="preserve">15. PowerIPTV für Samsung Smart TV (Tizen)</w:t>
+      </w:r>
+    </w:p>
+    <w:p>
+      <w:pPr>
+        <w:spacing w:after="120"/>
+      </w:pPr>
+      <w:r>
+        <w:t xml:space="preserve">Für Samsung-Fernseher ab Baujahr 2018 (Tizen 4.0, z. B. UE49NU8009) gibt es eine eigene App mit dem Samsung-Videoplayer des Fernsehers. Sie wird einmalig vom PC aus installiert. Samsung erlaubt Apps außerhalb des Samsung-Stores nur mit einem eigenen, kostenlosen Samsung-Zertifikat, das an deinen Fernseher gebunden ist.</w:t>
+      </w:r>
+    </w:p>
+    <w:p>
+      <w:pPr>
+        <w:pStyle w:val="Heading2"/>
+        <w:spacing w:after="120" w:before="240"/>
+      </w:pPr>
+      <w:r>
+        <w:t xml:space="preserve">Was die TV-Version kann</w:t>
+      </w:r>
+    </w:p>
+    <w:p>
+      <w:pPr>
+        <w:spacing w:after="120"/>
+      </w:pPr>
+      <w:r>
+        <w:t xml:space="preserve">Zugänge (Xtream/M3U, mehrere Benutzer), Live TV, Filme und Serien mit Kategorien und Sprachauswahl, Favoriten, Verlauf, Weiterschauen, TV-Guide mit Catch-up und Erinnerungen, Suche, Kindersicherung, KI-Empfehlungen, Tonspur, Untertitel, Bildformat, Sleep-Timer, nächste Folge und „Intro überspringen“. Nicht möglich auf dem Fernseher: Aufnahmen, Downloads, VPN und Multi-Screen.</w:t>
+      </w:r>
+    </w:p>
+    <w:p>
+      <w:pPr>
+        <w:pBdr>
+          <w:left w:val="single" w:color="1E88B8" w:sz="18" w:space="8"/>
+        </w:pBdr>
+        <w:spacing w:after="160" w:before="80"/>
+        <w:ind w:left="240"/>
+      </w:pPr>
+      <w:r>
+        <w:rPr>
+          <w:b/>
+          <w:bCs/>
+          <w:color w:val="1E88B8"/>
+        </w:rPr>
+        <w:t xml:space="preserve">Tipp: </w:t>
+      </w:r>
+      <w:r>
+        <w:t xml:space="preserve">Ton: Samsung-Fernseher ab 2018 können kein DTS mehr abspielen. Hat ein Film mehrere Tonspuren, mit der grünen Taste eine andere wählen (z. B. AC3).</w:t>
+      </w:r>
+    </w:p>
+    <w:p>
+      <w:pPr>
+        <w:pStyle w:val="Heading2"/>
+        <w:spacing w:after="120" w:before="240"/>
+      </w:pPr>
+      <w:r>
+        <w:t xml:space="preserve">1. Software am PC installieren</w:t>
+      </w:r>
+    </w:p>
+    <w:p>
+      <w:pPr>
+        <w:pStyle w:val="ListParagraph"/>
+        <w:numPr>
+          <w:ilvl w:val="0"/>
+          <w:numId w:val="8"/>
+        </w:numPr>
+        <w:spacing w:after="60"/>
+      </w:pPr>
+      <w:r>
+        <w:rPr>
+          <w:b/>
+          <w:bCs/>
+        </w:rPr>
+        <w:t xml:space="preserve">Tizen Studio herunterladen: </w:t>
+      </w:r>
+      <w:r>
+        <w:t xml:space="preserve">https://developer.tizen.org/development/tizen-studio/download (Variante „with IDE installer“ für Windows, Mac oder Linux) und installieren.</w:t>
+      </w:r>
+    </w:p>
+    <w:p>
+      <w:pPr>
+        <w:pStyle w:val="ListParagraph"/>
+        <w:numPr>
+          <w:ilvl w:val="0"/>
+          <w:numId w:val="8"/>
+        </w:numPr>
+        <w:spacing w:after="60"/>
+      </w:pPr>
+      <w:r>
+        <w:rPr>
+          <w:b/>
+          <w:bCs/>
+        </w:rPr>
+        <w:t xml:space="preserve">Samsung-Anleitung (falls nötig): </w:t>
+      </w:r>
+      <w:r>
+        <w:t xml:space="preserve">https://developer.samsung.com/smarttv/develop/getting-started/setting-up-sdk/installing-tv-sdk.html</w:t>
+      </w:r>
+    </w:p>
+    <w:p>
+      <w:pPr>
+        <w:pStyle w:val="ListParagraph"/>
+        <w:numPr>
+          <w:ilvl w:val="0"/>
+          <w:numId w:val="8"/>
+        </w:numPr>
+        <w:spacing w:after="60"/>
+      </w:pPr>
+      <w:r>
+        <w:t xml:space="preserve">Im Package Manager unter „Extension SDK“ installieren: „TV Extensions-4.0“ (oder neuer) und „Samsung Certificate Extension“.</w:t>
+      </w:r>
+    </w:p>
+    <w:p>
+      <w:pPr>
+        <w:pStyle w:val="Heading2"/>
+        <w:spacing w:after="120" w:before="240"/>
+      </w:pPr>
+      <w:r>
+        <w:t xml:space="preserve">2. Entwicklermodus am Fernseher</w:t>
+      </w:r>
+    </w:p>
+    <w:p>
+      <w:pPr>
+        <w:pStyle w:val="ListParagraph"/>
+        <w:numPr>
+          <w:ilvl w:val="0"/>
+          <w:numId w:val="9"/>
+        </w:numPr>
+        <w:spacing w:after="60"/>
+      </w:pPr>
+      <w:r>
+        <w:t xml:space="preserve">PC und Fernseher ins selbe Heimnetz. IP-Adresse des PCs notieren (Windows: Eingabeaufforderung → ipconfig → IPv4-Adresse).</w:t>
+      </w:r>
+    </w:p>
+    <w:p>
+      <w:pPr>
+        <w:pStyle w:val="ListParagraph"/>
+        <w:numPr>
+          <w:ilvl w:val="0"/>
+          <w:numId w:val="9"/>
+        </w:numPr>
+        <w:spacing w:after="60"/>
+      </w:pPr>
+      <w:r>
+        <w:t xml:space="preserve">Am Fernseher Home drücken → „Apps“ öffnen → auf der Fernbedienung 1 2 3 4 5 eingeben.</w:t>
+      </w:r>
+    </w:p>
+    <w:p>
+      <w:pPr>
+        <w:pStyle w:val="ListParagraph"/>
+        <w:numPr>
+          <w:ilvl w:val="0"/>
+          <w:numId w:val="9"/>
+        </w:numPr>
+        <w:spacing w:after="60"/>
+      </w:pPr>
+      <w:r>
+        <w:t xml:space="preserve">„Developer mode“ auf „On“ stellen, die IP-Adresse des PCs eintragen, OK.</w:t>
+      </w:r>
+    </w:p>
+    <w:p>
+      <w:pPr>
+        <w:pStyle w:val="ListParagraph"/>
+        <w:numPr>
+          <w:ilvl w:val="0"/>
+          <w:numId w:val="9"/>
+        </w:numPr>
+        <w:spacing w:after="60"/>
+      </w:pPr>
+      <w:r>
+        <w:t xml:space="preserve">Fernseher neu starten (Ein/Aus-Taste gedrückt halten oder kurz vom Strom trennen).</w:t>
+      </w:r>
+    </w:p>
+    <w:p>
+      <w:pPr>
+        <w:pStyle w:val="ListParagraph"/>
+        <w:numPr>
+          <w:ilvl w:val="0"/>
+          <w:numId w:val="9"/>
+        </w:numPr>
+        <w:spacing w:after="60"/>
+      </w:pPr>
+      <w:r>
+        <w:t xml:space="preserve">IP-Adresse des Fernsehers notieren: Einstellungen → Allgemein → Netzwerk → Netzwerkstatus → IP-Einstellungen.</w:t>
+      </w:r>
+    </w:p>
+    <w:p>
+      <w:pPr>
+        <w:pStyle w:val="Heading2"/>
+        <w:spacing w:after="120" w:before="240"/>
+      </w:pPr>
+      <w:r>
+        <w:t xml:space="preserve">3. Verbinden und Zertifikat erstellen (einmalig)</w:t>
+      </w:r>
+    </w:p>
+    <w:p>
+      <w:pPr>
+        <w:pStyle w:val="ListParagraph"/>
+        <w:numPr>
+          <w:ilvl w:val="0"/>
+          <w:numId w:val="10"/>
+        </w:numPr>
+        <w:spacing w:after="60"/>
+      </w:pPr>
+      <w:r>
+        <w:t xml:space="preserve">Tizen Studio → Tools → Device Manager → Remote Device Manager → „+“ → IP des Fernsehers eintragen → Verbindung einschalten.</w:t>
+      </w:r>
+    </w:p>
+    <w:p>
+      <w:pPr>
+        <w:pStyle w:val="ListParagraph"/>
+        <w:numPr>
+          <w:ilvl w:val="0"/>
+          <w:numId w:val="10"/>
+        </w:numPr>
+        <w:spacing w:after="60"/>
+      </w:pPr>
+      <w:r>
+        <w:t xml:space="preserve">Tools → Certificate Manager → „+“ → Samsung → TV → Profilname „PortivaTV“.</w:t>
+      </w:r>
+    </w:p>
+    <w:p>
+      <w:pPr>
+        <w:pStyle w:val="ListParagraph"/>
+        <w:numPr>
+          <w:ilvl w:val="0"/>
+          <w:numId w:val="10"/>
+        </w:numPr>
+        <w:spacing w:after="60"/>
+      </w:pPr>
+      <w:r>
+        <w:t xml:space="preserve">Neues Author-Zertifikat anlegen (Name, Passwort) und mit dem kostenlosen Samsung-Konto anmelden.</w:t>
+      </w:r>
+    </w:p>
+    <w:p>
+      <w:pPr>
+        <w:pStyle w:val="ListParagraph"/>
+        <w:numPr>
+          <w:ilvl w:val="0"/>
+          <w:numId w:val="10"/>
+        </w:numPr>
+        <w:spacing w:after="60"/>
+      </w:pPr>
+      <w:r>
+        <w:t xml:space="preserve">Neues Distributor-Zertifikat, Stufe „Public“ – die DUID des verbundenen Fernsehers wird automatisch eingetragen → Fertig.</w:t>
+      </w:r>
+    </w:p>
+    <w:p>
+      <w:pPr>
+        <w:pStyle w:val="Heading2"/>
+        <w:spacing w:after="120" w:before="240"/>
+      </w:pPr>
+      <w:r>
+        <w:t xml:space="preserve">4. App signieren und installieren</w:t>
+      </w:r>
+    </w:p>
+    <w:p>
+      <w:pPr>
+        <w:pStyle w:val="ListParagraph"/>
+        <w:numPr>
+          <w:ilvl w:val="0"/>
+          <w:numId w:val="11"/>
+        </w:numPr>
+        <w:spacing w:after="60"/>
+      </w:pPr>
+      <w:r>
+        <w:t xml:space="preserve">Auf GitHub unter „Releases“ die neueste Version öffnen und „PowerIPTV-Tizen-v1.1.X.zip“ herunterladen und entpacken.</w:t>
+      </w:r>
+    </w:p>
+    <w:p>
+      <w:pPr>
+        <w:pStyle w:val="ListParagraph"/>
+        <w:numPr>
+          <w:ilvl w:val="0"/>
+          <w:numId w:val="11"/>
+        </w:numPr>
+        <w:spacing w:after="60"/>
+      </w:pPr>
+      <w:r>
+        <w:t xml:space="preserve">Eingabeaufforderung im entpackten Ordner „PowerIPTV-Tizen“ öffnen (das Programm „tizen“ liegt in tizen-studio\tools\ide\bin).</w:t>
+      </w:r>
+    </w:p>
+    <w:p>
+      <w:pPr>
+        <w:pStyle w:val="ListParagraph"/>
+        <w:numPr>
+          <w:ilvl w:val="0"/>
+          <w:numId w:val="11"/>
+        </w:numPr>
+        <w:spacing w:after="60"/>
+      </w:pPr>
+      <w:r>
+        <w:rPr>
+          <w:b/>
+          <w:bCs/>
+        </w:rPr>
+        <w:t xml:space="preserve">Signieren: </w:t>
+      </w:r>
+      <w:r>
+        <w:t xml:space="preserve">tizen package -t wgt -s PortivaTV</w:t>
+      </w:r>
+    </w:p>
+    <w:p>
+      <w:pPr>
+        <w:pStyle w:val="ListParagraph"/>
+        <w:numPr>
+          <w:ilvl w:val="0"/>
+          <w:numId w:val="11"/>
+        </w:numPr>
+        <w:spacing w:after="60"/>
+      </w:pPr>
+      <w:r>
+        <w:rPr>
+          <w:b/>
+          <w:bCs/>
+        </w:rPr>
+        <w:t xml:space="preserve">Installieren: </w:t>
+      </w:r>
+      <w:r>
+        <w:t xml:space="preserve">tizen install -n Portiva.wgt -s &lt;IP-des-Fernsehers&gt;:26101</w:t>
+      </w:r>
+    </w:p>
+    <w:p>
+      <w:pPr>
+        <w:pStyle w:val="ListParagraph"/>
+        <w:numPr>
+          <w:ilvl w:val="0"/>
+          <w:numId w:val="11"/>
+        </w:numPr>
+        <w:spacing w:after="60"/>
+      </w:pPr>
+      <w:r>
+        <w:t xml:space="preserve">Fertig – „Portiva“ erscheint am Fernseher unter „Apps“. Beim ersten Start den Zugang einrichten (OK auf einem Feld öffnet die Fernseher-Tastatur).</w:t>
+      </w:r>
+    </w:p>
+    <w:p>
+      <w:pPr>
+        <w:pStyle w:val="Heading2"/>
+        <w:spacing w:after="120" w:before="240"/>
+      </w:pPr>
+      <w:r>
+        <w:t xml:space="preserve">Fernbedienung</w:t>
+      </w:r>
+    </w:p>
+    <w:tbl>
+      <w:tblPr>
+        <w:tblW w:type="dxa" w:w="9026"/>
+        <w:tblBorders>
+          <w:top w:val="single" w:color="auto" w:sz="4"/>
+          <w:left w:val="single" w:color="auto" w:sz="4"/>
+          <w:bottom w:val="single" w:color="auto" w:sz="4"/>
+          <w:right w:val="single" w:color="auto" w:sz="4"/>
+          <w:insideH w:val="single" w:color="auto" w:sz="4"/>
+          <w:insideV w:val="single" w:color="auto" w:sz="4"/>
+        </w:tblBorders>
+      </w:tblPr>
+      <w:tblGrid>
+        <w:gridCol w:w="3000"/>
+        <w:gridCol w:w="6000"/>
+      </w:tblGrid>
+      <w:tr>
+        <w:trPr>
+          <w:tblHeader/>
+        </w:trPr>
+        <w:tc>
+          <w:tcPr>
+            <w:tcW w:type="dxa" w:w="3000"/>
+            <w:shd w:fill="1E3A5F" w:color="auto" w:val="clear"/>
+            <w:tcMar>
+              <w:top w:type="dxa" w:w="60"/>
+              <w:left w:type="dxa" w:w="100"/>
+              <w:bottom w:type="dxa" w:w="60"/>
+              <w:right w:type="dxa" w:w="100"/>
+            </w:tcMar>
+          </w:tcPr>
+          <w:p>
+            <w:r>
+              <w:rPr>
+                <w:b/>
+                <w:bCs/>
+                <w:color w:val="FFFFFF"/>
+                <w:sz w:val="20"/>
+                <w:szCs w:val="20"/>
+              </w:rPr>
+              <w:t xml:space="preserve">Taste</w:t>
+            </w:r>
+          </w:p>
+        </w:tc>
+        <w:tc>
+          <w:tcPr>
+            <w:tcW w:type="dxa" w:w="6000"/>
+            <w:shd w:fill="1E3A5F" w:color="auto" w:val="clear"/>
+            <w:tcMar>
+              <w:top w:type="dxa" w:w="60"/>
+              <w:left w:type="dxa" w:w="100"/>
+              <w:bottom w:type="dxa" w:w="60"/>
+              <w:right w:type="dxa" w:w="100"/>
+            </w:tcMar>
+          </w:tcPr>
+          <w:p>
+            <w:r>
+              <w:rPr>
+                <w:b/>
+                <w:bCs/>
+                <w:color w:val="FFFFFF"/>
+                <w:sz w:val="20"/>
+                <w:szCs w:val="20"/>
+              </w:rPr>
+              <w:t xml:space="preserve">Funktion</w:t>
+            </w:r>
+          </w:p>
+        </w:tc>
+      </w:tr>
+      <w:tr>
+        <w:trPr>
+          <w:tblHeader w:val="false"/>
+        </w:trPr>
+        <w:tc>
+          <w:tcPr>
+            <w:tcW w:type="dxa" w:w="3000"/>
+            <w:tcMar>
+              <w:top w:type="dxa" w:w="60"/>
+              <w:left w:type="dxa" w:w="100"/>
+              <w:bottom w:type="dxa" w:w="60"/>
+              <w:right w:type="dxa" w:w="100"/>
+            </w:tcMar>
+          </w:tcPr>
+          <w:p>
+            <w:r>
+              <w:rPr>
+                <w:b/>
+                <w:bCs/>
+                <w:sz w:val="20"/>
+                <w:szCs w:val="20"/>
+              </w:rPr>
+              <w:t xml:space="preserve">Pfeile / OK / Zurück</w:t>
+            </w:r>
+          </w:p>
+        </w:tc>
+        <w:tc>
+          <w:tcPr>
+            <w:tcW w:type="dxa" w:w="6000"/>
+            <w:tcMar>
+              <w:top w:type="dxa" w:w="60"/>
+              <w:left w:type="dxa" w:w="100"/>
+              <w:bottom w:type="dxa" w:w="60"/>
+              <w:right w:type="dxa" w:w="100"/>
+            </w:tcMar>
+          </w:tcPr>
+          <w:p>
+            <w:r>
+              <w:rPr>
+                <w:b w:val="false"/>
+                <w:bCs w:val="false"/>
+                <w:sz w:val="20"/>
+                <w:szCs w:val="20"/>
+              </w:rPr>
+              <w:t xml:space="preserve">Bedienen; auf der Startseite fragt Zurück, ob Portiva beendet werden soll</w:t>
+            </w:r>
+          </w:p>
+        </w:tc>
+      </w:tr>
+      <w:tr>
+        <w:trPr>
+          <w:tblHeader w:val="false"/>
+        </w:trPr>
+        <w:tc>
+          <w:tcPr>
+            <w:tcW w:type="dxa" w:w="3000"/>
+            <w:shd w:fill="EEF5FA" w:color="auto" w:val="clear"/>
+            <w:tcMar>
+              <w:top w:type="dxa" w:w="60"/>
+              <w:left w:type="dxa" w:w="100"/>
+              <w:bottom w:type="dxa" w:w="60"/>
+              <w:right w:type="dxa" w:w="100"/>
+            </w:tcMar>
+          </w:tcPr>
+          <w:p>
+            <w:r>
+              <w:rPr>
+                <w:b/>
+                <w:bCs/>
+                <w:sz w:val="20"/>
+                <w:szCs w:val="20"/>
+              </w:rPr>
+              <w:t xml:space="preserve">▶❚❚, ■, ⏪ ⏩</w:t>
+            </w:r>
+          </w:p>
+        </w:tc>
+        <w:tc>
+          <w:tcPr>
+            <w:tcW w:type="dxa" w:w="6000"/>
+            <w:shd w:fill="EEF5FA" w:color="auto" w:val="clear"/>
+            <w:tcMar>
+              <w:top w:type="dxa" w:w="60"/>
+              <w:left w:type="dxa" w:w="100"/>
+              <w:bottom w:type="dxa" w:w="60"/>
+              <w:right w:type="dxa" w:w="100"/>
+            </w:tcMar>
+          </w:tcPr>
+          <w:p>
+            <w:r>
+              <w:rPr>
+                <w:b w:val="false"/>
+                <w:bCs w:val="false"/>
+                <w:sz w:val="20"/>
+                <w:szCs w:val="20"/>
+              </w:rPr>
+              <w:t xml:space="preserve">Pause/Weiter, Stopp, 30 Sekunden zurück/vor</w:t>
+            </w:r>
+          </w:p>
+        </w:tc>
+      </w:tr>
+      <w:tr>
+        <w:trPr>
+          <w:tblHeader w:val="false"/>
+        </w:trPr>
+        <w:tc>
+          <w:tcPr>
+            <w:tcW w:type="dxa" w:w="3000"/>
+            <w:tcMar>
+              <w:top w:type="dxa" w:w="60"/>
+              <w:left w:type="dxa" w:w="100"/>
+              <w:bottom w:type="dxa" w:w="60"/>
+              <w:right w:type="dxa" w:w="100"/>
+            </w:tcMar>
+          </w:tcPr>
+          <w:p>
+            <w:r>
+              <w:rPr>
+                <w:b/>
+                <w:bCs/>
+                <w:sz w:val="20"/>
+                <w:szCs w:val="20"/>
+              </w:rPr>
+              <w:t xml:space="preserve">← / → (Leiste aus)</w:t>
+            </w:r>
+          </w:p>
+        </w:tc>
+        <w:tc>
+          <w:tcPr>
+            <w:tcW w:type="dxa" w:w="6000"/>
+            <w:tcMar>
+              <w:top w:type="dxa" w:w="60"/>
+              <w:left w:type="dxa" w:w="100"/>
+              <w:bottom w:type="dxa" w:w="60"/>
+              <w:right w:type="dxa" w:w="100"/>
+            </w:tcMar>
+          </w:tcPr>
+          <w:p>
+            <w:r>
+              <w:rPr>
+                <w:b w:val="false"/>
+                <w:bCs w:val="false"/>
+                <w:sz w:val="20"/>
+                <w:szCs w:val="20"/>
+              </w:rPr>
+              <w:t xml:space="preserve">Film/Serie 10 Sekunden zurück/vor</w:t>
+            </w:r>
+          </w:p>
+        </w:tc>
+      </w:tr>
+      <w:tr>
+        <w:trPr>
+          <w:tblHeader w:val="false"/>
+        </w:trPr>
+        <w:tc>
+          <w:tcPr>
+            <w:tcW w:type="dxa" w:w="3000"/>
+            <w:shd w:fill="EEF5FA" w:color="auto" w:val="clear"/>
+            <w:tcMar>
+              <w:top w:type="dxa" w:w="60"/>
+              <w:left w:type="dxa" w:w="100"/>
+              <w:bottom w:type="dxa" w:w="60"/>
+              <w:right w:type="dxa" w:w="100"/>
+            </w:tcMar>
+          </w:tcPr>
+          <w:p>
+            <w:r>
+              <w:rPr>
+                <w:b/>
+                <w:bCs/>
+                <w:sz w:val="20"/>
+                <w:szCs w:val="20"/>
+              </w:rPr>
+              <w:t xml:space="preserve">CH+ / CH− oder ↑ / ↓</w:t>
+            </w:r>
+          </w:p>
+        </w:tc>
+        <w:tc>
+          <w:tcPr>
+            <w:tcW w:type="dxa" w:w="6000"/>
+            <w:shd w:fill="EEF5FA" w:color="auto" w:val="clear"/>
+            <w:tcMar>
+              <w:top w:type="dxa" w:w="60"/>
+              <w:left w:type="dxa" w:w="100"/>
+              <w:bottom w:type="dxa" w:w="60"/>
+              <w:right w:type="dxa" w:w="100"/>
+            </w:tcMar>
+          </w:tcPr>
+          <w:p>
+            <w:r>
+              <w:rPr>
+                <w:b w:val="false"/>
+                <w:bCs w:val="false"/>
+                <w:sz w:val="20"/>
+                <w:szCs w:val="20"/>
+              </w:rPr>
+              <w:t xml:space="preserve">Sender umschalten; 0–9 = Sendernummer direkt</w:t>
+            </w:r>
+          </w:p>
+        </w:tc>
+      </w:tr>
+      <w:tr>
+        <w:trPr>
+          <w:tblHeader w:val="false"/>
+        </w:trPr>
+        <w:tc>
+          <w:tcPr>
+            <w:tcW w:type="dxa" w:w="3000"/>
+            <w:tcMar>
+              <w:top w:type="dxa" w:w="60"/>
+              <w:left w:type="dxa" w:w="100"/>
+              <w:bottom w:type="dxa" w:w="60"/>
+              <w:right w:type="dxa" w:w="100"/>
+            </w:tcMar>
+          </w:tcPr>
+          <w:p>
+            <w:r>
+              <w:rPr>
+                <w:b/>
+                <w:bCs/>
+                <w:sz w:val="20"/>
+                <w:szCs w:val="20"/>
+              </w:rPr>
+              <w:t xml:space="preserve">Rot / Grün / Gelb / Blau</w:t>
+            </w:r>
+          </w:p>
+        </w:tc>
+        <w:tc>
+          <w:tcPr>
+            <w:tcW w:type="dxa" w:w="6000"/>
+            <w:tcMar>
+              <w:top w:type="dxa" w:w="60"/>
+              <w:left w:type="dxa" w:w="100"/>
+              <w:bottom w:type="dxa" w:w="60"/>
+              <w:right w:type="dxa" w:w="100"/>
+            </w:tcMar>
+          </w:tcPr>
+          <w:p>
+            <w:r>
+              <w:rPr>
+                <w:b w:val="false"/>
+                <w:bCs w:val="false"/>
+                <w:sz w:val="20"/>
+                <w:szCs w:val="20"/>
+              </w:rPr>
+              <w:t xml:space="preserve">Favorit / Tonspur (TV-Guide, Sortieren) / Untertitel (Kategorie-Menü) / Bildformat</w:t>
+            </w:r>
+          </w:p>
+        </w:tc>
+      </w:tr>
+      <w:tr>
+        <w:trPr>
+          <w:tblHeader w:val="false"/>
+        </w:trPr>
+        <w:tc>
+          <w:tcPr>
+            <w:tcW w:type="dxa" w:w="3000"/>
+            <w:shd w:fill="EEF5FA" w:color="auto" w:val="clear"/>
+            <w:tcMar>
+              <w:top w:type="dxa" w:w="60"/>
+              <w:left w:type="dxa" w:w="100"/>
+              <w:bottom w:type="dxa" w:w="60"/>
+              <w:right w:type="dxa" w:w="100"/>
+            </w:tcMar>
+          </w:tcPr>
+          <w:p>
+            <w:r>
+              <w:rPr>
+                <w:b/>
+                <w:bCs/>
+                <w:sz w:val="20"/>
+                <w:szCs w:val="20"/>
+              </w:rPr>
+              <w:t xml:space="preserve">CH LIST, INFO, GUIDE</w:t>
+            </w:r>
+          </w:p>
+        </w:tc>
+        <w:tc>
+          <w:tcPr>
+            <w:tcW w:type="dxa" w:w="6000"/>
+            <w:shd w:fill="EEF5FA" w:color="auto" w:val="clear"/>
+            <w:tcMar>
+              <w:top w:type="dxa" w:w="60"/>
+              <w:left w:type="dxa" w:w="100"/>
+              <w:bottom w:type="dxa" w:w="60"/>
+              <w:right w:type="dxa" w:w="100"/>
+            </w:tcMar>
+          </w:tcPr>
+          <w:p>
+            <w:r>
+              <w:rPr>
+                <w:b w:val="false"/>
+                <w:bCs w:val="false"/>
+                <w:sz w:val="20"/>
+                <w:szCs w:val="20"/>
+              </w:rPr>
+              <w:t xml:space="preserve">Senderliste, Infoleiste, Programm des Senders</w:t>
+            </w:r>
+          </w:p>
+        </w:tc>
+      </w:tr>
+    </w:tbl>
+    <w:p>
+      <w:pPr>
+        <w:pStyle w:val="Heading2"/>
+        <w:spacing w:after="120" w:before="240"/>
+      </w:pPr>
+      <w:r>
+        <w:t xml:space="preserve">Updates</w:t>
+      </w:r>
+    </w:p>
+    <w:p>
+      <w:pPr>
+        <w:spacing w:after="120"/>
+      </w:pPr>
+      <w:r>
+        <w:t xml:space="preserve">Die Kachel „Update“ prüft alle 24 Stunden bei GitHub und leuchtet bei einer neuen Version. Installiert wird wie oben (Schritt 4) mit derselben Zertifikat-Datei – Zugänge, Favoriten und Verlauf bleiben erhalten.</w:t>
+      </w:r>
+    </w:p>
+    <w:p>
+      <w:pPr>
+        <w:pBdr>
+          <w:left w:val="single" w:color="1E88B8" w:sz="18" w:space="8"/>
+        </w:pBdr>
+        <w:spacing w:after="160" w:before="80"/>
+        <w:ind w:left="240"/>
+      </w:pPr>
+      <w:r>
+        <w:rPr>
+          <w:b/>
+          <w:bCs/>
+          <w:color w:val="1E88B8"/>
+        </w:rPr>
+        <w:t xml:space="preserve">Tipp: </w:t>
+      </w:r>
+      <w:r>
+        <w:t xml:space="preserve">Die Zertifikat-Dateien (author.p12, distributor.p12) gut aufheben und nie weitergeben. Mit einem neuen Zertifikat muss die App vorher deinstalliert werden.</w:t>
       </w:r>
     </w:p>
     <w:sectPr>
@@ -5502,6 +6279,54 @@
     </w:lvl>
   </w:abstractNum>
   <w:abstractNum w:abstractNumId="8" w15:restartNumberingAfterBreak="0">
+    <w:multiLevelType w:val="hybridMultilevel"/>
+    <w:lvl w:ilvl="0" w15:tentative="1">
+      <w:start w:val="1"/>
+      <w:numFmt w:val="decimal"/>
+      <w:lvlText w:val="%1."/>
+      <w:lvlJc w:val="left"/>
+      <w:pPr>
+        <w:ind w:left="540" w:hanging="270"/>
+      </w:pPr>
+    </w:lvl>
+  </w:abstractNum>
+  <w:abstractNum w:abstractNumId="9" w15:restartNumberingAfterBreak="0">
+    <w:multiLevelType w:val="hybridMultilevel"/>
+    <w:lvl w:ilvl="0" w15:tentative="1">
+      <w:start w:val="1"/>
+      <w:numFmt w:val="decimal"/>
+      <w:lvlText w:val="%1."/>
+      <w:lvlJc w:val="left"/>
+      <w:pPr>
+        <w:ind w:left="540" w:hanging="270"/>
+      </w:pPr>
+    </w:lvl>
+  </w:abstractNum>
+  <w:abstractNum w:abstractNumId="10" w15:restartNumberingAfterBreak="0">
+    <w:multiLevelType w:val="hybridMultilevel"/>
+    <w:lvl w:ilvl="0" w15:tentative="1">
+      <w:start w:val="1"/>
+      <w:numFmt w:val="decimal"/>
+      <w:lvlText w:val="%1."/>
+      <w:lvlJc w:val="left"/>
+      <w:pPr>
+        <w:ind w:left="540" w:hanging="270"/>
+      </w:pPr>
+    </w:lvl>
+  </w:abstractNum>
+  <w:abstractNum w:abstractNumId="11" w15:restartNumberingAfterBreak="0">
+    <w:multiLevelType w:val="hybridMultilevel"/>
+    <w:lvl w:ilvl="0" w15:tentative="1">
+      <w:start w:val="1"/>
+      <w:numFmt w:val="decimal"/>
+      <w:lvlText w:val="%1."/>
+      <w:lvlJc w:val="left"/>
+      <w:pPr>
+        <w:ind w:left="540" w:hanging="270"/>
+      </w:pPr>
+    </w:lvl>
+  </w:abstractNum>
+  <w:abstractNum w:abstractNumId="12" w15:restartNumberingAfterBreak="0">
     <w:multiLevelType w:val="hybridMultilevel"/>
     <w:lvl w:ilvl="0" w15:tentative="1">
       <w:start w:val="1"/>
@@ -5551,6 +6376,30 @@
   </w:num>
   <w:num w:numId="7">
     <w:abstractNumId w:val="6"/>
+    <w:lvlOverride w:ilvl="0">
+      <w:startOverride w:val="1"/>
+    </w:lvlOverride>
+  </w:num>
+  <w:num w:numId="8">
+    <w:abstractNumId w:val="8"/>
+    <w:lvlOverride w:ilvl="0">
+      <w:startOverride w:val="1"/>
+    </w:lvlOverride>
+  </w:num>
+  <w:num w:numId="9">
+    <w:abstractNumId w:val="9"/>
+    <w:lvlOverride w:ilvl="0">
+      <w:startOverride w:val="1"/>
+    </w:lvlOverride>
+  </w:num>
+  <w:num w:numId="10">
+    <w:abstractNumId w:val="10"/>
+    <w:lvlOverride w:ilvl="0">
+      <w:startOverride w:val="1"/>
+    </w:lvlOverride>
+  </w:num>
+  <w:num w:numId="11">
+    <w:abstractNumId w:val="11"/>
     <w:lvlOverride w:ilvl="0">
       <w:startOverride w:val="1"/>
     </w:lvlOverride>

</xml_diff>

<commit_message>
Portiva Link: Zugang per QR uebertragen + Wiedergabe an anderes Geraet senden (Android, Windows, Samsung TV)
- Wer schaut?: QR-Symbol neben Stift/Muelleimer -> grosser QR des Zugangs (Kreuz/daneben tippen schliesst)
- Neuer Zugang: Manuell / QR-Code scannen (Kamera) / Vom anderen Geraet empfangen (TV zeigt Code)
- Handy: 'An TV-Stick / Fernseher senden' -> Code am TV scannen -> nur dieser eine Zugang wird uebertragen
- Player: 'An Geraet senden' -> Portiva-Geraete im Heimnetz finden, dort an gleicher Stelle weiter
- Gemeinsamer Kern app/.../link/PortivaLink.kt (HTTP-Dienst 47800, UDP-Suche 47801), QrCode.kt geteilt mit Windows
- Samsung TV: holt Zugang beim Handy ab (darf selbst nichts empfangen), sendet Wiedergabe
- Anleitung Kapitel 16 (1.1.82)

Co-Authored-By: Claude Opus 5.5 <noreply@anthropic.com>
Claude-Session: https://claude.ai/code/session_01CaJqjA6T7wr6qkboQBX5Ep
</commit_message>
<xml_diff>
--- a/docs/PowerIPTV-Anleitung.docx
+++ b/docs/PowerIPTV-Anleitung.docx
@@ -49,7 +49,7 @@
         <w:rPr>
           <w:color w:val="666666"/>
         </w:rPr>
-        <w:t xml:space="preserve">Stand: Version 1.1.81 · Oktober 2026</w:t>
+        <w:t xml:space="preserve">Stand: Version 1.1.82 · Oktober 2026</w:t>
       </w:r>
     </w:p>
     <w:p>
@@ -6000,6 +6000,199 @@
       </w:r>
       <w:r>
         <w:t xml:space="preserve">Die Zertifikat-Dateien (author.p12, distributor.p12) gut aufheben und nie weitergeben. Mit einem neuen Zertifikat muss die App vorher deinstalliert werden.</w:t>
+      </w:r>
+    </w:p>
+    <w:p>
+      <w:r>
+        <w:br w:type="page"/>
+      </w:r>
+    </w:p>
+    <w:p>
+      <w:pPr>
+        <w:pStyle w:val="Heading1"/>
+        <w:spacing w:after="160" w:before="360"/>
+      </w:pPr>
+      <w:r>
+        <w:t xml:space="preserve">16. Portiva Link: Zugang übertragen &amp; an Gerät senden</w:t>
+      </w:r>
+    </w:p>
+    <w:p>
+      <w:pPr>
+        <w:spacing w:after="120"/>
+      </w:pPr>
+      <w:r>
+        <w:t xml:space="preserve">Portiva-Geräte im selben WLAN arbeiten zusammen – ohne Konto, ohne Cloud, ohne Chromecast. Übertragen wird immer nur der eine Zugang, den du auswählst.</w:t>
+      </w:r>
+    </w:p>
+    <w:p>
+      <w:pPr>
+        <w:pStyle w:val="Heading2"/>
+        <w:spacing w:after="120" w:before="240"/>
+      </w:pPr>
+      <w:r>
+        <w:t xml:space="preserve">Zugang auf Handy/Tablet übertragen (mit Kamera)</w:t>
+      </w:r>
+    </w:p>
+    <w:p>
+      <w:pPr>
+        <w:pStyle w:val="ListParagraph"/>
+        <w:numPr>
+          <w:ilvl w:val="0"/>
+          <w:numId w:val="12"/>
+        </w:numPr>
+        <w:spacing w:after="60"/>
+      </w:pPr>
+      <w:r>
+        <w:t xml:space="preserve">Am Gerät mit dem Zugang: Benutzer wechseln („Wer schaut?“) → beim gewünschten Zugang auf das QR-Symbol (links neben Stift und Mülleimer) tippen. Der Code erscheint groß; schließen mit dem Kreuz oder durch Tippen daneben.</w:t>
+      </w:r>
+    </w:p>
+    <w:p>
+      <w:pPr>
+        <w:pStyle w:val="ListParagraph"/>
+        <w:numPr>
+          <w:ilvl w:val="0"/>
+          <w:numId w:val="12"/>
+        </w:numPr>
+        <w:spacing w:after="60"/>
+      </w:pPr>
+      <w:r>
+        <w:t xml:space="preserve">Am neuen Handy/Tablet: Benutzer wechseln → „Neuer Zugang“ → „QR-Code scannen“ → Code scannen. Fertig – der Zugang ist eingerichtet und aktiv.</w:t>
+      </w:r>
+    </w:p>
+    <w:p>
+      <w:pPr>
+        <w:pStyle w:val="Heading2"/>
+        <w:spacing w:after="120" w:before="240"/>
+      </w:pPr>
+      <w:r>
+        <w:t xml:space="preserve">Zugang auf TV-Stick, Fernseher oder PC übertragen (ohne Kamera)</w:t>
+      </w:r>
+    </w:p>
+    <w:p>
+      <w:pPr>
+        <w:pStyle w:val="ListParagraph"/>
+        <w:numPr>
+          <w:ilvl w:val="0"/>
+          <w:numId w:val="13"/>
+        </w:numPr>
+        <w:spacing w:after="60"/>
+      </w:pPr>
+      <w:r>
+        <w:t xml:space="preserve">Am TV-Stick / Android TV: Benutzer wechseln → „Neuer Zugang“ → „Vom anderen Gerät empfangen“. Samsung-TV: Benutzer wechseln → „Vom Handy empfangen“. Windows: Zugänge → „Vom Handy empfangen“. Es erscheint ein QR-Code.</w:t>
+      </w:r>
+    </w:p>
+    <w:p>
+      <w:pPr>
+        <w:pStyle w:val="ListParagraph"/>
+        <w:numPr>
+          <w:ilvl w:val="0"/>
+          <w:numId w:val="13"/>
+        </w:numPr>
+        <w:spacing w:after="60"/>
+      </w:pPr>
+      <w:r>
+        <w:t xml:space="preserve">Am Handy: Benutzer wechseln → beim gewünschten Zugang auf das QR-Symbol tippen → „An TV-Stick / Fernseher senden“ → den Code am TV scannen.</w:t>
+      </w:r>
+    </w:p>
+    <w:p>
+      <w:pPr>
+        <w:pStyle w:val="ListParagraph"/>
+        <w:numPr>
+          <w:ilvl w:val="0"/>
+          <w:numId w:val="13"/>
+        </w:numPr>
+        <w:spacing w:after="60"/>
+      </w:pPr>
+      <w:r>
+        <w:t xml:space="preserve">Der Zugang erscheint sofort auf dem TV und wird aktiviert. Beim Samsung-TV dauert es einige Sekunden (der Fernseher holt den Zugang beim Handy ab – Portiva am Handy so lange geöffnet lassen).</w:t>
+      </w:r>
+    </w:p>
+    <w:p>
+      <w:pPr>
+        <w:pBdr>
+          <w:left w:val="single" w:color="1E88B8" w:sz="18" w:space="8"/>
+        </w:pBdr>
+        <w:spacing w:after="160" w:before="80"/>
+        <w:ind w:left="240"/>
+      </w:pPr>
+      <w:r>
+        <w:rPr>
+          <w:b/>
+          <w:bCs/>
+          <w:color w:val="1E88B8"/>
+        </w:rPr>
+        <w:t xml:space="preserve">Tipp: </w:t>
+      </w:r>
+      <w:r>
+        <w:t xml:space="preserve">Der QR-Code eines Zugangs enthält die Zugangsdaten – nur dir selbst zeigen. Lokale M3U-Dateien lassen sich nicht übertragen (dort fehlt das QR-Symbol).</w:t>
+      </w:r>
+    </w:p>
+    <w:p>
+      <w:pPr>
+        <w:pStyle w:val="Heading2"/>
+        <w:spacing w:after="120" w:before="240"/>
+      </w:pPr>
+      <w:r>
+        <w:t xml:space="preserve">Wiedergabe an ein anderes Gerät senden</w:t>
+      </w:r>
+    </w:p>
+    <w:p>
+      <w:pPr>
+        <w:pStyle w:val="ListParagraph"/>
+        <w:numPr>
+          <w:ilvl w:val="0"/>
+          <w:numId w:val="14"/>
+        </w:numPr>
+        <w:spacing w:after="60"/>
+      </w:pPr>
+      <w:r>
+        <w:t xml:space="preserve">Im Player oben auf das Fernseher-Symbol „An Gerät senden“ tippen (Samsung-TV: Knopf „📲 Senden“ in der Leiste).</w:t>
+      </w:r>
+    </w:p>
+    <w:p>
+      <w:pPr>
+        <w:pStyle w:val="ListParagraph"/>
+        <w:numPr>
+          <w:ilvl w:val="0"/>
+          <w:numId w:val="14"/>
+        </w:numPr>
+        <w:spacing w:after="60"/>
+      </w:pPr>
+      <w:r>
+        <w:t xml:space="preserve">Portiva sucht alle Portiva-Geräte im Heimnetz (TV-Stick, Tablet, Handy, Windows-PC) → Gerät wählen.</w:t>
+      </w:r>
+    </w:p>
+    <w:p>
+      <w:pPr>
+        <w:pStyle w:val="ListParagraph"/>
+        <w:numPr>
+          <w:ilvl w:val="0"/>
+          <w:numId w:val="14"/>
+        </w:numPr>
+        <w:spacing w:after="60"/>
+      </w:pPr>
+      <w:r>
+        <w:t xml:space="preserve">Der Film läuft dort an derselben Stelle weiter (Live TV: derselbe Sender), hier wird gestoppt.</w:t>
+      </w:r>
+    </w:p>
+    <w:p>
+      <w:pPr>
+        <w:pBdr>
+          <w:left w:val="single" w:color="1E88B8" w:sz="18" w:space="8"/>
+        </w:pBdr>
+        <w:spacing w:after="160" w:before="80"/>
+        <w:ind w:left="240"/>
+      </w:pPr>
+      <w:r>
+        <w:rPr>
+          <w:b/>
+          <w:bCs/>
+          <w:color w:val="1E88B8"/>
+        </w:rPr>
+        <w:t xml:space="preserve">Tipp: </w:t>
+      </w:r>
+      <w:r>
+        <w:t xml:space="preserve">Portiva muss auf dem Zielgerät geöffnet sein (Android ab Version 10 erlaubt Apps im Hintergrund nicht, sich selbst zu öffnen). Samsung-Fernseher können senden, aber nichts empfangen. Windows fragt beim ersten Mal nach der Firewall – „Zulassen“ wählen.</w:t>
       </w:r>
     </w:p>
     <w:sectPr>
@@ -6327,6 +6520,42 @@
     </w:lvl>
   </w:abstractNum>
   <w:abstractNum w:abstractNumId="12" w15:restartNumberingAfterBreak="0">
+    <w:multiLevelType w:val="hybridMultilevel"/>
+    <w:lvl w:ilvl="0" w15:tentative="1">
+      <w:start w:val="1"/>
+      <w:numFmt w:val="decimal"/>
+      <w:lvlText w:val="%1."/>
+      <w:lvlJc w:val="left"/>
+      <w:pPr>
+        <w:ind w:left="540" w:hanging="270"/>
+      </w:pPr>
+    </w:lvl>
+  </w:abstractNum>
+  <w:abstractNum w:abstractNumId="13" w15:restartNumberingAfterBreak="0">
+    <w:multiLevelType w:val="hybridMultilevel"/>
+    <w:lvl w:ilvl="0" w15:tentative="1">
+      <w:start w:val="1"/>
+      <w:numFmt w:val="decimal"/>
+      <w:lvlText w:val="%1."/>
+      <w:lvlJc w:val="left"/>
+      <w:pPr>
+        <w:ind w:left="540" w:hanging="270"/>
+      </w:pPr>
+    </w:lvl>
+  </w:abstractNum>
+  <w:abstractNum w:abstractNumId="14" w15:restartNumberingAfterBreak="0">
+    <w:multiLevelType w:val="hybridMultilevel"/>
+    <w:lvl w:ilvl="0" w15:tentative="1">
+      <w:start w:val="1"/>
+      <w:numFmt w:val="decimal"/>
+      <w:lvlText w:val="%1."/>
+      <w:lvlJc w:val="left"/>
+      <w:pPr>
+        <w:ind w:left="540" w:hanging="270"/>
+      </w:pPr>
+    </w:lvl>
+  </w:abstractNum>
+  <w:abstractNum w:abstractNumId="15" w15:restartNumberingAfterBreak="0">
     <w:multiLevelType w:val="hybridMultilevel"/>
     <w:lvl w:ilvl="0" w15:tentative="1">
       <w:start w:val="1"/>
@@ -6400,6 +6629,24 @@
   </w:num>
   <w:num w:numId="11">
     <w:abstractNumId w:val="11"/>
+    <w:lvlOverride w:ilvl="0">
+      <w:startOverride w:val="1"/>
+    </w:lvlOverride>
+  </w:num>
+  <w:num w:numId="12">
+    <w:abstractNumId w:val="12"/>
+    <w:lvlOverride w:ilvl="0">
+      <w:startOverride w:val="1"/>
+    </w:lvlOverride>
+  </w:num>
+  <w:num w:numId="13">
+    <w:abstractNumId w:val="13"/>
+    <w:lvlOverride w:ilvl="0">
+      <w:startOverride w:val="1"/>
+    </w:lvlOverride>
+  </w:num>
+  <w:num w:numId="14">
+    <w:abstractNumId w:val="14"/>
     <w:lvlOverride w:ilvl="0">
       <w:startOverride w:val="1"/>
     </w:lvlOverride>

</xml_diff>

<commit_message>
Uebertragen-Fenster schliesst nicht mehr von selbst + Portiva-Geraete direkt im Uebertragen-Fenster
- Player-Leiste bleibt sichtbar, solange das Uebertragen-/Senden-Fenster offen ist (Android Standard + VLC, Windows)
- Uebertragen-Fenster zeigt unter 'Portiva-Geraete' TV-Stick/Tablet/PC zum Weiterschauen an gleicher Stelle
- Auf Geraeten ohne Google Cast (z.B. Fire TV) erscheint der Knopf jetzt ebenfalls
- Anleitung 1.1.83

Co-Authored-By: Claude Opus 5.5 <noreply@anthropic.com>
Claude-Session: https://claude.ai/code/session_01CaJqjA6T7wr6qkboQBX5Ep
</commit_message>
<xml_diff>
--- a/docs/PowerIPTV-Anleitung.docx
+++ b/docs/PowerIPTV-Anleitung.docx
@@ -49,7 +49,7 @@
         <w:rPr>
           <w:color w:val="666666"/>
         </w:rPr>
-        <w:t xml:space="preserve">Stand: Version 1.1.82 · Oktober 2026</w:t>
+        <w:t xml:space="preserve">Stand: Version 1.1.83 · Oktober 2026</w:t>
       </w:r>
     </w:p>
     <w:p>
@@ -6146,7 +6146,7 @@
         <w:spacing w:after="60"/>
       </w:pPr>
       <w:r>
-        <w:t xml:space="preserve">Im Player oben auf das Fernseher-Symbol „An Gerät senden“ tippen (Samsung-TV: Knopf „📲 Senden“ in der Leiste).</w:t>
+        <w:t xml:space="preserve">Im Player oben auf das Übertragen-Symbol (wie bei Chromecast) oder das Fernseher-Symbol „An Gerät senden“ tippen (Samsung-TV: Knopf „📲 Senden“). Das Fenster bleibt offen, bis du es schließt – auch wenn die Suche etwas dauert.</w:t>
       </w:r>
     </w:p>
     <w:p>
@@ -6159,7 +6159,7 @@
         <w:spacing w:after="60"/>
       </w:pPr>
       <w:r>
-        <w:t xml:space="preserve">Portiva sucht alle Portiva-Geräte im Heimnetz (TV-Stick, Tablet, Handy, Windows-PC) → Gerät wählen.</w:t>
+        <w:t xml:space="preserve">Unter „Portiva-Geräte“ erscheinen alle Geräte mit geöffnetem Portiva im Heimnetz (TV-Stick, Tablet, Handy, Windows-PC) → Gerät wählen. Darüber stehen wie bisher Chromecast-Geräte.</w:t>
       </w:r>
     </w:p>
     <w:p>

</xml_diff>

<commit_message>
Schnelleres Spulen (Android + Windows)
- Standard-Player: Spruenge zum naechsten Schluesselbild (CLOSEST_SYNC) statt exakt -> kein langes Nachladen
- Mehrfaches Tippen auf 10s-Tasten/Pfeile/Doppeltipp wird gesammelt -> nur ein Sprung (eine neue Verbindung statt vieler)
- VLC (Android + Windows): input-fast-seek fuer Filme, Spruenge immer zum Schluesselbild
- Spul-Vorschau im Ein-Verbindungs-Modus setzt schneller fort
- Anleitung 1.1.84

Co-Authored-By: Claude Opus 5.5 <noreply@anthropic.com>
Claude-Session: https://claude.ai/code/session_01CaJqjA6T7wr6qkboQBX5Ep
</commit_message>
<xml_diff>
--- a/docs/PowerIPTV-Anleitung.docx
+++ b/docs/PowerIPTV-Anleitung.docx
@@ -49,7 +49,7 @@
         <w:rPr>
           <w:color w:val="666666"/>
         </w:rPr>
-        <w:t xml:space="preserve">Stand: Version 1.1.83 · Oktober 2026</w:t>
+        <w:t xml:space="preserve">Stand: Version 1.1.84 · Oktober 2026</w:t>
       </w:r>
     </w:p>
     <w:p>
@@ -3554,7 +3554,7 @@
                 <w:sz w:val="20"/>
                 <w:szCs w:val="20"/>
               </w:rPr>
-              <w:t xml:space="preserve">Behoben ab 1.1.79: Bei Zugängen mit nur 1 Stream öffnet die Vorschau keine 2. Verbindung mehr. Ab 1.1.80 gibt es die Vorschaubilder dort trotzdem wieder: Der Film hält beim Ziehen kurz an. Hängt das Bild länger als 10 Sekunden, lädt der Player den Stream automatisch an derselben Stelle neu.</w:t>
+              <w:t xml:space="preserve">Behoben ab 1.1.79: Bei Zugängen mit nur 1 Stream öffnet die Vorschau keine 2. Verbindung mehr. Ab 1.1.80 gibt es die Vorschaubilder dort trotzdem wieder: Der Film hält beim Ziehen kurz an. Ab 1.1.84 spult der Player schneller: mehrere Tipps auf ⏪10/10⏩ werden zu einem Sprung zusammengefasst und es wird zum nächsten Schlüsselbild gesprungen (kein langes Nachladen bis zur exakten Sekunde). Hängt das Bild länger als 10 Sekunden, lädt der Player den Stream automatisch an derselben Stelle neu.</w:t>
             </w:r>
           </w:p>
         </w:tc>

</xml_diff>

<commit_message>
Portiva-P oben links auf jeder Seite fuehrt zur Startseite (Android, Windows, Samsung TV)
- Android: in allen Kopfzeilen (auch Kategorie-Leiste auf Tablet/TV und Wer schaut?) neben dem Zurueck-Pfeil
- Windows: Logo oben in der linken Leiste klickbar
- Samsung TV: P-Knopf neben Zurueck in jeder Kopfzeile
- Anleitung 1.1.85

Co-Authored-By: Claude Opus 5.5 <noreply@anthropic.com>
Claude-Session: https://claude.ai/code/session_01CaJqjA6T7wr6qkboQBX5Ep
</commit_message>
<xml_diff>
--- a/docs/PowerIPTV-Anleitung.docx
+++ b/docs/PowerIPTV-Anleitung.docx
@@ -49,7 +49,7 @@
         <w:rPr>
           <w:color w:val="666666"/>
         </w:rPr>
-        <w:t xml:space="preserve">Stand: Version 1.1.84 · Oktober 2026</w:t>
+        <w:t xml:space="preserve">Stand: Version 1.1.85 · Oktober 2026</w:t>
       </w:r>
     </w:p>
     <w:p>
@@ -720,6 +720,26 @@
       </w:pPr>
       <w:r>
         <w:t xml:space="preserve">Playlist und TV-Guide werden ebenfalls automatisch alle 24 Stunden aktualisiert – auch wenn die App länger geöffnet bleibt. Sofort geht es über die zwei Pfeile oben.</w:t>
+      </w:r>
+    </w:p>
+    <w:p>
+      <w:pPr>
+        <w:pBdr>
+          <w:left w:val="single" w:color="1E88B8" w:sz="18" w:space="8"/>
+        </w:pBdr>
+        <w:spacing w:after="160" w:before="80"/>
+        <w:ind w:left="240"/>
+      </w:pPr>
+      <w:r>
+        <w:rPr>
+          <w:b/>
+          <w:bCs/>
+          <w:color w:val="1E88B8"/>
+        </w:rPr>
+        <w:t xml:space="preserve">Tipp: </w:t>
+      </w:r>
+      <w:r>
+        <w:t xml:space="preserve">Auf jeder Seite steht oben links das Portiva-„P“ – ein Tipp (am Fernseher: Pfeil hoch, OK) führt direkt zur Startseite.</w:t>
       </w:r>
     </w:p>
     <w:p>

</xml_diff>

<commit_message>
Player-Bedienung wie Vorbild: Helligkeit links, Lautstaerke rechts, unten Seitenverhaeltnis/Geschwindigkeit/Untertitel
- Android (Standard + VLC): senkrechte Regler fuer Helligkeit (Fenster) und Lautstaerke (System) auf Handy/Tablet,
  Knopfleiste unten; Zahnrad nur noch Tonspur + Sleep-Timer; media3-eigenes Zahnrad ausgeblendet
- Windows: Bildhelligkeit (VLC) links, Lautstaerke rechts (Ziehen/Klick/Mausrad), Knopfleiste unten mit Menues
- Samsung TV: Knopfleiste unten (Seitenverhaeltnis, Geschwindigkeit, Untertitel); Ton/Helligkeit ueber den Fernseher
- Anleitung 1.1.86

Co-Authored-By: Claude Opus 5.5 <noreply@anthropic.com>
Claude-Session: https://claude.ai/code/session_01CaJqjA6T7wr6qkboQBX5Ep
</commit_message>
<xml_diff>
--- a/docs/PowerIPTV-Anleitung.docx
+++ b/docs/PowerIPTV-Anleitung.docx
@@ -49,7 +49,7 @@
         <w:rPr>
           <w:color w:val="666666"/>
         </w:rPr>
-        <w:t xml:space="preserve">Stand: Version 1.1.85 · Oktober 2026</w:t>
+        <w:t xml:space="preserve">Stand: Version 1.1.86 · Oktober 2026</w:t>
       </w:r>
     </w:p>
     <w:p>
@@ -740,6 +740,26 @@
       </w:r>
       <w:r>
         <w:t xml:space="preserve">Auf jeder Seite steht oben links das Portiva-„P“ – ein Tipp (am Fernseher: Pfeil hoch, OK) führt direkt zur Startseite.</w:t>
+      </w:r>
+    </w:p>
+    <w:p>
+      <w:pPr>
+        <w:pBdr>
+          <w:left w:val="single" w:color="1E88B8" w:sz="18" w:space="8"/>
+        </w:pBdr>
+        <w:spacing w:after="160" w:before="80"/>
+        <w:ind w:left="240"/>
+      </w:pPr>
+      <w:r>
+        <w:rPr>
+          <w:b/>
+          <w:bCs/>
+          <w:color w:val="1E88B8"/>
+        </w:rPr>
+        <w:t xml:space="preserve">Tipp: </w:t>
+      </w:r>
+      <w:r>
+        <w:t xml:space="preserve">Im Player: links Helligkeit, rechts Lautstärke (senkrechte Regler zum Ziehen oder Antippen; am Fernseher regelt das die Fernbedienung). Unten unter dem Zeitstrahl: Seitenverhältnis – Geschwindigkeit – Untertitel. Das Zahnrad oben enthält jetzt Tonspur und Sleep-Timer.</w:t>
       </w:r>
     </w:p>
     <w:p>

</xml_diff>

<commit_message>
Zahnrad als Einstellungsleiste rechts (Video-/Audio-/Untertitelspuren, Untertitel-Stil, Sleep-Timer), Untertitel-Knopf nur ein/aus
- Android (Standard + VLC): Seitenleiste wie Vorbild mit ausfuehrlichen Spurangaben (Codec, kb/s, Aufloesung, Hz), 'Aus' je Spurart
- Untertitel-Knopf unten + Untertitel-Taste: ein/aus (letzte bzw. deutsche Spur)
- Windows: Zahnrad mit Video-, Ton-, Untertitelspur + Sleep-Timer, Untertitel-Knopf ein/aus
- Samsung TV: Einstellungen (Audio-/Untertitelspur, Sleep-Timer), Untertitel-Knopf/gelbe Taste ein/aus
- Anleitung 1.1.88

Co-Authored-By: Claude Opus 5.5 <noreply@anthropic.com>
Claude-Session: https://claude.ai/code/session_01CaJqjA6T7wr6qkboQBX5Ep
</commit_message>
<xml_diff>
--- a/docs/PowerIPTV-Anleitung.docx
+++ b/docs/PowerIPTV-Anleitung.docx
@@ -49,7 +49,7 @@
         <w:rPr>
           <w:color w:val="666666"/>
         </w:rPr>
-        <w:t xml:space="preserve">Stand: Version 1.1.86 · Oktober 2026</w:t>
+        <w:t xml:space="preserve">Stand: Version 1.1.88 · Oktober 2026</w:t>
       </w:r>
     </w:p>
     <w:p>
@@ -759,7 +759,7 @@
         <w:t xml:space="preserve">Tipp: </w:t>
       </w:r>
       <w:r>
-        <w:t xml:space="preserve">Im Player: links Helligkeit, rechts Lautstärke (senkrechte Regler zum Ziehen oder Antippen; am Fernseher regelt das die Fernbedienung). Unten unter dem Zeitstrahl: Seitenverhältnis – Geschwindigkeit – Untertitel. Das Zahnrad oben enthält jetzt Tonspur und Sleep-Timer.</w:t>
+        <w:t xml:space="preserve">Im Player: links Helligkeit, rechts Lautstärke (senkrechte Regler zum Ziehen oder Antippen; am Fernseher regelt das die Fernbedienung). Unten unter dem Zeitstrahl: Seitenverhältnis – Geschwindigkeit – Untertitel (ein/aus). Das Zahnrad oben öffnet rechts die Einstellungsleiste: Videospuren, Audiospuren (mit Codec, kb/s, Hz), Untertitelspuren, Untertitel-Einstellungen (Schriftgröße, Hintergrund) und Sleep-Timer.</w:t>
       </w:r>
     </w:p>
     <w:p>

</xml_diff>

<commit_message>
iOS-App (Etappe 1) mit VLC + Android: VLC als Standard fuer Filme & Serien
- Neuer Ordner iOS/: SwiftUI-App mit MobileVLCKit (gleicher Player wie Android/Windows):
  Zugaenge (Xtream/M3U, Schluesselbund), QR scannen/zeigen, Vom anderen Geraet empfangen, Startseite,
  Stoebern mit Sprache/Kategorien, Details/Staffeln/Folgen, Weiterschauen, Favoriten, Suche, TV-Guide mit Catch-up,
  Player (Helligkeit/Lautstaerke, Seitenverhaeltnis, Geschwindigkeit, Untertitel ein/aus, Einstellungsleiste,
  naechste Folge, Neuverbinden, Haenger-Waechter), Portiva Link (Senden/Empfangen), Update-Pruefung
- CI: macOS-Job baut unsignierte .ipa ins Release (XcodeGen + CocoaPods)
- Android: Automatik nimmt fuer Filme & Serien VLC, Live TV bleibt beim Standard-Player (Live-Pause)
- Anleitung Kapitel 17 iPhone & iPad (1.1.89)

Co-Authored-By: Claude Opus 5.5 <noreply@anthropic.com>
Claude-Session: https://claude.ai/code/session_01CaJqjA6T7wr6qkboQBX5Ep
</commit_message>
<xml_diff>
--- a/docs/PowerIPTV-Anleitung.docx
+++ b/docs/PowerIPTV-Anleitung.docx
@@ -49,7 +49,7 @@
         <w:rPr>
           <w:color w:val="666666"/>
         </w:rPr>
-        <w:t xml:space="preserve">Stand: Version 1.1.88 · Oktober 2026</w:t>
+        <w:t xml:space="preserve">Stand: Version 1.1.89 · Oktober 2026</w:t>
       </w:r>
     </w:p>
     <w:p>
@@ -103,7 +103,7 @@
         <w:spacing w:after="120"/>
       </w:pPr>
       <w:r>
-        <w:t xml:space="preserve">PowerIPTV ist ein IPTV-Player für Live-TV, Filme und Serien deines Anbieters (Xtream Codes oder M3U). Eine einzige App-Datei läuft auf Handy, Tablet, Fire TV und Android TV und passt die Oberfläche automatisch an. Zusätzlich gibt es eine eigene Version für Windows-PCs (Kapitel 14) und für Samsung Smart TVs ab 2018 (Kapitel 15).</w:t>
+        <w:t xml:space="preserve">PowerIPTV ist ein IPTV-Player für Live-TV, Filme und Serien deines Anbieters (Xtream Codes oder M3U). Eine einzige App-Datei läuft auf Handy, Tablet, Fire TV und Android TV und passt die Oberfläche automatisch an. Zusätzlich gibt es eine eigene Version für Windows-PCs (Kapitel 14) und für Samsung Smart TVs ab 2018 (Kapitel 15) sowie für iPhone &amp; iPad (Kapitel 17).</w:t>
       </w:r>
     </w:p>
     <w:tbl>
@@ -6233,6 +6233,143 @@
       </w:r>
       <w:r>
         <w:t xml:space="preserve">Portiva muss auf dem Zielgerät geöffnet sein (Android ab Version 10 erlaubt Apps im Hintergrund nicht, sich selbst zu öffnen). Samsung-Fernseher können senden, aber nichts empfangen. Windows fragt beim ersten Mal nach der Firewall – „Zulassen“ wählen.</w:t>
+      </w:r>
+    </w:p>
+    <w:p>
+      <w:r>
+        <w:br w:type="page"/>
+      </w:r>
+    </w:p>
+    <w:p>
+      <w:pPr>
+        <w:pStyle w:val="Heading1"/>
+        <w:spacing w:after="160" w:before="360"/>
+      </w:pPr>
+      <w:r>
+        <w:t xml:space="preserve">17. PowerIPTV für iPhone &amp; iPad</w:t>
+      </w:r>
+    </w:p>
+    <w:p>
+      <w:pPr>
+        <w:spacing w:after="120"/>
+      </w:pPr>
+      <w:r>
+        <w:t xml:space="preserve">Die iOS-Version nutzt denselben Player wie Android und Windows: VLC. Damit laufen auch DTS-, AC3- und MKV-Filme. Sie kann Zugänge (auch per QR-Code), Live TV, Filme und Serien mit Sprachauswahl, Weiterschauen, Favoriten, Suche, TV-Guide mit Catch-up, Player mit Helligkeit/Lautstärke, Seitenverhältnis, Geschwindigkeit, Untertiteln und Einstellungsleiste sowie „An Gerät senden“.</w:t>
+      </w:r>
+    </w:p>
+    <w:p>
+      <w:pPr>
+        <w:pBdr>
+          <w:left w:val="single" w:color="1E88B8" w:sz="18" w:space="8"/>
+        </w:pBdr>
+        <w:spacing w:after="160" w:before="80"/>
+        <w:ind w:left="240"/>
+      </w:pPr>
+      <w:r>
+        <w:rPr>
+          <w:b/>
+          <w:bCs/>
+          <w:color w:val="1E88B8"/>
+        </w:rPr>
+        <w:t xml:space="preserve">Tipp: </w:t>
+      </w:r>
+      <w:r>
+        <w:t xml:space="preserve">Apple erlaubt Apps außerhalb des App Stores nur mit einer Apple-ID-Signatur. Mit einer kostenlosen Apple-ID läuft die App 7 Tage und muss dann neu aufgespielt werden (Zugänge bleiben erhalten). Mit einem Apple-Entwicklerkonto (99 €/Jahr) gilt sie 1 Jahr.</w:t>
+      </w:r>
+    </w:p>
+    <w:p>
+      <w:pPr>
+        <w:pStyle w:val="Heading2"/>
+        <w:spacing w:after="120" w:before="240"/>
+      </w:pPr>
+      <w:r>
+        <w:t xml:space="preserve">Installation mit Sideloadly (Windows oder Mac)</w:t>
+      </w:r>
+    </w:p>
+    <w:p>
+      <w:pPr>
+        <w:pStyle w:val="ListParagraph"/>
+        <w:numPr>
+          <w:ilvl w:val="0"/>
+          <w:numId w:val="15"/>
+        </w:numPr>
+        <w:spacing w:after="60"/>
+      </w:pPr>
+      <w:r>
+        <w:t xml:space="preserve">Am PC: Sideloadly von https://sideloadly.io herunterladen und installieren. Unter Windows zusätzlich iTunes und iCloud von der Apple-Webseite (nicht aus dem Microsoft Store).</w:t>
+      </w:r>
+    </w:p>
+    <w:p>
+      <w:pPr>
+        <w:pStyle w:val="ListParagraph"/>
+        <w:numPr>
+          <w:ilvl w:val="0"/>
+          <w:numId w:val="15"/>
+        </w:numPr>
+        <w:spacing w:after="60"/>
+      </w:pPr>
+      <w:r>
+        <w:t xml:space="preserve">Auf GitHub unter „Releases“ die neueste Version öffnen und „Portiva-iOS-v1.1.X.ipa“ herunterladen.</w:t>
+      </w:r>
+    </w:p>
+    <w:p>
+      <w:pPr>
+        <w:pStyle w:val="ListParagraph"/>
+        <w:numPr>
+          <w:ilvl w:val="0"/>
+          <w:numId w:val="15"/>
+        </w:numPr>
+        <w:spacing w:after="60"/>
+      </w:pPr>
+      <w:r>
+        <w:t xml:space="preserve">iPhone/iPad per Kabel anschließen, entsperren und „Vertrauen“ bestätigen.</w:t>
+      </w:r>
+    </w:p>
+    <w:p>
+      <w:pPr>
+        <w:pStyle w:val="ListParagraph"/>
+        <w:numPr>
+          <w:ilvl w:val="0"/>
+          <w:numId w:val="15"/>
+        </w:numPr>
+        <w:spacing w:after="60"/>
+      </w:pPr>
+      <w:r>
+        <w:t xml:space="preserve">Sideloadly öffnen, die .ipa hineinziehen, deine Apple-ID eintragen und „Start“ klicken.</w:t>
+      </w:r>
+    </w:p>
+    <w:p>
+      <w:pPr>
+        <w:pStyle w:val="ListParagraph"/>
+        <w:numPr>
+          <w:ilvl w:val="0"/>
+          <w:numId w:val="15"/>
+        </w:numPr>
+        <w:spacing w:after="60"/>
+      </w:pPr>
+      <w:r>
+        <w:t xml:space="preserve">Am iPhone: Einstellungen → Datenschutz &amp; Sicherheit → Entwicklermodus einschalten (iOS 16+, Neustart). Danach Einstellungen → Allgemein → VPN &amp; Geräteverwaltung → deine Apple-ID → „Vertrauen“.</w:t>
+      </w:r>
+    </w:p>
+    <w:p>
+      <w:pPr>
+        <w:pStyle w:val="ListParagraph"/>
+        <w:numPr>
+          <w:ilvl w:val="0"/>
+          <w:numId w:val="15"/>
+        </w:numPr>
+        <w:spacing w:after="60"/>
+      </w:pPr>
+      <w:r>
+        <w:t xml:space="preserve">Portiva öffnen. Beim ersten Start fragt iOS nach „Lokales Netzwerk“ – erlauben (für QR-Übertragung und „An Gerät senden“).</w:t>
+      </w:r>
+    </w:p>
+    <w:p>
+      <w:pPr>
+        <w:spacing w:after="120"/>
+      </w:pPr>
+      <w:r>
+        <w:t xml:space="preserve">Zugang am schnellsten: Benutzer wechseln → „+“ → „QR-Code scannen“ und am anderen Gerät beim Zugang auf das QR-Symbol tippen.</w:t>
       </w:r>
     </w:p>
     <w:sectPr>
@@ -6596,6 +6733,18 @@
     </w:lvl>
   </w:abstractNum>
   <w:abstractNum w:abstractNumId="15" w15:restartNumberingAfterBreak="0">
+    <w:multiLevelType w:val="hybridMultilevel"/>
+    <w:lvl w:ilvl="0" w15:tentative="1">
+      <w:start w:val="1"/>
+      <w:numFmt w:val="decimal"/>
+      <w:lvlText w:val="%1."/>
+      <w:lvlJc w:val="left"/>
+      <w:pPr>
+        <w:ind w:left="540" w:hanging="270"/>
+      </w:pPr>
+    </w:lvl>
+  </w:abstractNum>
+  <w:abstractNum w:abstractNumId="16" w15:restartNumberingAfterBreak="0">
     <w:multiLevelType w:val="hybridMultilevel"/>
     <w:lvl w:ilvl="0" w15:tentative="1">
       <w:start w:val="1"/>
@@ -6687,6 +6836,12 @@
   </w:num>
   <w:num w:numId="14">
     <w:abstractNumId w:val="14"/>
+    <w:lvlOverride w:ilvl="0">
+      <w:startOverride w:val="1"/>
+    </w:lvlOverride>
+  </w:num>
+  <w:num w:numId="15">
+    <w:abstractNumId w:val="15"/>
     <w:lvlOverride w:ilvl="0">
       <w:startOverride w:val="1"/>
     </w:lvlOverride>

</xml_diff>

<commit_message>
Repo nach Geraeten getrennt: Android/, iOS/, Tizen Samsung/, Windows/
Android-Projekt nach Android/ verschoben, Windows mit eigenem Gradle-Wrapper,
CI-Pfade, README, CLAUDE.md und Anleitung angepasst.

Co-Authored-By: Claude Opus 5.5 <noreply@anthropic.com>
Claude-Session: https://claude.ai/code/session_01CaJqjA6T7wr6qkboQBX5Ep
</commit_message>
<xml_diff>
--- a/docs/PowerIPTV-Anleitung.docx
+++ b/docs/PowerIPTV-Anleitung.docx
@@ -49,7 +49,7 @@
         <w:rPr>
           <w:color w:val="666666"/>
         </w:rPr>
-        <w:t xml:space="preserve">Stand: Version 1.1.89 · Oktober 2026</w:t>
+        <w:t xml:space="preserve">Stand: Version 1.1.90 · Oktober 2026</w:t>
       </w:r>
     </w:p>
     <w:p>
@@ -532,6 +532,14 @@
       </w:pPr>
       <w:r>
         <w:t xml:space="preserve">2. Installation &amp; Updates</w:t>
+      </w:r>
+    </w:p>
+    <w:p>
+      <w:pPr>
+        <w:spacing w:after="120"/>
+      </w:pPr>
+      <w:r>
+        <w:t xml:space="preserve">Alle Dateien liegen im Release bereit. Der Quellcode ist auf GitHub nach Geräten getrennt: Ordner „Android“, „iOS“, „Tizen Samsung“ und „Windows“.</w:t>
       </w:r>
     </w:p>
     <w:p>

</xml_diff>

<commit_message>
Live TV: Sender-Infoleiste unten (Logo, Jetzt/Weiter, Senderliste, Seitenverhaeltnis, Mehrfachbildschirm)
In allen Varianten (Android Exo + VLC, Windows, Samsung Tizen, iOS); erscheint
bei jedem Senderwechsel und beim Antippen. Filme/Serien unveraendert.

Co-Authored-By: Claude Opus 5.5 <noreply@anthropic.com>
Claude-Session: https://claude.ai/code/session_01CaJqjA6T7wr6qkboQBX5Ep
</commit_message>
<xml_diff>
--- a/docs/PowerIPTV-Anleitung.docx
+++ b/docs/PowerIPTV-Anleitung.docx
@@ -49,7 +49,7 @@
         <w:rPr>
           <w:color w:val="666666"/>
         </w:rPr>
-        <w:t xml:space="preserve">Stand: Version 1.1.90 · Oktober 2026</w:t>
+        <w:t xml:space="preserve">Stand: Version 1.1.92 · Oktober 2026</w:t>
       </w:r>
     </w:p>
     <w:p>
@@ -767,7 +767,7 @@
         <w:t xml:space="preserve">Tipp: </w:t>
       </w:r>
       <w:r>
-        <w:t xml:space="preserve">Im Player: links Helligkeit, rechts Lautstärke (senkrechte Regler zum Ziehen oder Antippen; am Fernseher regelt das die Fernbedienung). Unten unter dem Zeitstrahl: Seitenverhältnis – Geschwindigkeit – Untertitel (ein/aus). Das Zahnrad oben öffnet rechts die Einstellungsleiste: Videospuren, Audiospuren (mit Codec, kb/s, Hz), Untertitelspuren, Untertitel-Einstellungen (Schriftgröße, Hintergrund) und Sleep-Timer.</w:t>
+        <w:t xml:space="preserve">Im Player: links Helligkeit, rechts Lautstärke (senkrechte Regler zum Ziehen oder Antippen; am Fernseher regelt das die Fernbedienung). Bei Filmen und Serien unten unter dem Zeitstrahl: Seitenverhältnis – Geschwindigkeit – Untertitel (ein/aus). Bei Live TV erscheint unten die Sender-Infoleiste – bei jedem Umschalten und beim Antippen: Senderlogo, „Jetzt“ mit Uhrzeit und Fortschrittsbalken, „Weiter“ (nächste Sendung) und darunter Senderliste – Seitenverhältnis – Mehrfachbildschirm (Mehrfachbildschirm nur Android und Windows). Das Zahnrad oben öffnet rechts die Einstellungsleiste: Videospuren, Audiospuren (mit Codec, kb/s, Hz), Untertitelspuren, Untertitel-Einstellungen (Schriftgröße, Hintergrund) und Sleep-Timer.</w:t>
       </w:r>
     </w:p>
     <w:p>

</xml_diff>

<commit_message>
Neue Variante: Fire TV mit Vega OS (neue Amazon-Sticks ohne Android)
Ordner Fire TV Vega/: React-Native-Huelle mit Vega-Hardware-Player und
durchsichtiger WebView; Oberflaeche aus Tizen Samsung/ (build.js --vega),
Netzwerk/Video ueber Bruecke src/vega.js. CI-Job firetv-vega baut .vpkg,
Release kennzeichnet sie fuer die neuen Sticks. Anleitung Kapitel 18.

Co-Authored-By: Claude Opus 5.5 <noreply@anthropic.com>
Claude-Session: https://claude.ai/code/session_01CaJqjA6T7wr6qkboQBX5Ep
</commit_message>
<xml_diff>
--- a/docs/PowerIPTV-Anleitung.docx
+++ b/docs/PowerIPTV-Anleitung.docx
@@ -49,7 +49,7 @@
         <w:rPr>
           <w:color w:val="666666"/>
         </w:rPr>
-        <w:t xml:space="preserve">Stand: Version 1.1.92 · Oktober 2026</w:t>
+        <w:t xml:space="preserve">Stand: Version 1.1.93 · Oktober 2026</w:t>
       </w:r>
     </w:p>
     <w:p>
@@ -539,7 +539,7 @@
         <w:spacing w:after="120"/>
       </w:pPr>
       <w:r>
-        <w:t xml:space="preserve">Alle Dateien liegen im Release bereit. Der Quellcode ist auf GitHub nach Geräten getrennt: Ordner „Android“, „iOS“, „Tizen Samsung“ und „Windows“.</w:t>
+        <w:t xml:space="preserve">Alle Dateien liegen im Release bereit. Der Quellcode ist auf GitHub nach Geräten getrennt: Ordner „Android“, „iOS“, „Tizen Samsung“, „Windows“ und „Fire TV Vega“ (neue Amazon-Sticks mit Vega OS).</w:t>
       </w:r>
     </w:p>
     <w:p>
@@ -597,6 +597,26 @@
       </w:pPr>
       <w:r>
         <w:t xml:space="preserve">Fire TV / Android TV</w:t>
+      </w:r>
+    </w:p>
+    <w:p>
+      <w:pPr>
+        <w:pBdr>
+          <w:left w:val="single" w:color="1E88B8" w:sz="18" w:space="8"/>
+        </w:pBdr>
+        <w:spacing w:after="160" w:before="80"/>
+        <w:ind w:left="240"/>
+      </w:pPr>
+      <w:r>
+        <w:rPr>
+          <w:b/>
+          <w:bCs/>
+          <w:color w:val="1E88B8"/>
+        </w:rPr>
+        <w:t xml:space="preserve">Tipp: </w:t>
+      </w:r>
+      <w:r>
+        <w:t xml:space="preserve">Gilt für alle Fire TV mit Fire OS (Android): Fire TV Stick (Lite/3. Gen.), Fire TV Stick 4K, 4K Max, 4K Plus, Fire TV Cube. Die NEUEN Sticks mit Vega OS (Fire TV Stick 4K Select, Fire TV Stick HD 2026, Fire TV Stick 4K 2026) können keine APK installieren – dafür gibt es die eigene Fire-TV-Vega-Version (Kapitel 18). Welcher Stick? Einstellungen → Mein Fire TV → Info.</w:t>
       </w:r>
     </w:p>
     <w:p>
@@ -6378,6 +6398,261 @@
       </w:pPr>
       <w:r>
         <w:t xml:space="preserve">Zugang am schnellsten: Benutzer wechseln → „+“ → „QR-Code scannen“ und am anderen Gerät beim Zugang auf das QR-Symbol tippen.</w:t>
+      </w:r>
+    </w:p>
+    <w:p>
+      <w:pPr>
+        <w:pStyle w:val="Heading1"/>
+        <w:spacing w:after="160" w:before="360"/>
+      </w:pPr>
+      <w:r>
+        <w:t xml:space="preserve">18. PowerIPTV für die neuen Fire TV Sticks (Vega OS)</w:t>
+      </w:r>
+    </w:p>
+    <w:p>
+      <w:pPr>
+        <w:spacing w:after="120"/>
+      </w:pPr>
+      <w:r>
+        <w:t xml:space="preserve">Amazon hat bei den neuen Sticks Android durch das eigene Betriebssystem „Vega OS“ ersetzt. Betroffen sind der Fire TV Stick 4K Select, der Fire TV Stick HD (2026), der Fire TV Stick 4K (2026) und alle kommenden Sticks. Dort laufen keine APKs und es gibt kein „Apps unbekannter Herkunft“ mehr. Deshalb gibt es eine eigene Version: „Portiva-FireTV-Vega-v1.1.X.vpkg“ (auf GitHub im Ordner „Fire TV Vega“, im Release mit „🆕 NEUE Amazon Fire TV Sticks“ gekennzeichnet).</w:t>
+      </w:r>
+    </w:p>
+    <w:p>
+      <w:pPr>
+        <w:pBdr>
+          <w:left w:val="single" w:color="1E88B8" w:sz="18" w:space="8"/>
+        </w:pBdr>
+        <w:spacing w:after="160" w:before="80"/>
+        <w:ind w:left="240"/>
+      </w:pPr>
+      <w:r>
+        <w:rPr>
+          <w:b/>
+          <w:bCs/>
+          <w:color w:val="1E88B8"/>
+        </w:rPr>
+        <w:t xml:space="preserve">Tipp: </w:t>
+      </w:r>
+      <w:r>
+        <w:t xml:space="preserve">Welcher Stick? Einstellungen → Mein Fire TV → Info. Steht dort „Fire OS“, nimm die normale APK (Kapitel 2). Steht dort „Vega OS“, nimm diese Version.</w:t>
+      </w:r>
+    </w:p>
+    <w:p>
+      <w:pPr>
+        <w:spacing w:after="120"/>
+      </w:pPr>
+      <w:r>
+        <w:t xml:space="preserve">Die Oberfläche ist dieselbe wie beim Samsung-Fernseher (Fernbedienung, Live-TV-Infoleiste, EPG, Favoriten, Portiva Link). Das Bild kommt vom Hardware-Player des Sticks. Aufnahmen, Downloads, VPN und Mehrfachbildschirm gibt es dort nicht.</w:t>
+      </w:r>
+    </w:p>
+    <w:p>
+      <w:pPr>
+        <w:pStyle w:val="Heading2"/>
+        <w:spacing w:after="120" w:before="240"/>
+      </w:pPr>
+      <w:r>
+        <w:t xml:space="preserve">Einmalig: Amazon-Entwicklerkonto &amp; Vega-Werkzeug</w:t>
+      </w:r>
+    </w:p>
+    <w:p>
+      <w:pPr>
+        <w:pStyle w:val="ListParagraph"/>
+        <w:numPr>
+          <w:ilvl w:val="0"/>
+          <w:numId w:val="16"/>
+        </w:numPr>
+        <w:spacing w:after="60"/>
+      </w:pPr>
+      <w:r>
+        <w:t xml:space="preserve">Kostenloses Amazon-Entwicklerkonto auf developer.amazon.com anlegen und das Appstore-Entwicklerprofil vollständig ausfüllen (ohne Bank-/Steuerdaten). Ohne vollständiges Profil klappt der Entwicklermodus nicht.</w:t>
+      </w:r>
+    </w:p>
+    <w:p>
+      <w:pPr>
+        <w:pStyle w:val="ListParagraph"/>
+        <w:numPr>
+          <w:ilvl w:val="0"/>
+          <w:numId w:val="16"/>
+        </w:numPr>
+        <w:spacing w:after="60"/>
+      </w:pPr>
+      <w:r>
+        <w:t xml:space="preserve">Am PC (Windows mit WSL/Ubuntu, Linux oder Mac) das Vega-Werkzeug installieren: curl -fsSL https://sdk-installer.vega.labcollab.net/get_vvm.sh | bash und danach source ~/vega/env.</w:t>
+      </w:r>
+    </w:p>
+    <w:p>
+      <w:pPr>
+        <w:pStyle w:val="ListParagraph"/>
+        <w:numPr>
+          <w:ilvl w:val="0"/>
+          <w:numId w:val="16"/>
+        </w:numPr>
+        <w:spacing w:after="60"/>
+      </w:pPr>
+      <w:r>
+        <w:t xml:space="preserve">Anmelden: vega devmode login → den angezeigten Code auf amazon.com/code bestätigen.</w:t>
+      </w:r>
+    </w:p>
+    <w:p>
+      <w:pPr>
+        <w:pStyle w:val="Heading2"/>
+        <w:spacing w:after="120" w:before="240"/>
+      </w:pPr>
+      <w:r>
+        <w:t xml:space="preserve">Entwicklermodus am Stick einschalten</w:t>
+      </w:r>
+    </w:p>
+    <w:p>
+      <w:pPr>
+        <w:pStyle w:val="ListParagraph"/>
+        <w:numPr>
+          <w:ilvl w:val="0"/>
+          <w:numId w:val="17"/>
+        </w:numPr>
+        <w:spacing w:after="60"/>
+      </w:pPr>
+      <w:r>
+        <w:t xml:space="preserve">Am Stick: Einstellungen → Mein Fire TV → Info → 7-mal auf den Gerätenamen drücken („Du bist jetzt Entwickler“).</w:t>
+      </w:r>
+    </w:p>
+    <w:p>
+      <w:pPr>
+        <w:pStyle w:val="ListParagraph"/>
+        <w:numPr>
+          <w:ilvl w:val="0"/>
+          <w:numId w:val="17"/>
+        </w:numPr>
+        <w:spacing w:after="60"/>
+      </w:pPr>
+      <w:r>
+        <w:t xml:space="preserve">Zurück → Entwickleroptionen → Entwicklermodus → Weiter. Der Fernseher zeigt einen 6-stelligen Code (gilt ca. 5 Minuten).</w:t>
+      </w:r>
+    </w:p>
+    <w:p>
+      <w:pPr>
+        <w:pStyle w:val="ListParagraph"/>
+        <w:numPr>
+          <w:ilvl w:val="0"/>
+          <w:numId w:val="17"/>
+        </w:numPr>
+        <w:spacing w:after="60"/>
+      </w:pPr>
+      <w:r>
+        <w:t xml:space="preserve">Am PC: vega devmode enable-device --code &lt;Code&gt;. Der Stick startet neu.</w:t>
+      </w:r>
+    </w:p>
+    <w:p>
+      <w:pPr>
+        <w:pStyle w:val="ListParagraph"/>
+        <w:numPr>
+          <w:ilvl w:val="0"/>
+          <w:numId w:val="17"/>
+        </w:numPr>
+        <w:spacing w:after="60"/>
+      </w:pPr>
+      <w:r>
+        <w:t xml:space="preserve">Entwickleroptionen → Verbindungsart „Netzwerk“ wählen (oder per USB-Kabel verbinden). Prüfen mit: vega device list (zeigt die Seriennummer).</w:t>
+      </w:r>
+    </w:p>
+    <w:p>
+      <w:pPr>
+        <w:pStyle w:val="Heading2"/>
+        <w:spacing w:after="120" w:before="240"/>
+      </w:pPr>
+      <w:r>
+        <w:t xml:space="preserve">Portiva installieren &amp; aktualisieren</w:t>
+      </w:r>
+    </w:p>
+    <w:p>
+      <w:pPr>
+        <w:pStyle w:val="ListParagraph"/>
+        <w:numPr>
+          <w:ilvl w:val="0"/>
+          <w:numId w:val="18"/>
+        </w:numPr>
+        <w:spacing w:after="60"/>
+      </w:pPr>
+      <w:r>
+        <w:t xml:space="preserve">Auf GitHub unter „Releases“ die Datei „Portiva-FireTV-Vega-v1.1.X.vpkg“ herunterladen.</w:t>
+      </w:r>
+    </w:p>
+    <w:p>
+      <w:pPr>
+        <w:pStyle w:val="ListParagraph"/>
+        <w:numPr>
+          <w:ilvl w:val="0"/>
+          <w:numId w:val="18"/>
+        </w:numPr>
+        <w:spacing w:after="60"/>
+      </w:pPr>
+      <w:r>
+        <w:t xml:space="preserve">Installieren: vega device -d &lt;Seriennummer&gt; install-app --packagePath Portiva-FireTV-Vega-v1.1.X.vpkg</w:t>
+      </w:r>
+    </w:p>
+    <w:p>
+      <w:pPr>
+        <w:pStyle w:val="ListParagraph"/>
+        <w:numPr>
+          <w:ilvl w:val="0"/>
+          <w:numId w:val="18"/>
+        </w:numPr>
+        <w:spacing w:after="60"/>
+      </w:pPr>
+      <w:r>
+        <w:t xml:space="preserve">Starten: über die Kachel „Portiva“ bei den Apps (ggf. nach einem Neustart) oder vega device -d &lt;Seriennummer&gt; launch-app --appName app.portiva.firetv.main</w:t>
+      </w:r>
+    </w:p>
+    <w:p>
+      <w:pPr>
+        <w:pStyle w:val="ListParagraph"/>
+        <w:numPr>
+          <w:ilvl w:val="0"/>
+          <w:numId w:val="18"/>
+        </w:numPr>
+        <w:spacing w:after="60"/>
+      </w:pPr>
+      <w:r>
+        <w:t xml:space="preserve">Zugang am bequemsten per „Vom Handy empfangen“ einrichten (Kapitel 16).</w:t>
+      </w:r>
+    </w:p>
+    <w:p>
+      <w:pPr>
+        <w:pBdr>
+          <w:left w:val="single" w:color="1E88B8" w:sz="18" w:space="8"/>
+        </w:pBdr>
+        <w:spacing w:after="160" w:before="80"/>
+        <w:ind w:left="240"/>
+      </w:pPr>
+      <w:r>
+        <w:rPr>
+          <w:b/>
+          <w:bCs/>
+          <w:color w:val="1E88B8"/>
+        </w:rPr>
+        <w:t xml:space="preserve">Tipp: </w:t>
+      </w:r>
+      <w:r>
+        <w:t xml:space="preserve">Updates genauso installieren – Zugänge und Favoriten bleiben erhalten. Die App zeigt unter „Update“, wenn es eine neue Version gibt.</w:t>
+      </w:r>
+    </w:p>
+    <w:p>
+      <w:pPr>
+        <w:pBdr>
+          <w:left w:val="single" w:color="1E88B8" w:sz="18" w:space="8"/>
+        </w:pBdr>
+        <w:spacing w:after="160" w:before="80"/>
+        <w:ind w:left="240"/>
+      </w:pPr>
+      <w:r>
+        <w:rPr>
+          <w:b/>
+          <w:bCs/>
+          <w:color w:val="1E88B8"/>
+        </w:rPr>
+        <w:t xml:space="preserve">Tipp: </w:t>
+      </w:r>
+      <w:r>
+        <w:t xml:space="preserve">Hinweis: Diese Version ist neu und noch nicht auf jedem Stick erprobt. Klappt ein Sender oder Film nicht, im Anbieter-Portal bzw. in den Einstellungen das Live-Format „HLS (m3u8)“ wählen; MKV-Filme mit DTS-Ton spielen die neuen Sticks evtl. ohne Ton ab.</w:t>
       </w:r>
     </w:p>
     <w:sectPr>
@@ -6753,6 +7028,42 @@
     </w:lvl>
   </w:abstractNum>
   <w:abstractNum w:abstractNumId="16" w15:restartNumberingAfterBreak="0">
+    <w:multiLevelType w:val="hybridMultilevel"/>
+    <w:lvl w:ilvl="0" w15:tentative="1">
+      <w:start w:val="1"/>
+      <w:numFmt w:val="decimal"/>
+      <w:lvlText w:val="%1."/>
+      <w:lvlJc w:val="left"/>
+      <w:pPr>
+        <w:ind w:left="540" w:hanging="270"/>
+      </w:pPr>
+    </w:lvl>
+  </w:abstractNum>
+  <w:abstractNum w:abstractNumId="17" w15:restartNumberingAfterBreak="0">
+    <w:multiLevelType w:val="hybridMultilevel"/>
+    <w:lvl w:ilvl="0" w15:tentative="1">
+      <w:start w:val="1"/>
+      <w:numFmt w:val="decimal"/>
+      <w:lvlText w:val="%1."/>
+      <w:lvlJc w:val="left"/>
+      <w:pPr>
+        <w:ind w:left="540" w:hanging="270"/>
+      </w:pPr>
+    </w:lvl>
+  </w:abstractNum>
+  <w:abstractNum w:abstractNumId="18" w15:restartNumberingAfterBreak="0">
+    <w:multiLevelType w:val="hybridMultilevel"/>
+    <w:lvl w:ilvl="0" w15:tentative="1">
+      <w:start w:val="1"/>
+      <w:numFmt w:val="decimal"/>
+      <w:lvlText w:val="%1."/>
+      <w:lvlJc w:val="left"/>
+      <w:pPr>
+        <w:ind w:left="540" w:hanging="270"/>
+      </w:pPr>
+    </w:lvl>
+  </w:abstractNum>
+  <w:abstractNum w:abstractNumId="19" w15:restartNumberingAfterBreak="0">
     <w:multiLevelType w:val="hybridMultilevel"/>
     <w:lvl w:ilvl="0" w15:tentative="1">
       <w:start w:val="1"/>
@@ -6850,6 +7161,24 @@
   </w:num>
   <w:num w:numId="15">
     <w:abstractNumId w:val="15"/>
+    <w:lvlOverride w:ilvl="0">
+      <w:startOverride w:val="1"/>
+    </w:lvlOverride>
+  </w:num>
+  <w:num w:numId="16">
+    <w:abstractNumId w:val="16"/>
+    <w:lvlOverride w:ilvl="0">
+      <w:startOverride w:val="1"/>
+    </w:lvlOverride>
+  </w:num>
+  <w:num w:numId="17">
+    <w:abstractNumId w:val="17"/>
+    <w:lvlOverride w:ilvl="0">
+      <w:startOverride w:val="1"/>
+    </w:lvlOverride>
+  </w:num>
+  <w:num w:numId="18">
+    <w:abstractNumId w:val="18"/>
     <w:lvlOverride w:ilvl="0">
       <w:startOverride w:val="1"/>
     </w:lvlOverride>

</xml_diff>

<commit_message>
Live TV: Pfeile schalten Sender um; SD-Sender ohne Bild -> automatisch VLC
Pfeile in der Bildmitte direkt an die Senderliste gekoppelt. Laeuft der Ton
6 s ohne Bild (z.B. MPEG-2 bei SD-Sendern) oder ist das Videoformat nicht
abspielbar, wechselt der Standard-Player auf VLC (auch bei fester Einstellung).

Co-Authored-By: Claude Opus 5.5 <noreply@anthropic.com>
Claude-Session: https://claude.ai/code/session_01CaJqjA6T7wr6qkboQBX5Ep
</commit_message>
<xml_diff>
--- a/docs/PowerIPTV-Anleitung.docx
+++ b/docs/PowerIPTV-Anleitung.docx
@@ -49,7 +49,7 @@
         <w:rPr>
           <w:color w:val="666666"/>
         </w:rPr>
-        <w:t xml:space="preserve">Stand: Version 1.1.96 · Oktober 2026</w:t>
+        <w:t xml:space="preserve">Stand: Version 1.1.97 · Oktober 2026</w:t>
       </w:r>
     </w:p>
     <w:p>
@@ -2749,6 +2749,26 @@
     </w:p>
     <w:p>
       <w:pPr>
+        <w:pStyle w:val="ListParagraph"/>
+        <w:numPr>
+          <w:ilvl w:val="0"/>
+          <w:numId w:val="6"/>
+        </w:numPr>
+        <w:spacing w:after="60"/>
+      </w:pPr>
+      <w:r>
+        <w:rPr>
+          <w:b/>
+          <w:bCs/>
+        </w:rPr>
+        <w:t xml:space="preserve">Sender wechseln: </w:t>
+      </w:r>
+      <w:r>
+        <w:t xml:space="preserve">Die Pfeile ⏮ / ⏭ in der Bildmitte schalten zum vorherigen bzw. nächsten Sender der Liste (wie CH+/CH- auf der Fernbedienung).</w:t>
+      </w:r>
+    </w:p>
+    <w:p>
+      <w:pPr>
         <w:pStyle w:val="Heading1"/>
         <w:spacing w:after="160" w:before="360"/>
       </w:pPr>
@@ -3650,7 +3670,7 @@
                 <w:sz w:val="20"/>
                 <w:szCs w:val="20"/>
               </w:rPr>
-              <w:t xml:space="preserve">Film läuft ohne Ton</w:t>
+              <w:t xml:space="preserve">Live TV: nur Ton, kein Bild (oft SD-Sender)</w:t>
             </w:r>
           </w:p>
         </w:tc>
@@ -3673,7 +3693,7 @@
                 <w:sz w:val="20"/>
                 <w:szCs w:val="20"/>
               </w:rPr>
-              <w:t xml:space="preserve">Behoben ab 1.1.80: Viele Filme haben DTS- oder TrueHD-Ton, den der Standard-Player auf den meisten Handys/Tablets nicht abspielen kann. Portiva erkennt das und wechselt automatisch auf VLC (spielt DTS ab). Im Player-Zahnrad unter „Audiospur“ wählst du die Sprache (z. B. Deutsch / Englisch); Spuren mit „(mit VLC)“ wechseln beim Antippen auf VLC.</w:t>
+              <w:t xml:space="preserve">Behoben ab 1.1.97: Viele SD-Sender senden im älteren MPEG-2-Format, das der Standard-Player auf Handys/Tablets nicht anzeigen kann. Läuft der Ton 6 Sekunden ohne Bild, wechselt Portiva automatisch zu VLC und merkt sich das für diesen Sender.</w:t>
             </w:r>
           </w:p>
         </w:tc>
@@ -3700,7 +3720,7 @@
                 <w:sz w:val="20"/>
                 <w:szCs w:val="20"/>
               </w:rPr>
-              <w:t xml:space="preserve">Live TV stockt</w:t>
+              <w:t xml:space="preserve">Film läuft ohne Ton</w:t>
             </w:r>
           </w:p>
         </w:tc>
@@ -3722,7 +3742,7 @@
                 <w:sz w:val="20"/>
                 <w:szCs w:val="20"/>
               </w:rPr>
-              <w:t xml:space="preserve">Beide Player puffern Live TV jetzt größer (Standard-Player bis 60 s, nach einem Aussetzer erst mit 6 s Vorrat weiter; VLC 4 s) und verbinden sich nach Unterbrechungen automatisch neu. Unter Windows: Einstellungen → Player → Puffer „Groß“.</w:t>
+              <w:t xml:space="preserve">Behoben ab 1.1.80: Viele Filme haben DTS- oder TrueHD-Ton, den der Standard-Player auf den meisten Handys/Tablets nicht abspielen kann. Portiva erkennt das und wechselt automatisch auf VLC (spielt DTS ab). Im Player-Zahnrad unter „Audiospur“ wählst du die Sprache (z. B. Deutsch / Englisch); Spuren mit „(mit VLC)“ wechseln beim Antippen auf VLC.</w:t>
             </w:r>
           </w:p>
         </w:tc>
@@ -3750,7 +3770,7 @@
                 <w:sz w:val="20"/>
                 <w:szCs w:val="20"/>
               </w:rPr>
-              <w:t xml:space="preserve">Wann wird VLC benutzt?</w:t>
+              <w:t xml:space="preserve">Live TV stockt</w:t>
             </w:r>
           </w:p>
         </w:tc>
@@ -3773,7 +3793,7 @@
                 <w:sz w:val="20"/>
                 <w:szCs w:val="20"/>
               </w:rPr>
-              <w:t xml:space="preserve">Im Modus „Automatisch“ startet immer zuerst der Standard-Player. Nur wenn er einen bestimmten Stream nicht abspielen kann (z.B. seltene Ton- oder Bildformate), wechselt die App für genau diesen Titel zu VLC.</w:t>
+              <w:t xml:space="preserve">Beide Player puffern Live TV jetzt größer (Standard-Player bis 60 s, nach einem Aussetzer erst mit 6 s Vorrat weiter; VLC 4 s) und verbinden sich nach Unterbrechungen automatisch neu. Unter Windows: Einstellungen → Player → Puffer „Groß“.</w:t>
             </w:r>
           </w:p>
         </w:tc>
@@ -3800,7 +3820,7 @@
                 <w:sz w:val="20"/>
                 <w:szCs w:val="20"/>
               </w:rPr>
-              <w:t xml:space="preserve">VLC ruckelt oder hängt</w:t>
+              <w:t xml:space="preserve">Wann wird VLC benutzt?</w:t>
             </w:r>
           </w:p>
         </w:tc>
@@ -3822,7 +3842,7 @@
                 <w:sz w:val="20"/>
                 <w:szCs w:val="20"/>
               </w:rPr>
-              <w:t xml:space="preserve">Einstellungen → Player → VLC-Leistung auf „Schnell“ stellen (bei TV-Sticks automatisch).</w:t>
+              <w:t xml:space="preserve">Im Modus „Automatisch“ startet immer zuerst der Standard-Player. Nur wenn er einen bestimmten Stream nicht abspielen kann (z.B. seltene Ton- oder Bildformate), wechselt die App für genau diesen Titel zu VLC.</w:t>
             </w:r>
           </w:p>
         </w:tc>
@@ -3850,7 +3870,7 @@
                 <w:sz w:val="20"/>
                 <w:szCs w:val="20"/>
               </w:rPr>
-              <w:t xml:space="preserve">Nur Ton, kein Bild</w:t>
+              <w:t xml:space="preserve">VLC ruckelt oder hängt</w:t>
             </w:r>
           </w:p>
         </w:tc>
@@ -3873,7 +3893,7 @@
                 <w:sz w:val="20"/>
                 <w:szCs w:val="20"/>
               </w:rPr>
-              <w:t xml:space="preserve">Der Sender nutzt ein altes Format – die App wechselt automatisch zu VLC. Sonst Einstellungen → Player → VLC.</w:t>
+              <w:t xml:space="preserve">Einstellungen → Player → VLC-Leistung auf „Schnell“ stellen (bei TV-Sticks automatisch).</w:t>
             </w:r>
           </w:p>
         </w:tc>
@@ -3900,7 +3920,7 @@
                 <w:sz w:val="20"/>
                 <w:szCs w:val="20"/>
               </w:rPr>
-              <w:t xml:space="preserve">Bild bleibt bei Aufnahme stehen</w:t>
+              <w:t xml:space="preserve">Nur Ton, kein Bild</w:t>
             </w:r>
           </w:p>
         </w:tc>
@@ -3922,7 +3942,7 @@
                 <w:sz w:val="20"/>
                 <w:szCs w:val="20"/>
               </w:rPr>
-              <w:t xml:space="preserve">Der Zugang erlaubt nur eine Verbindung. Den aufgenommenen Sender schauen oder die Aufnahme stoppen.</w:t>
+              <w:t xml:space="preserve">Der Sender nutzt ein altes Format – die App wechselt automatisch zu VLC. Sonst Einstellungen → Player → VLC.</w:t>
             </w:r>
           </w:p>
         </w:tc>
@@ -3950,7 +3970,7 @@
                 <w:sz w:val="20"/>
                 <w:szCs w:val="20"/>
               </w:rPr>
-              <w:t xml:space="preserve">Update lässt sich nicht installieren</w:t>
+              <w:t xml:space="preserve">Bild bleibt bei Aufnahme stehen</w:t>
             </w:r>
           </w:p>
         </w:tc>
@@ -3973,7 +3993,7 @@
                 <w:sz w:val="20"/>
                 <w:szCs w:val="20"/>
               </w:rPr>
-              <w:t xml:space="preserve">Immer die APK aus den Releases verwenden (gleiche Signatur).</w:t>
+              <w:t xml:space="preserve">Der Zugang erlaubt nur eine Verbindung. Den aufgenommenen Sender schauen oder die Aufnahme stoppen.</w:t>
             </w:r>
           </w:p>
         </w:tc>
@@ -4000,7 +4020,7 @@
                 <w:sz w:val="20"/>
                 <w:szCs w:val="20"/>
               </w:rPr>
-              <w:t xml:space="preserve">Cast findet den Fernseher nicht</w:t>
+              <w:t xml:space="preserve">Update lässt sich nicht installieren</w:t>
             </w:r>
           </w:p>
         </w:tc>
@@ -4022,7 +4042,7 @@
                 <w:sz w:val="20"/>
                 <w:szCs w:val="20"/>
               </w:rPr>
-              <w:t xml:space="preserve">Samsung- und Fire-TV-Geräte können kein Google Cast – „Bildschirm spiegeln“ nutzen.</w:t>
+              <w:t xml:space="preserve">Immer die APK aus den Releases verwenden (gleiche Signatur).</w:t>
             </w:r>
           </w:p>
         </w:tc>
@@ -4050,7 +4070,7 @@
                 <w:sz w:val="20"/>
                 <w:szCs w:val="20"/>
               </w:rPr>
-              <w:t xml:space="preserve">Senderliste veraltet</w:t>
+              <w:t xml:space="preserve">Cast findet den Fernseher nicht</w:t>
             </w:r>
           </w:p>
         </w:tc>
@@ -4058,6 +4078,55 @@
           <w:tcPr>
             <w:tcW w:type="dxa" w:w="6026"/>
             <w:shd w:fill="EEF5FA" w:color="auto" w:val="clear"/>
+            <w:tcMar>
+              <w:top w:type="dxa" w:w="60"/>
+              <w:left w:type="dxa" w:w="100"/>
+              <w:bottom w:type="dxa" w:w="60"/>
+              <w:right w:type="dxa" w:w="100"/>
+            </w:tcMar>
+          </w:tcPr>
+          <w:p>
+            <w:r>
+              <w:rPr>
+                <w:b w:val="false"/>
+                <w:bCs w:val="false"/>
+                <w:sz w:val="20"/>
+                <w:szCs w:val="20"/>
+              </w:rPr>
+              <w:t xml:space="preserve">Samsung- und Fire-TV-Geräte können kein Google Cast – „Bildschirm spiegeln“ nutzen.</w:t>
+            </w:r>
+          </w:p>
+        </w:tc>
+      </w:tr>
+      <w:tr>
+        <w:trPr>
+          <w:tblHeader w:val="false"/>
+        </w:trPr>
+        <w:tc>
+          <w:tcPr>
+            <w:tcW w:type="dxa" w:w="3000"/>
+            <w:tcMar>
+              <w:top w:type="dxa" w:w="60"/>
+              <w:left w:type="dxa" w:w="100"/>
+              <w:bottom w:type="dxa" w:w="60"/>
+              <w:right w:type="dxa" w:w="100"/>
+            </w:tcMar>
+          </w:tcPr>
+          <w:p>
+            <w:r>
+              <w:rPr>
+                <w:b/>
+                <w:bCs/>
+                <w:sz w:val="20"/>
+                <w:szCs w:val="20"/>
+              </w:rPr>
+              <w:t xml:space="preserve">Senderliste veraltet</w:t>
+            </w:r>
+          </w:p>
+        </w:tc>
+        <w:tc>
+          <w:tcPr>
+            <w:tcW w:type="dxa" w:w="6026"/>
             <w:tcMar>
               <w:top w:type="dxa" w:w="60"/>
               <w:left w:type="dxa" w:w="100"/>

</xml_diff>

<commit_message>
Player: Senderliste rechts, Regler bei offener Liste aus, Leiste neu sortiert, Senderinfo groesser
- Helligkeit/Lautstaerke passen ihre Hoehe dem Platz an (waren gequetscht)
- Bei offener Senderliste ausgeblendet und ohne Funktion (VLC: Liste liegt jetzt ueber allem)
- Senderliste rechts; Fernbedienung: Rechts = Senderliste, Links = letzter Sender
- Infoleiste: Mehrfachbildschirm - Seitenverhaeltnis - Senderliste, Logo/Text groesser
- Gleich in Android, Windows, Samsung/Vega, iOS; Anleitung aktualisiert

Co-Authored-By: Claude Opus 5.5 <noreply@anthropic.com>
Claude-Session: https://claude.ai/code/session_01CAAYsSLELdQ4jL5JiXzQ6b
</commit_message>
<xml_diff>
--- a/docs/PowerIPTV-Anleitung.docx
+++ b/docs/PowerIPTV-Anleitung.docx
@@ -49,7 +49,7 @@
         <w:rPr>
           <w:color w:val="666666"/>
         </w:rPr>
-        <w:t xml:space="preserve">Stand: Version 1.1.97 · Oktober 2026</w:t>
+        <w:t xml:space="preserve">Stand: Version 1.1.98 · Oktober 2026</w:t>
       </w:r>
     </w:p>
     <w:p>
@@ -787,7 +787,7 @@
         <w:t xml:space="preserve">Tipp: </w:t>
       </w:r>
       <w:r>
-        <w:t xml:space="preserve">Im Player: links Helligkeit, rechts Lautstärke (senkrechte Regler zum Ziehen oder Antippen; am Fernseher regelt das die Fernbedienung). Bei Filmen und Serien unten unter dem Zeitstrahl: Seitenverhältnis – Geschwindigkeit – Untertitel (ein/aus). Bei Live TV erscheint unten die Sender-Infoleiste – bei jedem Umschalten und beim Antippen: Senderlogo, „Jetzt“ mit Uhrzeit und Fortschrittsbalken, „Weiter“ (nächste Sendung) und darunter Senderliste – Seitenverhältnis – Mehrfachbildschirm (Mehrfachbildschirm nur Android und Windows). Das Zahnrad oben öffnet rechts die Einstellungsleiste: Videospuren, Audiospuren (mit Codec, kb/s, Hz), Untertitelspuren, Untertitel-Einstellungen (Schriftgröße, Hintergrund) und Sleep-Timer.</w:t>
+        <w:t xml:space="preserve">Im Player: links Helligkeit, rechts Lautstärke (senkrechte Regler zum Ziehen oder Antippen; am Fernseher regelt das die Fernbedienung). Bei Filmen und Serien unten unter dem Zeitstrahl: Seitenverhältnis – Geschwindigkeit – Untertitel (ein/aus). Bei Live TV erscheint unten die Sender-Infoleiste – bei jedem Umschalten und beim Antippen: Senderlogo, „Jetzt“ mit Uhrzeit und Fortschrittsbalken, „Weiter“ (nächste Sendung) und darunter Mehrfachbildschirm – Seitenverhältnis – Senderliste (Mehrfachbildschirm nur Android und Windows). Die Senderliste öffnet sich rechts im Bild; solange sie offen ist, sind Helligkeit und Lautstärke ausgeblendet, damit das Blättern in der Liste nichts verstellt. Das Zahnrad oben öffnet rechts die Einstellungsleiste: Videospuren, Audiospuren (mit Codec, kb/s, Hz), Untertitelspuren, Untertitel-Einstellungen (Schriftgröße, Hintergrund) und Sleep-Timer.</w:t>
       </w:r>
     </w:p>
     <w:p>
@@ -2070,7 +2070,7 @@
                 <w:sz w:val="20"/>
                 <w:szCs w:val="20"/>
               </w:rPr>
-              <w:t xml:space="preserve">Listen-Symbol oben</w:t>
+              <w:t xml:space="preserve">„Senderliste“ unten in der Infoleiste (öffnet rechts)</w:t>
             </w:r>
           </w:p>
         </w:tc>
@@ -2093,7 +2093,7 @@
                 <w:sz w:val="20"/>
                 <w:szCs w:val="20"/>
               </w:rPr>
-              <w:t xml:space="preserve">←</w:t>
+              <w:t xml:space="preserve">→</w:t>
             </w:r>
           </w:p>
         </w:tc>
@@ -2164,7 +2164,7 @@
                 <w:sz w:val="20"/>
                 <w:szCs w:val="20"/>
               </w:rPr>
-              <w:t xml:space="preserve">→</w:t>
+              <w:t xml:space="preserve">←</w:t>
             </w:r>
           </w:p>
         </w:tc>

</xml_diff>

<commit_message>
Senderliste: am Griff breiter ziehen -> Programm-Uebersicht (Jetzt mit Fortschritt, Danach)
Android, Windows, iOS (Samsung TV/Vega ohne Touch: unveraendert); Anleitung aktualisiert

Co-Authored-By: Claude Opus 5.5 <noreply@anthropic.com>
Claude-Session: https://claude.ai/code/session_01CAAYsSLELdQ4jL5JiXzQ6b
</commit_message>
<xml_diff>
--- a/docs/PowerIPTV-Anleitung.docx
+++ b/docs/PowerIPTV-Anleitung.docx
@@ -49,7 +49,7 @@
         <w:rPr>
           <w:color w:val="666666"/>
         </w:rPr>
-        <w:t xml:space="preserve">Stand: Version 1.1.98 · Oktober 2026</w:t>
+        <w:t xml:space="preserve">Stand: Version 1.1.99 · Oktober 2026</w:t>
       </w:r>
     </w:p>
     <w:p>
@@ -787,7 +787,7 @@
         <w:t xml:space="preserve">Tipp: </w:t>
       </w:r>
       <w:r>
-        <w:t xml:space="preserve">Im Player: links Helligkeit, rechts Lautstärke (senkrechte Regler zum Ziehen oder Antippen; am Fernseher regelt das die Fernbedienung). Bei Filmen und Serien unten unter dem Zeitstrahl: Seitenverhältnis – Geschwindigkeit – Untertitel (ein/aus). Bei Live TV erscheint unten die Sender-Infoleiste – bei jedem Umschalten und beim Antippen: Senderlogo, „Jetzt“ mit Uhrzeit und Fortschrittsbalken, „Weiter“ (nächste Sendung) und darunter Mehrfachbildschirm – Seitenverhältnis – Senderliste (Mehrfachbildschirm nur Android und Windows). Die Senderliste öffnet sich rechts im Bild; solange sie offen ist, sind Helligkeit und Lautstärke ausgeblendet, damit das Blättern in der Liste nichts verstellt. Das Zahnrad oben öffnet rechts die Einstellungsleiste: Videospuren, Audiospuren (mit Codec, kb/s, Hz), Untertitelspuren, Untertitel-Einstellungen (Schriftgröße, Hintergrund) und Sleep-Timer.</w:t>
+        <w:t xml:space="preserve">Im Player: links Helligkeit, rechts Lautstärke (senkrechte Regler zum Ziehen oder Antippen; am Fernseher regelt das die Fernbedienung). Bei Filmen und Serien unten unter dem Zeitstrahl: Seitenverhältnis – Geschwindigkeit – Untertitel (ein/aus). Bei Live TV erscheint unten die Sender-Infoleiste – bei jedem Umschalten und beim Antippen: Senderlogo, „Jetzt“ mit Uhrzeit und Fortschrittsbalken, „Weiter“ (nächste Sendung) und darunter Mehrfachbildschirm – Seitenverhältnis – Senderliste (Mehrfachbildschirm nur Android und Windows). Die Senderliste öffnet sich rechts im Bild. Am Griff links an der Liste lässt sie sich breiter nach links ziehen (Handy, Tablet, iPhone, Windows): Dann steht bei jedem Sender, was gerade läuft (mit Uhrzeit und Fortschrittsbalken) und was danach kommt; zurück nach rechts ziehen macht sie wieder schmal. Solange die Liste offen ist, sind Helligkeit und Lautstärke ausgeblendet, damit das Blättern in der Liste nichts verstellt. Das Zahnrad oben öffnet rechts die Einstellungsleiste: Videospuren, Audiospuren (mit Codec, kb/s, Hz), Untertitelspuren, Untertitel-Einstellungen (Schriftgröße, Hintergrund) und Sleep-Timer.</w:t>
       </w:r>
     </w:p>
     <w:p>

</xml_diff>

<commit_message>
Live TV: Knopf 'EPG aktualisieren' in der Infoleiste (alle Varianten)
Holt Jetzt/Weiter sofort neu vom Anbieter (Android: auch XMLTV neu laden).
Programmfuehrer wird beim Live-TV im Hintergrund geladen und nach 3 h
automatisch neu eingelesen, damit er nicht veraltet.

Co-Authored-By: Claude Opus 5.5 <noreply@anthropic.com>
Claude-Session: https://claude.ai/code/session_01CaJqjA6T7wr6qkboQBX5Ep
</commit_message>
<xml_diff>
--- a/docs/PowerIPTV-Anleitung.docx
+++ b/docs/PowerIPTV-Anleitung.docx
@@ -49,7 +49,7 @@
         <w:rPr>
           <w:color w:val="666666"/>
         </w:rPr>
-        <w:t xml:space="preserve">Stand: Version 1.1.100 · Oktober 2026</w:t>
+        <w:t xml:space="preserve">Stand: Version 1.1.101 · Oktober 2026</w:t>
       </w:r>
     </w:p>
     <w:p>
@@ -787,7 +787,7 @@
         <w:t xml:space="preserve">Tipp: </w:t>
       </w:r>
       <w:r>
-        <w:t xml:space="preserve">Im Player: links Helligkeit, rechts Lautstärke (senkrechte Regler zum Ziehen oder Antippen; am Fernseher regelt das die Fernbedienung). Bei Filmen und Serien unten unter dem Zeitstrahl: Seitenverhältnis – Geschwindigkeit – Untertitel (ein/aus). Bei Live TV erscheint unten die Sender-Infoleiste – bei jedem Umschalten und beim Antippen: Senderlogo, „Jetzt“ mit Uhrzeit und Fortschrittsbalken, „Weiter“ (nächste Sendung) und darunter Mehrfachbildschirm – Seitenverhältnis – Senderliste (Mehrfachbildschirm nur Android und Windows). Die Senderliste öffnet sich rechts im Bild. Am Griff links an der Liste lässt sie sich breiter nach links ziehen (Handy, Tablet, iPhone, Windows): Dann steht bei jedem Sender, was gerade läuft (mit Uhrzeit und Fortschrittsbalken) und was danach kommt; zurück nach rechts ziehen macht sie wieder schmal. Solange die Liste offen ist, sind Helligkeit und Lautstärke ausgeblendet, damit das Blättern in der Liste nichts verstellt. Das Zahnrad oben öffnet rechts die Einstellungsleiste: Videospuren, Audiospuren (mit Codec, kb/s, Hz), Untertitelspuren, Untertitel-Einstellungen (Schriftgröße, Hintergrund) und Sleep-Timer.</w:t>
+        <w:t xml:space="preserve">Im Player: links Helligkeit, rechts Lautstärke (senkrechte Regler zum Ziehen oder Antippen; am Fernseher regelt das die Fernbedienung). Bei Filmen und Serien unten unter dem Zeitstrahl: Seitenverhältnis – Geschwindigkeit – Untertitel (ein/aus). Bei Live TV erscheint unten die Sender-Infoleiste – bei jedem Umschalten und beim Antippen: Senderlogo, „Jetzt“ mit Uhrzeit und Fortschrittsbalken, „Weiter“ (nächste Sendung), rechts daneben der Knopf ⟳ „EPG aktualisieren“ (holt das Programm sofort neu vom Anbieter – wie im TV-Guide; Samsung/Fire TV Vega: Knopf „⟳ EPG aktualisieren“ in der unteren Leiste) und darunter Mehrfachbildschirm – Seitenverhältnis – Senderliste (Mehrfachbildschirm nur Android und Windows). Die Senderliste öffnet sich rechts im Bild. Am Griff links an der Liste lässt sie sich breiter nach links ziehen (Handy, Tablet, iPhone, Windows): Dann steht bei jedem Sender, was gerade läuft (mit Uhrzeit und Fortschrittsbalken) und was danach kommt; zurück nach rechts ziehen macht sie wieder schmal. Solange die Liste offen ist, sind Helligkeit und Lautstärke ausgeblendet, damit das Blättern in der Liste nichts verstellt. Das Zahnrad oben öffnet rechts die Einstellungsleiste: Videospuren, Audiospuren (mit Codec, kb/s, Hz), Untertitelspuren, Untertitel-Einstellungen (Schriftgröße, Hintergrund) und Sleep-Timer.</w:t>
       </w:r>
     </w:p>
     <w:p>

</xml_diff>

<commit_message>
Senderliste: EPG-aktualisieren oben in der Liste, ganz zuschiebbar; Bild-in-Bild repariert
- Knopf EPG aktualisieren aus der Infoleiste in den Kopf der Senderliste
  (Android, Windows, iOS, Samsung/Fire TV Vega), dazu Schliessen-Knopf
- Griff nach rechts ziehen schiebt die Liste ganz zu (Android, Windows, iOS)
- Bild-in-Bild: jetzt auch im VLC-Player, ab Android 12 automatisch beim
  Verlassen (Home/Kreis), Seitenverhaeltnis vom Video, Bedienelemente im
  Mini-Fenster ausgeblendet

Co-Authored-By: Claude Opus 5.5 <noreply@anthropic.com>
Claude-Session: https://claude.ai/code/session_01CaJqjA6T7wr6qkboQBX5Ep
</commit_message>
<xml_diff>
--- a/docs/PowerIPTV-Anleitung.docx
+++ b/docs/PowerIPTV-Anleitung.docx
@@ -49,7 +49,7 @@
         <w:rPr>
           <w:color w:val="666666"/>
         </w:rPr>
-        <w:t xml:space="preserve">Stand: Version 1.1.101 · Oktober 2026</w:t>
+        <w:t xml:space="preserve">Stand: Version 1.1.102 · Oktober 2026</w:t>
       </w:r>
     </w:p>
     <w:p>
@@ -787,7 +787,7 @@
         <w:t xml:space="preserve">Tipp: </w:t>
       </w:r>
       <w:r>
-        <w:t xml:space="preserve">Im Player: links Helligkeit, rechts Lautstärke (senkrechte Regler zum Ziehen oder Antippen; am Fernseher regelt das die Fernbedienung). Bei Filmen und Serien unten unter dem Zeitstrahl: Seitenverhältnis – Geschwindigkeit – Untertitel (ein/aus). Bei Live TV erscheint unten die Sender-Infoleiste – bei jedem Umschalten und beim Antippen: Senderlogo, „Jetzt“ mit Uhrzeit und Fortschrittsbalken, „Weiter“ (nächste Sendung), rechts daneben der Knopf ⟳ „EPG aktualisieren“ (holt das Programm sofort neu vom Anbieter – wie im TV-Guide; Samsung/Fire TV Vega: Knopf „⟳ EPG aktualisieren“ in der unteren Leiste) und darunter Mehrfachbildschirm – Seitenverhältnis – Senderliste (Mehrfachbildschirm nur Android und Windows). Die Senderliste öffnet sich rechts im Bild. Am Griff links an der Liste lässt sie sich breiter nach links ziehen (Handy, Tablet, iPhone, Windows): Dann steht bei jedem Sender, was gerade läuft (mit Uhrzeit und Fortschrittsbalken) und was danach kommt; zurück nach rechts ziehen macht sie wieder schmal. Solange die Liste offen ist, sind Helligkeit und Lautstärke ausgeblendet, damit das Blättern in der Liste nichts verstellt. Das Zahnrad oben öffnet rechts die Einstellungsleiste: Videospuren, Audiospuren (mit Codec, kb/s, Hz), Untertitelspuren, Untertitel-Einstellungen (Schriftgröße, Hintergrund) und Sleep-Timer.</w:t>
+        <w:t xml:space="preserve">Im Player: links Helligkeit, rechts Lautstärke (senkrechte Regler zum Ziehen oder Antippen; am Fernseher regelt das die Fernbedienung). Bei Filmen und Serien unten unter dem Zeitstrahl: Seitenverhältnis – Geschwindigkeit – Untertitel (ein/aus). Bei Live TV erscheint unten die Sender-Infoleiste – bei jedem Umschalten und beim Antippen: Senderlogo, „Jetzt“ mit Uhrzeit und Fortschrittsbalken, „Weiter“ (nächste Sendung) und darunter Mehrfachbildschirm – Seitenverhältnis – Senderliste (Mehrfachbildschirm nur Android und Windows). Die Senderliste öffnet sich rechts im Bild. Oben in der Liste: ⟳ „EPG aktualisieren“ (holt das Programm sofort neu vom Anbieter – wie im TV-Guide) und ✕ zum Schließen. Am Griff nach rechts ziehen schiebt die Liste ganz zu. Am Griff links an der Liste lässt sie sich breiter nach links ziehen (Handy, Tablet, iPhone, Windows): Dann steht bei jedem Sender, was gerade läuft (mit Uhrzeit und Fortschrittsbalken) und was danach kommt; zurück nach rechts ziehen macht sie wieder schmal. Solange die Liste offen ist, sind Helligkeit und Lautstärke ausgeblendet, damit das Blättern in der Liste nichts verstellt. Das Zahnrad oben öffnet rechts die Einstellungsleiste: Videospuren, Audiospuren (mit Codec, kb/s, Hz), Untertitelspuren, Untertitel-Einstellungen (Schriftgröße, Hintergrund) und Sleep-Timer.</w:t>
       </w:r>
     </w:p>
     <w:p>
@@ -3670,7 +3670,7 @@
                 <w:sz w:val="20"/>
                 <w:szCs w:val="20"/>
               </w:rPr>
-              <w:t xml:space="preserve">Live TV: nur Ton, kein Bild (oft SD-Sender)</w:t>
+              <w:t xml:space="preserve">Bild-in-Bild (Mini-Fenster)</w:t>
             </w:r>
           </w:p>
         </w:tc>
@@ -3693,7 +3693,7 @@
                 <w:sz w:val="20"/>
                 <w:szCs w:val="20"/>
               </w:rPr>
-              <w:t xml:space="preserve">Behoben ab 1.1.97: Viele SD-Sender senden im älteren MPEG-2-Format, das der Standard-Player auf Handys/Tablets nicht anzeigen kann. Läuft der Ton 6 Sekunden ohne Bild, wechselt Portiva automatisch zu VLC und merkt sich das für diesen Sender.</w:t>
+              <w:t xml:space="preserve">Läuft ein Film oder Sender und du drückst die Home-Taste bzw. wischst nach Hause („Kreis“), spielt das Video in einem kleinen Fenster weiter – in beiden Playern (Standard und VLC). Das Fenster lässt sich verschieben; antippen und vergrößern bringt dich zurück, ✕ beendet die Wiedergabe. Nur Handy/Tablet (Fire TV unterstützt es für fremde Apps nicht).</w:t>
             </w:r>
           </w:p>
         </w:tc>
@@ -3720,7 +3720,7 @@
                 <w:sz w:val="20"/>
                 <w:szCs w:val="20"/>
               </w:rPr>
-              <w:t xml:space="preserve">Film läuft ohne Ton</w:t>
+              <w:t xml:space="preserve">Live TV: nur Ton, kein Bild (oft SD-Sender)</w:t>
             </w:r>
           </w:p>
         </w:tc>
@@ -3742,7 +3742,7 @@
                 <w:sz w:val="20"/>
                 <w:szCs w:val="20"/>
               </w:rPr>
-              <w:t xml:space="preserve">Behoben ab 1.1.80: Viele Filme haben DTS- oder TrueHD-Ton, den der Standard-Player auf den meisten Handys/Tablets nicht abspielen kann. Portiva erkennt das und wechselt automatisch auf VLC (spielt DTS ab). Im Player-Zahnrad unter „Audiospur“ wählst du die Sprache (z. B. Deutsch / Englisch); Spuren mit „(mit VLC)“ wechseln beim Antippen auf VLC.</w:t>
+              <w:t xml:space="preserve">Behoben ab 1.1.97: Viele SD-Sender senden im älteren MPEG-2-Format, das der Standard-Player auf Handys/Tablets nicht anzeigen kann. Läuft der Ton 6 Sekunden ohne Bild, wechselt Portiva automatisch zu VLC und merkt sich das für diesen Sender.</w:t>
             </w:r>
           </w:p>
         </w:tc>
@@ -3770,7 +3770,7 @@
                 <w:sz w:val="20"/>
                 <w:szCs w:val="20"/>
               </w:rPr>
-              <w:t xml:space="preserve">Live TV stockt</w:t>
+              <w:t xml:space="preserve">Film läuft ohne Ton</w:t>
             </w:r>
           </w:p>
         </w:tc>
@@ -3793,7 +3793,7 @@
                 <w:sz w:val="20"/>
                 <w:szCs w:val="20"/>
               </w:rPr>
-              <w:t xml:space="preserve">Beide Player puffern Live TV jetzt größer (Standard-Player bis 60 s, nach einem Aussetzer erst mit 6 s Vorrat weiter; VLC 4 s) und verbinden sich nach Unterbrechungen automatisch neu. Unter Windows: Einstellungen → Player → Puffer „Groß“.</w:t>
+              <w:t xml:space="preserve">Behoben ab 1.1.80: Viele Filme haben DTS- oder TrueHD-Ton, den der Standard-Player auf den meisten Handys/Tablets nicht abspielen kann. Portiva erkennt das und wechselt automatisch auf VLC (spielt DTS ab). Im Player-Zahnrad unter „Audiospur“ wählst du die Sprache (z. B. Deutsch / Englisch); Spuren mit „(mit VLC)“ wechseln beim Antippen auf VLC.</w:t>
             </w:r>
           </w:p>
         </w:tc>
@@ -3820,7 +3820,7 @@
                 <w:sz w:val="20"/>
                 <w:szCs w:val="20"/>
               </w:rPr>
-              <w:t xml:space="preserve">Wann wird VLC benutzt?</w:t>
+              <w:t xml:space="preserve">Live TV stockt</w:t>
             </w:r>
           </w:p>
         </w:tc>
@@ -3842,7 +3842,7 @@
                 <w:sz w:val="20"/>
                 <w:szCs w:val="20"/>
               </w:rPr>
-              <w:t xml:space="preserve">Im Modus „Automatisch“ startet immer zuerst der Standard-Player. Nur wenn er einen bestimmten Stream nicht abspielen kann (z.B. seltene Ton- oder Bildformate), wechselt die App für genau diesen Titel zu VLC.</w:t>
+              <w:t xml:space="preserve">Beide Player puffern Live TV jetzt größer (Standard-Player bis 60 s, nach einem Aussetzer erst mit 6 s Vorrat weiter; VLC 4 s) und verbinden sich nach Unterbrechungen automatisch neu. Unter Windows: Einstellungen → Player → Puffer „Groß“.</w:t>
             </w:r>
           </w:p>
         </w:tc>
@@ -3870,7 +3870,7 @@
                 <w:sz w:val="20"/>
                 <w:szCs w:val="20"/>
               </w:rPr>
-              <w:t xml:space="preserve">VLC ruckelt oder hängt</w:t>
+              <w:t xml:space="preserve">Wann wird VLC benutzt?</w:t>
             </w:r>
           </w:p>
         </w:tc>
@@ -3893,7 +3893,7 @@
                 <w:sz w:val="20"/>
                 <w:szCs w:val="20"/>
               </w:rPr>
-              <w:t xml:space="preserve">Einstellungen → Player → VLC-Leistung auf „Schnell“ stellen (bei TV-Sticks automatisch).</w:t>
+              <w:t xml:space="preserve">Im Modus „Automatisch“ startet immer zuerst der Standard-Player. Nur wenn er einen bestimmten Stream nicht abspielen kann (z.B. seltene Ton- oder Bildformate), wechselt die App für genau diesen Titel zu VLC.</w:t>
             </w:r>
           </w:p>
         </w:tc>
@@ -3920,7 +3920,7 @@
                 <w:sz w:val="20"/>
                 <w:szCs w:val="20"/>
               </w:rPr>
-              <w:t xml:space="preserve">Nur Ton, kein Bild</w:t>
+              <w:t xml:space="preserve">VLC ruckelt oder hängt</w:t>
             </w:r>
           </w:p>
         </w:tc>
@@ -3942,7 +3942,7 @@
                 <w:sz w:val="20"/>
                 <w:szCs w:val="20"/>
               </w:rPr>
-              <w:t xml:space="preserve">Der Sender nutzt ein altes Format – die App wechselt automatisch zu VLC. Sonst Einstellungen → Player → VLC.</w:t>
+              <w:t xml:space="preserve">Einstellungen → Player → VLC-Leistung auf „Schnell“ stellen (bei TV-Sticks automatisch).</w:t>
             </w:r>
           </w:p>
         </w:tc>
@@ -3970,7 +3970,7 @@
                 <w:sz w:val="20"/>
                 <w:szCs w:val="20"/>
               </w:rPr>
-              <w:t xml:space="preserve">Bild bleibt bei Aufnahme stehen</w:t>
+              <w:t xml:space="preserve">Nur Ton, kein Bild</w:t>
             </w:r>
           </w:p>
         </w:tc>
@@ -3993,7 +3993,7 @@
                 <w:sz w:val="20"/>
                 <w:szCs w:val="20"/>
               </w:rPr>
-              <w:t xml:space="preserve">Der Zugang erlaubt nur eine Verbindung. Den aufgenommenen Sender schauen oder die Aufnahme stoppen.</w:t>
+              <w:t xml:space="preserve">Der Sender nutzt ein altes Format – die App wechselt automatisch zu VLC. Sonst Einstellungen → Player → VLC.</w:t>
             </w:r>
           </w:p>
         </w:tc>
@@ -4020,7 +4020,7 @@
                 <w:sz w:val="20"/>
                 <w:szCs w:val="20"/>
               </w:rPr>
-              <w:t xml:space="preserve">Update lässt sich nicht installieren</w:t>
+              <w:t xml:space="preserve">Bild bleibt bei Aufnahme stehen</w:t>
             </w:r>
           </w:p>
         </w:tc>
@@ -4042,7 +4042,7 @@
                 <w:sz w:val="20"/>
                 <w:szCs w:val="20"/>
               </w:rPr>
-              <w:t xml:space="preserve">Immer die APK aus den Releases verwenden (gleiche Signatur).</w:t>
+              <w:t xml:space="preserve">Der Zugang erlaubt nur eine Verbindung. Den aufgenommenen Sender schauen oder die Aufnahme stoppen.</w:t>
             </w:r>
           </w:p>
         </w:tc>
@@ -4070,7 +4070,7 @@
                 <w:sz w:val="20"/>
                 <w:szCs w:val="20"/>
               </w:rPr>
-              <w:t xml:space="preserve">Cast findet den Fernseher nicht</w:t>
+              <w:t xml:space="preserve">Update lässt sich nicht installieren</w:t>
             </w:r>
           </w:p>
         </w:tc>
@@ -4093,7 +4093,7 @@
                 <w:sz w:val="20"/>
                 <w:szCs w:val="20"/>
               </w:rPr>
-              <w:t xml:space="preserve">Samsung- und Fire-TV-Geräte können kein Google Cast – „Bildschirm spiegeln“ nutzen.</w:t>
+              <w:t xml:space="preserve">Immer die APK aus den Releases verwenden (gleiche Signatur).</w:t>
             </w:r>
           </w:p>
         </w:tc>
@@ -4120,6 +4120,56 @@
                 <w:sz w:val="20"/>
                 <w:szCs w:val="20"/>
               </w:rPr>
+              <w:t xml:space="preserve">Cast findet den Fernseher nicht</w:t>
+            </w:r>
+          </w:p>
+        </w:tc>
+        <w:tc>
+          <w:tcPr>
+            <w:tcW w:type="dxa" w:w="6026"/>
+            <w:tcMar>
+              <w:top w:type="dxa" w:w="60"/>
+              <w:left w:type="dxa" w:w="100"/>
+              <w:bottom w:type="dxa" w:w="60"/>
+              <w:right w:type="dxa" w:w="100"/>
+            </w:tcMar>
+          </w:tcPr>
+          <w:p>
+            <w:r>
+              <w:rPr>
+                <w:b w:val="false"/>
+                <w:bCs w:val="false"/>
+                <w:sz w:val="20"/>
+                <w:szCs w:val="20"/>
+              </w:rPr>
+              <w:t xml:space="preserve">Samsung- und Fire-TV-Geräte können kein Google Cast – „Bildschirm spiegeln“ nutzen.</w:t>
+            </w:r>
+          </w:p>
+        </w:tc>
+      </w:tr>
+      <w:tr>
+        <w:trPr>
+          <w:tblHeader w:val="false"/>
+        </w:trPr>
+        <w:tc>
+          <w:tcPr>
+            <w:tcW w:type="dxa" w:w="3000"/>
+            <w:shd w:fill="EEF5FA" w:color="auto" w:val="clear"/>
+            <w:tcMar>
+              <w:top w:type="dxa" w:w="60"/>
+              <w:left w:type="dxa" w:w="100"/>
+              <w:bottom w:type="dxa" w:w="60"/>
+              <w:right w:type="dxa" w:w="100"/>
+            </w:tcMar>
+          </w:tcPr>
+          <w:p>
+            <w:r>
+              <w:rPr>
+                <w:b/>
+                <w:bCs/>
+                <w:sz w:val="20"/>
+                <w:szCs w:val="20"/>
+              </w:rPr>
               <w:t xml:space="preserve">Senderliste veraltet</w:t>
             </w:r>
           </w:p>
@@ -4127,6 +4177,7 @@
         <w:tc>
           <w:tcPr>
             <w:tcW w:type="dxa" w:w="6026"/>
+            <w:shd w:fill="EEF5FA" w:color="auto" w:val="clear"/>
             <w:tcMar>
               <w:top w:type="dxa" w:w="60"/>
               <w:left w:type="dxa" w:w="100"/>

</xml_diff>

<commit_message>
Enigma2-Plugin (.ipk) im Ordner 'Enigma IPK'; Windows: Mausrad nur noch ueber den Reglern
- Neues Plugin fuer Enigma2-Receiver (OpenATV/OpenPLi/VTi, Python 2/3):
  Xtream/M3U-Zugaenge, Live TV/Filme/Serien, Jetzt/Danach, Favoriten,
  Weiterschauen, naechste Folge, Suche, Live-Kategorie als Bouquet;
  Build ohne Zusatzwerkzeuge (build.py), CI-Job enigma2, Release-Datei
- Windows: Scrollen aendert die Lautstaerke nicht mehr ueberall
- Anleitung Kapitel 19 (Enigma2), Version 1.1.103

Co-Authored-By: Claude Opus 5.5 <noreply@anthropic.com>
Claude-Session: https://claude.ai/code/session_01CaJqjA6T7wr6qkboQBX5Ep
</commit_message>
<xml_diff>
--- a/docs/PowerIPTV-Anleitung.docx
+++ b/docs/PowerIPTV-Anleitung.docx
@@ -49,7 +49,7 @@
         <w:rPr>
           <w:color w:val="666666"/>
         </w:rPr>
-        <w:t xml:space="preserve">Stand: Version 1.1.102 · Oktober 2026</w:t>
+        <w:t xml:space="preserve">Stand: Version 1.1.103 · Oktober 2026</w:t>
       </w:r>
     </w:p>
     <w:p>
@@ -539,7 +539,7 @@
         <w:spacing w:after="120"/>
       </w:pPr>
       <w:r>
-        <w:t xml:space="preserve">Alle Dateien liegen im Release bereit. Der Quellcode ist auf GitHub nach Geräten getrennt: Ordner „Android“, „iOS“, „Tizen Samsung“, „Windows“ und „Fire TV Vega“ (neue Amazon-Sticks mit Vega OS).</w:t>
+        <w:t xml:space="preserve">Alle Dateien liegen im Release bereit. Der Quellcode ist auf GitHub nach Geräten getrennt: Ordner „Android“, „iOS“, „Tizen Samsung“, „Windows“, „Fire TV Vega“ (neue Amazon-Sticks mit Vega OS) und „Enigma IPK“ (Enigma2-Receiver).</w:t>
       </w:r>
     </w:p>
     <w:p>
@@ -4411,7 +4411,7 @@
         <w:t xml:space="preserve">Player: </w:t>
       </w:r>
       <w:r>
-        <w:t xml:space="preserve">Klick = Pause, Doppelklick = Vollbild, Mausrad = Lautstärke. Zahnrad: Bildformat, Tonspur, Untertitel, Geschwindigkeit. Bei Serien „Nächste Folge“ 40 Sekunden vor Schluss.</w:t>
+        <w:t xml:space="preserve">Klick = Pause, Doppelklick = Vollbild. Mausrad verstellt Helligkeit/Lautstärke nur direkt über dem jeweiligen Regler (sonst nichts – z. B. beim Blättern in der Senderliste). Zahnrad: Bildformat, Tonspur, Untertitel, Geschwindigkeit. Bei Serien „Nächste Folge“ 40 Sekunden vor Schluss.</w:t>
       </w:r>
     </w:p>
     <w:tbl>
@@ -6773,6 +6773,178 @@
       </w:r>
       <w:r>
         <w:t xml:space="preserve">Hinweis: Diese Version ist neu und noch nicht auf jedem Stick erprobt. Klappt ein Sender oder Film nicht, im Anbieter-Portal bzw. in den Einstellungen das Live-Format „HLS (m3u8)“ wählen; MKV-Filme mit DTS-Ton spielen die neuen Sticks evtl. ohne Ton ab.</w:t>
+      </w:r>
+    </w:p>
+    <w:p>
+      <w:pPr>
+        <w:pStyle w:val="Heading1"/>
+        <w:spacing w:after="160" w:before="360"/>
+      </w:pPr>
+      <w:r>
+        <w:t xml:space="preserve">19. PowerIPTV für Enigma2-Receiver (.ipk)</w:t>
+      </w:r>
+    </w:p>
+    <w:p>
+      <w:pPr>
+        <w:spacing w:after="120"/>
+      </w:pPr>
+      <w:r>
+        <w:t xml:space="preserve">Für Sat-/Kabel-Receiver mit Enigma2 (z. B. VU+, Dreambox, Gigablue, Octagon, Zgemma mit OpenATV, OpenPLi oder VTi) gibt es PowerIPTV als Plugin: Datei „PowerIPTV-Enigma2.ipk“ im Release (Quellcode im Ordner „Enigma IPK“).</w:t>
+      </w:r>
+    </w:p>
+    <w:p>
+      <w:pPr>
+        <w:pStyle w:val="Heading2"/>
+        <w:spacing w:after="120" w:before="240"/>
+      </w:pPr>
+      <w:r>
+        <w:t xml:space="preserve">Installieren</w:t>
+      </w:r>
+    </w:p>
+    <w:p>
+      <w:pPr>
+        <w:pStyle w:val="ListParagraph"/>
+        <w:numPr>
+          <w:ilvl w:val="0"/>
+          <w:numId w:val="19"/>
+        </w:numPr>
+        <w:spacing w:after="60"/>
+      </w:pPr>
+      <w:r>
+        <w:t xml:space="preserve">Die Datei „PowerIPTV-Enigma2.ipk“ am PC herunterladen.</w:t>
+      </w:r>
+    </w:p>
+    <w:p>
+      <w:pPr>
+        <w:pStyle w:val="ListParagraph"/>
+        <w:numPr>
+          <w:ilvl w:val="0"/>
+          <w:numId w:val="19"/>
+        </w:numPr>
+        <w:spacing w:after="60"/>
+      </w:pPr>
+      <w:r>
+        <w:t xml:space="preserve">Mit einem FTP-Programm (z. B. FileZilla; Adresse = IP des Receivers, Benutzer „root“, Passwort meist leer oder das des Images) in den Ordner /tmp des Receivers kopieren.</w:t>
+      </w:r>
+    </w:p>
+    <w:p>
+      <w:pPr>
+        <w:pStyle w:val="ListParagraph"/>
+        <w:numPr>
+          <w:ilvl w:val="0"/>
+          <w:numId w:val="19"/>
+        </w:numPr>
+        <w:spacing w:after="60"/>
+      </w:pPr>
+      <w:r>
+        <w:t xml:space="preserve">Am Receiver: Menü → Plugins → „Lokale Erweiterungen installieren“ (je nach Image grüne/blaue Taste) und die Datei wählen. Alternativ per Telnet/SSH: opkg install /tmp/PowerIPTV-Enigma2.ipk</w:t>
+      </w:r>
+    </w:p>
+    <w:p>
+      <w:pPr>
+        <w:pStyle w:val="ListParagraph"/>
+        <w:numPr>
+          <w:ilvl w:val="0"/>
+          <w:numId w:val="19"/>
+        </w:numPr>
+        <w:spacing w:after="60"/>
+      </w:pPr>
+      <w:r>
+        <w:t xml:space="preserve">GUI neu starten (Menü → Standby/Neustart → GUI neu starten).</w:t>
+      </w:r>
+    </w:p>
+    <w:p>
+      <w:pPr>
+        <w:pStyle w:val="ListParagraph"/>
+        <w:numPr>
+          <w:ilvl w:val="0"/>
+          <w:numId w:val="19"/>
+        </w:numPr>
+        <w:spacing w:after="60"/>
+      </w:pPr>
+      <w:r>
+        <w:t xml:space="preserve">Menü → Plugins → PowerIPTV öffnen und den Zugang eintragen (Xtream Codes oder M3U-Link). OK bzw. Gelb öffnet die Bildschirmtastatur, Grün prüft und speichert.</w:t>
+      </w:r>
+    </w:p>
+    <w:p>
+      <w:pPr>
+        <w:pStyle w:val="Heading2"/>
+        <w:spacing w:after="120" w:before="240"/>
+      </w:pPr>
+      <w:r>
+        <w:t xml:space="preserve">Bedienung</w:t>
+      </w:r>
+    </w:p>
+    <w:p>
+      <w:pPr>
+        <w:pStyle w:val="ListParagraph"/>
+        <w:numPr>
+          <w:ilvl w:val="0"/>
+          <w:numId w:val="6"/>
+        </w:numPr>
+        <w:spacing w:after="60"/>
+      </w:pPr>
+      <w:r>
+        <w:t xml:space="preserve">Startseite: Live TV, Filme, Serien, Favoriten, Suche, Zugänge (rot), Einstellungen (grün), Suche (blau).</w:t>
+      </w:r>
+    </w:p>
+    <w:p>
+      <w:pPr>
+        <w:pStyle w:val="ListParagraph"/>
+        <w:numPr>
+          <w:ilvl w:val="0"/>
+          <w:numId w:val="6"/>
+        </w:numPr>
+        <w:spacing w:after="60"/>
+      </w:pPr>
+      <w:r>
+        <w:t xml:space="preserve">In den Listen: rechts erscheinen Jetzt/Danach (Sender) bzw. Handlung (Filme). Gelb = Favorit, Blau = Liste filtern.</w:t>
+      </w:r>
+    </w:p>
+    <w:p>
+      <w:pPr>
+        <w:pStyle w:val="ListParagraph"/>
+        <w:numPr>
+          <w:ilvl w:val="0"/>
+          <w:numId w:val="6"/>
+        </w:numPr>
+        <w:spacing w:after="60"/>
+      </w:pPr>
+      <w:r>
+        <w:t xml:space="preserve">Live-Kategorie mit Grün „Als Bouquet“ übernehmen: Die Sender stehen dann auch in der normalen Senderliste des Receivers.</w:t>
+      </w:r>
+    </w:p>
+    <w:p>
+      <w:pPr>
+        <w:pStyle w:val="ListParagraph"/>
+        <w:numPr>
+          <w:ilvl w:val="0"/>
+          <w:numId w:val="6"/>
+        </w:numPr>
+        <w:spacing w:after="60"/>
+      </w:pPr>
+      <w:r>
+        <w:t xml:space="preserve">Im Player: Hoch/Runter bzw. CH+/CH- = Sender wechseln, INFO = Jetzt/Danach, Tonspur und Untertitel wie beim Receiver gewohnt, EXIT = zurück. Filme und Folgen merken sich die Stelle (Weiterschauen), die nächste Folge startet automatisch.</w:t>
+      </w:r>
+    </w:p>
+    <w:p>
+      <w:pPr>
+        <w:pBdr>
+          <w:left w:val="single" w:color="1E88B8" w:sz="18" w:space="8"/>
+        </w:pBdr>
+        <w:spacing w:after="160" w:before="80"/>
+        <w:ind w:left="240"/>
+      </w:pPr>
+      <w:r>
+        <w:rPr>
+          <w:b/>
+          <w:bCs/>
+          <w:color w:val="1E88B8"/>
+        </w:rPr>
+        <w:t xml:space="preserve">Tipp: </w:t>
+      </w:r>
+      <w:r>
+        <w:t xml:space="preserve">Ruckelt ein Sender oder fehlt Bild/Ton: Einstellungen → Player „exteplayer3 (5002)“ wählen (dafür das Paket ServiceApp aus dem Image-Feed installieren) oder Live-TV-Format „HLS (m3u8)“ probieren.</w:t>
       </w:r>
     </w:p>
     <w:sectPr>
@@ -7184,6 +7356,18 @@
     </w:lvl>
   </w:abstractNum>
   <w:abstractNum w:abstractNumId="19" w15:restartNumberingAfterBreak="0">
+    <w:multiLevelType w:val="hybridMultilevel"/>
+    <w:lvl w:ilvl="0" w15:tentative="1">
+      <w:start w:val="1"/>
+      <w:numFmt w:val="decimal"/>
+      <w:lvlText w:val="%1."/>
+      <w:lvlJc w:val="left"/>
+      <w:pPr>
+        <w:ind w:left="540" w:hanging="270"/>
+      </w:pPr>
+    </w:lvl>
+  </w:abstractNum>
+  <w:abstractNum w:abstractNumId="20" w15:restartNumberingAfterBreak="0">
     <w:multiLevelType w:val="hybridMultilevel"/>
     <w:lvl w:ilvl="0" w15:tentative="1">
       <w:start w:val="1"/>
@@ -7299,6 +7483,12 @@
   </w:num>
   <w:num w:numId="18">
     <w:abstractNumId w:val="18"/>
+    <w:lvlOverride w:ilvl="0">
+      <w:startOverride w:val="1"/>
+    </w:lvlOverride>
+  </w:num>
+  <w:num w:numId="19">
+    <w:abstractNumId w:val="19"/>
     <w:lvlOverride w:ilvl="0">
       <w:startOverride w:val="1"/>
     </w:lvlOverride>

</xml_diff>

<commit_message>
Anleitung 1.1.104: Enigma2-Kapitel erweitert
Co-Authored-By: Claude Opus 5.5 <noreply@anthropic.com>
Claude-Session: https://claude.ai/code/session_01CaJqjA6T7wr6qkboQBX5Ep
</commit_message>
<xml_diff>
--- a/docs/PowerIPTV-Anleitung.docx
+++ b/docs/PowerIPTV-Anleitung.docx
@@ -49,7 +49,7 @@
         <w:rPr>
           <w:color w:val="666666"/>
         </w:rPr>
-        <w:t xml:space="preserve">Stand: Version 1.1.103 · Oktober 2026</w:t>
+        <w:t xml:space="preserve">Stand: Version 1.1.104 · Oktober 2026</w:t>
       </w:r>
     </w:p>
     <w:p>
@@ -6872,7 +6872,7 @@
         <w:spacing w:after="120" w:before="240"/>
       </w:pPr>
       <w:r>
-        <w:t xml:space="preserve">Bedienung</w:t>
+        <w:t xml:space="preserve">Bedienung (mit der Fernbedienung)</w:t>
       </w:r>
     </w:p>
     <w:p>
@@ -6885,7 +6885,7 @@
         <w:spacing w:after="60"/>
       </w:pPr>
       <w:r>
-        <w:t xml:space="preserve">Startseite: Live TV, Filme, Serien, Favoriten, Suche, Zugänge (rot), Einstellungen (grün), Suche (blau).</w:t>
+        <w:t xml:space="preserve">Startseite wie bei den anderen Geräten: drei große Bild-Kacheln Live TV, Filme, Serien und darunter Weiterschauen, Suche, TV-Guide, Favoriten, Zuletzt gesehen, Benutzer wechseln, Vom Handy empfangen, Einstellungen, Update und Playlist aktualisieren. Pfeiltasten wählen, OK öffnet. Rot = Benutzer, Grün = Einstellungen, Blau = Suche.</w:t>
       </w:r>
     </w:p>
     <w:p>
@@ -6898,7 +6898,7 @@
         <w:spacing w:after="60"/>
       </w:pPr>
       <w:r>
-        <w:t xml:space="preserve">In den Listen: rechts erscheinen Jetzt/Danach (Sender) bzw. Handlung (Filme). Gelb = Favorit, Blau = Liste filtern.</w:t>
+        <w:t xml:space="preserve">Kategorien: oben „♥ Favoriten“, „Zuletzt gesehen“ und „Alle“. Gelb = Sprache filtern (z. B. nur DE), Rot = Kategorie mit PIN sperren/entsperren (Kindersicherung), Grün = Live-Kategorie als Bouquet in die normale Senderliste des Receivers übernehmen.</w:t>
       </w:r>
     </w:p>
     <w:p>
@@ -6911,7 +6911,7 @@
         <w:spacing w:after="60"/>
       </w:pPr>
       <w:r>
-        <w:t xml:space="preserve">Live-Kategorie mit Grün „Als Bouquet“ übernehmen: Die Sender stehen dann auch in der normalen Senderliste des Receivers.</w:t>
+        <w:t xml:space="preserve">In den Listen: rechts Jetzt/Weiter (Sender) bzw. Handlung, Genre, Bewertung (Filme). Rot = Sortieren, Gelb = Favorit, Blau = Filtern, MENU = mehr (Film herunterladen auf Festplatte/USB, Programm), INFO = Programm des Senders.</w:t>
       </w:r>
     </w:p>
     <w:p>
@@ -6924,7 +6924,93 @@
         <w:spacing w:after="60"/>
       </w:pPr>
       <w:r>
-        <w:t xml:space="preserve">Im Player: Hoch/Runter bzw. CH+/CH- = Sender wechseln, INFO = Jetzt/Danach, Tonspur und Untertitel wie beim Receiver gewohnt, EXIT = zurück. Filme und Folgen merken sich die Stelle (Weiterschauen), die nächste Folge startet automatisch.</w:t>
+        <w:t xml:space="preserve">Live TV: Beim Umschalten erscheint unten die Info-Leiste mit Senderlogo, Name, Uhrzeit, „Jetzt“ mit Fortschrittsbalken und „Weiter“. Hoch/Runter bzw. CH+/CH- = Sender wechseln, Rot = letzter Sender, Gelb = Favorit, Blau = an ein anderes Portiva-Gerät senden.</w:t>
+      </w:r>
+    </w:p>
+    <w:p>
+      <w:pPr>
+        <w:pStyle w:val="ListParagraph"/>
+        <w:numPr>
+          <w:ilvl w:val="0"/>
+          <w:numId w:val="6"/>
+        </w:numPr>
+        <w:spacing w:after="60"/>
+      </w:pPr>
+      <w:r>
+        <w:t xml:space="preserve">OK im Live TV öffnet rechts die Senderliste; Grün „EPG aktualisieren“ lädt das Programm neu. EXIT schließt die Liste wieder.</w:t>
+      </w:r>
+    </w:p>
+    <w:p>
+      <w:pPr>
+        <w:pStyle w:val="ListParagraph"/>
+        <w:numPr>
+          <w:ilvl w:val="0"/>
+          <w:numId w:val="6"/>
+        </w:numPr>
+        <w:spacing w:after="60"/>
+      </w:pPr>
+      <w:r>
+        <w:t xml:space="preserve">INFO im Live TV zeigt das ganze Programm des Senders. Sendungen mit ► kann man nachträglich ansehen (Catch-up), wenn der Anbieter ein Archiv hat.</w:t>
+      </w:r>
+    </w:p>
+    <w:p>
+      <w:pPr>
+        <w:pStyle w:val="ListParagraph"/>
+        <w:numPr>
+          <w:ilvl w:val="0"/>
+          <w:numId w:val="6"/>
+        </w:numPr>
+        <w:spacing w:after="60"/>
+      </w:pPr>
+      <w:r>
+        <w:t xml:space="preserve">Filme und Folgen: Stelle wird gemerkt (Kachel „Weiterschauen“), die nächste Folge startet automatisch. Tonspur (AUDIO) und Untertitel (TEXT) wie beim Receiver gewohnt.</w:t>
+      </w:r>
+    </w:p>
+    <w:p>
+      <w:pPr>
+        <w:pStyle w:val="ListParagraph"/>
+        <w:numPr>
+          <w:ilvl w:val="0"/>
+          <w:numId w:val="6"/>
+        </w:numPr>
+        <w:spacing w:after="60"/>
+      </w:pPr>
+      <w:r>
+        <w:t xml:space="preserve">Zugänge: Kachel „Vom Handy empfangen“ zeigt einen QR-Code – mit der PowerIPTV-App am Handy scannen, der Zugang wird übertragen. In „Benutzer wechseln“ zeigt Blau den Zugang als QR-Code für ein anderes Gerät (nur dir selbst zeigen – enthält die Zugangsdaten).</w:t>
+      </w:r>
+    </w:p>
+    <w:p>
+      <w:pPr>
+        <w:pStyle w:val="ListParagraph"/>
+        <w:numPr>
+          <w:ilvl w:val="0"/>
+          <w:numId w:val="6"/>
+        </w:numPr>
+        <w:spacing w:after="60"/>
+      </w:pPr>
+      <w:r>
+        <w:t xml:space="preserve">Portiva Link: Handy, Tablet oder PC finden den Receiver automatisch im Heimnetz („An Gerät senden“) und spielen den laufenden Film/Sender dort weiter.</w:t>
+      </w:r>
+    </w:p>
+    <w:p>
+      <w:pPr>
+        <w:pStyle w:val="ListParagraph"/>
+        <w:numPr>
+          <w:ilvl w:val="0"/>
+          <w:numId w:val="6"/>
+        </w:numPr>
+        <w:spacing w:after="60"/>
+      </w:pPr>
+      <w:r>
+        <w:t xml:space="preserve">Einstellungen: Player, Live-TV-Format, Gerätename, PIN der Kindersicherung, Erwachseneninhalte automatisch sperren, automatische Update-Prüfung. Kachel „Update“ installiert neue Versionen direkt von GitHub und startet die Oberfläche neu.</w:t>
+      </w:r>
+    </w:p>
+    <w:p>
+      <w:pPr>
+        <w:spacing w:after="120"/>
+      </w:pPr>
+      <w:r>
+        <w:t xml:space="preserve">Nicht auf dem Receiver: Multi-Screen, Bild-in-Bild, VPN, Vorschaubilder beim Spulen und KI-Empfehlungen – dafür ist die Receiver-Hardware nicht gedacht.</w:t>
       </w:r>
     </w:p>
     <w:p>

</xml_diff>

<commit_message>
Erwachseneninhalte nie in 'Zuletzt gesehen' (alle Varianten), alte Eintraege werden entfernt
Co-Authored-By: Claude Opus 5.5 <noreply@anthropic.com>
Claude-Session: https://claude.ai/code/session_01CaJqjA6T7wr6qkboQBX5Ep
</commit_message>
<xml_diff>
--- a/docs/PowerIPTV-Anleitung.docx
+++ b/docs/PowerIPTV-Anleitung.docx
@@ -49,7 +49,7 @@
         <w:rPr>
           <w:color w:val="666666"/>
         </w:rPr>
-        <w:t xml:space="preserve">Stand: Version 1.1.104 · Oktober 2026</w:t>
+        <w:t xml:space="preserve">Stand: Version 1.1.106 · Oktober 2026</w:t>
       </w:r>
     </w:p>
     <w:p>
@@ -5288,6 +5288,26 @@
       </w:r>
       <w:r>
         <w:t xml:space="preserve">PIN festlegen, Erwachseneninhalte automatisch sperren, einzelne Kategorien sperren, Einstellungen schützen – gesperrte Inhalte sind überall ausgeblendet (Listen, Suche, Verlauf, Favoriten, TV-Guide) und nur mit PIN erreichbar.</w:t>
+      </w:r>
+    </w:p>
+    <w:p>
+      <w:pPr>
+        <w:pStyle w:val="ListParagraph"/>
+        <w:numPr>
+          <w:ilvl w:val="0"/>
+          <w:numId w:val="6"/>
+        </w:numPr>
+        <w:spacing w:after="60"/>
+      </w:pPr>
+      <w:r>
+        <w:rPr>
+          <w:b/>
+          <w:bCs/>
+        </w:rPr>
+        <w:t xml:space="preserve">Zuletzt gesehen ohne Erwachseneninhalte: </w:t>
+      </w:r>
+      <w:r>
+        <w:t xml:space="preserve">Sender, Filme und Serien für Erwachsene (am Namen oder an der Kategorie erkannt, z. B. „XXX“, „Adult“, „18+“) werden auf allen Geräten nie in „Zuletzt gesehen“ gespeichert – auch ohne Kindersicherung. Bereits vorhandene Einträge werden automatisch entfernt.</w:t>
       </w:r>
     </w:p>
     <w:p>

</xml_diff>

<commit_message>
Play-Store-Anleitung (Word), Datenschutzerklaerung, Store-Texte und -Grafiken; Enigma2: EPG Jetzt/Weiter auch bei leerer Kurz-EPG
Co-Authored-By: Claude Opus 5.5 <noreply@anthropic.com>
Claude-Session: https://claude.ai/code/session_01CaJqjA6T7wr6qkboQBX5Ep
</commit_message>
<xml_diff>
--- a/docs/PowerIPTV-Anleitung.docx
+++ b/docs/PowerIPTV-Anleitung.docx
@@ -49,7 +49,7 @@
         <w:rPr>
           <w:color w:val="666666"/>
         </w:rPr>
-        <w:t xml:space="preserve">Stand: Version 1.1.109 · Oktober 2026</w:t>
+        <w:t xml:space="preserve">Stand: Version 1.1.111 · Oktober 2026</w:t>
       </w:r>
     </w:p>
     <w:p>
@@ -7051,6 +7051,62 @@
       </w:r>
       <w:r>
         <w:t xml:space="preserve">Ruckelt ein Sender oder fehlt Bild/Ton: Einstellungen → Player „exteplayer3 (5002)“ wählen (dafür das Paket ServiceApp aus dem Image-Feed installieren) oder Live-TV-Format „HLS (m3u8)“ probieren.</w:t>
+      </w:r>
+    </w:p>
+    <w:p>
+      <w:pPr>
+        <w:pStyle w:val="Heading1"/>
+        <w:spacing w:after="160" w:before="360"/>
+      </w:pPr>
+      <w:r>
+        <w:t xml:space="preserve">20. Android aus dem Google Play Store</w:t>
+      </w:r>
+    </w:p>
+    <w:p>
+      <w:pPr>
+        <w:spacing w:after="120"/>
+      </w:pPr>
+      <w:r>
+        <w:t xml:space="preserve">Neben der APK von GitHub gibt es eine eigene Variante für den Google Play Store. Sie wird bei jeder Änderung automatisch mitgebaut (App-Bundle .aab) und kann – einmal eingerichtet – automatisch an Google Play gesendet werden. Die Schritt-für-Schritt-Anleitung steht im Ordner „Android“: „Play-Store-Anleitung.docx“.</w:t>
+      </w:r>
+    </w:p>
+    <w:p>
+      <w:pPr>
+        <w:pStyle w:val="ListParagraph"/>
+        <w:numPr>
+          <w:ilvl w:val="0"/>
+          <w:numId w:val="6"/>
+        </w:numPr>
+        <w:spacing w:after="60"/>
+      </w:pPr>
+      <w:r>
+        <w:t xml:space="preserve">Play-Version: Updates kommen über den Play Store; es gibt dort keine eigene Update-Kachel und kein VPN (Google-Richtlinie). Alle anderen Funktionen sind gleich.</w:t>
+      </w:r>
+    </w:p>
+    <w:p>
+      <w:pPr>
+        <w:pStyle w:val="ListParagraph"/>
+        <w:numPr>
+          <w:ilvl w:val="0"/>
+          <w:numId w:val="6"/>
+        </w:numPr>
+        <w:spacing w:after="60"/>
+      </w:pPr>
+      <w:r>
+        <w:t xml:space="preserve">GitHub-Version (APK): unverändert mit eigener Update-Funktion und VPN.</w:t>
+      </w:r>
+    </w:p>
+    <w:p>
+      <w:pPr>
+        <w:pStyle w:val="ListParagraph"/>
+        <w:numPr>
+          <w:ilvl w:val="0"/>
+          <w:numId w:val="6"/>
+        </w:numPr>
+        <w:spacing w:after="60"/>
+      </w:pPr>
+      <w:r>
+        <w:t xml:space="preserve">Wechsel zwischen beiden Versionen nur nach Deinstallation (Zugänge vorher per Backup oder QR-Code sichern).</w:t>
       </w:r>
     </w:p>
     <w:sectPr>

</xml_diff>

<commit_message>
Enigma2: neues Design (Glas-Panels, Bild-Kacheln, Leucht-Fokus, Symbole, HD/FHD-Grafiken), Live-Vorschau in der Senderliste, Cover bei Filmen/Serien, neue Player-Infoleiste
Co-Authored-By: Claude Opus 5.5 <noreply@anthropic.com>
Claude-Session: https://claude.ai/code/session_01CaJqjA6T7wr6qkboQBX5Ep
</commit_message>
<xml_diff>
--- a/docs/PowerIPTV-Anleitung.docx
+++ b/docs/PowerIPTV-Anleitung.docx
@@ -49,7 +49,7 @@
         <w:rPr>
           <w:color w:val="666666"/>
         </w:rPr>
-        <w:t xml:space="preserve">Stand: Version 1.1.111 · Oktober 2026</w:t>
+        <w:t xml:space="preserve">Stand: Version 1.1.112 · Oktober 2026</w:t>
       </w:r>
     </w:p>
     <w:p>
@@ -6945,6 +6945,19 @@
       </w:pPr>
       <w:r>
         <w:t xml:space="preserve">Live TV: Beim Umschalten erscheint unten die Info-Leiste mit Senderlogo, Name, Uhrzeit, „Jetzt“ mit Fortschrittsbalken und „Weiter“. Hoch/Runter bzw. CH+/CH- = Sender wechseln, Rot = letzter Sender, Gelb = Favorit, Blau = an ein anderes Portiva-Gerät senden.</w:t>
+      </w:r>
+    </w:p>
+    <w:p>
+      <w:pPr>
+        <w:pStyle w:val="ListParagraph"/>
+        <w:numPr>
+          <w:ilvl w:val="0"/>
+          <w:numId w:val="6"/>
+        </w:numPr>
+        <w:spacing w:after="60"/>
+      </w:pPr>
+      <w:r>
+        <w:t xml:space="preserve">Neues Design: dunkle Glas-Optik mit Bild-Kacheln, leuchtendem Auswahlrahmen und Symbolen. In der Senderliste läuft nach kurzem Verweilen rechts oben eine Live-Vorschau des markierten Senders, darunter Jetzt/Danach mit Fortschrittsbalken. Filme und Serien zeigen das Cover. Die Vorschau lässt sich in den Einstellungen („Live-Vorschau in der Senderliste“) abschalten; beim Verlassen der Liste läuft wieder das vorherige Programm.</w:t>
       </w:r>
     </w:p>
     <w:p>

</xml_diff>

<commit_message>
Enigma2: Verbindungsschutz fuer Live-Vorschau und Zappen (nur ein Stream, Pause beim Wechsel, Zapp-Puffer, Vorschau pausiert bei belegten Verbindungen)
Co-Authored-By: Claude Opus 5.5 <noreply@anthropic.com>
Claude-Session: https://claude.ai/code/session_01CaJqjA6T7wr6qkboQBX5Ep
</commit_message>
<xml_diff>
--- a/docs/PowerIPTV-Anleitung.docx
+++ b/docs/PowerIPTV-Anleitung.docx
@@ -49,7 +49,7 @@
         <w:rPr>
           <w:color w:val="666666"/>
         </w:rPr>
-        <w:t xml:space="preserve">Stand: Version 1.1.112 · Oktober 2026</w:t>
+        <w:t xml:space="preserve">Stand: Version 1.1.113 · Oktober 2026</w:t>
       </w:r>
     </w:p>
     <w:p>
@@ -6958,6 +6958,19 @@
       </w:pPr>
       <w:r>
         <w:t xml:space="preserve">Neues Design: dunkle Glas-Optik mit Bild-Kacheln, leuchtendem Auswahlrahmen und Symbolen. In der Senderliste läuft nach kurzem Verweilen rechts oben eine Live-Vorschau des markierten Senders, darunter Jetzt/Danach mit Fortschrittsbalken. Filme und Serien zeigen das Cover. Die Vorschau lässt sich in den Einstellungen („Live-Vorschau in der Senderliste“) abschalten; beim Verlassen der Liste läuft wieder das vorherige Programm.</w:t>
+      </w:r>
+    </w:p>
+    <w:p>
+      <w:pPr>
+        <w:pStyle w:val="ListParagraph"/>
+        <w:numPr>
+          <w:ilvl w:val="0"/>
+          <w:numId w:val="6"/>
+        </w:numPr>
+        <w:spacing w:after="60"/>
+      </w:pPr>
+      <w:r>
+        <w:t xml:space="preserve">Verbindungsschutz (wichtig bei Zugängen mit 1–2 Verbindungen): Es ist immer nur ein Stream offen. Vor jedem Wechsel wird der alte geschlossen und kurz gewartet, schnelles Blättern oder Zappen verbindet nur den Sender, auf dem man stehen bleibt (Vorschau höchstens alle 3 Sekunden). Läuft der Sender schon in der Vorschau, übernimmt der Vollbild-Player ihn ohne neue Verbindung. Sind alle Verbindungen des Zugangs belegt (z. B. schaut jemand auf einem anderen Gerät), pausiert die Vorschau automatisch.</w:t>
       </w:r>
     </w:p>
     <w:p>

</xml_diff>

<commit_message>
Enigma2: Live-Vorschau wartet bei belegter Verbindung und startet automatisch, sobald sie frei ist
Co-Authored-By: Claude Opus 5.5 <noreply@anthropic.com>
Claude-Session: https://claude.ai/code/session_01CaJqjA6T7wr6qkboQBX5Ep
</commit_message>
<xml_diff>
--- a/docs/PowerIPTV-Anleitung.docx
+++ b/docs/PowerIPTV-Anleitung.docx
@@ -49,7 +49,7 @@
         <w:rPr>
           <w:color w:val="666666"/>
         </w:rPr>
-        <w:t xml:space="preserve">Stand: Version 1.1.113 · Oktober 2026</w:t>
+        <w:t xml:space="preserve">Stand: Version 1.1.114 · Oktober 2026</w:t>
       </w:r>
     </w:p>
     <w:p>
@@ -6970,7 +6970,7 @@
         <w:spacing w:after="60"/>
       </w:pPr>
       <w:r>
-        <w:t xml:space="preserve">Verbindungsschutz (wichtig bei Zugängen mit 1–2 Verbindungen): Es ist immer nur ein Stream offen. Vor jedem Wechsel wird der alte geschlossen und kurz gewartet, schnelles Blättern oder Zappen verbindet nur den Sender, auf dem man stehen bleibt (Vorschau höchstens alle 3 Sekunden). Läuft der Sender schon in der Vorschau, übernimmt der Vollbild-Player ihn ohne neue Verbindung. Sind alle Verbindungen des Zugangs belegt (z. B. schaut jemand auf einem anderen Gerät), pausiert die Vorschau automatisch.</w:t>
+        <w:t xml:space="preserve">Verbindungsschutz (wichtig bei Zugängen mit 1–2 Verbindungen): Es ist immer nur ein Stream offen. Vor jedem Wechsel wird der alte geschlossen und kurz gewartet, schnelles Blättern oder Zappen verbindet nur den Sender, auf dem man stehen bleibt (Vorschau höchstens alle 3 Sekunden). Läuft der Sender schon in der Vorschau, übernimmt der Vollbild-Player ihn ohne neue Verbindung. Auch mit nur einer Verbindung funktioniert die Vorschau. Ist die Verbindung woanders belegt (z. B. schaut jemand auf dem Handy), wartet die Vorschau und prüft alle 10 Sekunden, ob sie wieder frei ist.</w:t>
       </w:r>
     </w:p>
     <w:p>

</xml_diff>

<commit_message>
Enigma2: Zoom-Effekt – Live-Vorschau zieht beim Oeffnen zum Vollbild auf und beim Verlassen zurueck; Sender laeuft ohne neue Verbindung weiter
Co-Authored-By: Claude Opus 5.5 <noreply@anthropic.com>
Claude-Session: https://claude.ai/code/session_01CaJqjA6T7wr6qkboQBX5Ep
</commit_message>
<xml_diff>
--- a/docs/PowerIPTV-Anleitung.docx
+++ b/docs/PowerIPTV-Anleitung.docx
@@ -49,7 +49,7 @@
         <w:rPr>
           <w:color w:val="666666"/>
         </w:rPr>
-        <w:t xml:space="preserve">Stand: Version 1.1.114 · Oktober 2026</w:t>
+        <w:t xml:space="preserve">Stand: Version 1.1.115 · Oktober 2026</w:t>
       </w:r>
     </w:p>
     <w:p>
@@ -6958,6 +6958,19 @@
       </w:pPr>
       <w:r>
         <w:t xml:space="preserve">Neues Design: dunkle Glas-Optik mit Bild-Kacheln, leuchtendem Auswahlrahmen und Symbolen. In der Senderliste läuft nach kurzem Verweilen rechts oben eine Live-Vorschau des markierten Senders, darunter Jetzt/Danach mit Fortschrittsbalken. Filme und Serien zeigen das Cover. Die Vorschau lässt sich in den Einstellungen („Live-Vorschau in der Senderliste“) abschalten; beim Verlassen der Liste läuft wieder das vorherige Programm.</w:t>
+      </w:r>
+    </w:p>
+    <w:p>
+      <w:pPr>
+        <w:pStyle w:val="ListParagraph"/>
+        <w:numPr>
+          <w:ilvl w:val="0"/>
+          <w:numId w:val="6"/>
+        </w:numPr>
+        <w:spacing w:after="60"/>
+      </w:pPr>
+      <w:r>
+        <w:t xml:space="preserve">Zoom-Effekt: Läuft ein Sender in der Vorschau und du drückst OK, zieht das kleine Bild flüssig zum Vollbild auf – ohne neue Verbindung. Beim Verlassen des Players schrumpft es wieder ins kleine Fenster, und die Liste steht auf dem Sender, den du zuletzt gesehen hast.</w:t>
       </w:r>
     </w:p>
     <w:p>

</xml_diff>

<commit_message>
Android: Standard-Player (ExoPlayer + FFmpeg wie IPTV Smarters) auch fuer Filme/Serien – schneller Start, fluessiges Spulen; FFmpeg-Decoder fuer AC3/DTS/TrueHD/MPEG-2; VLC nur noch als automatische Reserve; Media3 1.9.0; VLC-Puffer fuer Filme kuerzer (Android/Windows/iOS)
Co-Authored-By: Claude Opus 5.5 <noreply@anthropic.com>
Claude-Session: https://claude.ai/code/session_01CaJqjA6T7wr6qkboQBX5Ep
</commit_message>
<xml_diff>
--- a/docs/PowerIPTV-Anleitung.docx
+++ b/docs/PowerIPTV-Anleitung.docx
@@ -49,7 +49,7 @@
         <w:rPr>
           <w:color w:val="666666"/>
         </w:rPr>
-        <w:t xml:space="preserve">Stand: Version 1.1.116 · Oktober 2026</w:t>
+        <w:t xml:space="preserve">Stand: Version 1.1.117 · Oktober 2026</w:t>
       </w:r>
     </w:p>
     <w:p>
@@ -7090,6 +7090,23 @@
       </w:r>
       <w:r>
         <w:t xml:space="preserve">Ruckelt ein Sender oder fehlt Bild/Ton: Einstellungen → Player „exteplayer3 (5002)“ wählen (dafür das Paket ServiceApp aus dem Image-Feed installieren) oder Live-TV-Format „HLS (m3u8)“ probieren.</w:t>
+      </w:r>
+    </w:p>
+    <w:p>
+      <w:pPr>
+        <w:pStyle w:val="Heading2"/>
+        <w:spacing w:after="120" w:before="240"/>
+      </w:pPr>
+      <w:r>
+        <w:t xml:space="preserve">Player auf Android: Standard-Player mit FFmpeg</w:t>
+      </w:r>
+    </w:p>
+    <w:p>
+      <w:pPr>
+        <w:spacing w:after="120"/>
+      </w:pPr>
+      <w:r>
+        <w:t xml:space="preserve">Seit Version 1.1.117 spielt die Android-App Live TV, Filme und Serien standardmäßig mit dem Standard-Player (ExoPlayer) plus FFmpeg-Erweiterung – dieselbe Technik wie bei IPTV Smarters. Er startet schnell, spult flüssig und kann jetzt auch AC3-/DTS-Ton und SD-Sender (MPEG-2). Nur wenn ein Titel trotzdem nicht läuft, wechselt die Einstellung „Automatisch“ von selbst zum VLC-Player. Unter Einstellungen → Player lässt sich weiterhin „Immer VLC“ wählen.</w:t>
       </w:r>
     </w:p>
     <w:p>

</xml_diff>

<commit_message>
Spulen ueber den Zeitstreifen ohne Anhalten/Neuverbinden (Vorschaubilder nur mit freier 2. Verbindung, Android+Windows); Multi-Screen: Sprachauswahl (DE, EN, ...) in der Senderauswahl
Co-Authored-By: Claude Opus 5.5 <noreply@anthropic.com>
Claude-Session: https://claude.ai/code/session_01CaJqjA6T7wr6qkboQBX5Ep
</commit_message>
<xml_diff>
--- a/docs/PowerIPTV-Anleitung.docx
+++ b/docs/PowerIPTV-Anleitung.docx
@@ -49,7 +49,7 @@
         <w:rPr>
           <w:color w:val="666666"/>
         </w:rPr>
-        <w:t xml:space="preserve">Stand: Version 1.1.117 · Oktober 2026</w:t>
+        <w:t xml:space="preserve">Stand: Version 1.1.118 · Oktober 2026</w:t>
       </w:r>
     </w:p>
     <w:p>
@@ -7107,6 +7107,14 @@
       </w:pPr>
       <w:r>
         <w:t xml:space="preserve">Seit Version 1.1.117 spielt die Android-App Live TV, Filme und Serien standardmäßig mit dem Standard-Player (ExoPlayer) plus FFmpeg-Erweiterung – dieselbe Technik wie bei IPTV Smarters. Er startet schnell, spult flüssig und kann jetzt auch AC3-/DTS-Ton und SD-Sender (MPEG-2). Nur wenn ein Titel trotzdem nicht läuft, wechselt die Einstellung „Automatisch“ von selbst zum VLC-Player. Unter Einstellungen → Player lässt sich weiterhin „Immer VLC“ wählen.</w:t>
+      </w:r>
+    </w:p>
+    <w:p>
+      <w:pPr>
+        <w:spacing w:after="120"/>
+      </w:pPr>
+      <w:r>
+        <w:t xml:space="preserve">Spulen über den Zeitstreifen: Der Film springt direkt an die gewählte Stelle. Vorschaubilder beim Ziehen gibt es in der Einstellung „Automatisch“ nur noch, wenn dein Zugang eine zweite Verbindung frei hat – bei nur einer Verbindung würde der Film sonst fürs Spulen angehalten und neu verbunden (das dauerte bis zu 20 Sekunden). Multi-Screen: In der Senderauswahl lässt sich jetzt die Sprache (z. B. DE) wählen.</w:t>
       </w:r>
     </w:p>
     <w:p>

</xml_diff>

<commit_message>
Stabil-Modus (mit Stocken-Erkennung) und Bildschaerfe auch fuer Windows und iOS, Mobile-Daten-Modus fuer iOS (erkennt Mobilfunk selbst), Stabil-Modus fuer Samsung-TV; Anleitung
Co-Authored-By: Claude Opus 5.5 <noreply@anthropic.com>
Claude-Session: https://claude.ai/code/session_01CaJqjA6T7wr6qkboQBX5Ep
</commit_message>
<xml_diff>
--- a/docs/PowerIPTV-Anleitung.docx
+++ b/docs/PowerIPTV-Anleitung.docx
@@ -49,7 +49,7 @@
         <w:rPr>
           <w:color w:val="666666"/>
         </w:rPr>
-        <w:t xml:space="preserve">Stand: Version 1.1.118 · Oktober 2026</w:t>
+        <w:t xml:space="preserve">Stand: Version 1.1.120 · Oktober 2026</w:t>
       </w:r>
     </w:p>
     <w:p>
@@ -7115,6 +7115,75 @@
       </w:pPr>
       <w:r>
         <w:t xml:space="preserve">Spulen über den Zeitstreifen: Der Film springt direkt an die gewählte Stelle. Vorschaubilder beim Ziehen gibt es in der Einstellung „Automatisch“ nur noch, wenn dein Zugang eine zweite Verbindung frei hat – bei nur einer Verbindung würde der Film sonst fürs Spulen angehalten und neu verbunden (das dauerte bis zu 20 Sekunden). Multi-Screen: In der Senderauswahl lässt sich jetzt die Sprache (z. B. DE) wählen.</w:t>
+      </w:r>
+    </w:p>
+    <w:p>
+      <w:pPr>
+        <w:pStyle w:val="Heading2"/>
+        <w:spacing w:after="120" w:before="240"/>
+      </w:pPr>
+      <w:r>
+        <w:t xml:space="preserve">Bild &amp; Verbindung: Mobile Daten, Stabil-Modus, Bildschärfe</w:t>
+      </w:r>
+    </w:p>
+    <w:p>
+      <w:pPr>
+        <w:pStyle w:val="ListParagraph"/>
+        <w:numPr>
+          <w:ilvl w:val="0"/>
+          <w:numId w:val="6"/>
+        </w:numPr>
+        <w:spacing w:after="60"/>
+      </w:pPr>
+      <w:r>
+        <w:rPr>
+          <w:b/>
+          <w:bCs/>
+        </w:rPr>
+        <w:t xml:space="preserve">Mobile-Daten-Modus (Android, iPhone): </w:t>
+      </w:r>
+      <w:r>
+        <w:t xml:space="preserve">erkennt selbst, ob du über Mobilfunk schaust. Dann nimmt die App die SD-Version eines Senders (z. B. „RTL“ statt „RTL FHD“, falls dein Anbieter beide hat) und bei mehrstufigen Streams die kleinere Stufe; Vorschaubilder beim Spulen entfallen. Im WLAN bleibt immer die volle Qualität. Einstellungen → Bild &amp; Verbindung: Automatisch / Immer an / Aus.</w:t>
+      </w:r>
+    </w:p>
+    <w:p>
+      <w:pPr>
+        <w:pStyle w:val="ListParagraph"/>
+        <w:numPr>
+          <w:ilvl w:val="0"/>
+          <w:numId w:val="6"/>
+        </w:numPr>
+        <w:spacing w:after="60"/>
+      </w:pPr>
+      <w:r>
+        <w:rPr>
+          <w:b/>
+          <w:bCs/>
+        </w:rPr>
+        <w:t xml:space="preserve">Stabil-Modus gegen Stocken (alle Geräte außer Enigma2): </w:t>
+      </w:r>
+      <w:r>
+        <w:t xml:space="preserve">größerer Puffer – der Sender startet etwa 2 Sekunden später, läuft dafür auch bei Aussetzern weiter. „Automatisch“ schaltet ihn im Mobilfunknetz und nach erkanntem Stocken (zweimal in 5 Minuten) für 24 Stunden selbst zu.</w:t>
+      </w:r>
+    </w:p>
+    <w:p>
+      <w:pPr>
+        <w:pStyle w:val="ListParagraph"/>
+        <w:numPr>
+          <w:ilvl w:val="0"/>
+          <w:numId w:val="6"/>
+        </w:numPr>
+        <w:spacing w:after="60"/>
+      </w:pPr>
+      <w:r>
+        <w:rPr>
+          <w:b/>
+          <w:bCs/>
+        </w:rPr>
+        <w:t xml:space="preserve">Bildschärfe (Android, Windows, iPhone): </w:t>
+      </w:r>
+      <w:r>
+        <w:t xml:space="preserve">dezenter Schärfe-Filter (Aus / Leicht / Stark), vor allem für SD-Sender. Auf schwachen TV-Sticks bei Ruckeln wieder ausschalten. Samsung-TV und Fire TV Vega schärfen selbst (Bildeinstellungen des Fernsehers).</w:t>
       </w:r>
     </w:p>
     <w:p>

</xml_diff>

<commit_message>
Eigene Listen auch fuer Live-TV-Sender: langes Druecken -> "Zu Liste hinzufuegen" (neue Liste anlegen oder vorhandene waehlen)
- Android: Lang-Druck-Menue (Sender, Filme, Serien, TV-Guide, Suche, Startseite) mit "Zu Liste hinzufuegen";
  Senderzeilen reagieren jetzt auf langes Druecken bzw. Menue-Taste
- Samsung-TV / Fire TV Vega: eigene Listen neu (OK lange halten oder blaue Taste), Verwaltung auf "Favoriten & Listen",
  Knopf "Zu Liste" auf der Detailseite
- iOS: eigene Listen neu (Kontextmenue, Auswahlblatt, Verwaltung auf "Favoriten & Listen")
- Enigma2: MENU -> "Zu Liste hinzufuegen", Listen in den Kategorien und unter Favoriten
- Windows hatte es bereits (Rechtsklick)
- Anleitung 1.1.123

Co-Authored-By: Claude Opus 5.5 <noreply@anthropic.com>
Claude-Session: https://claude.ai/code/session_01CaJqjA6T7wr6qkboQBX5Ep
</commit_message>
<xml_diff>
--- a/docs/PowerIPTV-Anleitung.docx
+++ b/docs/PowerIPTV-Anleitung.docx
@@ -49,7 +49,7 @@
         <w:rPr>
           <w:color w:val="666666"/>
         </w:rPr>
-        <w:t xml:space="preserve">Stand: Version 1.1.122 · Oktober 2026</w:t>
+        <w:t xml:space="preserve">Stand: Version 1.1.123 · Oktober 2026</w:t>
       </w:r>
     </w:p>
     <w:p>
@@ -1085,7 +1085,7 @@
         <w:t xml:space="preserve">Kategorie-Spalte links: </w:t>
       </w:r>
       <w:r>
-        <w:t xml:space="preserve">Favoriten, Zuletzt gesehen, Alle und die Kategorien des Anbieters.</w:t>
+        <w:t xml:space="preserve">Favoriten, Zuletzt gesehen, Alle und die Kategorien des Anbieters. Eigene Listen findest du unter „Favoriten &amp; Listen“ auf der Startseite.</w:t>
       </w:r>
     </w:p>
     <w:p>
@@ -2889,7 +2889,7 @@
         <w:t xml:space="preserve">Menü bei langem Drücken: </w:t>
       </w:r>
       <w:r>
-        <w:t xml:space="preserve">Zu Favoriten hinzufügen/entfernen, Teilen (WhatsApp &amp; Co. – geteilt wird nur der Titel, nie der Stream-Link mit deinen Zugangsdaten) und bei „Weiterschauen“/„Zuletzt gesehen“ zusätzlich „Aus Liste entfernen“ (der Titel selbst bleibt erhalten).</w:t>
+        <w:t xml:space="preserve">Zu Favoriten hinzufügen/entfernen, Zu Liste hinzufügen (neue Liste anlegen oder vorhandene wählen – auch für Live-TV-Sender), Teilen (WhatsApp &amp; Co. – geteilt wird nur der Titel, nie der Stream-Link mit deinen Zugangsdaten) und bei „Weiterschauen“/„Zuletzt gesehen“ zusätzlich „Aus Liste entfernen“ (der Titel selbst bleibt erhalten).</w:t>
       </w:r>
     </w:p>
     <w:p>
@@ -2909,7 +2909,7 @@
         <w:t xml:space="preserve">Eigene Listen: </w:t>
       </w:r>
       <w:r>
-        <w:t xml:space="preserve">„Liste“ auf der Detailseite, z.B. „Filmabend“ oder „Kinder“.</w:t>
+        <w:t xml:space="preserve">„Liste“ auf der Detailseite, z.B. „Filmabend“ oder „Kinder“ – oder lange auf einen Film, eine Serie oder einen Live-TV-Sender drücken (TV: OK halten) → „Zu Liste hinzufügen“. Dort eine neue Liste anlegen oder den Titel in eine vorhandene Liste legen (Häkchen = schon drin). Sender, Filme und Serien können in derselben Liste stehen, z.B. „Sport“ mit Sport-Sendern und Sport-Filmen.</w:t>
       </w:r>
     </w:p>
     <w:p>
@@ -4391,7 +4391,7 @@
         <w:t xml:space="preserve">Rechtsklick </w:t>
       </w:r>
       <w:r>
-        <w:t xml:space="preserve">auf Sender, Film, Serie oder Folge: Favorit, gesehen markieren, aus „Weiterschauen“ entfernen.</w:t>
+        <w:t xml:space="preserve">auf Sender, Film, Serie oder Folge: Favorit, „Zu Liste hinzufügen …“ (neue Liste oder vorhandene), gesehen markieren, aus „Weiterschauen“ entfernen.</w:t>
       </w:r>
     </w:p>
     <w:p>
@@ -5486,7 +5486,7 @@
         <w:spacing w:after="120"/>
       </w:pPr>
       <w:r>
-        <w:t xml:space="preserve">Zugänge (Xtream/M3U, mehrere Benutzer), Live TV, Filme und Serien mit Kategorien und Sprachauswahl, Favoriten, Verlauf, Weiterschauen, TV-Guide mit Catch-up und Erinnerungen, Suche, Kindersicherung, KI-Empfehlungen, Tonspur, Untertitel, Bildformat, Sleep-Timer, nächste Folge und „Intro überspringen“. Nicht möglich auf dem Fernseher: Aufnahmen, Downloads, VPN und Multi-Screen.</w:t>
+        <w:t xml:space="preserve">Zugänge (Xtream/M3U, mehrere Benutzer), Live TV, Filme und Serien mit Kategorien und Sprachauswahl, Favoriten, Verlauf, Weiterschauen, TV-Guide mit Catch-up und Erinnerungen, Suche, Kindersicherung, KI-Empfehlungen, eigene Listen, Tonspur, Untertitel, Bildformat, Sleep-Timer, nächste Folge und „Intro überspringen“. Nicht möglich auf dem Fernseher: Aufnahmen, Downloads, VPN und Multi-Screen.</w:t>
       </w:r>
     </w:p>
     <w:p>
@@ -6187,6 +6187,14 @@
         <w:spacing w:after="120"/>
       </w:pPr>
       <w:r>
+        <w:t xml:space="preserve">Eigene Listen: OK auf einem Sender, Film oder einer Serie lange gedrückt halten (oder die blaue Taste) → „Zu Liste hinzufügen …“ → „Neue Liste anlegen“ oder eine vorhandene Liste wählen (✓ = schon drin, nochmal OK nimmt den Titel wieder heraus). Die Listen stehen auf der Seite „Favoriten &amp; Listen“: Rot = aus der Liste entfernen, Grün = neue Liste, Gelb = Liste umbenennen oder löschen. Auf der Detailseite eines Films/einer Serie gibt es dafür den Knopf „☰ Zu Liste“. Gilt genauso für die Fire-TV-Vega-App.</w:t>
+      </w:r>
+    </w:p>
+    <w:p>
+      <w:pPr>
+        <w:spacing w:after="120"/>
+      </w:pPr>
+      <w:r>
         <w:t xml:space="preserve">Die Kachel „Update“ prüft alle 24 Stunden bei GitHub und leuchtet bei einer neuen Version. Installiert wird wie oben (Schritt 4) mit derselben Zertifikat-Datei – Zugänge, Favoriten und Verlauf bleiben erhalten.</w:t>
       </w:r>
     </w:p>
@@ -6422,7 +6430,7 @@
         <w:spacing w:after="120"/>
       </w:pPr>
       <w:r>
-        <w:t xml:space="preserve">Die iOS-Version nutzt denselben Player wie Android und Windows: VLC. Damit laufen auch DTS-, AC3- und MKV-Filme. Sie kann Zugänge (auch per QR-Code), Live TV, Filme und Serien mit Sprachauswahl, Weiterschauen, Favoriten, Suche, TV-Guide mit Catch-up, Player mit Helligkeit/Lautstärke, Seitenverhältnis, Geschwindigkeit, Untertiteln und Einstellungsleiste sowie „An Gerät senden“.</w:t>
+        <w:t xml:space="preserve">Die iOS-Version nutzt denselben Player wie Android und Windows: VLC. Damit laufen auch DTS-, AC3- und MKV-Filme. Sie kann Zugänge (auch per QR-Code), Live TV, Filme und Serien mit Sprachauswahl, Weiterschauen, Favoriten und eigene Listen (lange auf einen Sender, Film oder eine Serie drücken → „Zu Liste hinzufügen …“; verwalten unter „Favoriten &amp; Listen“ mit ＋ und ⋯), Suche, TV-Guide mit Catch-up, Player mit Helligkeit/Lautstärke, Seitenverhältnis, Geschwindigkeit, Untertiteln und Einstellungsleiste sowie „An Gerät senden“.</w:t>
       </w:r>
     </w:p>
     <w:p>
@@ -6918,20 +6926,20 @@
         <w:spacing w:after="60"/>
       </w:pPr>
       <w:r>
-        <w:t xml:space="preserve">Kategorien: oben „♥ Favoriten“, „Zuletzt gesehen“ und „Alle“. Gelb = Sprache filtern (z. B. nur DE), Rot = Kategorie mit PIN sperren/entsperren (Kindersicherung), Grün = Live-Kategorie als Bouquet in die normale Senderliste des Receivers übernehmen.</w:t>
-      </w:r>
-    </w:p>
-    <w:p>
-      <w:pPr>
-        <w:pStyle w:val="ListParagraph"/>
-        <w:numPr>
-          <w:ilvl w:val="0"/>
-          <w:numId w:val="6"/>
-        </w:numPr>
-        <w:spacing w:after="60"/>
-      </w:pPr>
-      <w:r>
-        <w:t xml:space="preserve">In den Listen: rechts Jetzt/Weiter (Sender) bzw. Handlung, Genre, Bewertung (Filme). Rot = Sortieren, Gelb = Favorit, Blau = Filtern, MENU = mehr (Film herunterladen auf Festplatte/USB, Programm), INFO = Programm des Senders.</w:t>
+        <w:t xml:space="preserve">Kategorien: oben „♥ Favoriten“, deine eigenen Listen (☰), „Zuletzt gesehen“ und „Alle“. Gelb = Sprache filtern (z. B. nur DE), Rot = Kategorie mit PIN sperren/entsperren (Kindersicherung), Grün = Live-Kategorie als Bouquet in die normale Senderliste des Receivers übernehmen.</w:t>
+      </w:r>
+    </w:p>
+    <w:p>
+      <w:pPr>
+        <w:pStyle w:val="ListParagraph"/>
+        <w:numPr>
+          <w:ilvl w:val="0"/>
+          <w:numId w:val="6"/>
+        </w:numPr>
+        <w:spacing w:after="60"/>
+      </w:pPr>
+      <w:r>
+        <w:t xml:space="preserve">In den Listen: rechts Jetzt/Weiter (Sender) bzw. Handlung, Genre, Bewertung (Filme). Rot = Sortieren, Gelb = Favorit, Blau = Filtern, MENU = mehr (Zu Liste hinzufügen – neue Liste anlegen oder vorhandene wählen, auch für Sender; Film herunterladen auf Festplatte/USB, Programm), INFO = Programm des Senders.</w:t>
       </w:r>
     </w:p>
     <w:p>

</xml_diff>

<commit_message>
An Geraet senden: Enigma2-Receiver am LAN-Kabel zuverlaessig finden, Geraet per IP-Adresse verbinden
- Enigma2: Portiva Link startet auch beim Oeffnen des Plugins (ohne Neustart nach der Installation),
  Ersatz-Server falls twisted-web fehlt, Rundruf-Antwort im eigenen Thread, Adresse unten auf der Startseite
- Android/Windows/iOS/Samsung/Fire TV: "Geraet per IP-Adresse" im Fenster "An Geraet senden" (wird gemerkt
  und bei jeder Suche mitgeprueft), Hinweistexte "gleiches Heimnetz (WLAN oder LAN-Kabel)"
- Anleitung 1.1.124

Co-Authored-By: Claude Opus 5.5 <noreply@anthropic.com>
Claude-Session: https://claude.ai/code/session_01CaJqjA6T7wr6qkboQBX5Ep
</commit_message>
<xml_diff>
--- a/docs/PowerIPTV-Anleitung.docx
+++ b/docs/PowerIPTV-Anleitung.docx
@@ -49,7 +49,7 @@
         <w:rPr>
           <w:color w:val="666666"/>
         </w:rPr>
-        <w:t xml:space="preserve">Stand: Version 1.1.123 · Oktober 2026</w:t>
+        <w:t xml:space="preserve">Stand: Version 1.1.124 · Oktober 2026</w:t>
       </w:r>
     </w:p>
     <w:p>
@@ -6367,32 +6367,6 @@
     </w:p>
     <w:p>
       <w:pPr>
-        <w:pStyle w:val="ListParagraph"/>
-        <w:numPr>
-          <w:ilvl w:val="0"/>
-          <w:numId w:val="14"/>
-        </w:numPr>
-        <w:spacing w:after="60"/>
-      </w:pPr>
-      <w:r>
-        <w:t xml:space="preserve">Unter „Portiva-Geräte“ erscheinen alle Geräte mit geöffnetem Portiva im Heimnetz (TV-Stick, Tablet, Handy, Windows-PC) → Gerät wählen. Darüber stehen wie bisher Chromecast-Geräte.</w:t>
-      </w:r>
-    </w:p>
-    <w:p>
-      <w:pPr>
-        <w:pStyle w:val="ListParagraph"/>
-        <w:numPr>
-          <w:ilvl w:val="0"/>
-          <w:numId w:val="14"/>
-        </w:numPr>
-        <w:spacing w:after="60"/>
-      </w:pPr>
-      <w:r>
-        <w:t xml:space="preserve">Der Film läuft dort an derselben Stelle weiter (Live TV: derselbe Sender), hier wird gestoppt.</w:t>
-      </w:r>
-    </w:p>
-    <w:p>
-      <w:pPr>
         <w:pBdr>
           <w:left w:val="single" w:color="1E88B8" w:sz="18" w:space="8"/>
         </w:pBdr>
@@ -6408,29 +6382,33 @@
         <w:t xml:space="preserve">Tipp: </w:t>
       </w:r>
       <w:r>
-        <w:t xml:space="preserve">Portiva muss auf dem Zielgerät geöffnet sein (Android ab Version 10 erlaubt Apps im Hintergrund nicht, sich selbst zu öffnen). Samsung-Fernseher können senden, aber nichts empfangen. Windows fragt beim ersten Mal nach der Firewall – „Zulassen“ wählen.</w:t>
-      </w:r>
-    </w:p>
-    <w:p>
-      <w:r>
-        <w:br w:type="page"/>
-      </w:r>
-    </w:p>
-    <w:p>
-      <w:pPr>
-        <w:pStyle w:val="Heading1"/>
-        <w:spacing w:after="160" w:before="360"/>
-      </w:pPr>
-      <w:r>
-        <w:t xml:space="preserve">17. PowerIPTV für iPhone &amp; iPad</w:t>
-      </w:r>
-    </w:p>
-    <w:p>
-      <w:pPr>
-        <w:spacing w:after="120"/>
-      </w:pPr>
-      <w:r>
-        <w:t xml:space="preserve">Die iOS-Version nutzt denselben Player wie Android und Windows: VLC. Damit laufen auch DTS-, AC3- und MKV-Filme. Sie kann Zugänge (auch per QR-Code), Live TV, Filme und Serien mit Sprachauswahl, Weiterschauen, Favoriten und eigene Listen (lange auf einen Sender, Film oder eine Serie drücken → „Zu Liste hinzufügen …“; verwalten unter „Favoriten &amp; Listen“ mit ＋ und ⋯), Suche, TV-Guide mit Catch-up, Player mit Helligkeit/Lautstärke, Seitenverhältnis, Geschwindigkeit, Untertiteln und Einstellungsleiste sowie „An Gerät senden“.</w:t>
+        <w:t xml:space="preserve">Wird ein Gerät nicht gefunden: Alle Geräte müssen im selben Heimnetz hängen – WLAN oder LAN-Kabel ist egal. Klappt die automatische Suche trotzdem nicht, im Fenster „An Gerät senden“ unten die IP-Adresse des Geräts eingeben und „Verbinden“ drücken (Samsung-TV: „＋ Gerät per IP-Adresse …“). Das Gerät wird gemerkt und beim nächsten Mal automatisch angezeigt.</w:t>
+      </w:r>
+    </w:p>
+    <w:p>
+      <w:pPr>
+        <w:pStyle w:val="ListParagraph"/>
+        <w:numPr>
+          <w:ilvl w:val="0"/>
+          <w:numId w:val="14"/>
+        </w:numPr>
+        <w:spacing w:after="60"/>
+      </w:pPr>
+      <w:r>
+        <w:t xml:space="preserve">Unter „Portiva-Geräte“ erscheinen alle Geräte mit geöffnetem Portiva im Heimnetz (TV-Stick, Tablet, Handy, Windows-PC) → Gerät wählen. Darüber stehen wie bisher Chromecast-Geräte.</w:t>
+      </w:r>
+    </w:p>
+    <w:p>
+      <w:pPr>
+        <w:pStyle w:val="ListParagraph"/>
+        <w:numPr>
+          <w:ilvl w:val="0"/>
+          <w:numId w:val="14"/>
+        </w:numPr>
+        <w:spacing w:after="60"/>
+      </w:pPr>
+      <w:r>
+        <w:t xml:space="preserve">Der Film läuft dort an derselben Stelle weiter (Live TV: derselbe Sender), hier wird gestoppt.</w:t>
       </w:r>
     </w:p>
     <w:p>
@@ -6450,102 +6428,12 @@
         <w:t xml:space="preserve">Tipp: </w:t>
       </w:r>
       <w:r>
-        <w:t xml:space="preserve">Apple erlaubt Apps außerhalb des App Stores nur mit einer Apple-ID-Signatur. Mit einer kostenlosen Apple-ID läuft die App 7 Tage und muss dann neu aufgespielt werden (Zugänge bleiben erhalten). Mit einem Apple-Entwicklerkonto (99 €/Jahr) gilt sie 1 Jahr.</w:t>
-      </w:r>
-    </w:p>
-    <w:p>
-      <w:pPr>
-        <w:pStyle w:val="Heading2"/>
-        <w:spacing w:after="120" w:before="240"/>
-      </w:pPr>
-      <w:r>
-        <w:t xml:space="preserve">Installation mit Sideloadly (Windows oder Mac)</w:t>
-      </w:r>
-    </w:p>
-    <w:p>
-      <w:pPr>
-        <w:pStyle w:val="ListParagraph"/>
-        <w:numPr>
-          <w:ilvl w:val="0"/>
-          <w:numId w:val="15"/>
-        </w:numPr>
-        <w:spacing w:after="60"/>
-      </w:pPr>
-      <w:r>
-        <w:t xml:space="preserve">Am PC: Sideloadly von https://sideloadly.io herunterladen und installieren. Unter Windows zusätzlich iTunes und iCloud von der Apple-Webseite (nicht aus dem Microsoft Store).</w:t>
-      </w:r>
-    </w:p>
-    <w:p>
-      <w:pPr>
-        <w:pStyle w:val="ListParagraph"/>
-        <w:numPr>
-          <w:ilvl w:val="0"/>
-          <w:numId w:val="15"/>
-        </w:numPr>
-        <w:spacing w:after="60"/>
-      </w:pPr>
-      <w:r>
-        <w:t xml:space="preserve">Auf GitHub unter „Releases“ die neueste Version öffnen und „Portiva-iOS-v1.1.X.ipa“ herunterladen.</w:t>
-      </w:r>
-    </w:p>
-    <w:p>
-      <w:pPr>
-        <w:pStyle w:val="ListParagraph"/>
-        <w:numPr>
-          <w:ilvl w:val="0"/>
-          <w:numId w:val="15"/>
-        </w:numPr>
-        <w:spacing w:after="60"/>
-      </w:pPr>
-      <w:r>
-        <w:t xml:space="preserve">iPhone/iPad per Kabel anschließen, entsperren und „Vertrauen“ bestätigen.</w:t>
-      </w:r>
-    </w:p>
-    <w:p>
-      <w:pPr>
-        <w:pStyle w:val="ListParagraph"/>
-        <w:numPr>
-          <w:ilvl w:val="0"/>
-          <w:numId w:val="15"/>
-        </w:numPr>
-        <w:spacing w:after="60"/>
-      </w:pPr>
-      <w:r>
-        <w:t xml:space="preserve">Sideloadly öffnen, die .ipa hineinziehen, deine Apple-ID eintragen und „Start“ klicken.</w:t>
-      </w:r>
-    </w:p>
-    <w:p>
-      <w:pPr>
-        <w:pStyle w:val="ListParagraph"/>
-        <w:numPr>
-          <w:ilvl w:val="0"/>
-          <w:numId w:val="15"/>
-        </w:numPr>
-        <w:spacing w:after="60"/>
-      </w:pPr>
-      <w:r>
-        <w:t xml:space="preserve">Am iPhone: Einstellungen → Datenschutz &amp; Sicherheit → Entwicklermodus einschalten (iOS 16+, Neustart). Danach Einstellungen → Allgemein → VPN &amp; Geräteverwaltung → deine Apple-ID → „Vertrauen“.</w:t>
-      </w:r>
-    </w:p>
-    <w:p>
-      <w:pPr>
-        <w:pStyle w:val="ListParagraph"/>
-        <w:numPr>
-          <w:ilvl w:val="0"/>
-          <w:numId w:val="15"/>
-        </w:numPr>
-        <w:spacing w:after="60"/>
-      </w:pPr>
-      <w:r>
-        <w:t xml:space="preserve">Portiva öffnen. Beim ersten Start fragt iOS nach „Lokales Netzwerk“ – erlauben (für QR-Übertragung und „An Gerät senden“).</w:t>
-      </w:r>
-    </w:p>
-    <w:p>
-      <w:pPr>
-        <w:spacing w:after="120"/>
-      </w:pPr>
-      <w:r>
-        <w:t xml:space="preserve">Zugang am schnellsten: Benutzer wechseln → „+“ → „QR-Code scannen“ und am anderen Gerät beim Zugang auf das QR-Symbol tippen.</w:t>
+        <w:t xml:space="preserve">Portiva muss auf dem Zielgerät geöffnet sein (Android ab Version 10 erlaubt Apps im Hintergrund nicht, sich selbst zu öffnen). Samsung-Fernseher können senden, aber nichts empfangen. Windows fragt beim ersten Mal nach der Firewall – „Zulassen“ wählen.</w:t>
+      </w:r>
+    </w:p>
+    <w:p>
+      <w:r>
+        <w:br w:type="page"/>
       </w:r>
     </w:p>
     <w:p>
@@ -6554,7 +6442,7 @@
         <w:spacing w:after="160" w:before="360"/>
       </w:pPr>
       <w:r>
-        <w:t xml:space="preserve">18. PowerIPTV für die neuen Fire TV Sticks (Vega OS)</w:t>
+        <w:t xml:space="preserve">17. PowerIPTV für iPhone &amp; iPad</w:t>
       </w:r>
     </w:p>
     <w:p>
@@ -6562,7 +6450,7 @@
         <w:spacing w:after="120"/>
       </w:pPr>
       <w:r>
-        <w:t xml:space="preserve">Amazon hat bei den neuen Sticks Android durch das eigene Betriebssystem „Vega OS“ ersetzt. Betroffen sind der Fire TV Stick 4K Select, der Fire TV Stick HD (2026), der Fire TV Stick 4K (2026) und alle kommenden Sticks. Dort laufen keine APKs und es gibt kein „Apps unbekannter Herkunft“ mehr. Deshalb gibt es eine eigene Version: „Portiva-FireTV-Vega-v1.1.X.vpkg“ (auf GitHub im Ordner „Fire TV Vega“, im Release mit „🆕 NEUE Amazon Fire TV Sticks“ gekennzeichnet).</w:t>
+        <w:t xml:space="preserve">Die iOS-Version nutzt denselben Player wie Android und Windows: VLC. Damit laufen auch DTS-, AC3- und MKV-Filme. Sie kann Zugänge (auch per QR-Code), Live TV, Filme und Serien mit Sprachauswahl, Weiterschauen, Favoriten und eigene Listen (lange auf einen Sender, Film oder eine Serie drücken → „Zu Liste hinzufügen …“; verwalten unter „Favoriten &amp; Listen“ mit ＋ und ⋯), Suche, TV-Guide mit Catch-up, Player mit Helligkeit/Lautstärke, Seitenverhältnis, Geschwindigkeit, Untertiteln und Einstellungsleiste sowie „An Gerät senden“.</w:t>
       </w:r>
     </w:p>
     <w:p>
@@ -6582,15 +6470,7 @@
         <w:t xml:space="preserve">Tipp: </w:t>
       </w:r>
       <w:r>
-        <w:t xml:space="preserve">Welcher Stick? Einstellungen → Mein Fire TV → Info. Steht dort „Fire OS“, nimm die normale APK (Kapitel 2). Steht dort „Vega OS“, nimm diese Version.</w:t>
-      </w:r>
-    </w:p>
-    <w:p>
-      <w:pPr>
-        <w:spacing w:after="120"/>
-      </w:pPr>
-      <w:r>
-        <w:t xml:space="preserve">Die Oberfläche ist dieselbe wie beim Samsung-Fernseher (Fernbedienung, Live-TV-Infoleiste, EPG, Favoriten, Portiva Link). Das Bild kommt vom Hardware-Player des Sticks. Aufnahmen, Downloads, VPN und Mehrfachbildschirm gibt es dort nicht.</w:t>
+        <w:t xml:space="preserve">Apple erlaubt Apps außerhalb des App Stores nur mit einer Apple-ID-Signatur. Mit einer kostenlosen Apple-ID läuft die App 7 Tage und muss dann neu aufgespielt werden (Zugänge bleiben erhalten). Mit einem Apple-Entwicklerkonto (99 €/Jahr) gilt sie 1 Jahr.</w:t>
       </w:r>
     </w:p>
     <w:p>
@@ -6599,168 +6479,110 @@
         <w:spacing w:after="120" w:before="240"/>
       </w:pPr>
       <w:r>
-        <w:t xml:space="preserve">Einmalig: Amazon-Entwicklerkonto &amp; Vega-Werkzeug</w:t>
-      </w:r>
-    </w:p>
-    <w:p>
-      <w:pPr>
-        <w:pStyle w:val="ListParagraph"/>
-        <w:numPr>
-          <w:ilvl w:val="0"/>
-          <w:numId w:val="16"/>
-        </w:numPr>
-        <w:spacing w:after="60"/>
-      </w:pPr>
-      <w:r>
-        <w:t xml:space="preserve">Kostenloses Amazon-Entwicklerkonto auf developer.amazon.com anlegen und das Appstore-Entwicklerprofil vollständig ausfüllen (ohne Bank-/Steuerdaten). Ohne vollständiges Profil klappt der Entwicklermodus nicht.</w:t>
-      </w:r>
-    </w:p>
-    <w:p>
-      <w:pPr>
-        <w:pStyle w:val="ListParagraph"/>
-        <w:numPr>
-          <w:ilvl w:val="0"/>
-          <w:numId w:val="16"/>
-        </w:numPr>
-        <w:spacing w:after="60"/>
-      </w:pPr>
-      <w:r>
-        <w:t xml:space="preserve">Am PC (Windows mit WSL/Ubuntu, Linux oder Mac) das Vega-Werkzeug installieren: curl -fsSL https://sdk-installer.vega.labcollab.net/get_vvm.sh | bash und danach source ~/vega/env.</w:t>
-      </w:r>
-    </w:p>
-    <w:p>
-      <w:pPr>
-        <w:pStyle w:val="ListParagraph"/>
-        <w:numPr>
-          <w:ilvl w:val="0"/>
-          <w:numId w:val="16"/>
-        </w:numPr>
-        <w:spacing w:after="60"/>
-      </w:pPr>
-      <w:r>
-        <w:t xml:space="preserve">Anmelden: vega devmode login → den angezeigten Code auf amazon.com/code bestätigen.</w:t>
-      </w:r>
-    </w:p>
-    <w:p>
-      <w:pPr>
-        <w:pStyle w:val="Heading2"/>
-        <w:spacing w:after="120" w:before="240"/>
-      </w:pPr>
-      <w:r>
-        <w:t xml:space="preserve">Entwicklermodus am Stick einschalten</w:t>
-      </w:r>
-    </w:p>
-    <w:p>
-      <w:pPr>
-        <w:pStyle w:val="ListParagraph"/>
-        <w:numPr>
-          <w:ilvl w:val="0"/>
-          <w:numId w:val="17"/>
-        </w:numPr>
-        <w:spacing w:after="60"/>
-      </w:pPr>
-      <w:r>
-        <w:t xml:space="preserve">Am Stick: Einstellungen → Mein Fire TV → Info → 7-mal auf den Gerätenamen drücken („Du bist jetzt Entwickler“).</w:t>
-      </w:r>
-    </w:p>
-    <w:p>
-      <w:pPr>
-        <w:pStyle w:val="ListParagraph"/>
-        <w:numPr>
-          <w:ilvl w:val="0"/>
-          <w:numId w:val="17"/>
-        </w:numPr>
-        <w:spacing w:after="60"/>
-      </w:pPr>
-      <w:r>
-        <w:t xml:space="preserve">Zurück → Entwickleroptionen → Entwicklermodus → Weiter. Der Fernseher zeigt einen 6-stelligen Code (gilt ca. 5 Minuten).</w:t>
-      </w:r>
-    </w:p>
-    <w:p>
-      <w:pPr>
-        <w:pStyle w:val="ListParagraph"/>
-        <w:numPr>
-          <w:ilvl w:val="0"/>
-          <w:numId w:val="17"/>
-        </w:numPr>
-        <w:spacing w:after="60"/>
-      </w:pPr>
-      <w:r>
-        <w:t xml:space="preserve">Am PC: vega devmode enable-device --code &lt;Code&gt;. Der Stick startet neu.</w:t>
-      </w:r>
-    </w:p>
-    <w:p>
-      <w:pPr>
-        <w:pStyle w:val="ListParagraph"/>
-        <w:numPr>
-          <w:ilvl w:val="0"/>
-          <w:numId w:val="17"/>
-        </w:numPr>
-        <w:spacing w:after="60"/>
-      </w:pPr>
-      <w:r>
-        <w:t xml:space="preserve">Entwickleroptionen → Verbindungsart „Netzwerk“ wählen (oder per USB-Kabel verbinden). Prüfen mit: vega device list (zeigt die Seriennummer).</w:t>
-      </w:r>
-    </w:p>
-    <w:p>
-      <w:pPr>
-        <w:pStyle w:val="Heading2"/>
-        <w:spacing w:after="120" w:before="240"/>
-      </w:pPr>
-      <w:r>
-        <w:t xml:space="preserve">Portiva installieren &amp; aktualisieren</w:t>
-      </w:r>
-    </w:p>
-    <w:p>
-      <w:pPr>
-        <w:pStyle w:val="ListParagraph"/>
-        <w:numPr>
-          <w:ilvl w:val="0"/>
-          <w:numId w:val="18"/>
-        </w:numPr>
-        <w:spacing w:after="60"/>
-      </w:pPr>
-      <w:r>
-        <w:t xml:space="preserve">Auf GitHub unter „Releases“ die Datei „Portiva-FireTV-Vega-v1.1.X.vpkg“ herunterladen.</w:t>
-      </w:r>
-    </w:p>
-    <w:p>
-      <w:pPr>
-        <w:pStyle w:val="ListParagraph"/>
-        <w:numPr>
-          <w:ilvl w:val="0"/>
-          <w:numId w:val="18"/>
-        </w:numPr>
-        <w:spacing w:after="60"/>
-      </w:pPr>
-      <w:r>
-        <w:t xml:space="preserve">Installieren: vega device -d &lt;Seriennummer&gt; install-app --packagePath Portiva-FireTV-Vega-v1.1.X.vpkg</w:t>
-      </w:r>
-    </w:p>
-    <w:p>
-      <w:pPr>
-        <w:pStyle w:val="ListParagraph"/>
-        <w:numPr>
-          <w:ilvl w:val="0"/>
-          <w:numId w:val="18"/>
-        </w:numPr>
-        <w:spacing w:after="60"/>
-      </w:pPr>
-      <w:r>
-        <w:t xml:space="preserve">Starten: über die Kachel „Portiva“ bei den Apps (ggf. nach einem Neustart) oder vega device -d &lt;Seriennummer&gt; launch-app --appName app.portiva.firetv.main</w:t>
-      </w:r>
-    </w:p>
-    <w:p>
-      <w:pPr>
-        <w:pStyle w:val="ListParagraph"/>
-        <w:numPr>
-          <w:ilvl w:val="0"/>
-          <w:numId w:val="18"/>
-        </w:numPr>
-        <w:spacing w:after="60"/>
-      </w:pPr>
-      <w:r>
-        <w:t xml:space="preserve">Zugang am bequemsten per „Vom Handy empfangen“ einrichten (Kapitel 16).</w:t>
+        <w:t xml:space="preserve">Installation mit Sideloadly (Windows oder Mac)</w:t>
+      </w:r>
+    </w:p>
+    <w:p>
+      <w:pPr>
+        <w:pStyle w:val="ListParagraph"/>
+        <w:numPr>
+          <w:ilvl w:val="0"/>
+          <w:numId w:val="15"/>
+        </w:numPr>
+        <w:spacing w:after="60"/>
+      </w:pPr>
+      <w:r>
+        <w:t xml:space="preserve">Am PC: Sideloadly von https://sideloadly.io herunterladen und installieren. Unter Windows zusätzlich iTunes und iCloud von der Apple-Webseite (nicht aus dem Microsoft Store).</w:t>
+      </w:r>
+    </w:p>
+    <w:p>
+      <w:pPr>
+        <w:pStyle w:val="ListParagraph"/>
+        <w:numPr>
+          <w:ilvl w:val="0"/>
+          <w:numId w:val="15"/>
+        </w:numPr>
+        <w:spacing w:after="60"/>
+      </w:pPr>
+      <w:r>
+        <w:t xml:space="preserve">Auf GitHub unter „Releases“ die neueste Version öffnen und „Portiva-iOS-v1.1.X.ipa“ herunterladen.</w:t>
+      </w:r>
+    </w:p>
+    <w:p>
+      <w:pPr>
+        <w:pStyle w:val="ListParagraph"/>
+        <w:numPr>
+          <w:ilvl w:val="0"/>
+          <w:numId w:val="15"/>
+        </w:numPr>
+        <w:spacing w:after="60"/>
+      </w:pPr>
+      <w:r>
+        <w:t xml:space="preserve">iPhone/iPad per Kabel anschließen, entsperren und „Vertrauen“ bestätigen.</w:t>
+      </w:r>
+    </w:p>
+    <w:p>
+      <w:pPr>
+        <w:pStyle w:val="ListParagraph"/>
+        <w:numPr>
+          <w:ilvl w:val="0"/>
+          <w:numId w:val="15"/>
+        </w:numPr>
+        <w:spacing w:after="60"/>
+      </w:pPr>
+      <w:r>
+        <w:t xml:space="preserve">Sideloadly öffnen, die .ipa hineinziehen, deine Apple-ID eintragen und „Start“ klicken.</w:t>
+      </w:r>
+    </w:p>
+    <w:p>
+      <w:pPr>
+        <w:pStyle w:val="ListParagraph"/>
+        <w:numPr>
+          <w:ilvl w:val="0"/>
+          <w:numId w:val="15"/>
+        </w:numPr>
+        <w:spacing w:after="60"/>
+      </w:pPr>
+      <w:r>
+        <w:t xml:space="preserve">Am iPhone: Einstellungen → Datenschutz &amp; Sicherheit → Entwicklermodus einschalten (iOS 16+, Neustart). Danach Einstellungen → Allgemein → VPN &amp; Geräteverwaltung → deine Apple-ID → „Vertrauen“.</w:t>
+      </w:r>
+    </w:p>
+    <w:p>
+      <w:pPr>
+        <w:pStyle w:val="ListParagraph"/>
+        <w:numPr>
+          <w:ilvl w:val="0"/>
+          <w:numId w:val="15"/>
+        </w:numPr>
+        <w:spacing w:after="60"/>
+      </w:pPr>
+      <w:r>
+        <w:t xml:space="preserve">Portiva öffnen. Beim ersten Start fragt iOS nach „Lokales Netzwerk“ – erlauben (für QR-Übertragung und „An Gerät senden“).</w:t>
+      </w:r>
+    </w:p>
+    <w:p>
+      <w:pPr>
+        <w:spacing w:after="120"/>
+      </w:pPr>
+      <w:r>
+        <w:t xml:space="preserve">Zugang am schnellsten: Benutzer wechseln → „+“ → „QR-Code scannen“ und am anderen Gerät beim Zugang auf das QR-Symbol tippen.</w:t>
+      </w:r>
+    </w:p>
+    <w:p>
+      <w:pPr>
+        <w:pStyle w:val="Heading1"/>
+        <w:spacing w:after="160" w:before="360"/>
+      </w:pPr>
+      <w:r>
+        <w:t xml:space="preserve">18. PowerIPTV für die neuen Fire TV Sticks (Vega OS)</w:t>
+      </w:r>
+    </w:p>
+    <w:p>
+      <w:pPr>
+        <w:spacing w:after="120"/>
+      </w:pPr>
+      <w:r>
+        <w:t xml:space="preserve">Amazon hat bei den neuen Sticks Android durch das eigene Betriebssystem „Vega OS“ ersetzt. Betroffen sind der Fire TV Stick 4K Select, der Fire TV Stick HD (2026), der Fire TV Stick 4K (2026) und alle kommenden Sticks. Dort laufen keine APKs und es gibt kein „Apps unbekannter Herkunft“ mehr. Deshalb gibt es eine eigene Version: „Portiva-FireTV-Vega-v1.1.X.vpkg“ (auf GitHub im Ordner „Fire TV Vega“, im Release mit „🆕 NEUE Amazon Fire TV Sticks“ gekennzeichnet).</w:t>
       </w:r>
     </w:p>
     <w:p>
@@ -6780,7 +6602,185 @@
         <w:t xml:space="preserve">Tipp: </w:t>
       </w:r>
       <w:r>
-        <w:t xml:space="preserve">Updates genauso installieren – Zugänge und Favoriten bleiben erhalten. Die App zeigt unter „Update“, wenn es eine neue Version gibt.</w:t>
+        <w:t xml:space="preserve">Welcher Stick? Einstellungen → Mein Fire TV → Info. Steht dort „Fire OS“, nimm die normale APK (Kapitel 2). Steht dort „Vega OS“, nimm diese Version.</w:t>
+      </w:r>
+    </w:p>
+    <w:p>
+      <w:pPr>
+        <w:spacing w:after="120"/>
+      </w:pPr>
+      <w:r>
+        <w:t xml:space="preserve">Die Oberfläche ist dieselbe wie beim Samsung-Fernseher (Fernbedienung, Live-TV-Infoleiste, EPG, Favoriten, Portiva Link). Das Bild kommt vom Hardware-Player des Sticks. Aufnahmen, Downloads, VPN und Mehrfachbildschirm gibt es dort nicht.</w:t>
+      </w:r>
+    </w:p>
+    <w:p>
+      <w:pPr>
+        <w:pStyle w:val="Heading2"/>
+        <w:spacing w:after="120" w:before="240"/>
+      </w:pPr>
+      <w:r>
+        <w:t xml:space="preserve">Einmalig: Amazon-Entwicklerkonto &amp; Vega-Werkzeug</w:t>
+      </w:r>
+    </w:p>
+    <w:p>
+      <w:pPr>
+        <w:pStyle w:val="ListParagraph"/>
+        <w:numPr>
+          <w:ilvl w:val="0"/>
+          <w:numId w:val="16"/>
+        </w:numPr>
+        <w:spacing w:after="60"/>
+      </w:pPr>
+      <w:r>
+        <w:t xml:space="preserve">Kostenloses Amazon-Entwicklerkonto auf developer.amazon.com anlegen und das Appstore-Entwicklerprofil vollständig ausfüllen (ohne Bank-/Steuerdaten). Ohne vollständiges Profil klappt der Entwicklermodus nicht.</w:t>
+      </w:r>
+    </w:p>
+    <w:p>
+      <w:pPr>
+        <w:pStyle w:val="ListParagraph"/>
+        <w:numPr>
+          <w:ilvl w:val="0"/>
+          <w:numId w:val="16"/>
+        </w:numPr>
+        <w:spacing w:after="60"/>
+      </w:pPr>
+      <w:r>
+        <w:t xml:space="preserve">Am PC (Windows mit WSL/Ubuntu, Linux oder Mac) das Vega-Werkzeug installieren: curl -fsSL https://sdk-installer.vega.labcollab.net/get_vvm.sh | bash und danach source ~/vega/env.</w:t>
+      </w:r>
+    </w:p>
+    <w:p>
+      <w:pPr>
+        <w:pStyle w:val="ListParagraph"/>
+        <w:numPr>
+          <w:ilvl w:val="0"/>
+          <w:numId w:val="16"/>
+        </w:numPr>
+        <w:spacing w:after="60"/>
+      </w:pPr>
+      <w:r>
+        <w:t xml:space="preserve">Anmelden: vega devmode login → den angezeigten Code auf amazon.com/code bestätigen.</w:t>
+      </w:r>
+    </w:p>
+    <w:p>
+      <w:pPr>
+        <w:pStyle w:val="Heading2"/>
+        <w:spacing w:after="120" w:before="240"/>
+      </w:pPr>
+      <w:r>
+        <w:t xml:space="preserve">Entwicklermodus am Stick einschalten</w:t>
+      </w:r>
+    </w:p>
+    <w:p>
+      <w:pPr>
+        <w:pStyle w:val="ListParagraph"/>
+        <w:numPr>
+          <w:ilvl w:val="0"/>
+          <w:numId w:val="17"/>
+        </w:numPr>
+        <w:spacing w:after="60"/>
+      </w:pPr>
+      <w:r>
+        <w:t xml:space="preserve">Am Stick: Einstellungen → Mein Fire TV → Info → 7-mal auf den Gerätenamen drücken („Du bist jetzt Entwickler“).</w:t>
+      </w:r>
+    </w:p>
+    <w:p>
+      <w:pPr>
+        <w:pStyle w:val="ListParagraph"/>
+        <w:numPr>
+          <w:ilvl w:val="0"/>
+          <w:numId w:val="17"/>
+        </w:numPr>
+        <w:spacing w:after="60"/>
+      </w:pPr>
+      <w:r>
+        <w:t xml:space="preserve">Zurück → Entwickleroptionen → Entwicklermodus → Weiter. Der Fernseher zeigt einen 6-stelligen Code (gilt ca. 5 Minuten).</w:t>
+      </w:r>
+    </w:p>
+    <w:p>
+      <w:pPr>
+        <w:pStyle w:val="ListParagraph"/>
+        <w:numPr>
+          <w:ilvl w:val="0"/>
+          <w:numId w:val="17"/>
+        </w:numPr>
+        <w:spacing w:after="60"/>
+      </w:pPr>
+      <w:r>
+        <w:t xml:space="preserve">Am PC: vega devmode enable-device --code &lt;Code&gt;. Der Stick startet neu.</w:t>
+      </w:r>
+    </w:p>
+    <w:p>
+      <w:pPr>
+        <w:pStyle w:val="ListParagraph"/>
+        <w:numPr>
+          <w:ilvl w:val="0"/>
+          <w:numId w:val="17"/>
+        </w:numPr>
+        <w:spacing w:after="60"/>
+      </w:pPr>
+      <w:r>
+        <w:t xml:space="preserve">Entwickleroptionen → Verbindungsart „Netzwerk“ wählen (oder per USB-Kabel verbinden). Prüfen mit: vega device list (zeigt die Seriennummer).</w:t>
+      </w:r>
+    </w:p>
+    <w:p>
+      <w:pPr>
+        <w:pStyle w:val="Heading2"/>
+        <w:spacing w:after="120" w:before="240"/>
+      </w:pPr>
+      <w:r>
+        <w:t xml:space="preserve">Portiva installieren &amp; aktualisieren</w:t>
+      </w:r>
+    </w:p>
+    <w:p>
+      <w:pPr>
+        <w:pStyle w:val="ListParagraph"/>
+        <w:numPr>
+          <w:ilvl w:val="0"/>
+          <w:numId w:val="18"/>
+        </w:numPr>
+        <w:spacing w:after="60"/>
+      </w:pPr>
+      <w:r>
+        <w:t xml:space="preserve">Auf GitHub unter „Releases“ die Datei „Portiva-FireTV-Vega-v1.1.X.vpkg“ herunterladen.</w:t>
+      </w:r>
+    </w:p>
+    <w:p>
+      <w:pPr>
+        <w:pStyle w:val="ListParagraph"/>
+        <w:numPr>
+          <w:ilvl w:val="0"/>
+          <w:numId w:val="18"/>
+        </w:numPr>
+        <w:spacing w:after="60"/>
+      </w:pPr>
+      <w:r>
+        <w:t xml:space="preserve">Installieren: vega device -d &lt;Seriennummer&gt; install-app --packagePath Portiva-FireTV-Vega-v1.1.X.vpkg</w:t>
+      </w:r>
+    </w:p>
+    <w:p>
+      <w:pPr>
+        <w:pStyle w:val="ListParagraph"/>
+        <w:numPr>
+          <w:ilvl w:val="0"/>
+          <w:numId w:val="18"/>
+        </w:numPr>
+        <w:spacing w:after="60"/>
+      </w:pPr>
+      <w:r>
+        <w:t xml:space="preserve">Starten: über die Kachel „Portiva“ bei den Apps (ggf. nach einem Neustart) oder vega device -d &lt;Seriennummer&gt; launch-app --appName app.portiva.firetv.main</w:t>
+      </w:r>
+    </w:p>
+    <w:p>
+      <w:pPr>
+        <w:pStyle w:val="ListParagraph"/>
+        <w:numPr>
+          <w:ilvl w:val="0"/>
+          <w:numId w:val="18"/>
+        </w:numPr>
+        <w:spacing w:after="60"/>
+      </w:pPr>
+      <w:r>
+        <w:t xml:space="preserve">Zugang am bequemsten per „Vom Handy empfangen“ einrichten (Kapitel 16).</w:t>
       </w:r>
     </w:p>
     <w:p>
@@ -6800,6 +6800,26 @@
         <w:t xml:space="preserve">Tipp: </w:t>
       </w:r>
       <w:r>
+        <w:t xml:space="preserve">Updates genauso installieren – Zugänge und Favoriten bleiben erhalten. Die App zeigt unter „Update“, wenn es eine neue Version gibt.</w:t>
+      </w:r>
+    </w:p>
+    <w:p>
+      <w:pPr>
+        <w:pBdr>
+          <w:left w:val="single" w:color="1E88B8" w:sz="18" w:space="8"/>
+        </w:pBdr>
+        <w:spacing w:after="160" w:before="80"/>
+        <w:ind w:left="240"/>
+      </w:pPr>
+      <w:r>
+        <w:rPr>
+          <w:b/>
+          <w:bCs/>
+          <w:color w:val="1E88B8"/>
+        </w:rPr>
+        <w:t xml:space="preserve">Tipp: </w:t>
+      </w:r>
+      <w:r>
         <w:t xml:space="preserve">Hinweis: Diese Version ist neu und noch nicht auf jedem Stick erprobt. Klappt ein Sender oder Film nicht, im Anbieter-Portal bzw. in den Einstellungen das Live-Format „HLS (m3u8)“ wählen; MKV-Filme mit DTS-Ton spielen die neuen Sticks evtl. ohne Ton ab.</w:t>
       </w:r>
     </w:p>
@@ -7056,7 +7076,7 @@
         <w:spacing w:after="60"/>
       </w:pPr>
       <w:r>
-        <w:t xml:space="preserve">Portiva Link: Handy, Tablet oder PC finden den Receiver automatisch im Heimnetz („An Gerät senden“) und spielen den laufenden Film/Sender dort weiter.</w:t>
+        <w:t xml:space="preserve">Portiva Link: Handy, Tablet oder PC finden den Receiver automatisch im Heimnetz („An Gerät senden“) und spielen den laufenden Film/Sender dort weiter – egal ob der Receiver per LAN-Kabel oder WLAN am Router hängt. Die Adresse des Receivers steht unten auf der Portiva-Startseite (z.B. „Portiva Link: 192.168.178.40“). Findet die Suche ihn nicht (z.B. anderer Netzbereich), im Fenster „An Gerät senden“ diese IP-Adresse eintragen und „Verbinden“ drücken – sie wird gemerkt. Der Empfang läuft ab dem ersten Öffnen des Plugins, ein Neustart des Receivers ist nicht nötig.</w:t>
       </w:r>
     </w:p>
     <w:p>

</xml_diff>

<commit_message>
Automatische Rettung bei Abbruechen (alle Geraete) + QR-Code auf aelteren Enigma2-Receivern
- Rettungsleiter: neu verbinden -> anderes Format (Xtream .ts <-> .m3u8) -> Ausweich-Sender gleichen
  Namens (z.B. "... RAW" statt "... HD") -> klarer Hinweis, wenn alle Verbindungen des Zugangs belegt sind
  (Android Standard-Player + VLC, Windows, iOS, Samsung/Fire TV, Enigma2)
- Enigma2: Live-Stream-Ende und stehendes Bild werden erkannt und automatisch neu verbunden (bisher gar nicht)
- Enigma2: QR-Code-Erzeugung jetzt auch unter Python 2 (OpenPLi 7 u.a.), Bild als RGB-PNG
- Anleitung 1.1.126

Co-Authored-By: Claude Opus 5.5 <noreply@anthropic.com>
Claude-Session: https://claude.ai/code/session_01CaJqjA6T7wr6qkboQBX5Ep
</commit_message>
<xml_diff>
--- a/docs/PowerIPTV-Anleitung.docx
+++ b/docs/PowerIPTV-Anleitung.docx
@@ -49,7 +49,7 @@
         <w:rPr>
           <w:color w:val="666666"/>
         </w:rPr>
-        <w:t xml:space="preserve">Stand: Version 1.1.124 · Oktober 2026</w:t>
+        <w:t xml:space="preserve">Stand: Version 1.1.126 · Oktober 2026</w:t>
       </w:r>
     </w:p>
     <w:p>
@@ -7172,6 +7172,26 @@
       </w:r>
       <w:r>
         <w:t xml:space="preserve">erkennt selbst, ob du über Mobilfunk schaust. Dann nimmt die App die SD-Version eines Senders (z. B. „RTL“ statt „RTL FHD“, falls dein Anbieter beide hat) und bei mehrstufigen Streams die kleinere Stufe; Vorschaubilder beim Spulen entfallen. Im WLAN bleibt immer die volle Qualität. Einstellungen → Bild &amp; Verbindung: Automatisch / Immer an / Aus.</w:t>
+      </w:r>
+    </w:p>
+    <w:p>
+      <w:pPr>
+        <w:pStyle w:val="ListParagraph"/>
+        <w:numPr>
+          <w:ilvl w:val="0"/>
+          <w:numId w:val="6"/>
+        </w:numPr>
+        <w:spacing w:after="60"/>
+      </w:pPr>
+      <w:r>
+        <w:rPr>
+          <w:b/>
+          <w:bCs/>
+        </w:rPr>
+        <w:t xml:space="preserve">Automatische Rettung bei Abbrüchen (alle Geräte, auch Enigma2): </w:t>
+      </w:r>
+      <w:r>
+        <w:t xml:space="preserve">Bricht ein Stream ab oder bleibt das Bild stehen, verbindet Portiva selbst neu (Filme an derselben Stelle). Hilft das bei einem Live-Sender nicht, probiert Portiva das andere Format (TS bzw. HLS) und danach – falls in der Senderliste vorhanden – einen Ausweich-Sender gleichen Namens, z.B. „Sky Sport 1 RAW“ statt „Sky Sport 1 HD“. Unten steht jeweils kurz, was gerade passiert. Sind alle Verbindungen deines Zugangs belegt (z.B. weil auf einem anderen Gerät geschaut wird), steht das klar da: „Zugang wird gerade woanders genutzt (2/2)“ – dann liegt es nicht am Server.</w:t>
       </w:r>
     </w:p>
     <w:p>

</xml_diff>

<commit_message>
Zugang vom Handy auf den Enigma2-Receiver uebertragen (QR scannen oder IP + Code)
- Receiver: "Benutzer wechseln" hat ganz oben "Zugang vom Handy empfangen" (QR-Code, darunter IP-Adresse
  und Code); gleicher Zugang wird beim erneuten Uebertragen aktualisiert statt doppelt angelegt
- Android/iOS: beim Zugang (QR-Symbol) "Auf Receiver / TV uebertragen (QR scannen)" und "Code eingeben"
- Windows und Samsung/Fire TV (ohne Kamera): "Auf Receiver / TV uebertragen (Code eingeben)"
- Portiva Link auf dem Receiver: Hauptthread-Aufruf auch ohne twisted robust
- Anleitung 1.1.129

Co-Authored-By: Claude Opus 5.5 <noreply@anthropic.com>
Claude-Session: https://claude.ai/code/session_01CaJqjA6T7wr6qkboQBX5Ep
</commit_message>
<xml_diff>
--- a/docs/PowerIPTV-Anleitung.docx
+++ b/docs/PowerIPTV-Anleitung.docx
@@ -49,7 +49,7 @@
         <w:rPr>
           <w:color w:val="666666"/>
         </w:rPr>
-        <w:t xml:space="preserve">Stand: Version 1.1.128 · Oktober 2026</w:t>
+        <w:t xml:space="preserve">Stand: Version 1.1.129 · Oktober 2026</w:t>
       </w:r>
     </w:p>
     <w:p>
@@ -6294,7 +6294,7 @@
         <w:spacing w:after="60"/>
       </w:pPr>
       <w:r>
-        <w:t xml:space="preserve">Am TV-Stick / Android TV: Benutzer wechseln → „Neuer Zugang“ → „Vom anderen Gerät empfangen“. Samsung-TV: Benutzer wechseln → „Vom Handy empfangen“. Windows: Zugänge → „Vom Handy empfangen“. Es erscheint ein QR-Code.</w:t>
+        <w:t xml:space="preserve">Am TV-Stick / Android TV: Benutzer wechseln → „Neuer Zugang“ → „Vom anderen Gerät empfangen“. Samsung-TV: Benutzer wechseln → „Vom Handy empfangen“. Windows: Zugänge → „Vom Handy empfangen“. Enigma2-Receiver: PowerIPTV → Benutzer wechseln → ganz oben „Zugang vom Handy empfangen“. Es erscheint ein QR-Code, darunter IP-Adresse und Code.</w:t>
       </w:r>
     </w:p>
     <w:p>
@@ -6307,20 +6307,7 @@
         <w:spacing w:after="60"/>
       </w:pPr>
       <w:r>
-        <w:t xml:space="preserve">Am Handy: Benutzer wechseln → beim gewünschten Zugang auf das QR-Symbol tippen → „An TV-Stick / Fernseher senden“ → den Code am TV scannen.</w:t>
-      </w:r>
-    </w:p>
-    <w:p>
-      <w:pPr>
-        <w:pStyle w:val="ListParagraph"/>
-        <w:numPr>
-          <w:ilvl w:val="0"/>
-          <w:numId w:val="13"/>
-        </w:numPr>
-        <w:spacing w:after="60"/>
-      </w:pPr>
-      <w:r>
-        <w:t xml:space="preserve">Der Zugang erscheint sofort auf dem TV und wird aktiviert. Beim Samsung-TV dauert es einige Sekunden (der Fernseher holt den Zugang beim Handy ab – Portiva am Handy so lange geöffnet lassen).</w:t>
+        <w:t xml:space="preserve">Am Handy: Benutzer wechseln → beim gewünschten Zugang auf das QR-Symbol tippen → „Auf Receiver / TV übertragen (QR scannen)“ → den Code am Receiver/TV scannen. Fertig – der Receiver übernimmt Zugang und Passwort automatisch und schaltet darauf um.</w:t>
       </w:r>
     </w:p>
     <w:p>
@@ -6340,29 +6327,20 @@
         <w:t xml:space="preserve">Tipp: </w:t>
       </w:r>
       <w:r>
-        <w:t xml:space="preserve">Der QR-Code eines Zugangs enthält die Zugangsdaten – nur dir selbst zeigen. Lokale M3U-Dateien lassen sich nicht übertragen (dort fehlt das QR-Symbol).</w:t>
-      </w:r>
-    </w:p>
-    <w:p>
-      <w:pPr>
-        <w:pStyle w:val="Heading2"/>
-        <w:spacing w:after="120" w:before="240"/>
-      </w:pPr>
-      <w:r>
-        <w:t xml:space="preserve">Wiedergabe an ein anderes Gerät senden</w:t>
-      </w:r>
-    </w:p>
-    <w:p>
-      <w:pPr>
-        <w:pStyle w:val="ListParagraph"/>
-        <w:numPr>
-          <w:ilvl w:val="0"/>
-          <w:numId w:val="14"/>
-        </w:numPr>
-        <w:spacing w:after="60"/>
-      </w:pPr>
-      <w:r>
-        <w:t xml:space="preserve">Im Player oben auf das Übertragen-Symbol (wie bei Chromecast) oder das Fernseher-Symbol „An Gerät senden“ tippen (Samsung-TV: Knopf „📲 Senden“). Das Fenster bleibt offen, bis du es schließt – auch wenn die Suche etwas dauert.</w:t>
+        <w:t xml:space="preserve">Ohne Kamera (Windows-PC, TV-Stick, Samsung-TV) oder wenn das Scannen nicht klappt: beim Zugang „Code eingeben“ wählen und die am Receiver angezeigte IP-Adresse und den 6-stelligen Code eintragen. Den gleichen Zugang zweimal zu übertragen legt ihn nicht doppelt an.</w:t>
+      </w:r>
+    </w:p>
+    <w:p>
+      <w:pPr>
+        <w:pStyle w:val="ListParagraph"/>
+        <w:numPr>
+          <w:ilvl w:val="0"/>
+          <w:numId w:val="13"/>
+        </w:numPr>
+        <w:spacing w:after="60"/>
+      </w:pPr>
+      <w:r>
+        <w:t xml:space="preserve">Der Zugang erscheint sofort auf dem TV und wird aktiviert. Beim Samsung-TV dauert es einige Sekunden (der Fernseher holt den Zugang beim Handy ab – Portiva am Handy so lange geöffnet lassen).</w:t>
       </w:r>
     </w:p>
     <w:p>
@@ -6382,7 +6360,16 @@
         <w:t xml:space="preserve">Tipp: </w:t>
       </w:r>
       <w:r>
-        <w:t xml:space="preserve">Wird ein Gerät nicht gefunden: Alle Geräte müssen im selben Heimnetz hängen – WLAN oder LAN-Kabel ist egal. Klappt die automatische Suche trotzdem nicht, im Fenster „An Gerät senden“ unten die IP-Adresse des Geräts eingeben und „Verbinden“ drücken (Samsung-TV: „＋ Gerät per IP-Adresse …“). Das Gerät wird gemerkt und beim nächsten Mal automatisch angezeigt.</w:t>
+        <w:t xml:space="preserve">Der QR-Code eines Zugangs enthält die Zugangsdaten – nur dir selbst zeigen. Lokale M3U-Dateien lassen sich nicht übertragen (dort fehlt das QR-Symbol).</w:t>
+      </w:r>
+    </w:p>
+    <w:p>
+      <w:pPr>
+        <w:pStyle w:val="Heading2"/>
+        <w:spacing w:after="120" w:before="240"/>
+      </w:pPr>
+      <w:r>
+        <w:t xml:space="preserve">Wiedergabe an ein anderes Gerät senden</w:t>
       </w:r>
     </w:p>
     <w:p>
@@ -6395,20 +6382,7 @@
         <w:spacing w:after="60"/>
       </w:pPr>
       <w:r>
-        <w:t xml:space="preserve">Unter „Portiva-Geräte“ erscheinen alle Geräte mit geöffnetem Portiva im Heimnetz (TV-Stick, Tablet, Handy, Windows-PC) → Gerät wählen. Darüber stehen wie bisher Chromecast-Geräte.</w:t>
-      </w:r>
-    </w:p>
-    <w:p>
-      <w:pPr>
-        <w:pStyle w:val="ListParagraph"/>
-        <w:numPr>
-          <w:ilvl w:val="0"/>
-          <w:numId w:val="14"/>
-        </w:numPr>
-        <w:spacing w:after="60"/>
-      </w:pPr>
-      <w:r>
-        <w:t xml:space="preserve">Der Film läuft dort an derselben Stelle weiter (Live TV: derselbe Sender), hier wird gestoppt.</w:t>
+        <w:t xml:space="preserve">Im Player oben auf das Übertragen-Symbol (wie bei Chromecast) oder das Fernseher-Symbol „An Gerät senden“ tippen (Samsung-TV: Knopf „📲 Senden“). Das Fenster bleibt offen, bis du es schließt – auch wenn die Suche etwas dauert.</w:t>
       </w:r>
     </w:p>
     <w:p>
@@ -6428,29 +6402,33 @@
         <w:t xml:space="preserve">Tipp: </w:t>
       </w:r>
       <w:r>
-        <w:t xml:space="preserve">Portiva muss auf dem Zielgerät geöffnet sein (Android ab Version 10 erlaubt Apps im Hintergrund nicht, sich selbst zu öffnen). Samsung-Fernseher können senden, aber nichts empfangen. Windows fragt beim ersten Mal nach der Firewall – „Zulassen“ wählen.</w:t>
-      </w:r>
-    </w:p>
-    <w:p>
-      <w:r>
-        <w:br w:type="page"/>
-      </w:r>
-    </w:p>
-    <w:p>
-      <w:pPr>
-        <w:pStyle w:val="Heading1"/>
-        <w:spacing w:after="160" w:before="360"/>
-      </w:pPr>
-      <w:r>
-        <w:t xml:space="preserve">17. PowerIPTV für iPhone &amp; iPad</w:t>
-      </w:r>
-    </w:p>
-    <w:p>
-      <w:pPr>
-        <w:spacing w:after="120"/>
-      </w:pPr>
-      <w:r>
-        <w:t xml:space="preserve">Die iOS-Version nutzt denselben Player wie Android und Windows: VLC. Damit laufen auch DTS-, AC3- und MKV-Filme. Sie kann Zugänge (auch per QR-Code), Live TV, Filme und Serien mit Sprachauswahl, Weiterschauen, Favoriten und eigene Listen (lange auf einen Sender, Film oder eine Serie drücken → „Zu Liste hinzufügen …“; verwalten unter „Favoriten &amp; Listen“ mit ＋ und ⋯), Suche, TV-Guide mit Catch-up, Player mit Helligkeit/Lautstärke, Seitenverhältnis, Geschwindigkeit, Untertiteln und Einstellungsleiste sowie „An Gerät senden“.</w:t>
+        <w:t xml:space="preserve">Wird ein Gerät nicht gefunden: Alle Geräte müssen im selben Heimnetz hängen – WLAN oder LAN-Kabel ist egal. Klappt die automatische Suche trotzdem nicht, im Fenster „An Gerät senden“ unten die IP-Adresse des Geräts eingeben und „Verbinden“ drücken (Samsung-TV: „＋ Gerät per IP-Adresse …“). Das Gerät wird gemerkt und beim nächsten Mal automatisch angezeigt.</w:t>
+      </w:r>
+    </w:p>
+    <w:p>
+      <w:pPr>
+        <w:pStyle w:val="ListParagraph"/>
+        <w:numPr>
+          <w:ilvl w:val="0"/>
+          <w:numId w:val="14"/>
+        </w:numPr>
+        <w:spacing w:after="60"/>
+      </w:pPr>
+      <w:r>
+        <w:t xml:space="preserve">Unter „Portiva-Geräte“ erscheinen alle Geräte mit geöffnetem Portiva im Heimnetz (TV-Stick, Tablet, Handy, Windows-PC) → Gerät wählen. Darüber stehen wie bisher Chromecast-Geräte.</w:t>
+      </w:r>
+    </w:p>
+    <w:p>
+      <w:pPr>
+        <w:pStyle w:val="ListParagraph"/>
+        <w:numPr>
+          <w:ilvl w:val="0"/>
+          <w:numId w:val="14"/>
+        </w:numPr>
+        <w:spacing w:after="60"/>
+      </w:pPr>
+      <w:r>
+        <w:t xml:space="preserve">Der Film läuft dort an derselben Stelle weiter (Live TV: derselbe Sender), hier wird gestoppt.</w:t>
       </w:r>
     </w:p>
     <w:p>
@@ -6470,102 +6448,12 @@
         <w:t xml:space="preserve">Tipp: </w:t>
       </w:r>
       <w:r>
-        <w:t xml:space="preserve">Apple erlaubt Apps außerhalb des App Stores nur mit einer Apple-ID-Signatur. Mit einer kostenlosen Apple-ID läuft die App 7 Tage und muss dann neu aufgespielt werden (Zugänge bleiben erhalten). Mit einem Apple-Entwicklerkonto (99 €/Jahr) gilt sie 1 Jahr.</w:t>
-      </w:r>
-    </w:p>
-    <w:p>
-      <w:pPr>
-        <w:pStyle w:val="Heading2"/>
-        <w:spacing w:after="120" w:before="240"/>
-      </w:pPr>
-      <w:r>
-        <w:t xml:space="preserve">Installation mit Sideloadly (Windows oder Mac)</w:t>
-      </w:r>
-    </w:p>
-    <w:p>
-      <w:pPr>
-        <w:pStyle w:val="ListParagraph"/>
-        <w:numPr>
-          <w:ilvl w:val="0"/>
-          <w:numId w:val="15"/>
-        </w:numPr>
-        <w:spacing w:after="60"/>
-      </w:pPr>
-      <w:r>
-        <w:t xml:space="preserve">Am PC: Sideloadly von https://sideloadly.io herunterladen und installieren. Unter Windows zusätzlich iTunes und iCloud von der Apple-Webseite (nicht aus dem Microsoft Store).</w:t>
-      </w:r>
-    </w:p>
-    <w:p>
-      <w:pPr>
-        <w:pStyle w:val="ListParagraph"/>
-        <w:numPr>
-          <w:ilvl w:val="0"/>
-          <w:numId w:val="15"/>
-        </w:numPr>
-        <w:spacing w:after="60"/>
-      </w:pPr>
-      <w:r>
-        <w:t xml:space="preserve">Auf GitHub unter „Releases“ die neueste Version öffnen und „Portiva-iOS-v1.1.X.ipa“ herunterladen.</w:t>
-      </w:r>
-    </w:p>
-    <w:p>
-      <w:pPr>
-        <w:pStyle w:val="ListParagraph"/>
-        <w:numPr>
-          <w:ilvl w:val="0"/>
-          <w:numId w:val="15"/>
-        </w:numPr>
-        <w:spacing w:after="60"/>
-      </w:pPr>
-      <w:r>
-        <w:t xml:space="preserve">iPhone/iPad per Kabel anschließen, entsperren und „Vertrauen“ bestätigen.</w:t>
-      </w:r>
-    </w:p>
-    <w:p>
-      <w:pPr>
-        <w:pStyle w:val="ListParagraph"/>
-        <w:numPr>
-          <w:ilvl w:val="0"/>
-          <w:numId w:val="15"/>
-        </w:numPr>
-        <w:spacing w:after="60"/>
-      </w:pPr>
-      <w:r>
-        <w:t xml:space="preserve">Sideloadly öffnen, die .ipa hineinziehen, deine Apple-ID eintragen und „Start“ klicken.</w:t>
-      </w:r>
-    </w:p>
-    <w:p>
-      <w:pPr>
-        <w:pStyle w:val="ListParagraph"/>
-        <w:numPr>
-          <w:ilvl w:val="0"/>
-          <w:numId w:val="15"/>
-        </w:numPr>
-        <w:spacing w:after="60"/>
-      </w:pPr>
-      <w:r>
-        <w:t xml:space="preserve">Am iPhone: Einstellungen → Datenschutz &amp; Sicherheit → Entwicklermodus einschalten (iOS 16+, Neustart). Danach Einstellungen → Allgemein → VPN &amp; Geräteverwaltung → deine Apple-ID → „Vertrauen“.</w:t>
-      </w:r>
-    </w:p>
-    <w:p>
-      <w:pPr>
-        <w:pStyle w:val="ListParagraph"/>
-        <w:numPr>
-          <w:ilvl w:val="0"/>
-          <w:numId w:val="15"/>
-        </w:numPr>
-        <w:spacing w:after="60"/>
-      </w:pPr>
-      <w:r>
-        <w:t xml:space="preserve">Portiva öffnen. Beim ersten Start fragt iOS nach „Lokales Netzwerk“ – erlauben (für QR-Übertragung und „An Gerät senden“).</w:t>
-      </w:r>
-    </w:p>
-    <w:p>
-      <w:pPr>
-        <w:spacing w:after="120"/>
-      </w:pPr>
-      <w:r>
-        <w:t xml:space="preserve">Zugang am schnellsten: Benutzer wechseln → „+“ → „QR-Code scannen“ und am anderen Gerät beim Zugang auf das QR-Symbol tippen.</w:t>
+        <w:t xml:space="preserve">Portiva muss auf dem Zielgerät geöffnet sein (Android ab Version 10 erlaubt Apps im Hintergrund nicht, sich selbst zu öffnen). Samsung-Fernseher können senden, aber nichts empfangen. Windows fragt beim ersten Mal nach der Firewall – „Zulassen“ wählen.</w:t>
+      </w:r>
+    </w:p>
+    <w:p>
+      <w:r>
+        <w:br w:type="page"/>
       </w:r>
     </w:p>
     <w:p>
@@ -6574,7 +6462,7 @@
         <w:spacing w:after="160" w:before="360"/>
       </w:pPr>
       <w:r>
-        <w:t xml:space="preserve">18. PowerIPTV für die neuen Fire TV Sticks (Vega OS)</w:t>
+        <w:t xml:space="preserve">17. PowerIPTV für iPhone &amp; iPad</w:t>
       </w:r>
     </w:p>
     <w:p>
@@ -6582,7 +6470,7 @@
         <w:spacing w:after="120"/>
       </w:pPr>
       <w:r>
-        <w:t xml:space="preserve">Amazon hat bei den neuen Sticks Android durch das eigene Betriebssystem „Vega OS“ ersetzt. Betroffen sind der Fire TV Stick 4K Select, der Fire TV Stick HD (2026), der Fire TV Stick 4K (2026) und alle kommenden Sticks. Dort laufen keine APKs und es gibt kein „Apps unbekannter Herkunft“ mehr. Deshalb gibt es eine eigene Version: „Portiva-FireTV-Vega-v1.1.X.vpkg“ (auf GitHub im Ordner „Fire TV Vega“, im Release mit „🆕 NEUE Amazon Fire TV Sticks“ gekennzeichnet).</w:t>
+        <w:t xml:space="preserve">Die iOS-Version nutzt denselben Player wie Android und Windows: VLC. Damit laufen auch DTS-, AC3- und MKV-Filme. Sie kann Zugänge (auch per QR-Code), Live TV, Filme und Serien mit Sprachauswahl, Weiterschauen, Favoriten und eigene Listen (lange auf einen Sender, Film oder eine Serie drücken → „Zu Liste hinzufügen …“; verwalten unter „Favoriten &amp; Listen“ mit ＋ und ⋯), Suche, TV-Guide mit Catch-up, Player mit Helligkeit/Lautstärke, Seitenverhältnis, Geschwindigkeit, Untertiteln und Einstellungsleiste sowie „An Gerät senden“.</w:t>
       </w:r>
     </w:p>
     <w:p>
@@ -6602,15 +6490,7 @@
         <w:t xml:space="preserve">Tipp: </w:t>
       </w:r>
       <w:r>
-        <w:t xml:space="preserve">Welcher Stick? Einstellungen → Mein Fire TV → Info. Steht dort „Fire OS“, nimm die normale APK (Kapitel 2). Steht dort „Vega OS“, nimm diese Version.</w:t>
-      </w:r>
-    </w:p>
-    <w:p>
-      <w:pPr>
-        <w:spacing w:after="120"/>
-      </w:pPr>
-      <w:r>
-        <w:t xml:space="preserve">Die Oberfläche ist dieselbe wie beim Samsung-Fernseher (Fernbedienung, Live-TV-Infoleiste, EPG, Favoriten, Portiva Link). Das Bild kommt vom Hardware-Player des Sticks. Aufnahmen, Downloads, VPN und Mehrfachbildschirm gibt es dort nicht.</w:t>
+        <w:t xml:space="preserve">Apple erlaubt Apps außerhalb des App Stores nur mit einer Apple-ID-Signatur. Mit einer kostenlosen Apple-ID läuft die App 7 Tage und muss dann neu aufgespielt werden (Zugänge bleiben erhalten). Mit einem Apple-Entwicklerkonto (99 €/Jahr) gilt sie 1 Jahr.</w:t>
       </w:r>
     </w:p>
     <w:p>
@@ -6619,168 +6499,110 @@
         <w:spacing w:after="120" w:before="240"/>
       </w:pPr>
       <w:r>
-        <w:t xml:space="preserve">Einmalig: Amazon-Entwicklerkonto &amp; Vega-Werkzeug</w:t>
-      </w:r>
-    </w:p>
-    <w:p>
-      <w:pPr>
-        <w:pStyle w:val="ListParagraph"/>
-        <w:numPr>
-          <w:ilvl w:val="0"/>
-          <w:numId w:val="16"/>
-        </w:numPr>
-        <w:spacing w:after="60"/>
-      </w:pPr>
-      <w:r>
-        <w:t xml:space="preserve">Kostenloses Amazon-Entwicklerkonto auf developer.amazon.com anlegen und das Appstore-Entwicklerprofil vollständig ausfüllen (ohne Bank-/Steuerdaten). Ohne vollständiges Profil klappt der Entwicklermodus nicht.</w:t>
-      </w:r>
-    </w:p>
-    <w:p>
-      <w:pPr>
-        <w:pStyle w:val="ListParagraph"/>
-        <w:numPr>
-          <w:ilvl w:val="0"/>
-          <w:numId w:val="16"/>
-        </w:numPr>
-        <w:spacing w:after="60"/>
-      </w:pPr>
-      <w:r>
-        <w:t xml:space="preserve">Am PC (Windows mit WSL/Ubuntu, Linux oder Mac) das Vega-Werkzeug installieren: curl -fsSL https://sdk-installer.vega.labcollab.net/get_vvm.sh | bash und danach source ~/vega/env.</w:t>
-      </w:r>
-    </w:p>
-    <w:p>
-      <w:pPr>
-        <w:pStyle w:val="ListParagraph"/>
-        <w:numPr>
-          <w:ilvl w:val="0"/>
-          <w:numId w:val="16"/>
-        </w:numPr>
-        <w:spacing w:after="60"/>
-      </w:pPr>
-      <w:r>
-        <w:t xml:space="preserve">Anmelden: vega devmode login → den angezeigten Code auf amazon.com/code bestätigen.</w:t>
-      </w:r>
-    </w:p>
-    <w:p>
-      <w:pPr>
-        <w:pStyle w:val="Heading2"/>
-        <w:spacing w:after="120" w:before="240"/>
-      </w:pPr>
-      <w:r>
-        <w:t xml:space="preserve">Entwicklermodus am Stick einschalten</w:t>
-      </w:r>
-    </w:p>
-    <w:p>
-      <w:pPr>
-        <w:pStyle w:val="ListParagraph"/>
-        <w:numPr>
-          <w:ilvl w:val="0"/>
-          <w:numId w:val="17"/>
-        </w:numPr>
-        <w:spacing w:after="60"/>
-      </w:pPr>
-      <w:r>
-        <w:t xml:space="preserve">Am Stick: Einstellungen → Mein Fire TV → Info → 7-mal auf den Gerätenamen drücken („Du bist jetzt Entwickler“).</w:t>
-      </w:r>
-    </w:p>
-    <w:p>
-      <w:pPr>
-        <w:pStyle w:val="ListParagraph"/>
-        <w:numPr>
-          <w:ilvl w:val="0"/>
-          <w:numId w:val="17"/>
-        </w:numPr>
-        <w:spacing w:after="60"/>
-      </w:pPr>
-      <w:r>
-        <w:t xml:space="preserve">Zurück → Entwickleroptionen → Entwicklermodus → Weiter. Der Fernseher zeigt einen 6-stelligen Code (gilt ca. 5 Minuten).</w:t>
-      </w:r>
-    </w:p>
-    <w:p>
-      <w:pPr>
-        <w:pStyle w:val="ListParagraph"/>
-        <w:numPr>
-          <w:ilvl w:val="0"/>
-          <w:numId w:val="17"/>
-        </w:numPr>
-        <w:spacing w:after="60"/>
-      </w:pPr>
-      <w:r>
-        <w:t xml:space="preserve">Am PC: vega devmode enable-device --code &lt;Code&gt;. Der Stick startet neu.</w:t>
-      </w:r>
-    </w:p>
-    <w:p>
-      <w:pPr>
-        <w:pStyle w:val="ListParagraph"/>
-        <w:numPr>
-          <w:ilvl w:val="0"/>
-          <w:numId w:val="17"/>
-        </w:numPr>
-        <w:spacing w:after="60"/>
-      </w:pPr>
-      <w:r>
-        <w:t xml:space="preserve">Entwickleroptionen → Verbindungsart „Netzwerk“ wählen (oder per USB-Kabel verbinden). Prüfen mit: vega device list (zeigt die Seriennummer).</w:t>
-      </w:r>
-    </w:p>
-    <w:p>
-      <w:pPr>
-        <w:pStyle w:val="Heading2"/>
-        <w:spacing w:after="120" w:before="240"/>
-      </w:pPr>
-      <w:r>
-        <w:t xml:space="preserve">Portiva installieren &amp; aktualisieren</w:t>
-      </w:r>
-    </w:p>
-    <w:p>
-      <w:pPr>
-        <w:pStyle w:val="ListParagraph"/>
-        <w:numPr>
-          <w:ilvl w:val="0"/>
-          <w:numId w:val="18"/>
-        </w:numPr>
-        <w:spacing w:after="60"/>
-      </w:pPr>
-      <w:r>
-        <w:t xml:space="preserve">Auf GitHub unter „Releases“ die Datei „Portiva-FireTV-Vega-v1.1.X.vpkg“ herunterladen.</w:t>
-      </w:r>
-    </w:p>
-    <w:p>
-      <w:pPr>
-        <w:pStyle w:val="ListParagraph"/>
-        <w:numPr>
-          <w:ilvl w:val="0"/>
-          <w:numId w:val="18"/>
-        </w:numPr>
-        <w:spacing w:after="60"/>
-      </w:pPr>
-      <w:r>
-        <w:t xml:space="preserve">Installieren: vega device -d &lt;Seriennummer&gt; install-app --packagePath Portiva-FireTV-Vega-v1.1.X.vpkg</w:t>
-      </w:r>
-    </w:p>
-    <w:p>
-      <w:pPr>
-        <w:pStyle w:val="ListParagraph"/>
-        <w:numPr>
-          <w:ilvl w:val="0"/>
-          <w:numId w:val="18"/>
-        </w:numPr>
-        <w:spacing w:after="60"/>
-      </w:pPr>
-      <w:r>
-        <w:t xml:space="preserve">Starten: über die Kachel „Portiva“ bei den Apps (ggf. nach einem Neustart) oder vega device -d &lt;Seriennummer&gt; launch-app --appName app.portiva.firetv.main</w:t>
-      </w:r>
-    </w:p>
-    <w:p>
-      <w:pPr>
-        <w:pStyle w:val="ListParagraph"/>
-        <w:numPr>
-          <w:ilvl w:val="0"/>
-          <w:numId w:val="18"/>
-        </w:numPr>
-        <w:spacing w:after="60"/>
-      </w:pPr>
-      <w:r>
-        <w:t xml:space="preserve">Zugang am bequemsten per „Vom Handy empfangen“ einrichten (Kapitel 16).</w:t>
+        <w:t xml:space="preserve">Installation mit Sideloadly (Windows oder Mac)</w:t>
+      </w:r>
+    </w:p>
+    <w:p>
+      <w:pPr>
+        <w:pStyle w:val="ListParagraph"/>
+        <w:numPr>
+          <w:ilvl w:val="0"/>
+          <w:numId w:val="15"/>
+        </w:numPr>
+        <w:spacing w:after="60"/>
+      </w:pPr>
+      <w:r>
+        <w:t xml:space="preserve">Am PC: Sideloadly von https://sideloadly.io herunterladen und installieren. Unter Windows zusätzlich iTunes und iCloud von der Apple-Webseite (nicht aus dem Microsoft Store).</w:t>
+      </w:r>
+    </w:p>
+    <w:p>
+      <w:pPr>
+        <w:pStyle w:val="ListParagraph"/>
+        <w:numPr>
+          <w:ilvl w:val="0"/>
+          <w:numId w:val="15"/>
+        </w:numPr>
+        <w:spacing w:after="60"/>
+      </w:pPr>
+      <w:r>
+        <w:t xml:space="preserve">Auf GitHub unter „Releases“ die neueste Version öffnen und „Portiva-iOS-v1.1.X.ipa“ herunterladen.</w:t>
+      </w:r>
+    </w:p>
+    <w:p>
+      <w:pPr>
+        <w:pStyle w:val="ListParagraph"/>
+        <w:numPr>
+          <w:ilvl w:val="0"/>
+          <w:numId w:val="15"/>
+        </w:numPr>
+        <w:spacing w:after="60"/>
+      </w:pPr>
+      <w:r>
+        <w:t xml:space="preserve">iPhone/iPad per Kabel anschließen, entsperren und „Vertrauen“ bestätigen.</w:t>
+      </w:r>
+    </w:p>
+    <w:p>
+      <w:pPr>
+        <w:pStyle w:val="ListParagraph"/>
+        <w:numPr>
+          <w:ilvl w:val="0"/>
+          <w:numId w:val="15"/>
+        </w:numPr>
+        <w:spacing w:after="60"/>
+      </w:pPr>
+      <w:r>
+        <w:t xml:space="preserve">Sideloadly öffnen, die .ipa hineinziehen, deine Apple-ID eintragen und „Start“ klicken.</w:t>
+      </w:r>
+    </w:p>
+    <w:p>
+      <w:pPr>
+        <w:pStyle w:val="ListParagraph"/>
+        <w:numPr>
+          <w:ilvl w:val="0"/>
+          <w:numId w:val="15"/>
+        </w:numPr>
+        <w:spacing w:after="60"/>
+      </w:pPr>
+      <w:r>
+        <w:t xml:space="preserve">Am iPhone: Einstellungen → Datenschutz &amp; Sicherheit → Entwicklermodus einschalten (iOS 16+, Neustart). Danach Einstellungen → Allgemein → VPN &amp; Geräteverwaltung → deine Apple-ID → „Vertrauen“.</w:t>
+      </w:r>
+    </w:p>
+    <w:p>
+      <w:pPr>
+        <w:pStyle w:val="ListParagraph"/>
+        <w:numPr>
+          <w:ilvl w:val="0"/>
+          <w:numId w:val="15"/>
+        </w:numPr>
+        <w:spacing w:after="60"/>
+      </w:pPr>
+      <w:r>
+        <w:t xml:space="preserve">Portiva öffnen. Beim ersten Start fragt iOS nach „Lokales Netzwerk“ – erlauben (für QR-Übertragung und „An Gerät senden“).</w:t>
+      </w:r>
+    </w:p>
+    <w:p>
+      <w:pPr>
+        <w:spacing w:after="120"/>
+      </w:pPr>
+      <w:r>
+        <w:t xml:space="preserve">Zugang am schnellsten: Benutzer wechseln → „+“ → „QR-Code scannen“ und am anderen Gerät beim Zugang auf das QR-Symbol tippen.</w:t>
+      </w:r>
+    </w:p>
+    <w:p>
+      <w:pPr>
+        <w:pStyle w:val="Heading1"/>
+        <w:spacing w:after="160" w:before="360"/>
+      </w:pPr>
+      <w:r>
+        <w:t xml:space="preserve">18. PowerIPTV für die neuen Fire TV Sticks (Vega OS)</w:t>
+      </w:r>
+    </w:p>
+    <w:p>
+      <w:pPr>
+        <w:spacing w:after="120"/>
+      </w:pPr>
+      <w:r>
+        <w:t xml:space="preserve">Amazon hat bei den neuen Sticks Android durch das eigene Betriebssystem „Vega OS“ ersetzt. Betroffen sind der Fire TV Stick 4K Select, der Fire TV Stick HD (2026), der Fire TV Stick 4K (2026) und alle kommenden Sticks. Dort laufen keine APKs und es gibt kein „Apps unbekannter Herkunft“ mehr. Deshalb gibt es eine eigene Version: „Portiva-FireTV-Vega-v1.1.X.vpkg“ (auf GitHub im Ordner „Fire TV Vega“, im Release mit „🆕 NEUE Amazon Fire TV Sticks“ gekennzeichnet).</w:t>
       </w:r>
     </w:p>
     <w:p>
@@ -6800,7 +6622,185 @@
         <w:t xml:space="preserve">Tipp: </w:t>
       </w:r>
       <w:r>
-        <w:t xml:space="preserve">Updates genauso installieren – Zugänge und Favoriten bleiben erhalten. Die App zeigt unter „Update“, wenn es eine neue Version gibt.</w:t>
+        <w:t xml:space="preserve">Welcher Stick? Einstellungen → Mein Fire TV → Info. Steht dort „Fire OS“, nimm die normale APK (Kapitel 2). Steht dort „Vega OS“, nimm diese Version.</w:t>
+      </w:r>
+    </w:p>
+    <w:p>
+      <w:pPr>
+        <w:spacing w:after="120"/>
+      </w:pPr>
+      <w:r>
+        <w:t xml:space="preserve">Die Oberfläche ist dieselbe wie beim Samsung-Fernseher (Fernbedienung, Live-TV-Infoleiste, EPG, Favoriten, Portiva Link). Das Bild kommt vom Hardware-Player des Sticks. Aufnahmen, Downloads, VPN und Mehrfachbildschirm gibt es dort nicht.</w:t>
+      </w:r>
+    </w:p>
+    <w:p>
+      <w:pPr>
+        <w:pStyle w:val="Heading2"/>
+        <w:spacing w:after="120" w:before="240"/>
+      </w:pPr>
+      <w:r>
+        <w:t xml:space="preserve">Einmalig: Amazon-Entwicklerkonto &amp; Vega-Werkzeug</w:t>
+      </w:r>
+    </w:p>
+    <w:p>
+      <w:pPr>
+        <w:pStyle w:val="ListParagraph"/>
+        <w:numPr>
+          <w:ilvl w:val="0"/>
+          <w:numId w:val="16"/>
+        </w:numPr>
+        <w:spacing w:after="60"/>
+      </w:pPr>
+      <w:r>
+        <w:t xml:space="preserve">Kostenloses Amazon-Entwicklerkonto auf developer.amazon.com anlegen und das Appstore-Entwicklerprofil vollständig ausfüllen (ohne Bank-/Steuerdaten). Ohne vollständiges Profil klappt der Entwicklermodus nicht.</w:t>
+      </w:r>
+    </w:p>
+    <w:p>
+      <w:pPr>
+        <w:pStyle w:val="ListParagraph"/>
+        <w:numPr>
+          <w:ilvl w:val="0"/>
+          <w:numId w:val="16"/>
+        </w:numPr>
+        <w:spacing w:after="60"/>
+      </w:pPr>
+      <w:r>
+        <w:t xml:space="preserve">Am PC (Windows mit WSL/Ubuntu, Linux oder Mac) das Vega-Werkzeug installieren: curl -fsSL https://sdk-installer.vega.labcollab.net/get_vvm.sh | bash und danach source ~/vega/env.</w:t>
+      </w:r>
+    </w:p>
+    <w:p>
+      <w:pPr>
+        <w:pStyle w:val="ListParagraph"/>
+        <w:numPr>
+          <w:ilvl w:val="0"/>
+          <w:numId w:val="16"/>
+        </w:numPr>
+        <w:spacing w:after="60"/>
+      </w:pPr>
+      <w:r>
+        <w:t xml:space="preserve">Anmelden: vega devmode login → den angezeigten Code auf amazon.com/code bestätigen.</w:t>
+      </w:r>
+    </w:p>
+    <w:p>
+      <w:pPr>
+        <w:pStyle w:val="Heading2"/>
+        <w:spacing w:after="120" w:before="240"/>
+      </w:pPr>
+      <w:r>
+        <w:t xml:space="preserve">Entwicklermodus am Stick einschalten</w:t>
+      </w:r>
+    </w:p>
+    <w:p>
+      <w:pPr>
+        <w:pStyle w:val="ListParagraph"/>
+        <w:numPr>
+          <w:ilvl w:val="0"/>
+          <w:numId w:val="17"/>
+        </w:numPr>
+        <w:spacing w:after="60"/>
+      </w:pPr>
+      <w:r>
+        <w:t xml:space="preserve">Am Stick: Einstellungen → Mein Fire TV → Info → 7-mal auf den Gerätenamen drücken („Du bist jetzt Entwickler“).</w:t>
+      </w:r>
+    </w:p>
+    <w:p>
+      <w:pPr>
+        <w:pStyle w:val="ListParagraph"/>
+        <w:numPr>
+          <w:ilvl w:val="0"/>
+          <w:numId w:val="17"/>
+        </w:numPr>
+        <w:spacing w:after="60"/>
+      </w:pPr>
+      <w:r>
+        <w:t xml:space="preserve">Zurück → Entwickleroptionen → Entwicklermodus → Weiter. Der Fernseher zeigt einen 6-stelligen Code (gilt ca. 5 Minuten).</w:t>
+      </w:r>
+    </w:p>
+    <w:p>
+      <w:pPr>
+        <w:pStyle w:val="ListParagraph"/>
+        <w:numPr>
+          <w:ilvl w:val="0"/>
+          <w:numId w:val="17"/>
+        </w:numPr>
+        <w:spacing w:after="60"/>
+      </w:pPr>
+      <w:r>
+        <w:t xml:space="preserve">Am PC: vega devmode enable-device --code &lt;Code&gt;. Der Stick startet neu.</w:t>
+      </w:r>
+    </w:p>
+    <w:p>
+      <w:pPr>
+        <w:pStyle w:val="ListParagraph"/>
+        <w:numPr>
+          <w:ilvl w:val="0"/>
+          <w:numId w:val="17"/>
+        </w:numPr>
+        <w:spacing w:after="60"/>
+      </w:pPr>
+      <w:r>
+        <w:t xml:space="preserve">Entwickleroptionen → Verbindungsart „Netzwerk“ wählen (oder per USB-Kabel verbinden). Prüfen mit: vega device list (zeigt die Seriennummer).</w:t>
+      </w:r>
+    </w:p>
+    <w:p>
+      <w:pPr>
+        <w:pStyle w:val="Heading2"/>
+        <w:spacing w:after="120" w:before="240"/>
+      </w:pPr>
+      <w:r>
+        <w:t xml:space="preserve">Portiva installieren &amp; aktualisieren</w:t>
+      </w:r>
+    </w:p>
+    <w:p>
+      <w:pPr>
+        <w:pStyle w:val="ListParagraph"/>
+        <w:numPr>
+          <w:ilvl w:val="0"/>
+          <w:numId w:val="18"/>
+        </w:numPr>
+        <w:spacing w:after="60"/>
+      </w:pPr>
+      <w:r>
+        <w:t xml:space="preserve">Auf GitHub unter „Releases“ die Datei „Portiva-FireTV-Vega-v1.1.X.vpkg“ herunterladen.</w:t>
+      </w:r>
+    </w:p>
+    <w:p>
+      <w:pPr>
+        <w:pStyle w:val="ListParagraph"/>
+        <w:numPr>
+          <w:ilvl w:val="0"/>
+          <w:numId w:val="18"/>
+        </w:numPr>
+        <w:spacing w:after="60"/>
+      </w:pPr>
+      <w:r>
+        <w:t xml:space="preserve">Installieren: vega device -d &lt;Seriennummer&gt; install-app --packagePath Portiva-FireTV-Vega-v1.1.X.vpkg</w:t>
+      </w:r>
+    </w:p>
+    <w:p>
+      <w:pPr>
+        <w:pStyle w:val="ListParagraph"/>
+        <w:numPr>
+          <w:ilvl w:val="0"/>
+          <w:numId w:val="18"/>
+        </w:numPr>
+        <w:spacing w:after="60"/>
+      </w:pPr>
+      <w:r>
+        <w:t xml:space="preserve">Starten: über die Kachel „Portiva“ bei den Apps (ggf. nach einem Neustart) oder vega device -d &lt;Seriennummer&gt; launch-app --appName app.portiva.firetv.main</w:t>
+      </w:r>
+    </w:p>
+    <w:p>
+      <w:pPr>
+        <w:pStyle w:val="ListParagraph"/>
+        <w:numPr>
+          <w:ilvl w:val="0"/>
+          <w:numId w:val="18"/>
+        </w:numPr>
+        <w:spacing w:after="60"/>
+      </w:pPr>
+      <w:r>
+        <w:t xml:space="preserve">Zugang am bequemsten per „Vom Handy empfangen“ einrichten (Kapitel 16).</w:t>
       </w:r>
     </w:p>
     <w:p>
@@ -6820,6 +6820,26 @@
         <w:t xml:space="preserve">Tipp: </w:t>
       </w:r>
       <w:r>
+        <w:t xml:space="preserve">Updates genauso installieren – Zugänge und Favoriten bleiben erhalten. Die App zeigt unter „Update“, wenn es eine neue Version gibt.</w:t>
+      </w:r>
+    </w:p>
+    <w:p>
+      <w:pPr>
+        <w:pBdr>
+          <w:left w:val="single" w:color="1E88B8" w:sz="18" w:space="8"/>
+        </w:pBdr>
+        <w:spacing w:after="160" w:before="80"/>
+        <w:ind w:left="240"/>
+      </w:pPr>
+      <w:r>
+        <w:rPr>
+          <w:b/>
+          <w:bCs/>
+          <w:color w:val="1E88B8"/>
+        </w:rPr>
+        <w:t xml:space="preserve">Tipp: </w:t>
+      </w:r>
+      <w:r>
         <w:t xml:space="preserve">Hinweis: Diese Version ist neu und noch nicht auf jedem Stick erprobt. Klappt ein Sender oder Film nicht, im Anbieter-Portal bzw. in den Einstellungen das Live-Format „HLS (m3u8)“ wählen; MKV-Filme mit DTS-Ton spielen die neuen Sticks evtl. ohne Ton ab.</w:t>
       </w:r>
     </w:p>
@@ -7063,7 +7083,7 @@
         <w:spacing w:after="60"/>
       </w:pPr>
       <w:r>
-        <w:t xml:space="preserve">Zugänge: Kachel „Vom Handy empfangen“ zeigt einen QR-Code – mit der PowerIPTV-App am Handy scannen, der Zugang wird übertragen. In „Benutzer wechseln“ zeigt Blau den Zugang als QR-Code für ein anderes Gerät (nur dir selbst zeigen – enthält die Zugangsdaten).</w:t>
+        <w:t xml:space="preserve">Zugänge: Kachel „Vom Handy empfangen“ oder „Benutzer wechseln“ → ganz oben „Zugang vom Handy empfangen“ zeigt einen QR-Code mit IP-Adresse und Code – in der PowerIPTV-App beim Zugang „Auf Receiver / TV übertragen“ wählen und scannen (oder IP + Code eingeben), der Zugang wird übertragen und aktiviert. In „Benutzer wechseln“ zeigt Blau den Zugang als QR-Code für ein anderes Gerät (nur dir selbst zeigen – enthält die Zugangsdaten).</w:t>
       </w:r>
     </w:p>
     <w:p>

</xml_diff>

<commit_message>
Enigma2: Filme/Serien als Poster-Kacheln wie in der App, Sprachauswahl unter Favoriten, Sprache streng filtern
- Poster-Ansicht (7 x 2 je Seite): Poster, Titel, Bewertung mit Stern, leuchtender Auswahlrahmen,
  Pfeiltasten/CH+-, unten Titel/Jahr/Bewertung/Position; umschaltbar per MENU oder Einstellungen
- Sprachauswahl als Zeile "Sprache: DE (OK = aendern)" direkt unter Favoriten statt gelber Taste
- Sprache DE zeigt nur noch Kategorien mit "DE"-Kuerzel (BRASIL, IRAN o.ae. ohne Kuerzel nicht mehr);
  "Alle" mit gewaehlter Sprache nur Titel dieser Sprache. Gleiche Regel jetzt auch Samsung/Fire TV und iOS
  (wie Android/Windows)
- Namenskonflikt LIST (Listen-Praefix vs. Skin-Attribute) behoben
- Mit Python 2.7 und 3 in der Enigma2-Simulation getestet; Anleitung 1.1.130

Co-Authored-By: Claude Opus 5.5 <noreply@anthropic.com>
Claude-Session: https://claude.ai/code/session_01CaJqjA6T7wr6qkboQBX5Ep
</commit_message>
<xml_diff>
--- a/docs/PowerIPTV-Anleitung.docx
+++ b/docs/PowerIPTV-Anleitung.docx
@@ -49,7 +49,7 @@
         <w:rPr>
           <w:color w:val="666666"/>
         </w:rPr>
-        <w:t xml:space="preserve">Stand: Version 1.1.129 · Oktober 2026</w:t>
+        <w:t xml:space="preserve">Stand: Version 1.1.130 · Oktober 2026</w:t>
       </w:r>
     </w:p>
     <w:p>
@@ -6966,7 +6966,20 @@
         <w:spacing w:after="60"/>
       </w:pPr>
       <w:r>
-        <w:t xml:space="preserve">Kategorien: oben „♥ Favoriten“, deine eigenen Listen (☰), „Zuletzt gesehen“ und „Alle“. Gelb = Sprache filtern (z. B. nur DE), Rot = Kategorie mit PIN sperren/entsperren (Kindersicherung), Grün = Live-Kategorie als Bouquet in die normale Senderliste des Receivers übernehmen.</w:t>
+        <w:t xml:space="preserve">Kategorien: oben „♥ Favoriten“, darunter „Sprache: …“ (OK öffnet die Auswahl, z. B. DE – dann erscheinen nur Kategorien mit „DE“ davor, keine wie „BRASIL“ oder „IRAN“; auch „Alle“ zeigt dann nur deutsche Titel), deine eigenen Listen (☰), „Zuletzt gesehen“ und „Alle“. Rot = Kategorie mit PIN sperren/entsperren (Kindersicherung), Grün = Live-Kategorie als Bouquet in die normale Senderliste des Receivers übernehmen.</w:t>
+      </w:r>
+    </w:p>
+    <w:p>
+      <w:pPr>
+        <w:pStyle w:val="ListParagraph"/>
+        <w:numPr>
+          <w:ilvl w:val="0"/>
+          <w:numId w:val="6"/>
+        </w:numPr>
+        <w:spacing w:after="60"/>
+      </w:pPr>
+      <w:r>
+        <w:t xml:space="preserve">Filme und Serien erscheinen als Poster-Kacheln wie in der App (7 × 2 pro Seite, darunter Titel und Bewertung). Pfeiltasten bewegen den leuchtenden Rahmen, CH+/CH− blättern seitenweise, OK öffnet. Unten stehen Titel, Jahr, Bewertung und die Position (z. B. 8 / 4092). Umschalten auf die Liste: MENU → „Ansicht: als Liste“ oder in den Einstellungen.</w:t>
       </w:r>
     </w:p>
     <w:p>

</xml_diff>

<commit_message>
An Geraet senden: Film laeuft auf dem Receiver an derselben Stelle weiter statt von vorn
- Enigma2: Sprung an die uebergebene Stelle wartet, bis der Stream spulbar ist, prueft das Ergebnis und
  wiederholt (bisher ein einziger Sprung nach 2,5 s, den viele Receiver waehrend des Ladens ignorieren)
- Android als Empfaenger: Stelle wird auch uebernommen, wenn das sendende Geraet die Filmlaenge nicht kannte
- Getestet mit simuliertem "noch nicht spulbar"/"erster Sprung ignoriert" unter Python 2 und 3
- Anleitung 1.1.131

Co-Authored-By: Claude Opus 5.5 <noreply@anthropic.com>
Claude-Session: https://claude.ai/code/session_01CaJqjA6T7wr6qkboQBX5Ep
</commit_message>
<xml_diff>
--- a/docs/PowerIPTV-Anleitung.docx
+++ b/docs/PowerIPTV-Anleitung.docx
@@ -49,7 +49,7 @@
         <w:rPr>
           <w:color w:val="666666"/>
         </w:rPr>
-        <w:t xml:space="preserve">Stand: Version 1.1.130 · Oktober 2026</w:t>
+        <w:t xml:space="preserve">Stand: Version 1.1.131 · Oktober 2026</w:t>
       </w:r>
     </w:p>
     <w:p>
@@ -6428,7 +6428,7 @@
         <w:spacing w:after="60"/>
       </w:pPr>
       <w:r>
-        <w:t xml:space="preserve">Der Film läuft dort an derselben Stelle weiter (Live TV: derselbe Sender), hier wird gestoppt.</w:t>
+        <w:t xml:space="preserve">Der Film läuft dort an derselben Stelle weiter (Live TV: derselbe Sender), hier wird gestoppt. Der Enigma2-Receiver wartet dafür, bis der Film geladen und spulbar ist, springt dann an die Stelle und prüft, ob es geklappt hat (unten erscheint „▶ Weiter ab 30:00“) – das kann ein paar Sekunden dauern.</w:t>
       </w:r>
     </w:p>
     <w:p>

</xml_diff>

<commit_message>
Enigma2: PowerIPTV direkt im Hauptmenue (WHERE_MENU), Anleitung ergaenzt
Co-Authored-By: Claude Opus 5.5 <noreply@anthropic.com>
Claude-Session: https://claude.ai/code/session_01HFuMtKL5su9iLaTUtgZAPx
</commit_message>
<xml_diff>
--- a/docs/PowerIPTV-Anleitung.docx
+++ b/docs/PowerIPTV-Anleitung.docx
@@ -49,7 +49,7 @@
         <w:rPr>
           <w:color w:val="666666"/>
         </w:rPr>
-        <w:t xml:space="preserve">Stand: Version 1.1.131 · Oktober 2026</w:t>
+        <w:t xml:space="preserve">Stand: Version 1.1.132 · Oktober 2026</w:t>
       </w:r>
     </w:p>
     <w:p>
@@ -6906,6 +6906,26 @@
       </w:pPr>
       <w:r>
         <w:t xml:space="preserve">Am Receiver: Menü → Plugins → „Lokale Erweiterungen installieren“ (je nach Image grüne/blaue Taste) und die Datei wählen. Alternativ per Telnet/SSH: opkg install /tmp/PowerIPTV-Enigma2.ipk</w:t>
+      </w:r>
+    </w:p>
+    <w:p>
+      <w:pPr>
+        <w:pBdr>
+          <w:left w:val="single" w:color="1E88B8" w:sz="18" w:space="8"/>
+        </w:pBdr>
+        <w:spacing w:after="160" w:before="80"/>
+        <w:ind w:left="240"/>
+      </w:pPr>
+      <w:r>
+        <w:rPr>
+          <w:b/>
+          <w:bCs/>
+          <w:color w:val="1E88B8"/>
+        </w:rPr>
+        <w:t xml:space="preserve">Tipp: </w:t>
+      </w:r>
+      <w:r>
+        <w:t xml:space="preserve">Nach dem Neustart der Oberfläche steht PowerIPTV direkt im Hauptmenü (MENU-Taste) – zusätzlich wie gewohnt unter Menü → Plugins.</w:t>
       </w:r>
     </w:p>
     <w:p>

</xml_diff>

<commit_message>
Enigma2: Poster-Ansicht 4 x 2 mit Info-Feld rechts wie die Detailseite der App
- 8 Poster je Seite, rechts Titel, Genre, Erscheinungsdatum, Laufzeit, Bewertung, Regie, Handlung,
  Besetzung und ggf. "Weiterschauen ab ..." (Filme ueber get_vod_info, Serien ueber get_series_info;
  erst nach kurzem Verweilen nachgeladen, Ergebnisse zwischengespeichert)
- Neuer Hintergrund bg_poster.png mit Info-Feld (tools/make_skin.py)
- Mit Python 2.7 und 3 in der Enigma2-Simulation getestet; Anleitung 1.1.133

Co-Authored-By: Claude Opus 5.5 <noreply@anthropic.com>
Claude-Session: https://claude.ai/code/session_01CaJqjA6T7wr6qkboQBX5Ep
</commit_message>
<xml_diff>
--- a/docs/PowerIPTV-Anleitung.docx
+++ b/docs/PowerIPTV-Anleitung.docx
@@ -49,7 +49,7 @@
         <w:rPr>
           <w:color w:val="666666"/>
         </w:rPr>
-        <w:t xml:space="preserve">Stand: Version 1.1.132 · Oktober 2026</w:t>
+        <w:t xml:space="preserve">Stand: Version 1.1.133 · Oktober 2026</w:t>
       </w:r>
     </w:p>
     <w:p>
@@ -6999,7 +6999,7 @@
         <w:spacing w:after="60"/>
       </w:pPr>
       <w:r>
-        <w:t xml:space="preserve">Filme und Serien erscheinen als Poster-Kacheln wie in der App (7 × 2 pro Seite, darunter Titel und Bewertung). Pfeiltasten bewegen den leuchtenden Rahmen, CH+/CH− blättern seitenweise, OK öffnet. Unten stehen Titel, Jahr, Bewertung und die Position (z. B. 8 / 4092). Umschalten auf die Liste: MENU → „Ansicht: als Liste“ oder in den Einstellungen.</w:t>
+        <w:t xml:space="preserve">Filme und Serien erscheinen als Poster-Kacheln wie in der App (4 × 2 pro Seite, darunter Titel und Bewertung). Rechts daneben stehen – wie auf der Detailseite der App – Infos zum gewählten Titel: Genre, Erscheinungsdatum, Laufzeit, Bewertung, Regie, Handlung, Besetzung und ggf. „Weiterschauen ab …“. Pfeiltasten bewegen den leuchtenden Rahmen, CH+/CH− blättern seitenweise, OK öffnet. Unten stehen Titel, Jahr, Bewertung und die Position (z. B. 8 / 4092). Umschalten auf die Liste: MENU → „Ansicht: als Liste“ oder in den Einstellungen.</w:t>
       </w:r>
     </w:p>
     <w:p>

</xml_diff>

<commit_message>
Android-Player: Vollbild-Knopf und Zwei-Finger-Zoom, schnelleres Weiterschauen
- Oben im Player (Handy/Tablet, beide Player) Vollbild-Symbol: Bild fuellt den Bildschirm (Zoom) <-> Original;
  zusaetzlich zwei Finger auseinander/zusammen. Wahl wird gemerkt
- Status-/Navigationsleiste werden nach Dialogen wieder ausgeblendet (onWindowFocusChanged)
- VLC: Weiterschauen oeffnet den Film direkt an der gemerkten Stelle (":start-time") statt erst den Anfang
  zu laden und dann zu springen; Sprung nur noch als Rueckfall
- Standard-Player: kuerzere Wartezeiten (12 s statt 60 s), damit nach laengerer Pause eingeschlafene
  Verbindungen schnell erkannt und neu aufgebaut werden
- Anleitung 1.1.135

Co-Authored-By: Claude Opus 5.5 <noreply@anthropic.com>
Claude-Session: https://claude.ai/code/session_01CaJqjA6T7wr6qkboQBX5Ep
</commit_message>
<xml_diff>
--- a/docs/PowerIPTV-Anleitung.docx
+++ b/docs/PowerIPTV-Anleitung.docx
@@ -49,7 +49,7 @@
         <w:rPr>
           <w:color w:val="666666"/>
         </w:rPr>
-        <w:t xml:space="preserve">Stand: Version 1.1.134 · Oktober 2026</w:t>
+        <w:t xml:space="preserve">Stand: Version 1.1.135 · Oktober 2026</w:t>
       </w:r>
     </w:p>
     <w:p>
@@ -1203,6 +1203,26 @@
       </w:pPr>
       <w:r>
         <w:t xml:space="preserve">Beide Player (Standard und VLC) sehen gleich aus: oben Titel und Optionen, in der Mitte die Steuerung, unten der Zeitstrahl. Die Leisten verschwinden 5 Sekunden nach der letzten Bedienung.</w:t>
+      </w:r>
+    </w:p>
+    <w:p>
+      <w:pPr>
+        <w:pBdr>
+          <w:left w:val="single" w:color="1E88B8" w:sz="18" w:space="8"/>
+        </w:pBdr>
+        <w:spacing w:after="160" w:before="80"/>
+        <w:ind w:left="240"/>
+      </w:pPr>
+      <w:r>
+        <w:rPr>
+          <w:b/>
+          <w:bCs/>
+          <w:color w:val="1E88B8"/>
+        </w:rPr>
+        <w:t xml:space="preserve">Tipp: </w:t>
+      </w:r>
+      <w:r>
+        <w:t xml:space="preserve">Vollbild (Handy/Tablet): Oben das Symbol ⛶ tippen – das Bild füllt dann den ganzen Bildschirm (oben/unten bzw. links/rechts wird etwas abgeschnitten, keine schwarzen Ränder mehr). Nochmal tippen = Original-Seitenverhältnis. Genauso geht es mit zwei Fingern: auseinanderziehen = Vollbild, zusammenziehen = Original. Die Wahl wird gemerkt. Status- und Navigationsleiste des Handys sind im Player immer ausgeblendet (Wischen vom Rand holt sie kurz zurück).</w:t>
       </w:r>
     </w:p>
     <w:tbl>

</xml_diff>

<commit_message>
iPhone/iPad: Vollbild-Knopf und Zwei-Finger-Zoom im Player (wie Android)
Oben im Player Symbol fuer Vollbild (Bildschirm fuellen) <-> Original, zusaetzlich Zwei-Finger-Geste;
Wahl wird gemerkt. Windows hatte Vollbild schon, Fernseher/Fire TV/Receiver sind immer Vollbild;
Weiterschauen oeffnet auf iOS/Windows bereits direkt an der gemerkten Stelle. Anleitung 1.1.136.

Co-Authored-By: Claude Opus 5.5 <noreply@anthropic.com>
Claude-Session: https://claude.ai/code/session_01CaJqjA6T7wr6qkboQBX5Ep
</commit_message>
<xml_diff>
--- a/docs/PowerIPTV-Anleitung.docx
+++ b/docs/PowerIPTV-Anleitung.docx
@@ -49,7 +49,7 @@
         <w:rPr>
           <w:color w:val="666666"/>
         </w:rPr>
-        <w:t xml:space="preserve">Stand: Version 1.1.135 · Oktober 2026</w:t>
+        <w:t xml:space="preserve">Stand: Version 1.1.136 · Oktober 2026</w:t>
       </w:r>
     </w:p>
     <w:p>
@@ -1222,7 +1222,7 @@
         <w:t xml:space="preserve">Tipp: </w:t>
       </w:r>
       <w:r>
-        <w:t xml:space="preserve">Vollbild (Handy/Tablet): Oben das Symbol ⛶ tippen – das Bild füllt dann den ganzen Bildschirm (oben/unten bzw. links/rechts wird etwas abgeschnitten, keine schwarzen Ränder mehr). Nochmal tippen = Original-Seitenverhältnis. Genauso geht es mit zwei Fingern: auseinanderziehen = Vollbild, zusammenziehen = Original. Die Wahl wird gemerkt. Status- und Navigationsleiste des Handys sind im Player immer ausgeblendet (Wischen vom Rand holt sie kurz zurück).</w:t>
+        <w:t xml:space="preserve">Vollbild (Android-Handy/Tablet und iPhone/iPad): Oben das Vollbild-Symbol tippen – das Bild füllt dann den ganzen Bildschirm (oben/unten bzw. links/rechts wird etwas abgeschnitten, keine schwarzen Ränder mehr). Nochmal tippen = Original-Seitenverhältnis. Genauso geht es mit zwei Fingern: auseinanderziehen = Vollbild, zusammenziehen = Original. Die Wahl wird gemerkt. Status- und Navigationsleiste des Handys sind im Player immer ausgeblendet (Wischen vom Rand holt sie kurz zurück). Windows: Vollbild-Symbol oben, Taste F oder Doppelklick; Zoom über das Zahnrad → Seitenverhältnis. Fernseher, Fire TV und Receiver zeigen immer Vollbild. Weiterschauen öffnet den Film auf allen Geräten direkt an der gemerkten Stelle.</w:t>
       </w:r>
     </w:p>
     <w:tbl>

</xml_diff>

<commit_message>
Android: Bild-in-Bild (Mini-Fenster) beim Druck auf den Kreis zuverlaessiger
- Beim Verlassen ("Kreis"/Home) wird jetzt auf allen Android-Versionen direkt ins Mini-Fenster
  geschaltet (bisher ab Android 12 nur ueber autoEnter, das manche Hersteller nicht ausloesen)
- Mini-Fenster-Einstellungen werden bei jedem Zurueckkehren in den Player gesetzt (onResume)
- Ist Bild-in-Bild fuer die App in den Android-Einstellungen ausgeschaltet, erscheint ein Hinweis
- Beide Player (Standard und VLC); Anleitung 1.1.139

Co-Authored-By: Claude Opus 5.5 <noreply@anthropic.com>
Claude-Session: https://claude.ai/code/session_01CaJqjA6T7wr6qkboQBX5Ep
</commit_message>
<xml_diff>
--- a/docs/PowerIPTV-Anleitung.docx
+++ b/docs/PowerIPTV-Anleitung.docx
@@ -49,7 +49,7 @@
         <w:rPr>
           <w:color w:val="666666"/>
         </w:rPr>
-        <w:t xml:space="preserve">Stand: Version 1.1.138 · Oktober 2026</w:t>
+        <w:t xml:space="preserve">Stand: Version 1.1.139 · Oktober 2026</w:t>
       </w:r>
     </w:p>
     <w:p>
@@ -3713,7 +3713,7 @@
                 <w:sz w:val="20"/>
                 <w:szCs w:val="20"/>
               </w:rPr>
-              <w:t xml:space="preserve">Läuft ein Film oder Sender und du drückst die Home-Taste bzw. wischst nach Hause („Kreis“), spielt das Video in einem kleinen Fenster weiter – in beiden Playern (Standard und VLC). Das Fenster lässt sich verschieben; antippen und vergrößern bringt dich zurück, ✕ beendet die Wiedergabe. Nur Handy/Tablet (Fire TV unterstützt es für fremde Apps nicht).</w:t>
+              <w:t xml:space="preserve">Läuft ein Film oder Sender und du drückst die Home-Taste bzw. wischst nach Hause („Kreis“), spielt das Video in einem kleinen Fenster weiter – in beiden Playern (Standard und VLC). Das Fenster lässt sich verschieben; antippen und vergrößern bringt dich zurück, ✕ beendet die Wiedergabe. Nur Handy/Tablet (Fire TV unterstützt es für fremde Apps nicht). Klappt es nicht, ist Bild-in-Bild für die App in Android ausgeschaltet – Portiva zeigt dann einen Hinweis: Einstellungen → Apps → PowerIPTV → Bild-in-Bild einschalten (bei Samsung: Einstellungen → Apps → ⋮ → Spezieller Zugriff → Bild-in-Bild).</w:t>
             </w:r>
           </w:p>
         </w:tc>

</xml_diff>

<commit_message>
Android Live TV: Haenger (ERROR_CODE_TIMEOUT) und stehendes Bild werden automatisch behoben
- ERROR_CODE_TIMEOUT (Standard-Player haengt intern) fiel bisher durch die Rettungsleiter und zeigte nur
  die Fehlermeldung: jetzt Player-Neustart, beim selben Sender binnen 10 Minuten erneut -> VLC
- Neuer Waechter im Standard-Player: Live-Sender puffert 15 s ohne Bild und ohne Fehler -> Rettungsleiter
  (neu verbinden, anderes Format, Ausweich-Sender), danach klarer Hinweis
- Lese-Wartezeit der Wiedergabe 20 s statt 12 s (manche Live-Sender liefern bei Last kurz keine Daten)
- Rettungsschritte in applyRescue() zusammengefasst; Anleitung 1.1.140

Co-Authored-By: Claude Opus 5.5 <noreply@anthropic.com>
Claude-Session: https://claude.ai/code/session_01CaJqjA6T7wr6qkboQBX5Ep
</commit_message>
<xml_diff>
--- a/docs/PowerIPTV-Anleitung.docx
+++ b/docs/PowerIPTV-Anleitung.docx
@@ -49,7 +49,7 @@
         <w:rPr>
           <w:color w:val="666666"/>
         </w:rPr>
-        <w:t xml:space="preserve">Stand: Version 1.1.139 · Oktober 2026</w:t>
+        <w:t xml:space="preserve">Stand: Version 1.1.140 · Oktober 2026</w:t>
       </w:r>
     </w:p>
     <w:p>
@@ -7264,7 +7264,7 @@
         <w:t xml:space="preserve">Automatische Rettung bei Abbrüchen (alle Geräte, auch Enigma2): </w:t>
       </w:r>
       <w:r>
-        <w:t xml:space="preserve">Bricht ein Stream ab oder bleibt das Bild stehen, verbindet Portiva selbst neu (Filme an derselben Stelle). Hilft das bei einem Live-Sender nicht, probiert Portiva das andere Format (TS bzw. HLS) und danach – falls in der Senderliste vorhanden – einen Ausweich-Sender gleichen Namens, z.B. „Sky Sport 1 RAW“ statt „Sky Sport 1 HD“. Unten steht jeweils kurz, was gerade passiert. Sind alle Verbindungen deines Zugangs belegt (z.B. weil auf einem anderen Gerät geschaut wird), steht das klar da: „Zugang wird gerade woanders genutzt (2/2)“ – dann liegt es nicht am Server.</w:t>
+        <w:t xml:space="preserve">Bricht ein Stream ab oder bleibt das Bild stehen (Live: nach 15 Sekunden Puffern ohne Bild), verbindet Portiva selbst neu. Hängt der Standard-Player intern („ERROR_CODE_TIMEOUT“), startet er sich neu; passiert das beim selben Sender noch einmal, übernimmt automatisch VLC (Filme an derselben Stelle). Hilft das bei einem Live-Sender nicht, probiert Portiva das andere Format (TS bzw. HLS) und danach – falls in der Senderliste vorhanden – einen Ausweich-Sender gleichen Namens, z.B. „Sky Sport 1 RAW“ statt „Sky Sport 1 HD“. Unten steht jeweils kurz, was gerade passiert. Sind alle Verbindungen deines Zugangs belegt (z.B. weil auf einem anderen Gerät geschaut wird), steht das klar da: „Zugang wird gerade woanders genutzt (2/2)“ – dann liegt es nicht am Server.</w:t>
       </w:r>
     </w:p>
     <w:p>

</xml_diff>

<commit_message>
Android Live TV: Haenger-Waechter prueft jetzt echten Fortschritt (Position + neue Bilder)
- Der Waechter aus 1.1.140 reagierte nur auf "Puffern". Haengt der Player, ohne zu puffern oder einen Fehler
  zu melden (Bild eingefroren, ggf. Ton laeuft weiter), passierte nichts. Jetzt alle 2 s: kommt 12 s lang
  weder die Position voran noch ein neues Bild -> Rettungsleiter
- Neu verbinden haelt einen "laufenden", aber haengenden Player erst an (prepare() allein wirkte dort nicht)
- Anleitung 1.1.141

Co-Authored-By: Claude Opus 5.5 <noreply@anthropic.com>
Claude-Session: https://claude.ai/code/session_01CaJqjA6T7wr6qkboQBX5Ep
</commit_message>
<xml_diff>
--- a/docs/PowerIPTV-Anleitung.docx
+++ b/docs/PowerIPTV-Anleitung.docx
@@ -49,7 +49,7 @@
         <w:rPr>
           <w:color w:val="666666"/>
         </w:rPr>
-        <w:t xml:space="preserve">Stand: Version 1.1.140 · Oktober 2026</w:t>
+        <w:t xml:space="preserve">Stand: Version 1.1.141 · Oktober 2026</w:t>
       </w:r>
     </w:p>
     <w:p>
@@ -7264,7 +7264,7 @@
         <w:t xml:space="preserve">Automatische Rettung bei Abbrüchen (alle Geräte, auch Enigma2): </w:t>
       </w:r>
       <w:r>
-        <w:t xml:space="preserve">Bricht ein Stream ab oder bleibt das Bild stehen (Live: nach 15 Sekunden Puffern ohne Bild), verbindet Portiva selbst neu. Hängt der Standard-Player intern („ERROR_CODE_TIMEOUT“), startet er sich neu; passiert das beim selben Sender noch einmal, übernimmt automatisch VLC (Filme an derselben Stelle). Hilft das bei einem Live-Sender nicht, probiert Portiva das andere Format (TS bzw. HLS) und danach – falls in der Senderliste vorhanden – einen Ausweich-Sender gleichen Namens, z.B. „Sky Sport 1 RAW“ statt „Sky Sport 1 HD“. Unten steht jeweils kurz, was gerade passiert. Sind alle Verbindungen deines Zugangs belegt (z.B. weil auf einem anderen Gerät geschaut wird), steht das klar da: „Zugang wird gerade woanders genutzt (2/2)“ – dann liegt es nicht am Server.</w:t>
+        <w:t xml:space="preserve">Bricht ein Stream ab oder bleibt das Bild stehen (Live: wenn 12 Sekunden lang kein neues Bild kommt – auch wenn der Ton weiterläuft), verbindet Portiva selbst neu. Hängt der Standard-Player intern („ERROR_CODE_TIMEOUT“), startet er sich neu; passiert das beim selben Sender noch einmal, übernimmt automatisch VLC (Filme an derselben Stelle). Hilft das bei einem Live-Sender nicht, probiert Portiva das andere Format (TS bzw. HLS) und danach – falls in der Senderliste vorhanden – einen Ausweich-Sender gleichen Namens, z.B. „Sky Sport 1 RAW“ statt „Sky Sport 1 HD“. Unten steht jeweils kurz, was gerade passiert. Sind alle Verbindungen deines Zugangs belegt (z.B. weil auf einem anderen Gerät geschaut wird), steht das klar da: „Zugang wird gerade woanders genutzt (2/2)“ – dann liegt es nicht am Server.</w:t>
       </w:r>
     </w:p>
     <w:p>

</xml_diff>

<commit_message>
Mitteilung vom Anbieter auf allen Geraeten + Portiva Link abgesichert
- Xtream user_info.message wird gelesen (HTML entfernt, gekuerzt) und beim Start
  einmalig angezeigt, wenn neu oder geaendert; danach im Konto-Bereich lesbar
  (Android, Windows, iOS, Samsung-TV/Fire TV Vega, Enigma2)
- Portiva-Link-Empfang (Android/Windows, iOS, Enigma2): nur Heimnetz-Adressen,
  keine Befehle aus Webseiten (Origin) und Schutz vor DNS-Rebinding (Host),
  Sperre nach 5 falschen Codes fuer 10 Minuten, Codevergleich in konstanter Zeit,
  nur http/https/rtsp/rtmp-Streams und begrenzte Feldlaengen, UDP-Antwort nur im Heimnetz
- Android: Zugangs-QR und Passwort-Eingabe vor Bildschirmfotos geschuetzt (FLAG_SECURE)
- Anleitung 1.1.142

Co-Authored-By: Claude Opus 5.5 <noreply@anthropic.com>
Claude-Session: https://claude.ai/code/session_01CaJqjA6T7wr6qkboQBX5Ep
</commit_message>
<xml_diff>
--- a/docs/PowerIPTV-Anleitung.docx
+++ b/docs/PowerIPTV-Anleitung.docx
@@ -49,7 +49,7 @@
         <w:rPr>
           <w:color w:val="666666"/>
         </w:rPr>
-        <w:t xml:space="preserve">Stand: Version 1.1.141 · Oktober 2026</w:t>
+        <w:t xml:space="preserve">Stand: Version 1.1.142 · Oktober 2026</w:t>
       </w:r>
     </w:p>
     <w:p>
@@ -977,6 +977,26 @@
       </w:r>
       <w:r>
         <w:t xml:space="preserve">Live TV, Filme, Serien.</w:t>
+      </w:r>
+    </w:p>
+    <w:p>
+      <w:pPr>
+        <w:pStyle w:val="ListParagraph"/>
+        <w:numPr>
+          <w:ilvl w:val="0"/>
+          <w:numId w:val="6"/>
+        </w:numPr>
+        <w:spacing w:after="60"/>
+      </w:pPr>
+      <w:r>
+        <w:rPr>
+          <w:b/>
+          <w:bCs/>
+        </w:rPr>
+        <w:t xml:space="preserve">Mitteilung vom Anbieter: </w:t>
+      </w:r>
+      <w:r>
+        <w:t xml:space="preserve">schickt dein IPTV-Anbieter eine Nachricht (z.B. Wartung, Verlängerung), erscheint sie beim Start einmal als Hinweis und bleibt danach im Konto-Bereich der Startseite lesbar (Windows: Feld „✉ Mitteilung vom Anbieter“, Samsung-TV/Fire TV: Kachel unter „Mehr“, Enigma2: in der Kopfzeile). Eine neue oder geänderte Mitteilung wird wieder einmal angezeigt. Gilt für alle Geräte.</w:t>
       </w:r>
     </w:p>
     <w:p>
@@ -6449,6 +6469,26 @@
       </w:pPr>
       <w:r>
         <w:t xml:space="preserve">Der Film läuft dort an derselben Stelle weiter (Live TV: derselbe Sender), hier wird gestoppt. Der Enigma2-Receiver wartet dafür, bis der Film geladen und spulbar ist, springt dann an die Stelle und prüft, ob es geklappt hat (unten erscheint „▶ Weiter ab 30:00“) – das kann ein paar Sekunden dauern.</w:t>
+      </w:r>
+    </w:p>
+    <w:p>
+      <w:pPr>
+        <w:pBdr>
+          <w:left w:val="single" w:color="1E88B8" w:sz="18" w:space="8"/>
+        </w:pBdr>
+        <w:spacing w:after="160" w:before="80"/>
+        <w:ind w:left="240"/>
+      </w:pPr>
+      <w:r>
+        <w:rPr>
+          <w:b/>
+          <w:bCs/>
+          <w:color w:val="1E88B8"/>
+        </w:rPr>
+        <w:t xml:space="preserve">Tipp: </w:t>
+      </w:r>
+      <w:r>
+        <w:t xml:space="preserve">Sicherheit: Portiva Link nimmt nur Anfragen aus deinem eigenen Heimnetz an (Router-Adressen wie 192.168.x.x, 10.x.x.x). Webseiten im Browser können keine Befehle schicken. Nach 5 falschen Codes ist das anfragende Gerät für 10 Minuten gesperrt („Zu viele falsche Codes“), damit niemand den Code durchprobieren kann. Angenommen werden nur echte Stream-Adressen (http/https). Der Zugangs-QR und die Passwort-Eingabe sind am Android-Gerät vor Bildschirmfotos und der Vorschau unter „Zuletzt verwendet“ geschützt.</w:t>
       </w:r>
     </w:p>
     <w:p>

</xml_diff>

<commit_message>
Einrichtungs-Code: Zugang (+ VPN) verschluesselt weitergeben – PIN, Geraetebindung, Ablaufdatum
- Neues Format PORTIVA-SETUP1 (AES-256-GCM, PBKDF2-HMAC-SHA256 aus PIN + Geraetenummer),
  gleich in Android/Windows (SetupCode.kt) und iOS (SetupCode.swift)
- Erstellen: Android, Windows, iOS (beim Zugangs-QR); Android/Windows koennen das WireGuard-VPN
  samt Kill-Switch mitgeben; Teilen/Kopieren, Gueltigkeit 24 h / 7 Tage / 30 Tage / unbegrenzt
- Einloesen: Android, Windows, iOS ("Neuer Zugang" -> Einrichtungs-Code, Zwischenablage wird erkannt)
- Receiver, Samsung-TV, Fire TV: das Handy oeffnet den Code fuer das Geraet und schickt den Zugang
  per Portiva Link; jedes Geraet hat eine Geraetenummer (Empfangs-QR, /portiva/hello)
- Portiva Link: LinkPair kann VPN-Konfiguration mitbringen (Android/Windows uebernehmen sie)
- README + Anleitung 1.1.143

Co-Authored-By: Claude Opus 5.5 <noreply@anthropic.com>
Claude-Session: https://claude.ai/code/session_01CaJqjA6T7wr6qkboQBX5Ep
</commit_message>
<xml_diff>
--- a/docs/PowerIPTV-Anleitung.docx
+++ b/docs/PowerIPTV-Anleitung.docx
@@ -49,7 +49,7 @@
         <w:rPr>
           <w:color w:val="666666"/>
         </w:rPr>
-        <w:t xml:space="preserve">Stand: Version 1.1.142 · Oktober 2026</w:t>
+        <w:t xml:space="preserve">Stand: Version 1.1.143 · Oktober 2026</w:t>
       </w:r>
     </w:p>
     <w:p>
@@ -6409,7 +6409,15 @@
         <w:spacing w:after="120" w:before="240"/>
       </w:pPr>
       <w:r>
-        <w:t xml:space="preserve">Wiedergabe an ein anderes Gerät senden</w:t>
+        <w:t xml:space="preserve">Einrichtungs-Code: Zugang an andere weitergeben</w:t>
+      </w:r>
+    </w:p>
+    <w:p>
+      <w:pPr>
+        <w:spacing w:after="120"/>
+      </w:pPr>
+      <w:r>
+        <w:t xml:space="preserve">Mit dem Einrichtungs-Code gibst du einen Zugang an Freunde oder Kunden weiter, ohne Benutzername und Passwort vorzulesen oder im Klartext zu schicken. Der Code ist verschlüsselt (AES-256), auf Wunsch mit PIN, nur für ein bestimmtes Gerät und mit Ablaufdatum. Am Handy und PC kann er zusätzlich dein VPN mitbringen.</w:t>
       </w:r>
     </w:p>
     <w:p>
@@ -6422,7 +6430,33 @@
         <w:spacing w:after="60"/>
       </w:pPr>
       <w:r>
-        <w:t xml:space="preserve">Im Player oben auf das Übertragen-Symbol (wie bei Chromecast) oder das Fernseher-Symbol „An Gerät senden“ tippen (Samsung-TV: Knopf „📲 Senden“). Das Fenster bleibt offen, bis du es schließt – auch wenn die Suche etwas dauert.</w:t>
+        <w:t xml:space="preserve">Erstellen (Android, Windows, iPhone): Benutzer wechseln → beim Zugang auf das QR-Symbol → „🔐 Einrichtungs-Code erstellen (für andere)“.</w:t>
+      </w:r>
+    </w:p>
+    <w:p>
+      <w:pPr>
+        <w:pStyle w:val="ListParagraph"/>
+        <w:numPr>
+          <w:ilvl w:val="0"/>
+          <w:numId w:val="14"/>
+        </w:numPr>
+        <w:spacing w:after="60"/>
+      </w:pPr>
+      <w:r>
+        <w:t xml:space="preserve">PIN eintragen (4–8 Ziffern, empfohlen). Optional die Gerätenummer des Empfängers – dann funktioniert der Code nur auf diesem einen Gerät. Gültigkeit wählen: 24 Stunden, 7 Tage, 30 Tage oder unbegrenzt. Am Handy/PC mit VPN: „Mein VPN mitgeben“ und auf Wunsch „Kill-Switch beim Empfänger einschalten“.</w:t>
+      </w:r>
+    </w:p>
+    <w:p>
+      <w:pPr>
+        <w:pStyle w:val="ListParagraph"/>
+        <w:numPr>
+          <w:ilvl w:val="0"/>
+          <w:numId w:val="14"/>
+        </w:numPr>
+        <w:spacing w:after="60"/>
+      </w:pPr>
+      <w:r>
+        <w:t xml:space="preserve">„Code erstellen“ → „Teilen“ (z.B. WhatsApp) oder „Kopieren“. Der QR-Code kann auch direkt vom Bildschirm gescannt werden.</w:t>
       </w:r>
     </w:p>
     <w:p>
@@ -6442,33 +6476,73 @@
         <w:t xml:space="preserve">Tipp: </w:t>
       </w:r>
       <w:r>
-        <w:t xml:space="preserve">Wird ein Gerät nicht gefunden: Alle Geräte müssen im selben Heimnetz hängen – WLAN oder LAN-Kabel ist egal. Klappt die automatische Suche trotzdem nicht, im Fenster „An Gerät senden“ unten die IP-Adresse des Geräts eingeben und „Verbinden“ drücken (Samsung-TV: „＋ Gerät per IP-Adresse …“). Das Gerät wird gemerkt und beim nächsten Mal automatisch angezeigt.</w:t>
-      </w:r>
-    </w:p>
-    <w:p>
-      <w:pPr>
-        <w:pStyle w:val="ListParagraph"/>
-        <w:numPr>
-          <w:ilvl w:val="0"/>
-          <w:numId w:val="14"/>
-        </w:numPr>
-        <w:spacing w:after="60"/>
-      </w:pPr>
-      <w:r>
-        <w:t xml:space="preserve">Unter „Portiva-Geräte“ erscheinen alle Geräte mit geöffnetem Portiva im Heimnetz (TV-Stick, Tablet, Handy, Windows-PC) → Gerät wählen. Darüber stehen wie bisher Chromecast-Geräte.</w:t>
-      </w:r>
-    </w:p>
-    <w:p>
-      <w:pPr>
-        <w:pStyle w:val="ListParagraph"/>
-        <w:numPr>
-          <w:ilvl w:val="0"/>
-          <w:numId w:val="14"/>
-        </w:numPr>
-        <w:spacing w:after="60"/>
-      </w:pPr>
-      <w:r>
-        <w:t xml:space="preserve">Der Film läuft dort an derselben Stelle weiter (Live TV: derselbe Sender), hier wird gestoppt. Der Enigma2-Receiver wartet dafür, bis der Film geladen und spulbar ist, springt dann an die Stelle und prüft, ob es geklappt hat (unten erscheint „▶ Weiter ab 30:00“) – das kann ein paar Sekunden dauern.</w:t>
+        <w:t xml:space="preserve">Die PIN NIE im selben Chat wie den Code schicken – am besten anrufen oder per SMS. Nur so schützt die PIN wirklich.</w:t>
+      </w:r>
+    </w:p>
+    <w:p>
+      <w:pPr>
+        <w:pStyle w:val="ListParagraph"/>
+        <w:numPr>
+          <w:ilvl w:val="0"/>
+          <w:numId w:val="15"/>
+        </w:numPr>
+        <w:spacing w:after="60"/>
+      </w:pPr>
+      <w:r>
+        <w:t xml:space="preserve">Einlösen am Handy, Tablet oder PC: Benutzer wechseln → Neuer Zugang → „🔐 Einrichtungs-Code einlösen“. Ein kopierter Code wird automatisch eingefügt; sonst einfügen oder „Code scannen“. PIN eingeben → „Auf diesem Gerät einrichten“. Fertig – der Zugang ist aktiv. War ein VPN dabei: Startseite → VPN → „Verbinden“ (mit Kill-Switch läuft ohne VPN nichts).</w:t>
+      </w:r>
+    </w:p>
+    <w:p>
+      <w:pPr>
+        <w:pStyle w:val="ListParagraph"/>
+        <w:numPr>
+          <w:ilvl w:val="0"/>
+          <w:numId w:val="15"/>
+        </w:numPr>
+        <w:spacing w:after="60"/>
+      </w:pPr>
+      <w:r>
+        <w:t xml:space="preserve">Einlösen für Receiver, Samsung-TV oder Fire TV (dort kann man nichts einfügen): am Gerät „Zugang vom Handy empfangen“ öffnen. Am Handy den Code wie oben öffnen → „Auf Receiver / TV einrichten“ → den QR-Code am Gerät scannen (oder IP-Adresse und Code eintragen). Das Handy prüft PIN und Gerätenummer und schickt den Zugang ans Gerät.</w:t>
+      </w:r>
+    </w:p>
+    <w:p>
+      <w:pPr>
+        <w:pStyle w:val="ListParagraph"/>
+        <w:numPr>
+          <w:ilvl w:val="0"/>
+          <w:numId w:val="6"/>
+        </w:numPr>
+        <w:spacing w:after="60"/>
+      </w:pPr>
+      <w:r>
+        <w:rPr>
+          <w:b/>
+          <w:bCs/>
+        </w:rPr>
+        <w:t xml:space="preserve">Gerätenummer: </w:t>
+      </w:r>
+      <w:r>
+        <w:t xml:space="preserve">jedes Gerät hat eine eigene, z.B. 7KQ4-M2XD. Du findest sie im Fenster „Einrichtungs-Code einlösen“ und im Fenster „Zugang empfangen“ (auch am Receiver und Samsung-TV). Nach einer Neuinstallation der App gibt es eine neue Nummer – dann einen neuen Code erstellen.</w:t>
+      </w:r>
+    </w:p>
+    <w:p>
+      <w:pPr>
+        <w:pStyle w:val="ListParagraph"/>
+        <w:numPr>
+          <w:ilvl w:val="0"/>
+          <w:numId w:val="6"/>
+        </w:numPr>
+        <w:spacing w:after="60"/>
+      </w:pPr>
+      <w:r>
+        <w:rPr>
+          <w:b/>
+          <w:bCs/>
+        </w:rPr>
+        <w:t xml:space="preserve">Meldungen: </w:t>
+      </w:r>
+      <w:r>
+        <w:t xml:space="preserve">„Die PIN ist falsch“, „für ein anderes Gerät bestimmt“, „abgelaufen – bitte einen neuen anfordern“. Ein unvollständig kopierter Code wird als „Kein gültiger Einrichtungs-Code“ erkannt.</w:t>
       </w:r>
     </w:p>
     <w:p>
@@ -6488,7 +6562,29 @@
         <w:t xml:space="preserve">Tipp: </w:t>
       </w:r>
       <w:r>
-        <w:t xml:space="preserve">Sicherheit: Portiva Link nimmt nur Anfragen aus deinem eigenen Heimnetz an (Router-Adressen wie 192.168.x.x, 10.x.x.x). Webseiten im Browser können keine Befehle schicken. Nach 5 falschen Codes ist das anfragende Gerät für 10 Minuten gesperrt („Zu viele falsche Codes“), damit niemand den Code durchprobieren kann. Angenommen werden nur echte Stream-Adressen (http/https). Der Zugangs-QR und die Passwort-Eingabe sind am Android-Gerät vor Bildschirmfotos und der Vorschau unter „Zuletzt verwendet“ geschützt.</w:t>
+        <w:t xml:space="preserve">Wichtig: Ohne PIN und ohne Gerätenummer kann jeder, der den Code bekommt, den Zugang einrichten – wie ein Schlüssel. Das Ablaufdatum prüft die Uhr des Empfänger-Geräts. Ein mitgeschicktes VPN ist DEIN VPN-Zugang: viele VPN-Anbieter erlauben pro Konfiguration nur ein Gerät gleichzeitig – für jeden Empfänger besser eine eigene .conf anlegen. Das VPN gibt es nur in der Android- und Windows-App; iPhone, Receiver und Fernseher übernehmen nur den Zugang.</w:t>
+      </w:r>
+    </w:p>
+    <w:p>
+      <w:pPr>
+        <w:pStyle w:val="Heading2"/>
+        <w:spacing w:after="120" w:before="240"/>
+      </w:pPr>
+      <w:r>
+        <w:t xml:space="preserve">Wiedergabe an ein anderes Gerät senden</w:t>
+      </w:r>
+    </w:p>
+    <w:p>
+      <w:pPr>
+        <w:pStyle w:val="ListParagraph"/>
+        <w:numPr>
+          <w:ilvl w:val="0"/>
+          <w:numId w:val="16"/>
+        </w:numPr>
+        <w:spacing w:after="60"/>
+      </w:pPr>
+      <w:r>
+        <w:t xml:space="preserve">Im Player oben auf das Übertragen-Symbol (wie bei Chromecast) oder das Fernseher-Symbol „An Gerät senden“ tippen (Samsung-TV: Knopf „📲 Senden“). Das Fenster bleibt offen, bis du es schließt – auch wenn die Suche etwas dauert.</w:t>
       </w:r>
     </w:p>
     <w:p>
@@ -6508,29 +6604,33 @@
         <w:t xml:space="preserve">Tipp: </w:t>
       </w:r>
       <w:r>
-        <w:t xml:space="preserve">Portiva muss auf dem Zielgerät geöffnet sein (Android ab Version 10 erlaubt Apps im Hintergrund nicht, sich selbst zu öffnen). Samsung-Fernseher können senden, aber nichts empfangen. Windows fragt beim ersten Mal nach der Firewall – „Zulassen“ wählen.</w:t>
-      </w:r>
-    </w:p>
-    <w:p>
-      <w:r>
-        <w:br w:type="page"/>
-      </w:r>
-    </w:p>
-    <w:p>
-      <w:pPr>
-        <w:pStyle w:val="Heading1"/>
-        <w:spacing w:after="160" w:before="360"/>
-      </w:pPr>
-      <w:r>
-        <w:t xml:space="preserve">17. PowerIPTV für iPhone &amp; iPad</w:t>
-      </w:r>
-    </w:p>
-    <w:p>
-      <w:pPr>
-        <w:spacing w:after="120"/>
-      </w:pPr>
-      <w:r>
-        <w:t xml:space="preserve">Die iOS-Version nutzt denselben Player wie Android und Windows: VLC. Damit laufen auch DTS-, AC3- und MKV-Filme. Sie kann Zugänge (auch per QR-Code), Live TV, Filme und Serien mit Sprachauswahl, Weiterschauen, Favoriten und eigene Listen (lange auf einen Sender, Film oder eine Serie drücken → „Zu Liste hinzufügen …“; verwalten unter „Favoriten &amp; Listen“ mit ＋ und ⋯), Suche, TV-Guide mit Catch-up, Player mit Helligkeit/Lautstärke, Seitenverhältnis, Geschwindigkeit, Untertiteln und Einstellungsleiste sowie „An Gerät senden“.</w:t>
+        <w:t xml:space="preserve">Wird ein Gerät nicht gefunden: Alle Geräte müssen im selben Heimnetz hängen – WLAN oder LAN-Kabel ist egal. Klappt die automatische Suche trotzdem nicht, im Fenster „An Gerät senden“ unten die IP-Adresse des Geräts eingeben und „Verbinden“ drücken (Samsung-TV: „＋ Gerät per IP-Adresse …“). Das Gerät wird gemerkt und beim nächsten Mal automatisch angezeigt.</w:t>
+      </w:r>
+    </w:p>
+    <w:p>
+      <w:pPr>
+        <w:pStyle w:val="ListParagraph"/>
+        <w:numPr>
+          <w:ilvl w:val="0"/>
+          <w:numId w:val="16"/>
+        </w:numPr>
+        <w:spacing w:after="60"/>
+      </w:pPr>
+      <w:r>
+        <w:t xml:space="preserve">Unter „Portiva-Geräte“ erscheinen alle Geräte mit geöffnetem Portiva im Heimnetz (TV-Stick, Tablet, Handy, Windows-PC) → Gerät wählen. Darüber stehen wie bisher Chromecast-Geräte.</w:t>
+      </w:r>
+    </w:p>
+    <w:p>
+      <w:pPr>
+        <w:pStyle w:val="ListParagraph"/>
+        <w:numPr>
+          <w:ilvl w:val="0"/>
+          <w:numId w:val="16"/>
+        </w:numPr>
+        <w:spacing w:after="60"/>
+      </w:pPr>
+      <w:r>
+        <w:t xml:space="preserve">Der Film läuft dort an derselben Stelle weiter (Live TV: derselbe Sender), hier wird gestoppt. Der Enigma2-Receiver wartet dafür, bis der Film geladen und spulbar ist, springt dann an die Stelle und prüft, ob es geklappt hat (unten erscheint „▶ Weiter ab 30:00“) – das kann ein paar Sekunden dauern.</w:t>
       </w:r>
     </w:p>
     <w:p>
@@ -6550,119 +6650,7 @@
         <w:t xml:space="preserve">Tipp: </w:t>
       </w:r>
       <w:r>
-        <w:t xml:space="preserve">Apple erlaubt Apps außerhalb des App Stores nur mit einer Apple-ID-Signatur. Mit einer kostenlosen Apple-ID läuft die App 7 Tage und muss dann neu aufgespielt werden (Zugänge bleiben erhalten). Mit einem Apple-Entwicklerkonto (99 €/Jahr) gilt sie 1 Jahr.</w:t>
-      </w:r>
-    </w:p>
-    <w:p>
-      <w:pPr>
-        <w:pStyle w:val="Heading2"/>
-        <w:spacing w:after="120" w:before="240"/>
-      </w:pPr>
-      <w:r>
-        <w:t xml:space="preserve">Installation mit Sideloadly (Windows oder Mac)</w:t>
-      </w:r>
-    </w:p>
-    <w:p>
-      <w:pPr>
-        <w:pStyle w:val="ListParagraph"/>
-        <w:numPr>
-          <w:ilvl w:val="0"/>
-          <w:numId w:val="15"/>
-        </w:numPr>
-        <w:spacing w:after="60"/>
-      </w:pPr>
-      <w:r>
-        <w:t xml:space="preserve">Am PC: Sideloadly von https://sideloadly.io herunterladen und installieren. Unter Windows zusätzlich iTunes und iCloud von der Apple-Webseite (nicht aus dem Microsoft Store).</w:t>
-      </w:r>
-    </w:p>
-    <w:p>
-      <w:pPr>
-        <w:pStyle w:val="ListParagraph"/>
-        <w:numPr>
-          <w:ilvl w:val="0"/>
-          <w:numId w:val="15"/>
-        </w:numPr>
-        <w:spacing w:after="60"/>
-      </w:pPr>
-      <w:r>
-        <w:t xml:space="preserve">Auf GitHub unter „Releases“ die neueste Version öffnen und „Portiva-iOS-v1.1.X.ipa“ herunterladen.</w:t>
-      </w:r>
-    </w:p>
-    <w:p>
-      <w:pPr>
-        <w:pStyle w:val="ListParagraph"/>
-        <w:numPr>
-          <w:ilvl w:val="0"/>
-          <w:numId w:val="15"/>
-        </w:numPr>
-        <w:spacing w:after="60"/>
-      </w:pPr>
-      <w:r>
-        <w:t xml:space="preserve">iPhone/iPad per Kabel anschließen, entsperren und „Vertrauen“ bestätigen.</w:t>
-      </w:r>
-    </w:p>
-    <w:p>
-      <w:pPr>
-        <w:pStyle w:val="ListParagraph"/>
-        <w:numPr>
-          <w:ilvl w:val="0"/>
-          <w:numId w:val="15"/>
-        </w:numPr>
-        <w:spacing w:after="60"/>
-      </w:pPr>
-      <w:r>
-        <w:t xml:space="preserve">Sideloadly öffnen, die .ipa hineinziehen, deine Apple-ID eintragen und „Start“ klicken.</w:t>
-      </w:r>
-    </w:p>
-    <w:p>
-      <w:pPr>
-        <w:pStyle w:val="ListParagraph"/>
-        <w:numPr>
-          <w:ilvl w:val="0"/>
-          <w:numId w:val="15"/>
-        </w:numPr>
-        <w:spacing w:after="60"/>
-      </w:pPr>
-      <w:r>
-        <w:t xml:space="preserve">Am iPhone: Einstellungen → Datenschutz &amp; Sicherheit → Entwicklermodus einschalten (iOS 16+, Neustart). Danach Einstellungen → Allgemein → VPN &amp; Geräteverwaltung → deine Apple-ID → „Vertrauen“.</w:t>
-      </w:r>
-    </w:p>
-    <w:p>
-      <w:pPr>
-        <w:pStyle w:val="ListParagraph"/>
-        <w:numPr>
-          <w:ilvl w:val="0"/>
-          <w:numId w:val="15"/>
-        </w:numPr>
-        <w:spacing w:after="60"/>
-      </w:pPr>
-      <w:r>
-        <w:t xml:space="preserve">Portiva öffnen. Beim ersten Start fragt iOS nach „Lokales Netzwerk“ – erlauben (für QR-Übertragung und „An Gerät senden“).</w:t>
-      </w:r>
-    </w:p>
-    <w:p>
-      <w:pPr>
-        <w:spacing w:after="120"/>
-      </w:pPr>
-      <w:r>
-        <w:t xml:space="preserve">Zugang am schnellsten: Benutzer wechseln → „+“ → „QR-Code scannen“ und am anderen Gerät beim Zugang auf das QR-Symbol tippen.</w:t>
-      </w:r>
-    </w:p>
-    <w:p>
-      <w:pPr>
-        <w:pStyle w:val="Heading1"/>
-        <w:spacing w:after="160" w:before="360"/>
-      </w:pPr>
-      <w:r>
-        <w:t xml:space="preserve">18. PowerIPTV für die neuen Fire TV Sticks (Vega OS)</w:t>
-      </w:r>
-    </w:p>
-    <w:p>
-      <w:pPr>
-        <w:spacing w:after="120"/>
-      </w:pPr>
-      <w:r>
-        <w:t xml:space="preserve">Amazon hat bei den neuen Sticks Android durch das eigene Betriebssystem „Vega OS“ ersetzt. Betroffen sind der Fire TV Stick 4K Select, der Fire TV Stick HD (2026), der Fire TV Stick 4K (2026) und alle kommenden Sticks. Dort laufen keine APKs und es gibt kein „Apps unbekannter Herkunft“ mehr. Deshalb gibt es eine eigene Version: „Portiva-FireTV-Vega-v1.1.X.vpkg“ (auf GitHub im Ordner „Fire TV Vega“, im Release mit „🆕 NEUE Amazon Fire TV Sticks“ gekennzeichnet).</w:t>
+        <w:t xml:space="preserve">Sicherheit: Portiva Link nimmt nur Anfragen aus deinem eigenen Heimnetz an (Router-Adressen wie 192.168.x.x, 10.x.x.x). Webseiten im Browser können keine Befehle schicken. Nach 5 falschen Codes ist das anfragende Gerät für 10 Minuten gesperrt („Zu viele falsche Codes“), damit niemand den Code durchprobieren kann. Angenommen werden nur echte Stream-Adressen (http/https). Der Zugangs-QR und die Passwort-Eingabe sind am Android-Gerät vor Bildschirmfotos und der Vorschau unter „Zuletzt verwendet“ geschützt.</w:t>
       </w:r>
     </w:p>
     <w:p>
@@ -6682,7 +6670,21 @@
         <w:t xml:space="preserve">Tipp: </w:t>
       </w:r>
       <w:r>
-        <w:t xml:space="preserve">Welcher Stick? Einstellungen → Mein Fire TV → Info. Steht dort „Fire OS“, nimm die normale APK (Kapitel 2). Steht dort „Vega OS“, nimm diese Version.</w:t>
+        <w:t xml:space="preserve">Portiva muss auf dem Zielgerät geöffnet sein (Android ab Version 10 erlaubt Apps im Hintergrund nicht, sich selbst zu öffnen). Samsung-Fernseher können senden, aber nichts empfangen. Windows fragt beim ersten Mal nach der Firewall – „Zulassen“ wählen.</w:t>
+      </w:r>
+    </w:p>
+    <w:p>
+      <w:r>
+        <w:br w:type="page"/>
+      </w:r>
+    </w:p>
+    <w:p>
+      <w:pPr>
+        <w:pStyle w:val="Heading1"/>
+        <w:spacing w:after="160" w:before="360"/>
+      </w:pPr>
+      <w:r>
+        <w:t xml:space="preserve">17. PowerIPTV für iPhone &amp; iPad</w:t>
       </w:r>
     </w:p>
     <w:p>
@@ -6690,177 +6692,7 @@
         <w:spacing w:after="120"/>
       </w:pPr>
       <w:r>
-        <w:t xml:space="preserve">Die Oberfläche ist dieselbe wie beim Samsung-Fernseher (Fernbedienung, Live-TV-Infoleiste, EPG, Favoriten, Portiva Link). Das Bild kommt vom Hardware-Player des Sticks. Aufnahmen, Downloads, VPN und Mehrfachbildschirm gibt es dort nicht.</w:t>
-      </w:r>
-    </w:p>
-    <w:p>
-      <w:pPr>
-        <w:pStyle w:val="Heading2"/>
-        <w:spacing w:after="120" w:before="240"/>
-      </w:pPr>
-      <w:r>
-        <w:t xml:space="preserve">Einmalig: Amazon-Entwicklerkonto &amp; Vega-Werkzeug</w:t>
-      </w:r>
-    </w:p>
-    <w:p>
-      <w:pPr>
-        <w:pStyle w:val="ListParagraph"/>
-        <w:numPr>
-          <w:ilvl w:val="0"/>
-          <w:numId w:val="16"/>
-        </w:numPr>
-        <w:spacing w:after="60"/>
-      </w:pPr>
-      <w:r>
-        <w:t xml:space="preserve">Kostenloses Amazon-Entwicklerkonto auf developer.amazon.com anlegen und das Appstore-Entwicklerprofil vollständig ausfüllen (ohne Bank-/Steuerdaten). Ohne vollständiges Profil klappt der Entwicklermodus nicht.</w:t>
-      </w:r>
-    </w:p>
-    <w:p>
-      <w:pPr>
-        <w:pStyle w:val="ListParagraph"/>
-        <w:numPr>
-          <w:ilvl w:val="0"/>
-          <w:numId w:val="16"/>
-        </w:numPr>
-        <w:spacing w:after="60"/>
-      </w:pPr>
-      <w:r>
-        <w:t xml:space="preserve">Am PC (Windows mit WSL/Ubuntu, Linux oder Mac) das Vega-Werkzeug installieren: curl -fsSL https://sdk-installer.vega.labcollab.net/get_vvm.sh | bash und danach source ~/vega/env.</w:t>
-      </w:r>
-    </w:p>
-    <w:p>
-      <w:pPr>
-        <w:pStyle w:val="ListParagraph"/>
-        <w:numPr>
-          <w:ilvl w:val="0"/>
-          <w:numId w:val="16"/>
-        </w:numPr>
-        <w:spacing w:after="60"/>
-      </w:pPr>
-      <w:r>
-        <w:t xml:space="preserve">Anmelden: vega devmode login → den angezeigten Code auf amazon.com/code bestätigen.</w:t>
-      </w:r>
-    </w:p>
-    <w:p>
-      <w:pPr>
-        <w:pStyle w:val="Heading2"/>
-        <w:spacing w:after="120" w:before="240"/>
-      </w:pPr>
-      <w:r>
-        <w:t xml:space="preserve">Entwicklermodus am Stick einschalten</w:t>
-      </w:r>
-    </w:p>
-    <w:p>
-      <w:pPr>
-        <w:pStyle w:val="ListParagraph"/>
-        <w:numPr>
-          <w:ilvl w:val="0"/>
-          <w:numId w:val="17"/>
-        </w:numPr>
-        <w:spacing w:after="60"/>
-      </w:pPr>
-      <w:r>
-        <w:t xml:space="preserve">Am Stick: Einstellungen → Mein Fire TV → Info → 7-mal auf den Gerätenamen drücken („Du bist jetzt Entwickler“).</w:t>
-      </w:r>
-    </w:p>
-    <w:p>
-      <w:pPr>
-        <w:pStyle w:val="ListParagraph"/>
-        <w:numPr>
-          <w:ilvl w:val="0"/>
-          <w:numId w:val="17"/>
-        </w:numPr>
-        <w:spacing w:after="60"/>
-      </w:pPr>
-      <w:r>
-        <w:t xml:space="preserve">Zurück → Entwickleroptionen → Entwicklermodus → Weiter. Der Fernseher zeigt einen 6-stelligen Code (gilt ca. 5 Minuten).</w:t>
-      </w:r>
-    </w:p>
-    <w:p>
-      <w:pPr>
-        <w:pStyle w:val="ListParagraph"/>
-        <w:numPr>
-          <w:ilvl w:val="0"/>
-          <w:numId w:val="17"/>
-        </w:numPr>
-        <w:spacing w:after="60"/>
-      </w:pPr>
-      <w:r>
-        <w:t xml:space="preserve">Am PC: vega devmode enable-device --code &lt;Code&gt;. Der Stick startet neu.</w:t>
-      </w:r>
-    </w:p>
-    <w:p>
-      <w:pPr>
-        <w:pStyle w:val="ListParagraph"/>
-        <w:numPr>
-          <w:ilvl w:val="0"/>
-          <w:numId w:val="17"/>
-        </w:numPr>
-        <w:spacing w:after="60"/>
-      </w:pPr>
-      <w:r>
-        <w:t xml:space="preserve">Entwickleroptionen → Verbindungsart „Netzwerk“ wählen (oder per USB-Kabel verbinden). Prüfen mit: vega device list (zeigt die Seriennummer).</w:t>
-      </w:r>
-    </w:p>
-    <w:p>
-      <w:pPr>
-        <w:pStyle w:val="Heading2"/>
-        <w:spacing w:after="120" w:before="240"/>
-      </w:pPr>
-      <w:r>
-        <w:t xml:space="preserve">Portiva installieren &amp; aktualisieren</w:t>
-      </w:r>
-    </w:p>
-    <w:p>
-      <w:pPr>
-        <w:pStyle w:val="ListParagraph"/>
-        <w:numPr>
-          <w:ilvl w:val="0"/>
-          <w:numId w:val="18"/>
-        </w:numPr>
-        <w:spacing w:after="60"/>
-      </w:pPr>
-      <w:r>
-        <w:t xml:space="preserve">Auf GitHub unter „Releases“ die Datei „Portiva-FireTV-Vega-v1.1.X.vpkg“ herunterladen.</w:t>
-      </w:r>
-    </w:p>
-    <w:p>
-      <w:pPr>
-        <w:pStyle w:val="ListParagraph"/>
-        <w:numPr>
-          <w:ilvl w:val="0"/>
-          <w:numId w:val="18"/>
-        </w:numPr>
-        <w:spacing w:after="60"/>
-      </w:pPr>
-      <w:r>
-        <w:t xml:space="preserve">Installieren: vega device -d &lt;Seriennummer&gt; install-app --packagePath Portiva-FireTV-Vega-v1.1.X.vpkg</w:t>
-      </w:r>
-    </w:p>
-    <w:p>
-      <w:pPr>
-        <w:pStyle w:val="ListParagraph"/>
-        <w:numPr>
-          <w:ilvl w:val="0"/>
-          <w:numId w:val="18"/>
-        </w:numPr>
-        <w:spacing w:after="60"/>
-      </w:pPr>
-      <w:r>
-        <w:t xml:space="preserve">Starten: über die Kachel „Portiva“ bei den Apps (ggf. nach einem Neustart) oder vega device -d &lt;Seriennummer&gt; launch-app --appName app.portiva.firetv.main</w:t>
-      </w:r>
-    </w:p>
-    <w:p>
-      <w:pPr>
-        <w:pStyle w:val="ListParagraph"/>
-        <w:numPr>
-          <w:ilvl w:val="0"/>
-          <w:numId w:val="18"/>
-        </w:numPr>
-        <w:spacing w:after="60"/>
-      </w:pPr>
-      <w:r>
-        <w:t xml:space="preserve">Zugang am bequemsten per „Vom Handy empfangen“ einrichten (Kapitel 16).</w:t>
+        <w:t xml:space="preserve">Die iOS-Version nutzt denselben Player wie Android und Windows: VLC. Damit laufen auch DTS-, AC3- und MKV-Filme. Sie kann Zugänge (auch per QR-Code), Live TV, Filme und Serien mit Sprachauswahl, Weiterschauen, Favoriten und eigene Listen (lange auf einen Sender, Film oder eine Serie drücken → „Zu Liste hinzufügen …“; verwalten unter „Favoriten &amp; Listen“ mit ＋ und ⋯), Suche, TV-Guide mit Catch-up, Player mit Helligkeit/Lautstärke, Seitenverhältnis, Geschwindigkeit, Untertiteln und Einstellungsleiste sowie „An Gerät senden“.</w:t>
       </w:r>
     </w:p>
     <w:p>
@@ -6880,7 +6712,119 @@
         <w:t xml:space="preserve">Tipp: </w:t>
       </w:r>
       <w:r>
-        <w:t xml:space="preserve">Updates genauso installieren – Zugänge und Favoriten bleiben erhalten. Die App zeigt unter „Update“, wenn es eine neue Version gibt.</w:t>
+        <w:t xml:space="preserve">Apple erlaubt Apps außerhalb des App Stores nur mit einer Apple-ID-Signatur. Mit einer kostenlosen Apple-ID läuft die App 7 Tage und muss dann neu aufgespielt werden (Zugänge bleiben erhalten). Mit einem Apple-Entwicklerkonto (99 €/Jahr) gilt sie 1 Jahr.</w:t>
+      </w:r>
+    </w:p>
+    <w:p>
+      <w:pPr>
+        <w:pStyle w:val="Heading2"/>
+        <w:spacing w:after="120" w:before="240"/>
+      </w:pPr>
+      <w:r>
+        <w:t xml:space="preserve">Installation mit Sideloadly (Windows oder Mac)</w:t>
+      </w:r>
+    </w:p>
+    <w:p>
+      <w:pPr>
+        <w:pStyle w:val="ListParagraph"/>
+        <w:numPr>
+          <w:ilvl w:val="0"/>
+          <w:numId w:val="17"/>
+        </w:numPr>
+        <w:spacing w:after="60"/>
+      </w:pPr>
+      <w:r>
+        <w:t xml:space="preserve">Am PC: Sideloadly von https://sideloadly.io herunterladen und installieren. Unter Windows zusätzlich iTunes und iCloud von der Apple-Webseite (nicht aus dem Microsoft Store).</w:t>
+      </w:r>
+    </w:p>
+    <w:p>
+      <w:pPr>
+        <w:pStyle w:val="ListParagraph"/>
+        <w:numPr>
+          <w:ilvl w:val="0"/>
+          <w:numId w:val="17"/>
+        </w:numPr>
+        <w:spacing w:after="60"/>
+      </w:pPr>
+      <w:r>
+        <w:t xml:space="preserve">Auf GitHub unter „Releases“ die neueste Version öffnen und „Portiva-iOS-v1.1.X.ipa“ herunterladen.</w:t>
+      </w:r>
+    </w:p>
+    <w:p>
+      <w:pPr>
+        <w:pStyle w:val="ListParagraph"/>
+        <w:numPr>
+          <w:ilvl w:val="0"/>
+          <w:numId w:val="17"/>
+        </w:numPr>
+        <w:spacing w:after="60"/>
+      </w:pPr>
+      <w:r>
+        <w:t xml:space="preserve">iPhone/iPad per Kabel anschließen, entsperren und „Vertrauen“ bestätigen.</w:t>
+      </w:r>
+    </w:p>
+    <w:p>
+      <w:pPr>
+        <w:pStyle w:val="ListParagraph"/>
+        <w:numPr>
+          <w:ilvl w:val="0"/>
+          <w:numId w:val="17"/>
+        </w:numPr>
+        <w:spacing w:after="60"/>
+      </w:pPr>
+      <w:r>
+        <w:t xml:space="preserve">Sideloadly öffnen, die .ipa hineinziehen, deine Apple-ID eintragen und „Start“ klicken.</w:t>
+      </w:r>
+    </w:p>
+    <w:p>
+      <w:pPr>
+        <w:pStyle w:val="ListParagraph"/>
+        <w:numPr>
+          <w:ilvl w:val="0"/>
+          <w:numId w:val="17"/>
+        </w:numPr>
+        <w:spacing w:after="60"/>
+      </w:pPr>
+      <w:r>
+        <w:t xml:space="preserve">Am iPhone: Einstellungen → Datenschutz &amp; Sicherheit → Entwicklermodus einschalten (iOS 16+, Neustart). Danach Einstellungen → Allgemein → VPN &amp; Geräteverwaltung → deine Apple-ID → „Vertrauen“.</w:t>
+      </w:r>
+    </w:p>
+    <w:p>
+      <w:pPr>
+        <w:pStyle w:val="ListParagraph"/>
+        <w:numPr>
+          <w:ilvl w:val="0"/>
+          <w:numId w:val="17"/>
+        </w:numPr>
+        <w:spacing w:after="60"/>
+      </w:pPr>
+      <w:r>
+        <w:t xml:space="preserve">Portiva öffnen. Beim ersten Start fragt iOS nach „Lokales Netzwerk“ – erlauben (für QR-Übertragung und „An Gerät senden“).</w:t>
+      </w:r>
+    </w:p>
+    <w:p>
+      <w:pPr>
+        <w:spacing w:after="120"/>
+      </w:pPr>
+      <w:r>
+        <w:t xml:space="preserve">Zugang am schnellsten: Benutzer wechseln → „+“ → „QR-Code scannen“ und am anderen Gerät beim Zugang auf das QR-Symbol tippen.</w:t>
+      </w:r>
+    </w:p>
+    <w:p>
+      <w:pPr>
+        <w:pStyle w:val="Heading1"/>
+        <w:spacing w:after="160" w:before="360"/>
+      </w:pPr>
+      <w:r>
+        <w:t xml:space="preserve">18. PowerIPTV für die neuen Fire TV Sticks (Vega OS)</w:t>
+      </w:r>
+    </w:p>
+    <w:p>
+      <w:pPr>
+        <w:spacing w:after="120"/>
+      </w:pPr>
+      <w:r>
+        <w:t xml:space="preserve">Amazon hat bei den neuen Sticks Android durch das eigene Betriebssystem „Vega OS“ ersetzt. Betroffen sind der Fire TV Stick 4K Select, der Fire TV Stick HD (2026), der Fire TV Stick 4K (2026) und alle kommenden Sticks. Dort laufen keine APKs und es gibt kein „Apps unbekannter Herkunft“ mehr. Deshalb gibt es eine eigene Version: „Portiva-FireTV-Vega-v1.1.X.vpkg“ (auf GitHub im Ordner „Fire TV Vega“, im Release mit „🆕 NEUE Amazon Fire TV Sticks“ gekennzeichnet).</w:t>
       </w:r>
     </w:p>
     <w:p>
@@ -6900,16 +6844,7 @@
         <w:t xml:space="preserve">Tipp: </w:t>
       </w:r>
       <w:r>
-        <w:t xml:space="preserve">Hinweis: Diese Version ist neu und noch nicht auf jedem Stick erprobt. Klappt ein Sender oder Film nicht, im Anbieter-Portal bzw. in den Einstellungen das Live-Format „HLS (m3u8)“ wählen; MKV-Filme mit DTS-Ton spielen die neuen Sticks evtl. ohne Ton ab.</w:t>
-      </w:r>
-    </w:p>
-    <w:p>
-      <w:pPr>
-        <w:pStyle w:val="Heading1"/>
-        <w:spacing w:after="160" w:before="360"/>
-      </w:pPr>
-      <w:r>
-        <w:t xml:space="preserve">19. PowerIPTV für Enigma2-Receiver (.ipk)</w:t>
+        <w:t xml:space="preserve">Welcher Stick? Einstellungen → Mein Fire TV → Info. Steht dort „Fire OS“, nimm die normale APK (Kapitel 2). Steht dort „Vega OS“, nimm diese Version.</w:t>
       </w:r>
     </w:p>
     <w:p>
@@ -6917,7 +6852,7 @@
         <w:spacing w:after="120"/>
       </w:pPr>
       <w:r>
-        <w:t xml:space="preserve">Für Sat-/Kabel-Receiver mit Enigma2 (z. B. VU+, Dreambox, Gigablue, Octagon, Zgemma mit OpenATV, OpenPLi oder VTi) gibt es PowerIPTV als Plugin: Datei „PowerIPTV-Enigma2.ipk“ im Release (Quellcode im Ordner „Enigma IPK“).</w:t>
+        <w:t xml:space="preserve">Die Oberfläche ist dieselbe wie beim Samsung-Fernseher (Fernbedienung, Live-TV-Infoleiste, EPG, Favoriten, Portiva Link). Das Bild kommt vom Hardware-Player des Sticks. Aufnahmen, Downloads, VPN und Mehrfachbildschirm gibt es dort nicht.</w:t>
       </w:r>
     </w:p>
     <w:p>
@@ -6926,7 +6861,55 @@
         <w:spacing w:after="120" w:before="240"/>
       </w:pPr>
       <w:r>
-        <w:t xml:space="preserve">Installieren</w:t>
+        <w:t xml:space="preserve">Einmalig: Amazon-Entwicklerkonto &amp; Vega-Werkzeug</w:t>
+      </w:r>
+    </w:p>
+    <w:p>
+      <w:pPr>
+        <w:pStyle w:val="ListParagraph"/>
+        <w:numPr>
+          <w:ilvl w:val="0"/>
+          <w:numId w:val="18"/>
+        </w:numPr>
+        <w:spacing w:after="60"/>
+      </w:pPr>
+      <w:r>
+        <w:t xml:space="preserve">Kostenloses Amazon-Entwicklerkonto auf developer.amazon.com anlegen und das Appstore-Entwicklerprofil vollständig ausfüllen (ohne Bank-/Steuerdaten). Ohne vollständiges Profil klappt der Entwicklermodus nicht.</w:t>
+      </w:r>
+    </w:p>
+    <w:p>
+      <w:pPr>
+        <w:pStyle w:val="ListParagraph"/>
+        <w:numPr>
+          <w:ilvl w:val="0"/>
+          <w:numId w:val="18"/>
+        </w:numPr>
+        <w:spacing w:after="60"/>
+      </w:pPr>
+      <w:r>
+        <w:t xml:space="preserve">Am PC (Windows mit WSL/Ubuntu, Linux oder Mac) das Vega-Werkzeug installieren: curl -fsSL https://sdk-installer.vega.labcollab.net/get_vvm.sh | bash und danach source ~/vega/env.</w:t>
+      </w:r>
+    </w:p>
+    <w:p>
+      <w:pPr>
+        <w:pStyle w:val="ListParagraph"/>
+        <w:numPr>
+          <w:ilvl w:val="0"/>
+          <w:numId w:val="18"/>
+        </w:numPr>
+        <w:spacing w:after="60"/>
+      </w:pPr>
+      <w:r>
+        <w:t xml:space="preserve">Anmelden: vega devmode login → den angezeigten Code auf amazon.com/code bestätigen.</w:t>
+      </w:r>
+    </w:p>
+    <w:p>
+      <w:pPr>
+        <w:pStyle w:val="Heading2"/>
+        <w:spacing w:after="120" w:before="240"/>
+      </w:pPr>
+      <w:r>
+        <w:t xml:space="preserve">Entwicklermodus am Stick einschalten</w:t>
       </w:r>
     </w:p>
     <w:p>
@@ -6939,7 +6922,7 @@
         <w:spacing w:after="60"/>
       </w:pPr>
       <w:r>
-        <w:t xml:space="preserve">Die Datei „PowerIPTV-Enigma2.ipk“ am PC herunterladen.</w:t>
+        <w:t xml:space="preserve">Am Stick: Einstellungen → Mein Fire TV → Info → 7-mal auf den Gerätenamen drücken („Du bist jetzt Entwickler“).</w:t>
       </w:r>
     </w:p>
     <w:p>
@@ -6952,7 +6935,7 @@
         <w:spacing w:after="60"/>
       </w:pPr>
       <w:r>
-        <w:t xml:space="preserve">Mit einem FTP-Programm (z. B. FileZilla; Adresse = IP des Receivers, Benutzer „root“, Passwort meist leer oder das des Images) in den Ordner /tmp des Receivers kopieren.</w:t>
+        <w:t xml:space="preserve">Zurück → Entwickleroptionen → Entwicklermodus → Weiter. Der Fernseher zeigt einen 6-stelligen Code (gilt ca. 5 Minuten).</w:t>
       </w:r>
     </w:p>
     <w:p>
@@ -6965,7 +6948,81 @@
         <w:spacing w:after="60"/>
       </w:pPr>
       <w:r>
-        <w:t xml:space="preserve">Am Receiver: Menü → Plugins → „Lokale Erweiterungen installieren“ (je nach Image grüne/blaue Taste) und die Datei wählen. Alternativ per Telnet/SSH: opkg install /tmp/PowerIPTV-Enigma2.ipk</w:t>
+        <w:t xml:space="preserve">Am PC: vega devmode enable-device --code &lt;Code&gt;. Der Stick startet neu.</w:t>
+      </w:r>
+    </w:p>
+    <w:p>
+      <w:pPr>
+        <w:pStyle w:val="ListParagraph"/>
+        <w:numPr>
+          <w:ilvl w:val="0"/>
+          <w:numId w:val="19"/>
+        </w:numPr>
+        <w:spacing w:after="60"/>
+      </w:pPr>
+      <w:r>
+        <w:t xml:space="preserve">Entwickleroptionen → Verbindungsart „Netzwerk“ wählen (oder per USB-Kabel verbinden). Prüfen mit: vega device list (zeigt die Seriennummer).</w:t>
+      </w:r>
+    </w:p>
+    <w:p>
+      <w:pPr>
+        <w:pStyle w:val="Heading2"/>
+        <w:spacing w:after="120" w:before="240"/>
+      </w:pPr>
+      <w:r>
+        <w:t xml:space="preserve">Portiva installieren &amp; aktualisieren</w:t>
+      </w:r>
+    </w:p>
+    <w:p>
+      <w:pPr>
+        <w:pStyle w:val="ListParagraph"/>
+        <w:numPr>
+          <w:ilvl w:val="0"/>
+          <w:numId w:val="20"/>
+        </w:numPr>
+        <w:spacing w:after="60"/>
+      </w:pPr>
+      <w:r>
+        <w:t xml:space="preserve">Auf GitHub unter „Releases“ die Datei „Portiva-FireTV-Vega-v1.1.X.vpkg“ herunterladen.</w:t>
+      </w:r>
+    </w:p>
+    <w:p>
+      <w:pPr>
+        <w:pStyle w:val="ListParagraph"/>
+        <w:numPr>
+          <w:ilvl w:val="0"/>
+          <w:numId w:val="20"/>
+        </w:numPr>
+        <w:spacing w:after="60"/>
+      </w:pPr>
+      <w:r>
+        <w:t xml:space="preserve">Installieren: vega device -d &lt;Seriennummer&gt; install-app --packagePath Portiva-FireTV-Vega-v1.1.X.vpkg</w:t>
+      </w:r>
+    </w:p>
+    <w:p>
+      <w:pPr>
+        <w:pStyle w:val="ListParagraph"/>
+        <w:numPr>
+          <w:ilvl w:val="0"/>
+          <w:numId w:val="20"/>
+        </w:numPr>
+        <w:spacing w:after="60"/>
+      </w:pPr>
+      <w:r>
+        <w:t xml:space="preserve">Starten: über die Kachel „Portiva“ bei den Apps (ggf. nach einem Neustart) oder vega device -d &lt;Seriennummer&gt; launch-app --appName app.portiva.firetv.main</w:t>
+      </w:r>
+    </w:p>
+    <w:p>
+      <w:pPr>
+        <w:pStyle w:val="ListParagraph"/>
+        <w:numPr>
+          <w:ilvl w:val="0"/>
+          <w:numId w:val="20"/>
+        </w:numPr>
+        <w:spacing w:after="60"/>
+      </w:pPr>
+      <w:r>
+        <w:t xml:space="preserve">Zugang am bequemsten per „Vom Handy empfangen“ einrichten (Kapitel 16).</w:t>
       </w:r>
     </w:p>
     <w:p>
@@ -6985,6 +7042,111 @@
         <w:t xml:space="preserve">Tipp: </w:t>
       </w:r>
       <w:r>
+        <w:t xml:space="preserve">Updates genauso installieren – Zugänge und Favoriten bleiben erhalten. Die App zeigt unter „Update“, wenn es eine neue Version gibt.</w:t>
+      </w:r>
+    </w:p>
+    <w:p>
+      <w:pPr>
+        <w:pBdr>
+          <w:left w:val="single" w:color="1E88B8" w:sz="18" w:space="8"/>
+        </w:pBdr>
+        <w:spacing w:after="160" w:before="80"/>
+        <w:ind w:left="240"/>
+      </w:pPr>
+      <w:r>
+        <w:rPr>
+          <w:b/>
+          <w:bCs/>
+          <w:color w:val="1E88B8"/>
+        </w:rPr>
+        <w:t xml:space="preserve">Tipp: </w:t>
+      </w:r>
+      <w:r>
+        <w:t xml:space="preserve">Hinweis: Diese Version ist neu und noch nicht auf jedem Stick erprobt. Klappt ein Sender oder Film nicht, im Anbieter-Portal bzw. in den Einstellungen das Live-Format „HLS (m3u8)“ wählen; MKV-Filme mit DTS-Ton spielen die neuen Sticks evtl. ohne Ton ab.</w:t>
+      </w:r>
+    </w:p>
+    <w:p>
+      <w:pPr>
+        <w:pStyle w:val="Heading1"/>
+        <w:spacing w:after="160" w:before="360"/>
+      </w:pPr>
+      <w:r>
+        <w:t xml:space="preserve">19. PowerIPTV für Enigma2-Receiver (.ipk)</w:t>
+      </w:r>
+    </w:p>
+    <w:p>
+      <w:pPr>
+        <w:spacing w:after="120"/>
+      </w:pPr>
+      <w:r>
+        <w:t xml:space="preserve">Für Sat-/Kabel-Receiver mit Enigma2 (z. B. VU+, Dreambox, Gigablue, Octagon, Zgemma mit OpenATV, OpenPLi oder VTi) gibt es PowerIPTV als Plugin: Datei „PowerIPTV-Enigma2.ipk“ im Release (Quellcode im Ordner „Enigma IPK“).</w:t>
+      </w:r>
+    </w:p>
+    <w:p>
+      <w:pPr>
+        <w:pStyle w:val="Heading2"/>
+        <w:spacing w:after="120" w:before="240"/>
+      </w:pPr>
+      <w:r>
+        <w:t xml:space="preserve">Installieren</w:t>
+      </w:r>
+    </w:p>
+    <w:p>
+      <w:pPr>
+        <w:pStyle w:val="ListParagraph"/>
+        <w:numPr>
+          <w:ilvl w:val="0"/>
+          <w:numId w:val="21"/>
+        </w:numPr>
+        <w:spacing w:after="60"/>
+      </w:pPr>
+      <w:r>
+        <w:t xml:space="preserve">Die Datei „PowerIPTV-Enigma2.ipk“ am PC herunterladen.</w:t>
+      </w:r>
+    </w:p>
+    <w:p>
+      <w:pPr>
+        <w:pStyle w:val="ListParagraph"/>
+        <w:numPr>
+          <w:ilvl w:val="0"/>
+          <w:numId w:val="21"/>
+        </w:numPr>
+        <w:spacing w:after="60"/>
+      </w:pPr>
+      <w:r>
+        <w:t xml:space="preserve">Mit einem FTP-Programm (z. B. FileZilla; Adresse = IP des Receivers, Benutzer „root“, Passwort meist leer oder das des Images) in den Ordner /tmp des Receivers kopieren.</w:t>
+      </w:r>
+    </w:p>
+    <w:p>
+      <w:pPr>
+        <w:pStyle w:val="ListParagraph"/>
+        <w:numPr>
+          <w:ilvl w:val="0"/>
+          <w:numId w:val="21"/>
+        </w:numPr>
+        <w:spacing w:after="60"/>
+      </w:pPr>
+      <w:r>
+        <w:t xml:space="preserve">Am Receiver: Menü → Plugins → „Lokale Erweiterungen installieren“ (je nach Image grüne/blaue Taste) und die Datei wählen. Alternativ per Telnet/SSH: opkg install /tmp/PowerIPTV-Enigma2.ipk</w:t>
+      </w:r>
+    </w:p>
+    <w:p>
+      <w:pPr>
+        <w:pBdr>
+          <w:left w:val="single" w:color="1E88B8" w:sz="18" w:space="8"/>
+        </w:pBdr>
+        <w:spacing w:after="160" w:before="80"/>
+        <w:ind w:left="240"/>
+      </w:pPr>
+      <w:r>
+        <w:rPr>
+          <w:b/>
+          <w:bCs/>
+          <w:color w:val="1E88B8"/>
+        </w:rPr>
+        <w:t xml:space="preserve">Tipp: </w:t>
+      </w:r>
+      <w:r>
         <w:t xml:space="preserve">Nach dem Neustart der Oberfläche steht PowerIPTV direkt im Hauptmenü (MENU-Taste) – zusätzlich wie gewohnt unter Menü → Plugins.</w:t>
       </w:r>
     </w:p>
@@ -6993,7 +7155,7 @@
         <w:pStyle w:val="ListParagraph"/>
         <w:numPr>
           <w:ilvl w:val="0"/>
-          <w:numId w:val="19"/>
+          <w:numId w:val="21"/>
         </w:numPr>
         <w:spacing w:after="60"/>
       </w:pPr>
@@ -7006,7 +7168,7 @@
         <w:pStyle w:val="ListParagraph"/>
         <w:numPr>
           <w:ilvl w:val="0"/>
-          <w:numId w:val="19"/>
+          <w:numId w:val="21"/>
         </w:numPr>
         <w:spacing w:after="60"/>
       </w:pPr>
@@ -7824,6 +7986,30 @@
     </w:lvl>
   </w:abstractNum>
   <w:abstractNum w:abstractNumId="20" w15:restartNumberingAfterBreak="0">
+    <w:multiLevelType w:val="hybridMultilevel"/>
+    <w:lvl w:ilvl="0" w15:tentative="1">
+      <w:start w:val="1"/>
+      <w:numFmt w:val="decimal"/>
+      <w:lvlText w:val="%1."/>
+      <w:lvlJc w:val="left"/>
+      <w:pPr>
+        <w:ind w:left="540" w:hanging="270"/>
+      </w:pPr>
+    </w:lvl>
+  </w:abstractNum>
+  <w:abstractNum w:abstractNumId="21" w15:restartNumberingAfterBreak="0">
+    <w:multiLevelType w:val="hybridMultilevel"/>
+    <w:lvl w:ilvl="0" w15:tentative="1">
+      <w:start w:val="1"/>
+      <w:numFmt w:val="decimal"/>
+      <w:lvlText w:val="%1."/>
+      <w:lvlJc w:val="left"/>
+      <w:pPr>
+        <w:ind w:left="540" w:hanging="270"/>
+      </w:pPr>
+    </w:lvl>
+  </w:abstractNum>
+  <w:abstractNum w:abstractNumId="22" w15:restartNumberingAfterBreak="0">
     <w:multiLevelType w:val="hybridMultilevel"/>
     <w:lvl w:ilvl="0" w15:tentative="1">
       <w:start w:val="1"/>
@@ -7914,36 +8100,48 @@
     </w:lvlOverride>
   </w:num>
   <w:num w:numId="14">
+    <w:abstractNumId w:val="20"/>
+    <w:lvlOverride w:ilvl="0">
+      <w:startOverride w:val="1"/>
+    </w:lvlOverride>
+  </w:num>
+  <w:num w:numId="15">
+    <w:abstractNumId w:val="21"/>
+    <w:lvlOverride w:ilvl="0">
+      <w:startOverride w:val="1"/>
+    </w:lvlOverride>
+  </w:num>
+  <w:num w:numId="16">
     <w:abstractNumId w:val="14"/>
     <w:lvlOverride w:ilvl="0">
       <w:startOverride w:val="1"/>
     </w:lvlOverride>
   </w:num>
-  <w:num w:numId="15">
+  <w:num w:numId="17">
     <w:abstractNumId w:val="15"/>
     <w:lvlOverride w:ilvl="0">
       <w:startOverride w:val="1"/>
     </w:lvlOverride>
   </w:num>
-  <w:num w:numId="16">
+  <w:num w:numId="18">
     <w:abstractNumId w:val="16"/>
     <w:lvlOverride w:ilvl="0">
       <w:startOverride w:val="1"/>
     </w:lvlOverride>
   </w:num>
-  <w:num w:numId="17">
+  <w:num w:numId="19">
     <w:abstractNumId w:val="17"/>
     <w:lvlOverride w:ilvl="0">
       <w:startOverride w:val="1"/>
     </w:lvlOverride>
   </w:num>
-  <w:num w:numId="18">
+  <w:num w:numId="20">
     <w:abstractNumId w:val="18"/>
     <w:lvlOverride w:ilvl="0">
       <w:startOverride w:val="1"/>
     </w:lvlOverride>
   </w:num>
-  <w:num w:numId="19">
+  <w:num w:numId="21">
     <w:abstractNumId w:val="19"/>
     <w:lvlOverride w:ilvl="0">
       <w:startOverride w:val="1"/>

</xml_diff>

<commit_message>
Einrichtungs-Code wieder entfernt (wird nicht gebraucht)
- Revert von ad98e80: Erstellen/Einloesen, Geraetenummer und VPN-Feld im Portiva Link entfernt
  (alle Geraete). Grund: es werden keine Zugaenge an andere verschickt; eine Funktion zum
  Verteilen von IPTV-Zugaengen waere zudem bei der Play-Store-Pruefung eher hinderlich.
- Empfangs-QR mit 4. Teil (Geraete auf 1.1.143) wird am Handy weiter erkannt
- README: Sicherheit, Mitteilung vom Anbieter und Portiva Link bleiben beschrieben
- Anleitung 1.1.144

Co-Authored-By: Claude Opus 5.5 <noreply@anthropic.com>
Claude-Session: https://claude.ai/code/session_01CaJqjA6T7wr6qkboQBX5Ep
</commit_message>
<xml_diff>
--- a/docs/PowerIPTV-Anleitung.docx
+++ b/docs/PowerIPTV-Anleitung.docx
@@ -49,7 +49,7 @@
         <w:rPr>
           <w:color w:val="666666"/>
         </w:rPr>
-        <w:t xml:space="preserve">Stand: Version 1.1.143 · Oktober 2026</w:t>
+        <w:t xml:space="preserve">Stand: Version 1.1.144 · Oktober 2026</w:t>
       </w:r>
     </w:p>
     <w:p>
@@ -6409,15 +6409,7 @@
         <w:spacing w:after="120" w:before="240"/>
       </w:pPr>
       <w:r>
-        <w:t xml:space="preserve">Einrichtungs-Code: Zugang an andere weitergeben</w:t>
-      </w:r>
-    </w:p>
-    <w:p>
-      <w:pPr>
-        <w:spacing w:after="120"/>
-      </w:pPr>
-      <w:r>
-        <w:t xml:space="preserve">Mit dem Einrichtungs-Code gibst du einen Zugang an Freunde oder Kunden weiter, ohne Benutzername und Passwort vorzulesen oder im Klartext zu schicken. Der Code ist verschlüsselt (AES-256), auf Wunsch mit PIN, nur für ein bestimmtes Gerät und mit Ablaufdatum. Am Handy und PC kann er zusätzlich dein VPN mitbringen.</w:t>
+        <w:t xml:space="preserve">Wiedergabe an ein anderes Gerät senden</w:t>
       </w:r>
     </w:p>
     <w:p>
@@ -6430,33 +6422,7 @@
         <w:spacing w:after="60"/>
       </w:pPr>
       <w:r>
-        <w:t xml:space="preserve">Erstellen (Android, Windows, iPhone): Benutzer wechseln → beim Zugang auf das QR-Symbol → „🔐 Einrichtungs-Code erstellen (für andere)“.</w:t>
-      </w:r>
-    </w:p>
-    <w:p>
-      <w:pPr>
-        <w:pStyle w:val="ListParagraph"/>
-        <w:numPr>
-          <w:ilvl w:val="0"/>
-          <w:numId w:val="14"/>
-        </w:numPr>
-        <w:spacing w:after="60"/>
-      </w:pPr>
-      <w:r>
-        <w:t xml:space="preserve">PIN eintragen (4–8 Ziffern, empfohlen). Optional die Gerätenummer des Empfängers – dann funktioniert der Code nur auf diesem einen Gerät. Gültigkeit wählen: 24 Stunden, 7 Tage, 30 Tage oder unbegrenzt. Am Handy/PC mit VPN: „Mein VPN mitgeben“ und auf Wunsch „Kill-Switch beim Empfänger einschalten“.</w:t>
-      </w:r>
-    </w:p>
-    <w:p>
-      <w:pPr>
-        <w:pStyle w:val="ListParagraph"/>
-        <w:numPr>
-          <w:ilvl w:val="0"/>
-          <w:numId w:val="14"/>
-        </w:numPr>
-        <w:spacing w:after="60"/>
-      </w:pPr>
-      <w:r>
-        <w:t xml:space="preserve">„Code erstellen“ → „Teilen“ (z.B. WhatsApp) oder „Kopieren“. Der QR-Code kann auch direkt vom Bildschirm gescannt werden.</w:t>
+        <w:t xml:space="preserve">Im Player oben auf das Übertragen-Symbol (wie bei Chromecast) oder das Fernseher-Symbol „An Gerät senden“ tippen (Samsung-TV: Knopf „📲 Senden“). Das Fenster bleibt offen, bis du es schließt – auch wenn die Suche etwas dauert.</w:t>
       </w:r>
     </w:p>
     <w:p>
@@ -6476,73 +6442,33 @@
         <w:t xml:space="preserve">Tipp: </w:t>
       </w:r>
       <w:r>
-        <w:t xml:space="preserve">Die PIN NIE im selben Chat wie den Code schicken – am besten anrufen oder per SMS. Nur so schützt die PIN wirklich.</w:t>
-      </w:r>
-    </w:p>
-    <w:p>
-      <w:pPr>
-        <w:pStyle w:val="ListParagraph"/>
-        <w:numPr>
-          <w:ilvl w:val="0"/>
-          <w:numId w:val="15"/>
-        </w:numPr>
-        <w:spacing w:after="60"/>
-      </w:pPr>
-      <w:r>
-        <w:t xml:space="preserve">Einlösen am Handy, Tablet oder PC: Benutzer wechseln → Neuer Zugang → „🔐 Einrichtungs-Code einlösen“. Ein kopierter Code wird automatisch eingefügt; sonst einfügen oder „Code scannen“. PIN eingeben → „Auf diesem Gerät einrichten“. Fertig – der Zugang ist aktiv. War ein VPN dabei: Startseite → VPN → „Verbinden“ (mit Kill-Switch läuft ohne VPN nichts).</w:t>
-      </w:r>
-    </w:p>
-    <w:p>
-      <w:pPr>
-        <w:pStyle w:val="ListParagraph"/>
-        <w:numPr>
-          <w:ilvl w:val="0"/>
-          <w:numId w:val="15"/>
-        </w:numPr>
-        <w:spacing w:after="60"/>
-      </w:pPr>
-      <w:r>
-        <w:t xml:space="preserve">Einlösen für Receiver, Samsung-TV oder Fire TV (dort kann man nichts einfügen): am Gerät „Zugang vom Handy empfangen“ öffnen. Am Handy den Code wie oben öffnen → „Auf Receiver / TV einrichten“ → den QR-Code am Gerät scannen (oder IP-Adresse und Code eintragen). Das Handy prüft PIN und Gerätenummer und schickt den Zugang ans Gerät.</w:t>
-      </w:r>
-    </w:p>
-    <w:p>
-      <w:pPr>
-        <w:pStyle w:val="ListParagraph"/>
-        <w:numPr>
-          <w:ilvl w:val="0"/>
-          <w:numId w:val="6"/>
-        </w:numPr>
-        <w:spacing w:after="60"/>
-      </w:pPr>
-      <w:r>
-        <w:rPr>
-          <w:b/>
-          <w:bCs/>
-        </w:rPr>
-        <w:t xml:space="preserve">Gerätenummer: </w:t>
-      </w:r>
-      <w:r>
-        <w:t xml:space="preserve">jedes Gerät hat eine eigene, z.B. 7KQ4-M2XD. Du findest sie im Fenster „Einrichtungs-Code einlösen“ und im Fenster „Zugang empfangen“ (auch am Receiver und Samsung-TV). Nach einer Neuinstallation der App gibt es eine neue Nummer – dann einen neuen Code erstellen.</w:t>
-      </w:r>
-    </w:p>
-    <w:p>
-      <w:pPr>
-        <w:pStyle w:val="ListParagraph"/>
-        <w:numPr>
-          <w:ilvl w:val="0"/>
-          <w:numId w:val="6"/>
-        </w:numPr>
-        <w:spacing w:after="60"/>
-      </w:pPr>
-      <w:r>
-        <w:rPr>
-          <w:b/>
-          <w:bCs/>
-        </w:rPr>
-        <w:t xml:space="preserve">Meldungen: </w:t>
-      </w:r>
-      <w:r>
-        <w:t xml:space="preserve">„Die PIN ist falsch“, „für ein anderes Gerät bestimmt“, „abgelaufen – bitte einen neuen anfordern“. Ein unvollständig kopierter Code wird als „Kein gültiger Einrichtungs-Code“ erkannt.</w:t>
+        <w:t xml:space="preserve">Wird ein Gerät nicht gefunden: Alle Geräte müssen im selben Heimnetz hängen – WLAN oder LAN-Kabel ist egal. Klappt die automatische Suche trotzdem nicht, im Fenster „An Gerät senden“ unten die IP-Adresse des Geräts eingeben und „Verbinden“ drücken (Samsung-TV: „＋ Gerät per IP-Adresse …“). Das Gerät wird gemerkt und beim nächsten Mal automatisch angezeigt.</w:t>
+      </w:r>
+    </w:p>
+    <w:p>
+      <w:pPr>
+        <w:pStyle w:val="ListParagraph"/>
+        <w:numPr>
+          <w:ilvl w:val="0"/>
+          <w:numId w:val="14"/>
+        </w:numPr>
+        <w:spacing w:after="60"/>
+      </w:pPr>
+      <w:r>
+        <w:t xml:space="preserve">Unter „Portiva-Geräte“ erscheinen alle Geräte mit geöffnetem Portiva im Heimnetz (TV-Stick, Tablet, Handy, Windows-PC) → Gerät wählen. Darüber stehen wie bisher Chromecast-Geräte.</w:t>
+      </w:r>
+    </w:p>
+    <w:p>
+      <w:pPr>
+        <w:pStyle w:val="ListParagraph"/>
+        <w:numPr>
+          <w:ilvl w:val="0"/>
+          <w:numId w:val="14"/>
+        </w:numPr>
+        <w:spacing w:after="60"/>
+      </w:pPr>
+      <w:r>
+        <w:t xml:space="preserve">Der Film läuft dort an derselben Stelle weiter (Live TV: derselbe Sender), hier wird gestoppt. Der Enigma2-Receiver wartet dafür, bis der Film geladen und spulbar ist, springt dann an die Stelle und prüft, ob es geklappt hat (unten erscheint „▶ Weiter ab 30:00“) – das kann ein paar Sekunden dauern.</w:t>
       </w:r>
     </w:p>
     <w:p>
@@ -6562,29 +6488,7 @@
         <w:t xml:space="preserve">Tipp: </w:t>
       </w:r>
       <w:r>
-        <w:t xml:space="preserve">Wichtig: Ohne PIN und ohne Gerätenummer kann jeder, der den Code bekommt, den Zugang einrichten – wie ein Schlüssel. Das Ablaufdatum prüft die Uhr des Empfänger-Geräts. Ein mitgeschicktes VPN ist DEIN VPN-Zugang: viele VPN-Anbieter erlauben pro Konfiguration nur ein Gerät gleichzeitig – für jeden Empfänger besser eine eigene .conf anlegen. Das VPN gibt es nur in der Android- und Windows-App; iPhone, Receiver und Fernseher übernehmen nur den Zugang.</w:t>
-      </w:r>
-    </w:p>
-    <w:p>
-      <w:pPr>
-        <w:pStyle w:val="Heading2"/>
-        <w:spacing w:after="120" w:before="240"/>
-      </w:pPr>
-      <w:r>
-        <w:t xml:space="preserve">Wiedergabe an ein anderes Gerät senden</w:t>
-      </w:r>
-    </w:p>
-    <w:p>
-      <w:pPr>
-        <w:pStyle w:val="ListParagraph"/>
-        <w:numPr>
-          <w:ilvl w:val="0"/>
-          <w:numId w:val="16"/>
-        </w:numPr>
-        <w:spacing w:after="60"/>
-      </w:pPr>
-      <w:r>
-        <w:t xml:space="preserve">Im Player oben auf das Übertragen-Symbol (wie bei Chromecast) oder das Fernseher-Symbol „An Gerät senden“ tippen (Samsung-TV: Knopf „📲 Senden“). Das Fenster bleibt offen, bis du es schließt – auch wenn die Suche etwas dauert.</w:t>
+        <w:t xml:space="preserve">Sicherheit: Portiva Link nimmt nur Anfragen aus deinem eigenen Heimnetz an (Router-Adressen wie 192.168.x.x, 10.x.x.x). Webseiten im Browser können keine Befehle schicken. Nach 5 falschen Codes ist das anfragende Gerät für 10 Minuten gesperrt („Zu viele falsche Codes“), damit niemand den Code durchprobieren kann. Angenommen werden nur echte Stream-Adressen (http/https). Der Zugangs-QR und die Passwort-Eingabe sind am Android-Gerät vor Bildschirmfotos und der Vorschau unter „Zuletzt verwendet“ geschützt.</w:t>
       </w:r>
     </w:p>
     <w:p>
@@ -6604,33 +6508,29 @@
         <w:t xml:space="preserve">Tipp: </w:t>
       </w:r>
       <w:r>
-        <w:t xml:space="preserve">Wird ein Gerät nicht gefunden: Alle Geräte müssen im selben Heimnetz hängen – WLAN oder LAN-Kabel ist egal. Klappt die automatische Suche trotzdem nicht, im Fenster „An Gerät senden“ unten die IP-Adresse des Geräts eingeben und „Verbinden“ drücken (Samsung-TV: „＋ Gerät per IP-Adresse …“). Das Gerät wird gemerkt und beim nächsten Mal automatisch angezeigt.</w:t>
-      </w:r>
-    </w:p>
-    <w:p>
-      <w:pPr>
-        <w:pStyle w:val="ListParagraph"/>
-        <w:numPr>
-          <w:ilvl w:val="0"/>
-          <w:numId w:val="16"/>
-        </w:numPr>
-        <w:spacing w:after="60"/>
-      </w:pPr>
-      <w:r>
-        <w:t xml:space="preserve">Unter „Portiva-Geräte“ erscheinen alle Geräte mit geöffnetem Portiva im Heimnetz (TV-Stick, Tablet, Handy, Windows-PC) → Gerät wählen. Darüber stehen wie bisher Chromecast-Geräte.</w:t>
-      </w:r>
-    </w:p>
-    <w:p>
-      <w:pPr>
-        <w:pStyle w:val="ListParagraph"/>
-        <w:numPr>
-          <w:ilvl w:val="0"/>
-          <w:numId w:val="16"/>
-        </w:numPr>
-        <w:spacing w:after="60"/>
-      </w:pPr>
-      <w:r>
-        <w:t xml:space="preserve">Der Film läuft dort an derselben Stelle weiter (Live TV: derselbe Sender), hier wird gestoppt. Der Enigma2-Receiver wartet dafür, bis der Film geladen und spulbar ist, springt dann an die Stelle und prüft, ob es geklappt hat (unten erscheint „▶ Weiter ab 30:00“) – das kann ein paar Sekunden dauern.</w:t>
+        <w:t xml:space="preserve">Portiva muss auf dem Zielgerät geöffnet sein (Android ab Version 10 erlaubt Apps im Hintergrund nicht, sich selbst zu öffnen). Samsung-Fernseher können senden, aber nichts empfangen. Windows fragt beim ersten Mal nach der Firewall – „Zulassen“ wählen.</w:t>
+      </w:r>
+    </w:p>
+    <w:p>
+      <w:r>
+        <w:br w:type="page"/>
+      </w:r>
+    </w:p>
+    <w:p>
+      <w:pPr>
+        <w:pStyle w:val="Heading1"/>
+        <w:spacing w:after="160" w:before="360"/>
+      </w:pPr>
+      <w:r>
+        <w:t xml:space="preserve">17. PowerIPTV für iPhone &amp; iPad</w:t>
+      </w:r>
+    </w:p>
+    <w:p>
+      <w:pPr>
+        <w:spacing w:after="120"/>
+      </w:pPr>
+      <w:r>
+        <w:t xml:space="preserve">Die iOS-Version nutzt denselben Player wie Android und Windows: VLC. Damit laufen auch DTS-, AC3- und MKV-Filme. Sie kann Zugänge (auch per QR-Code), Live TV, Filme und Serien mit Sprachauswahl, Weiterschauen, Favoriten und eigene Listen (lange auf einen Sender, Film oder eine Serie drücken → „Zu Liste hinzufügen …“; verwalten unter „Favoriten &amp; Listen“ mit ＋ und ⋯), Suche, TV-Guide mit Catch-up, Player mit Helligkeit/Lautstärke, Seitenverhältnis, Geschwindigkeit, Untertiteln und Einstellungsleiste sowie „An Gerät senden“.</w:t>
       </w:r>
     </w:p>
     <w:p>
@@ -6650,7 +6550,119 @@
         <w:t xml:space="preserve">Tipp: </w:t>
       </w:r>
       <w:r>
-        <w:t xml:space="preserve">Sicherheit: Portiva Link nimmt nur Anfragen aus deinem eigenen Heimnetz an (Router-Adressen wie 192.168.x.x, 10.x.x.x). Webseiten im Browser können keine Befehle schicken. Nach 5 falschen Codes ist das anfragende Gerät für 10 Minuten gesperrt („Zu viele falsche Codes“), damit niemand den Code durchprobieren kann. Angenommen werden nur echte Stream-Adressen (http/https). Der Zugangs-QR und die Passwort-Eingabe sind am Android-Gerät vor Bildschirmfotos und der Vorschau unter „Zuletzt verwendet“ geschützt.</w:t>
+        <w:t xml:space="preserve">Apple erlaubt Apps außerhalb des App Stores nur mit einer Apple-ID-Signatur. Mit einer kostenlosen Apple-ID läuft die App 7 Tage und muss dann neu aufgespielt werden (Zugänge bleiben erhalten). Mit einem Apple-Entwicklerkonto (99 €/Jahr) gilt sie 1 Jahr.</w:t>
+      </w:r>
+    </w:p>
+    <w:p>
+      <w:pPr>
+        <w:pStyle w:val="Heading2"/>
+        <w:spacing w:after="120" w:before="240"/>
+      </w:pPr>
+      <w:r>
+        <w:t xml:space="preserve">Installation mit Sideloadly (Windows oder Mac)</w:t>
+      </w:r>
+    </w:p>
+    <w:p>
+      <w:pPr>
+        <w:pStyle w:val="ListParagraph"/>
+        <w:numPr>
+          <w:ilvl w:val="0"/>
+          <w:numId w:val="15"/>
+        </w:numPr>
+        <w:spacing w:after="60"/>
+      </w:pPr>
+      <w:r>
+        <w:t xml:space="preserve">Am PC: Sideloadly von https://sideloadly.io herunterladen und installieren. Unter Windows zusätzlich iTunes und iCloud von der Apple-Webseite (nicht aus dem Microsoft Store).</w:t>
+      </w:r>
+    </w:p>
+    <w:p>
+      <w:pPr>
+        <w:pStyle w:val="ListParagraph"/>
+        <w:numPr>
+          <w:ilvl w:val="0"/>
+          <w:numId w:val="15"/>
+        </w:numPr>
+        <w:spacing w:after="60"/>
+      </w:pPr>
+      <w:r>
+        <w:t xml:space="preserve">Auf GitHub unter „Releases“ die neueste Version öffnen und „Portiva-iOS-v1.1.X.ipa“ herunterladen.</w:t>
+      </w:r>
+    </w:p>
+    <w:p>
+      <w:pPr>
+        <w:pStyle w:val="ListParagraph"/>
+        <w:numPr>
+          <w:ilvl w:val="0"/>
+          <w:numId w:val="15"/>
+        </w:numPr>
+        <w:spacing w:after="60"/>
+      </w:pPr>
+      <w:r>
+        <w:t xml:space="preserve">iPhone/iPad per Kabel anschließen, entsperren und „Vertrauen“ bestätigen.</w:t>
+      </w:r>
+    </w:p>
+    <w:p>
+      <w:pPr>
+        <w:pStyle w:val="ListParagraph"/>
+        <w:numPr>
+          <w:ilvl w:val="0"/>
+          <w:numId w:val="15"/>
+        </w:numPr>
+        <w:spacing w:after="60"/>
+      </w:pPr>
+      <w:r>
+        <w:t xml:space="preserve">Sideloadly öffnen, die .ipa hineinziehen, deine Apple-ID eintragen und „Start“ klicken.</w:t>
+      </w:r>
+    </w:p>
+    <w:p>
+      <w:pPr>
+        <w:pStyle w:val="ListParagraph"/>
+        <w:numPr>
+          <w:ilvl w:val="0"/>
+          <w:numId w:val="15"/>
+        </w:numPr>
+        <w:spacing w:after="60"/>
+      </w:pPr>
+      <w:r>
+        <w:t xml:space="preserve">Am iPhone: Einstellungen → Datenschutz &amp; Sicherheit → Entwicklermodus einschalten (iOS 16+, Neustart). Danach Einstellungen → Allgemein → VPN &amp; Geräteverwaltung → deine Apple-ID → „Vertrauen“.</w:t>
+      </w:r>
+    </w:p>
+    <w:p>
+      <w:pPr>
+        <w:pStyle w:val="ListParagraph"/>
+        <w:numPr>
+          <w:ilvl w:val="0"/>
+          <w:numId w:val="15"/>
+        </w:numPr>
+        <w:spacing w:after="60"/>
+      </w:pPr>
+      <w:r>
+        <w:t xml:space="preserve">Portiva öffnen. Beim ersten Start fragt iOS nach „Lokales Netzwerk“ – erlauben (für QR-Übertragung und „An Gerät senden“).</w:t>
+      </w:r>
+    </w:p>
+    <w:p>
+      <w:pPr>
+        <w:spacing w:after="120"/>
+      </w:pPr>
+      <w:r>
+        <w:t xml:space="preserve">Zugang am schnellsten: Benutzer wechseln → „+“ → „QR-Code scannen“ und am anderen Gerät beim Zugang auf das QR-Symbol tippen.</w:t>
+      </w:r>
+    </w:p>
+    <w:p>
+      <w:pPr>
+        <w:pStyle w:val="Heading1"/>
+        <w:spacing w:after="160" w:before="360"/>
+      </w:pPr>
+      <w:r>
+        <w:t xml:space="preserve">18. PowerIPTV für die neuen Fire TV Sticks (Vega OS)</w:t>
+      </w:r>
+    </w:p>
+    <w:p>
+      <w:pPr>
+        <w:spacing w:after="120"/>
+      </w:pPr>
+      <w:r>
+        <w:t xml:space="preserve">Amazon hat bei den neuen Sticks Android durch das eigene Betriebssystem „Vega OS“ ersetzt. Betroffen sind der Fire TV Stick 4K Select, der Fire TV Stick HD (2026), der Fire TV Stick 4K (2026) und alle kommenden Sticks. Dort laufen keine APKs und es gibt kein „Apps unbekannter Herkunft“ mehr. Deshalb gibt es eine eigene Version: „Portiva-FireTV-Vega-v1.1.X.vpkg“ (auf GitHub im Ordner „Fire TV Vega“, im Release mit „🆕 NEUE Amazon Fire TV Sticks“ gekennzeichnet).</w:t>
       </w:r>
     </w:p>
     <w:p>
@@ -6670,21 +6682,7 @@
         <w:t xml:space="preserve">Tipp: </w:t>
       </w:r>
       <w:r>
-        <w:t xml:space="preserve">Portiva muss auf dem Zielgerät geöffnet sein (Android ab Version 10 erlaubt Apps im Hintergrund nicht, sich selbst zu öffnen). Samsung-Fernseher können senden, aber nichts empfangen. Windows fragt beim ersten Mal nach der Firewall – „Zulassen“ wählen.</w:t>
-      </w:r>
-    </w:p>
-    <w:p>
-      <w:r>
-        <w:br w:type="page"/>
-      </w:r>
-    </w:p>
-    <w:p>
-      <w:pPr>
-        <w:pStyle w:val="Heading1"/>
-        <w:spacing w:after="160" w:before="360"/>
-      </w:pPr>
-      <w:r>
-        <w:t xml:space="preserve">17. PowerIPTV für iPhone &amp; iPad</w:t>
+        <w:t xml:space="preserve">Welcher Stick? Einstellungen → Mein Fire TV → Info. Steht dort „Fire OS“, nimm die normale APK (Kapitel 2). Steht dort „Vega OS“, nimm diese Version.</w:t>
       </w:r>
     </w:p>
     <w:p>
@@ -6692,7 +6690,177 @@
         <w:spacing w:after="120"/>
       </w:pPr>
       <w:r>
-        <w:t xml:space="preserve">Die iOS-Version nutzt denselben Player wie Android und Windows: VLC. Damit laufen auch DTS-, AC3- und MKV-Filme. Sie kann Zugänge (auch per QR-Code), Live TV, Filme und Serien mit Sprachauswahl, Weiterschauen, Favoriten und eigene Listen (lange auf einen Sender, Film oder eine Serie drücken → „Zu Liste hinzufügen …“; verwalten unter „Favoriten &amp; Listen“ mit ＋ und ⋯), Suche, TV-Guide mit Catch-up, Player mit Helligkeit/Lautstärke, Seitenverhältnis, Geschwindigkeit, Untertiteln und Einstellungsleiste sowie „An Gerät senden“.</w:t>
+        <w:t xml:space="preserve">Die Oberfläche ist dieselbe wie beim Samsung-Fernseher (Fernbedienung, Live-TV-Infoleiste, EPG, Favoriten, Portiva Link). Das Bild kommt vom Hardware-Player des Sticks. Aufnahmen, Downloads, VPN und Mehrfachbildschirm gibt es dort nicht.</w:t>
+      </w:r>
+    </w:p>
+    <w:p>
+      <w:pPr>
+        <w:pStyle w:val="Heading2"/>
+        <w:spacing w:after="120" w:before="240"/>
+      </w:pPr>
+      <w:r>
+        <w:t xml:space="preserve">Einmalig: Amazon-Entwicklerkonto &amp; Vega-Werkzeug</w:t>
+      </w:r>
+    </w:p>
+    <w:p>
+      <w:pPr>
+        <w:pStyle w:val="ListParagraph"/>
+        <w:numPr>
+          <w:ilvl w:val="0"/>
+          <w:numId w:val="16"/>
+        </w:numPr>
+        <w:spacing w:after="60"/>
+      </w:pPr>
+      <w:r>
+        <w:t xml:space="preserve">Kostenloses Amazon-Entwicklerkonto auf developer.amazon.com anlegen und das Appstore-Entwicklerprofil vollständig ausfüllen (ohne Bank-/Steuerdaten). Ohne vollständiges Profil klappt der Entwicklermodus nicht.</w:t>
+      </w:r>
+    </w:p>
+    <w:p>
+      <w:pPr>
+        <w:pStyle w:val="ListParagraph"/>
+        <w:numPr>
+          <w:ilvl w:val="0"/>
+          <w:numId w:val="16"/>
+        </w:numPr>
+        <w:spacing w:after="60"/>
+      </w:pPr>
+      <w:r>
+        <w:t xml:space="preserve">Am PC (Windows mit WSL/Ubuntu, Linux oder Mac) das Vega-Werkzeug installieren: curl -fsSL https://sdk-installer.vega.labcollab.net/get_vvm.sh | bash und danach source ~/vega/env.</w:t>
+      </w:r>
+    </w:p>
+    <w:p>
+      <w:pPr>
+        <w:pStyle w:val="ListParagraph"/>
+        <w:numPr>
+          <w:ilvl w:val="0"/>
+          <w:numId w:val="16"/>
+        </w:numPr>
+        <w:spacing w:after="60"/>
+      </w:pPr>
+      <w:r>
+        <w:t xml:space="preserve">Anmelden: vega devmode login → den angezeigten Code auf amazon.com/code bestätigen.</w:t>
+      </w:r>
+    </w:p>
+    <w:p>
+      <w:pPr>
+        <w:pStyle w:val="Heading2"/>
+        <w:spacing w:after="120" w:before="240"/>
+      </w:pPr>
+      <w:r>
+        <w:t xml:space="preserve">Entwicklermodus am Stick einschalten</w:t>
+      </w:r>
+    </w:p>
+    <w:p>
+      <w:pPr>
+        <w:pStyle w:val="ListParagraph"/>
+        <w:numPr>
+          <w:ilvl w:val="0"/>
+          <w:numId w:val="17"/>
+        </w:numPr>
+        <w:spacing w:after="60"/>
+      </w:pPr>
+      <w:r>
+        <w:t xml:space="preserve">Am Stick: Einstellungen → Mein Fire TV → Info → 7-mal auf den Gerätenamen drücken („Du bist jetzt Entwickler“).</w:t>
+      </w:r>
+    </w:p>
+    <w:p>
+      <w:pPr>
+        <w:pStyle w:val="ListParagraph"/>
+        <w:numPr>
+          <w:ilvl w:val="0"/>
+          <w:numId w:val="17"/>
+        </w:numPr>
+        <w:spacing w:after="60"/>
+      </w:pPr>
+      <w:r>
+        <w:t xml:space="preserve">Zurück → Entwickleroptionen → Entwicklermodus → Weiter. Der Fernseher zeigt einen 6-stelligen Code (gilt ca. 5 Minuten).</w:t>
+      </w:r>
+    </w:p>
+    <w:p>
+      <w:pPr>
+        <w:pStyle w:val="ListParagraph"/>
+        <w:numPr>
+          <w:ilvl w:val="0"/>
+          <w:numId w:val="17"/>
+        </w:numPr>
+        <w:spacing w:after="60"/>
+      </w:pPr>
+      <w:r>
+        <w:t xml:space="preserve">Am PC: vega devmode enable-device --code &lt;Code&gt;. Der Stick startet neu.</w:t>
+      </w:r>
+    </w:p>
+    <w:p>
+      <w:pPr>
+        <w:pStyle w:val="ListParagraph"/>
+        <w:numPr>
+          <w:ilvl w:val="0"/>
+          <w:numId w:val="17"/>
+        </w:numPr>
+        <w:spacing w:after="60"/>
+      </w:pPr>
+      <w:r>
+        <w:t xml:space="preserve">Entwickleroptionen → Verbindungsart „Netzwerk“ wählen (oder per USB-Kabel verbinden). Prüfen mit: vega device list (zeigt die Seriennummer).</w:t>
+      </w:r>
+    </w:p>
+    <w:p>
+      <w:pPr>
+        <w:pStyle w:val="Heading2"/>
+        <w:spacing w:after="120" w:before="240"/>
+      </w:pPr>
+      <w:r>
+        <w:t xml:space="preserve">Portiva installieren &amp; aktualisieren</w:t>
+      </w:r>
+    </w:p>
+    <w:p>
+      <w:pPr>
+        <w:pStyle w:val="ListParagraph"/>
+        <w:numPr>
+          <w:ilvl w:val="0"/>
+          <w:numId w:val="18"/>
+        </w:numPr>
+        <w:spacing w:after="60"/>
+      </w:pPr>
+      <w:r>
+        <w:t xml:space="preserve">Auf GitHub unter „Releases“ die Datei „Portiva-FireTV-Vega-v1.1.X.vpkg“ herunterladen.</w:t>
+      </w:r>
+    </w:p>
+    <w:p>
+      <w:pPr>
+        <w:pStyle w:val="ListParagraph"/>
+        <w:numPr>
+          <w:ilvl w:val="0"/>
+          <w:numId w:val="18"/>
+        </w:numPr>
+        <w:spacing w:after="60"/>
+      </w:pPr>
+      <w:r>
+        <w:t xml:space="preserve">Installieren: vega device -d &lt;Seriennummer&gt; install-app --packagePath Portiva-FireTV-Vega-v1.1.X.vpkg</w:t>
+      </w:r>
+    </w:p>
+    <w:p>
+      <w:pPr>
+        <w:pStyle w:val="ListParagraph"/>
+        <w:numPr>
+          <w:ilvl w:val="0"/>
+          <w:numId w:val="18"/>
+        </w:numPr>
+        <w:spacing w:after="60"/>
+      </w:pPr>
+      <w:r>
+        <w:t xml:space="preserve">Starten: über die Kachel „Portiva“ bei den Apps (ggf. nach einem Neustart) oder vega device -d &lt;Seriennummer&gt; launch-app --appName app.portiva.firetv.main</w:t>
+      </w:r>
+    </w:p>
+    <w:p>
+      <w:pPr>
+        <w:pStyle w:val="ListParagraph"/>
+        <w:numPr>
+          <w:ilvl w:val="0"/>
+          <w:numId w:val="18"/>
+        </w:numPr>
+        <w:spacing w:after="60"/>
+      </w:pPr>
+      <w:r>
+        <w:t xml:space="preserve">Zugang am bequemsten per „Vom Handy empfangen“ einrichten (Kapitel 16).</w:t>
       </w:r>
     </w:p>
     <w:p>
@@ -6712,119 +6880,7 @@
         <w:t xml:space="preserve">Tipp: </w:t>
       </w:r>
       <w:r>
-        <w:t xml:space="preserve">Apple erlaubt Apps außerhalb des App Stores nur mit einer Apple-ID-Signatur. Mit einer kostenlosen Apple-ID läuft die App 7 Tage und muss dann neu aufgespielt werden (Zugänge bleiben erhalten). Mit einem Apple-Entwicklerkonto (99 €/Jahr) gilt sie 1 Jahr.</w:t>
-      </w:r>
-    </w:p>
-    <w:p>
-      <w:pPr>
-        <w:pStyle w:val="Heading2"/>
-        <w:spacing w:after="120" w:before="240"/>
-      </w:pPr>
-      <w:r>
-        <w:t xml:space="preserve">Installation mit Sideloadly (Windows oder Mac)</w:t>
-      </w:r>
-    </w:p>
-    <w:p>
-      <w:pPr>
-        <w:pStyle w:val="ListParagraph"/>
-        <w:numPr>
-          <w:ilvl w:val="0"/>
-          <w:numId w:val="17"/>
-        </w:numPr>
-        <w:spacing w:after="60"/>
-      </w:pPr>
-      <w:r>
-        <w:t xml:space="preserve">Am PC: Sideloadly von https://sideloadly.io herunterladen und installieren. Unter Windows zusätzlich iTunes und iCloud von der Apple-Webseite (nicht aus dem Microsoft Store).</w:t>
-      </w:r>
-    </w:p>
-    <w:p>
-      <w:pPr>
-        <w:pStyle w:val="ListParagraph"/>
-        <w:numPr>
-          <w:ilvl w:val="0"/>
-          <w:numId w:val="17"/>
-        </w:numPr>
-        <w:spacing w:after="60"/>
-      </w:pPr>
-      <w:r>
-        <w:t xml:space="preserve">Auf GitHub unter „Releases“ die neueste Version öffnen und „Portiva-iOS-v1.1.X.ipa“ herunterladen.</w:t>
-      </w:r>
-    </w:p>
-    <w:p>
-      <w:pPr>
-        <w:pStyle w:val="ListParagraph"/>
-        <w:numPr>
-          <w:ilvl w:val="0"/>
-          <w:numId w:val="17"/>
-        </w:numPr>
-        <w:spacing w:after="60"/>
-      </w:pPr>
-      <w:r>
-        <w:t xml:space="preserve">iPhone/iPad per Kabel anschließen, entsperren und „Vertrauen“ bestätigen.</w:t>
-      </w:r>
-    </w:p>
-    <w:p>
-      <w:pPr>
-        <w:pStyle w:val="ListParagraph"/>
-        <w:numPr>
-          <w:ilvl w:val="0"/>
-          <w:numId w:val="17"/>
-        </w:numPr>
-        <w:spacing w:after="60"/>
-      </w:pPr>
-      <w:r>
-        <w:t xml:space="preserve">Sideloadly öffnen, die .ipa hineinziehen, deine Apple-ID eintragen und „Start“ klicken.</w:t>
-      </w:r>
-    </w:p>
-    <w:p>
-      <w:pPr>
-        <w:pStyle w:val="ListParagraph"/>
-        <w:numPr>
-          <w:ilvl w:val="0"/>
-          <w:numId w:val="17"/>
-        </w:numPr>
-        <w:spacing w:after="60"/>
-      </w:pPr>
-      <w:r>
-        <w:t xml:space="preserve">Am iPhone: Einstellungen → Datenschutz &amp; Sicherheit → Entwicklermodus einschalten (iOS 16+, Neustart). Danach Einstellungen → Allgemein → VPN &amp; Geräteverwaltung → deine Apple-ID → „Vertrauen“.</w:t>
-      </w:r>
-    </w:p>
-    <w:p>
-      <w:pPr>
-        <w:pStyle w:val="ListParagraph"/>
-        <w:numPr>
-          <w:ilvl w:val="0"/>
-          <w:numId w:val="17"/>
-        </w:numPr>
-        <w:spacing w:after="60"/>
-      </w:pPr>
-      <w:r>
-        <w:t xml:space="preserve">Portiva öffnen. Beim ersten Start fragt iOS nach „Lokales Netzwerk“ – erlauben (für QR-Übertragung und „An Gerät senden“).</w:t>
-      </w:r>
-    </w:p>
-    <w:p>
-      <w:pPr>
-        <w:spacing w:after="120"/>
-      </w:pPr>
-      <w:r>
-        <w:t xml:space="preserve">Zugang am schnellsten: Benutzer wechseln → „+“ → „QR-Code scannen“ und am anderen Gerät beim Zugang auf das QR-Symbol tippen.</w:t>
-      </w:r>
-    </w:p>
-    <w:p>
-      <w:pPr>
-        <w:pStyle w:val="Heading1"/>
-        <w:spacing w:after="160" w:before="360"/>
-      </w:pPr>
-      <w:r>
-        <w:t xml:space="preserve">18. PowerIPTV für die neuen Fire TV Sticks (Vega OS)</w:t>
-      </w:r>
-    </w:p>
-    <w:p>
-      <w:pPr>
-        <w:spacing w:after="120"/>
-      </w:pPr>
-      <w:r>
-        <w:t xml:space="preserve">Amazon hat bei den neuen Sticks Android durch das eigene Betriebssystem „Vega OS“ ersetzt. Betroffen sind der Fire TV Stick 4K Select, der Fire TV Stick HD (2026), der Fire TV Stick 4K (2026) und alle kommenden Sticks. Dort laufen keine APKs und es gibt kein „Apps unbekannter Herkunft“ mehr. Deshalb gibt es eine eigene Version: „Portiva-FireTV-Vega-v1.1.X.vpkg“ (auf GitHub im Ordner „Fire TV Vega“, im Release mit „🆕 NEUE Amazon Fire TV Sticks“ gekennzeichnet).</w:t>
+        <w:t xml:space="preserve">Updates genauso installieren – Zugänge und Favoriten bleiben erhalten. Die App zeigt unter „Update“, wenn es eine neue Version gibt.</w:t>
       </w:r>
     </w:p>
     <w:p>
@@ -6844,7 +6900,16 @@
         <w:t xml:space="preserve">Tipp: </w:t>
       </w:r>
       <w:r>
-        <w:t xml:space="preserve">Welcher Stick? Einstellungen → Mein Fire TV → Info. Steht dort „Fire OS“, nimm die normale APK (Kapitel 2). Steht dort „Vega OS“, nimm diese Version.</w:t>
+        <w:t xml:space="preserve">Hinweis: Diese Version ist neu und noch nicht auf jedem Stick erprobt. Klappt ein Sender oder Film nicht, im Anbieter-Portal bzw. in den Einstellungen das Live-Format „HLS (m3u8)“ wählen; MKV-Filme mit DTS-Ton spielen die neuen Sticks evtl. ohne Ton ab.</w:t>
+      </w:r>
+    </w:p>
+    <w:p>
+      <w:pPr>
+        <w:pStyle w:val="Heading1"/>
+        <w:spacing w:after="160" w:before="360"/>
+      </w:pPr>
+      <w:r>
+        <w:t xml:space="preserve">19. PowerIPTV für Enigma2-Receiver (.ipk)</w:t>
       </w:r>
     </w:p>
     <w:p>
@@ -6852,7 +6917,7 @@
         <w:spacing w:after="120"/>
       </w:pPr>
       <w:r>
-        <w:t xml:space="preserve">Die Oberfläche ist dieselbe wie beim Samsung-Fernseher (Fernbedienung, Live-TV-Infoleiste, EPG, Favoriten, Portiva Link). Das Bild kommt vom Hardware-Player des Sticks. Aufnahmen, Downloads, VPN und Mehrfachbildschirm gibt es dort nicht.</w:t>
+        <w:t xml:space="preserve">Für Sat-/Kabel-Receiver mit Enigma2 (z. B. VU+, Dreambox, Gigablue, Octagon, Zgemma mit OpenATV, OpenPLi oder VTi) gibt es PowerIPTV als Plugin: Datei „PowerIPTV-Enigma2.ipk“ im Release (Quellcode im Ordner „Enigma IPK“).</w:t>
       </w:r>
     </w:p>
     <w:p>
@@ -6861,55 +6926,7 @@
         <w:spacing w:after="120" w:before="240"/>
       </w:pPr>
       <w:r>
-        <w:t xml:space="preserve">Einmalig: Amazon-Entwicklerkonto &amp; Vega-Werkzeug</w:t>
-      </w:r>
-    </w:p>
-    <w:p>
-      <w:pPr>
-        <w:pStyle w:val="ListParagraph"/>
-        <w:numPr>
-          <w:ilvl w:val="0"/>
-          <w:numId w:val="18"/>
-        </w:numPr>
-        <w:spacing w:after="60"/>
-      </w:pPr>
-      <w:r>
-        <w:t xml:space="preserve">Kostenloses Amazon-Entwicklerkonto auf developer.amazon.com anlegen und das Appstore-Entwicklerprofil vollständig ausfüllen (ohne Bank-/Steuerdaten). Ohne vollständiges Profil klappt der Entwicklermodus nicht.</w:t>
-      </w:r>
-    </w:p>
-    <w:p>
-      <w:pPr>
-        <w:pStyle w:val="ListParagraph"/>
-        <w:numPr>
-          <w:ilvl w:val="0"/>
-          <w:numId w:val="18"/>
-        </w:numPr>
-        <w:spacing w:after="60"/>
-      </w:pPr>
-      <w:r>
-        <w:t xml:space="preserve">Am PC (Windows mit WSL/Ubuntu, Linux oder Mac) das Vega-Werkzeug installieren: curl -fsSL https://sdk-installer.vega.labcollab.net/get_vvm.sh | bash und danach source ~/vega/env.</w:t>
-      </w:r>
-    </w:p>
-    <w:p>
-      <w:pPr>
-        <w:pStyle w:val="ListParagraph"/>
-        <w:numPr>
-          <w:ilvl w:val="0"/>
-          <w:numId w:val="18"/>
-        </w:numPr>
-        <w:spacing w:after="60"/>
-      </w:pPr>
-      <w:r>
-        <w:t xml:space="preserve">Anmelden: vega devmode login → den angezeigten Code auf amazon.com/code bestätigen.</w:t>
-      </w:r>
-    </w:p>
-    <w:p>
-      <w:pPr>
-        <w:pStyle w:val="Heading2"/>
-        <w:spacing w:after="120" w:before="240"/>
-      </w:pPr>
-      <w:r>
-        <w:t xml:space="preserve">Entwicklermodus am Stick einschalten</w:t>
+        <w:t xml:space="preserve">Installieren</w:t>
       </w:r>
     </w:p>
     <w:p>
@@ -6922,7 +6939,7 @@
         <w:spacing w:after="60"/>
       </w:pPr>
       <w:r>
-        <w:t xml:space="preserve">Am Stick: Einstellungen → Mein Fire TV → Info → 7-mal auf den Gerätenamen drücken („Du bist jetzt Entwickler“).</w:t>
+        <w:t xml:space="preserve">Die Datei „PowerIPTV-Enigma2.ipk“ am PC herunterladen.</w:t>
       </w:r>
     </w:p>
     <w:p>
@@ -6935,7 +6952,7 @@
         <w:spacing w:after="60"/>
       </w:pPr>
       <w:r>
-        <w:t xml:space="preserve">Zurück → Entwickleroptionen → Entwicklermodus → Weiter. Der Fernseher zeigt einen 6-stelligen Code (gilt ca. 5 Minuten).</w:t>
+        <w:t xml:space="preserve">Mit einem FTP-Programm (z. B. FileZilla; Adresse = IP des Receivers, Benutzer „root“, Passwort meist leer oder das des Images) in den Ordner /tmp des Receivers kopieren.</w:t>
       </w:r>
     </w:p>
     <w:p>
@@ -6948,81 +6965,7 @@
         <w:spacing w:after="60"/>
       </w:pPr>
       <w:r>
-        <w:t xml:space="preserve">Am PC: vega devmode enable-device --code &lt;Code&gt;. Der Stick startet neu.</w:t>
-      </w:r>
-    </w:p>
-    <w:p>
-      <w:pPr>
-        <w:pStyle w:val="ListParagraph"/>
-        <w:numPr>
-          <w:ilvl w:val="0"/>
-          <w:numId w:val="19"/>
-        </w:numPr>
-        <w:spacing w:after="60"/>
-      </w:pPr>
-      <w:r>
-        <w:t xml:space="preserve">Entwickleroptionen → Verbindungsart „Netzwerk“ wählen (oder per USB-Kabel verbinden). Prüfen mit: vega device list (zeigt die Seriennummer).</w:t>
-      </w:r>
-    </w:p>
-    <w:p>
-      <w:pPr>
-        <w:pStyle w:val="Heading2"/>
-        <w:spacing w:after="120" w:before="240"/>
-      </w:pPr>
-      <w:r>
-        <w:t xml:space="preserve">Portiva installieren &amp; aktualisieren</w:t>
-      </w:r>
-    </w:p>
-    <w:p>
-      <w:pPr>
-        <w:pStyle w:val="ListParagraph"/>
-        <w:numPr>
-          <w:ilvl w:val="0"/>
-          <w:numId w:val="20"/>
-        </w:numPr>
-        <w:spacing w:after="60"/>
-      </w:pPr>
-      <w:r>
-        <w:t xml:space="preserve">Auf GitHub unter „Releases“ die Datei „Portiva-FireTV-Vega-v1.1.X.vpkg“ herunterladen.</w:t>
-      </w:r>
-    </w:p>
-    <w:p>
-      <w:pPr>
-        <w:pStyle w:val="ListParagraph"/>
-        <w:numPr>
-          <w:ilvl w:val="0"/>
-          <w:numId w:val="20"/>
-        </w:numPr>
-        <w:spacing w:after="60"/>
-      </w:pPr>
-      <w:r>
-        <w:t xml:space="preserve">Installieren: vega device -d &lt;Seriennummer&gt; install-app --packagePath Portiva-FireTV-Vega-v1.1.X.vpkg</w:t>
-      </w:r>
-    </w:p>
-    <w:p>
-      <w:pPr>
-        <w:pStyle w:val="ListParagraph"/>
-        <w:numPr>
-          <w:ilvl w:val="0"/>
-          <w:numId w:val="20"/>
-        </w:numPr>
-        <w:spacing w:after="60"/>
-      </w:pPr>
-      <w:r>
-        <w:t xml:space="preserve">Starten: über die Kachel „Portiva“ bei den Apps (ggf. nach einem Neustart) oder vega device -d &lt;Seriennummer&gt; launch-app --appName app.portiva.firetv.main</w:t>
-      </w:r>
-    </w:p>
-    <w:p>
-      <w:pPr>
-        <w:pStyle w:val="ListParagraph"/>
-        <w:numPr>
-          <w:ilvl w:val="0"/>
-          <w:numId w:val="20"/>
-        </w:numPr>
-        <w:spacing w:after="60"/>
-      </w:pPr>
-      <w:r>
-        <w:t xml:space="preserve">Zugang am bequemsten per „Vom Handy empfangen“ einrichten (Kapitel 16).</w:t>
+        <w:t xml:space="preserve">Am Receiver: Menü → Plugins → „Lokale Erweiterungen installieren“ (je nach Image grüne/blaue Taste) und die Datei wählen. Alternativ per Telnet/SSH: opkg install /tmp/PowerIPTV-Enigma2.ipk</w:t>
       </w:r>
     </w:p>
     <w:p>
@@ -7042,111 +6985,6 @@
         <w:t xml:space="preserve">Tipp: </w:t>
       </w:r>
       <w:r>
-        <w:t xml:space="preserve">Updates genauso installieren – Zugänge und Favoriten bleiben erhalten. Die App zeigt unter „Update“, wenn es eine neue Version gibt.</w:t>
-      </w:r>
-    </w:p>
-    <w:p>
-      <w:pPr>
-        <w:pBdr>
-          <w:left w:val="single" w:color="1E88B8" w:sz="18" w:space="8"/>
-        </w:pBdr>
-        <w:spacing w:after="160" w:before="80"/>
-        <w:ind w:left="240"/>
-      </w:pPr>
-      <w:r>
-        <w:rPr>
-          <w:b/>
-          <w:bCs/>
-          <w:color w:val="1E88B8"/>
-        </w:rPr>
-        <w:t xml:space="preserve">Tipp: </w:t>
-      </w:r>
-      <w:r>
-        <w:t xml:space="preserve">Hinweis: Diese Version ist neu und noch nicht auf jedem Stick erprobt. Klappt ein Sender oder Film nicht, im Anbieter-Portal bzw. in den Einstellungen das Live-Format „HLS (m3u8)“ wählen; MKV-Filme mit DTS-Ton spielen die neuen Sticks evtl. ohne Ton ab.</w:t>
-      </w:r>
-    </w:p>
-    <w:p>
-      <w:pPr>
-        <w:pStyle w:val="Heading1"/>
-        <w:spacing w:after="160" w:before="360"/>
-      </w:pPr>
-      <w:r>
-        <w:t xml:space="preserve">19. PowerIPTV für Enigma2-Receiver (.ipk)</w:t>
-      </w:r>
-    </w:p>
-    <w:p>
-      <w:pPr>
-        <w:spacing w:after="120"/>
-      </w:pPr>
-      <w:r>
-        <w:t xml:space="preserve">Für Sat-/Kabel-Receiver mit Enigma2 (z. B. VU+, Dreambox, Gigablue, Octagon, Zgemma mit OpenATV, OpenPLi oder VTi) gibt es PowerIPTV als Plugin: Datei „PowerIPTV-Enigma2.ipk“ im Release (Quellcode im Ordner „Enigma IPK“).</w:t>
-      </w:r>
-    </w:p>
-    <w:p>
-      <w:pPr>
-        <w:pStyle w:val="Heading2"/>
-        <w:spacing w:after="120" w:before="240"/>
-      </w:pPr>
-      <w:r>
-        <w:t xml:space="preserve">Installieren</w:t>
-      </w:r>
-    </w:p>
-    <w:p>
-      <w:pPr>
-        <w:pStyle w:val="ListParagraph"/>
-        <w:numPr>
-          <w:ilvl w:val="0"/>
-          <w:numId w:val="21"/>
-        </w:numPr>
-        <w:spacing w:after="60"/>
-      </w:pPr>
-      <w:r>
-        <w:t xml:space="preserve">Die Datei „PowerIPTV-Enigma2.ipk“ am PC herunterladen.</w:t>
-      </w:r>
-    </w:p>
-    <w:p>
-      <w:pPr>
-        <w:pStyle w:val="ListParagraph"/>
-        <w:numPr>
-          <w:ilvl w:val="0"/>
-          <w:numId w:val="21"/>
-        </w:numPr>
-        <w:spacing w:after="60"/>
-      </w:pPr>
-      <w:r>
-        <w:t xml:space="preserve">Mit einem FTP-Programm (z. B. FileZilla; Adresse = IP des Receivers, Benutzer „root“, Passwort meist leer oder das des Images) in den Ordner /tmp des Receivers kopieren.</w:t>
-      </w:r>
-    </w:p>
-    <w:p>
-      <w:pPr>
-        <w:pStyle w:val="ListParagraph"/>
-        <w:numPr>
-          <w:ilvl w:val="0"/>
-          <w:numId w:val="21"/>
-        </w:numPr>
-        <w:spacing w:after="60"/>
-      </w:pPr>
-      <w:r>
-        <w:t xml:space="preserve">Am Receiver: Menü → Plugins → „Lokale Erweiterungen installieren“ (je nach Image grüne/blaue Taste) und die Datei wählen. Alternativ per Telnet/SSH: opkg install /tmp/PowerIPTV-Enigma2.ipk</w:t>
-      </w:r>
-    </w:p>
-    <w:p>
-      <w:pPr>
-        <w:pBdr>
-          <w:left w:val="single" w:color="1E88B8" w:sz="18" w:space="8"/>
-        </w:pBdr>
-        <w:spacing w:after="160" w:before="80"/>
-        <w:ind w:left="240"/>
-      </w:pPr>
-      <w:r>
-        <w:rPr>
-          <w:b/>
-          <w:bCs/>
-          <w:color w:val="1E88B8"/>
-        </w:rPr>
-        <w:t xml:space="preserve">Tipp: </w:t>
-      </w:r>
-      <w:r>
         <w:t xml:space="preserve">Nach dem Neustart der Oberfläche steht PowerIPTV direkt im Hauptmenü (MENU-Taste) – zusätzlich wie gewohnt unter Menü → Plugins.</w:t>
       </w:r>
     </w:p>
@@ -7155,7 +6993,7 @@
         <w:pStyle w:val="ListParagraph"/>
         <w:numPr>
           <w:ilvl w:val="0"/>
-          <w:numId w:val="21"/>
+          <w:numId w:val="19"/>
         </w:numPr>
         <w:spacing w:after="60"/>
       </w:pPr>
@@ -7168,7 +7006,7 @@
         <w:pStyle w:val="ListParagraph"/>
         <w:numPr>
           <w:ilvl w:val="0"/>
-          <w:numId w:val="21"/>
+          <w:numId w:val="19"/>
         </w:numPr>
         <w:spacing w:after="60"/>
       </w:pPr>
@@ -7986,30 +7824,6 @@
     </w:lvl>
   </w:abstractNum>
   <w:abstractNum w:abstractNumId="20" w15:restartNumberingAfterBreak="0">
-    <w:multiLevelType w:val="hybridMultilevel"/>
-    <w:lvl w:ilvl="0" w15:tentative="1">
-      <w:start w:val="1"/>
-      <w:numFmt w:val="decimal"/>
-      <w:lvlText w:val="%1."/>
-      <w:lvlJc w:val="left"/>
-      <w:pPr>
-        <w:ind w:left="540" w:hanging="270"/>
-      </w:pPr>
-    </w:lvl>
-  </w:abstractNum>
-  <w:abstractNum w:abstractNumId="21" w15:restartNumberingAfterBreak="0">
-    <w:multiLevelType w:val="hybridMultilevel"/>
-    <w:lvl w:ilvl="0" w15:tentative="1">
-      <w:start w:val="1"/>
-      <w:numFmt w:val="decimal"/>
-      <w:lvlText w:val="%1."/>
-      <w:lvlJc w:val="left"/>
-      <w:pPr>
-        <w:ind w:left="540" w:hanging="270"/>
-      </w:pPr>
-    </w:lvl>
-  </w:abstractNum>
-  <w:abstractNum w:abstractNumId="22" w15:restartNumberingAfterBreak="0">
     <w:multiLevelType w:val="hybridMultilevel"/>
     <w:lvl w:ilvl="0" w15:tentative="1">
       <w:start w:val="1"/>
@@ -8100,48 +7914,36 @@
     </w:lvlOverride>
   </w:num>
   <w:num w:numId="14">
-    <w:abstractNumId w:val="20"/>
+    <w:abstractNumId w:val="14"/>
     <w:lvlOverride w:ilvl="0">
       <w:startOverride w:val="1"/>
     </w:lvlOverride>
   </w:num>
   <w:num w:numId="15">
-    <w:abstractNumId w:val="21"/>
+    <w:abstractNumId w:val="15"/>
     <w:lvlOverride w:ilvl="0">
       <w:startOverride w:val="1"/>
     </w:lvlOverride>
   </w:num>
   <w:num w:numId="16">
-    <w:abstractNumId w:val="14"/>
+    <w:abstractNumId w:val="16"/>
     <w:lvlOverride w:ilvl="0">
       <w:startOverride w:val="1"/>
     </w:lvlOverride>
   </w:num>
   <w:num w:numId="17">
-    <w:abstractNumId w:val="15"/>
+    <w:abstractNumId w:val="17"/>
     <w:lvlOverride w:ilvl="0">
       <w:startOverride w:val="1"/>
     </w:lvlOverride>
   </w:num>
   <w:num w:numId="18">
-    <w:abstractNumId w:val="16"/>
+    <w:abstractNumId w:val="18"/>
     <w:lvlOverride w:ilvl="0">
       <w:startOverride w:val="1"/>
     </w:lvlOverride>
   </w:num>
   <w:num w:numId="19">
-    <w:abstractNumId w:val="17"/>
-    <w:lvlOverride w:ilvl="0">
-      <w:startOverride w:val="1"/>
-    </w:lvlOverride>
-  </w:num>
-  <w:num w:numId="20">
-    <w:abstractNumId w:val="18"/>
-    <w:lvlOverride w:ilvl="0">
-      <w:startOverride w:val="1"/>
-    </w:lvlOverride>
-  </w:num>
-  <w:num w:numId="21">
     <w:abstractNumId w:val="19"/>
     <w:lvlOverride w:ilvl="0">
       <w:startOverride w:val="1"/>

</xml_diff>

<commit_message>
Stabil-Modus entfernt: Live TV startet wieder ohne zusaetzliche Verzoegerung
- Der Stabil-Modus (schaltete sich nach erkanntem Stocken bzw. im Mobilfunk 24 h lang zu und
  puffert vor dem Start doppelt so lange) hat das Stocken nicht behoben, Live TV startete aber spaeter
- Entfernt auf Android (Standard-Player + VLC), Windows, iOS, Samsung-TV/Fire TV: Einstellung,
  Stocken-Erkennung und groesserer Puffer; es gelten wieder die normalen Pufferwerte
- Haenger-Waechter, Rettungsleiter, Mobile-Daten-Modus und Bildschaerfe bleiben
- Anleitung 1.1.145

Co-Authored-By: Claude Opus 5.5 <noreply@anthropic.com>
Claude-Session: https://claude.ai/code/session_01CaJqjA6T7wr6qkboQBX5Ep
</commit_message>
<xml_diff>
--- a/docs/PowerIPTV-Anleitung.docx
+++ b/docs/PowerIPTV-Anleitung.docx
@@ -49,7 +49,7 @@
         <w:rPr>
           <w:color w:val="666666"/>
         </w:rPr>
-        <w:t xml:space="preserve">Stand: Version 1.1.144 · Oktober 2026</w:t>
+        <w:t xml:space="preserve">Stand: Version 1.1.145 · Oktober 2026</w:t>
       </w:r>
     </w:p>
     <w:p>
@@ -7264,7 +7264,7 @@
         <w:spacing w:after="120" w:before="240"/>
       </w:pPr>
       <w:r>
-        <w:t xml:space="preserve">Bild &amp; Verbindung: Mobile Daten, Stabil-Modus, Bildschärfe</w:t>
+        <w:t xml:space="preserve">Bild &amp; Verbindung: Mobile Daten, Bildschärfe</w:t>
       </w:r>
     </w:p>
     <w:p>
@@ -7305,26 +7305,6 @@
       </w:r>
       <w:r>
         <w:t xml:space="preserve">Bricht ein Stream ab oder bleibt das Bild stehen (Live: wenn 12 Sekunden lang kein neues Bild kommt – auch wenn der Ton weiterläuft), verbindet Portiva selbst neu. Hängt der Standard-Player intern („ERROR_CODE_TIMEOUT“), startet er sich neu; passiert das beim selben Sender noch einmal, übernimmt automatisch VLC (Filme an derselben Stelle). Hilft das bei einem Live-Sender nicht, probiert Portiva das andere Format (TS bzw. HLS) und danach – falls in der Senderliste vorhanden – einen Ausweich-Sender gleichen Namens, z.B. „Sky Sport 1 RAW“ statt „Sky Sport 1 HD“. Unten steht jeweils kurz, was gerade passiert. Sind alle Verbindungen deines Zugangs belegt (z.B. weil auf einem anderen Gerät geschaut wird), steht das klar da: „Zugang wird gerade woanders genutzt (2/2)“ – dann liegt es nicht am Server.</w:t>
-      </w:r>
-    </w:p>
-    <w:p>
-      <w:pPr>
-        <w:pStyle w:val="ListParagraph"/>
-        <w:numPr>
-          <w:ilvl w:val="0"/>
-          <w:numId w:val="6"/>
-        </w:numPr>
-        <w:spacing w:after="60"/>
-      </w:pPr>
-      <w:r>
-        <w:rPr>
-          <w:b/>
-          <w:bCs/>
-        </w:rPr>
-        <w:t xml:space="preserve">Stabil-Modus gegen Stocken (alle Geräte außer Enigma2): </w:t>
-      </w:r>
-      <w:r>
-        <w:t xml:space="preserve">größerer Puffer – der Sender startet etwa 2 Sekunden später, läuft dafür auch bei Aussetzern weiter. „Automatisch“ schaltet ihn im Mobilfunknetz und nach erkanntem Stocken (zweimal in 5 Minuten) für 24 Stunden selbst zu.</w:t>
       </w:r>
     </w:p>
     <w:p>

</xml_diff>

<commit_message>
Android TV: Live-Vorschau in der Senderliste + Umschalten mit Pfeil hoch/runter mehrmals hintereinander
- Senderliste (TV, Querformat): der angewaehlte Sender laeuft klein rechts neben der Liste, darunter
  Jetzt/Danach aus dem TV-Guide. Start erst nach kurzem Verweilen (kein Verbindungs-Gewitter beim
  Blaettern), Verbindung wird vor dem Vollbild-Player und im Hintergrund freigegeben, Kindersicherung beachtet
- Player (Standard + VLC): nach dem Umschalten zeigt die Leiste nur die Sender-Infos – Hoch/Runter schaltet
  weiter statt in die Bedienknoepfe zu springen; erst OK holt die Knoepfe
- Anleitung 1.1.146

Co-Authored-By: Claude Opus 5.5 <noreply@anthropic.com>
Claude-Session: https://claude.ai/code/session_01CaJqjA6T7wr6qkboQBX5Ep
</commit_message>
<xml_diff>
--- a/docs/PowerIPTV-Anleitung.docx
+++ b/docs/PowerIPTV-Anleitung.docx
@@ -49,7 +49,7 @@
         <w:rPr>
           <w:color w:val="666666"/>
         </w:rPr>
-        <w:t xml:space="preserve">Stand: Version 1.1.145 · Oktober 2026</w:t>
+        <w:t xml:space="preserve">Stand: Version 1.1.146 · Oktober 2026</w:t>
       </w:r>
     </w:p>
     <w:p>
@@ -2805,6 +2805,46 @@
       </w:r>
       <w:r>
         <w:t xml:space="preserve">Die Pfeile ⏮ / ⏭ in der Bildmitte schalten zum vorherigen bzw. nächsten Sender der Liste (wie CH+/CH- auf der Fernbedienung).</w:t>
+      </w:r>
+    </w:p>
+    <w:p>
+      <w:pPr>
+        <w:pStyle w:val="ListParagraph"/>
+        <w:numPr>
+          <w:ilvl w:val="0"/>
+          <w:numId w:val="6"/>
+        </w:numPr>
+        <w:spacing w:after="60"/>
+      </w:pPr>
+      <w:r>
+        <w:rPr>
+          <w:b/>
+          <w:bCs/>
+        </w:rPr>
+        <w:t xml:space="preserve">Umschalten mit der Fernbedienung: </w:t>
+      </w:r>
+      <w:r>
+        <w:t xml:space="preserve">Pfeil hoch/runter (oder CH+/CH-) schaltet einen Sender weiter – auch mehrmals hintereinander. Nach dem Umschalten erscheinen nur die Sender-Infos; erst OK holt die Bedienknöpfe (Pause, Senderliste, Einstellungen …). Links = zuletzt gesehener Sender, rechts = Senderliste.</w:t>
+      </w:r>
+    </w:p>
+    <w:p>
+      <w:pPr>
+        <w:pStyle w:val="ListParagraph"/>
+        <w:numPr>
+          <w:ilvl w:val="0"/>
+          <w:numId w:val="6"/>
+        </w:numPr>
+        <w:spacing w:after="60"/>
+      </w:pPr>
+      <w:r>
+        <w:rPr>
+          <w:b/>
+          <w:bCs/>
+        </w:rPr>
+        <w:t xml:space="preserve">Live-Vorschau (Android TV / Fire TV): </w:t>
+      </w:r>
+      <w:r>
+        <w:t xml:space="preserve">In der Senderliste läuft der angewählte Sender klein rechts neben der Liste, darunter „Jetzt“ und „Danach“ aus dem TV-Guide. Die Vorschau startet, sobald du kurz auf einem Sender stehen bleibst; OK schaltet ins Vollbild. Die Vorschau gibt ihre Verbindung vorher frei – auch Zugänge mit nur einer Verbindung funktionieren.</w:t>
       </w:r>
     </w:p>
     <w:p>

</xml_diff>

<commit_message>
Android TV: Eingabefelder oeffnen die Tastatur erst mit OK (man kommt per Pfeil an ihnen vorbei)
- Neues TvOutlinedTextField (wie das Suchfeld): am Fernseher wird ein Feld mit den Pfeilen nur angewaehlt,
  OK oeffnet die Tastatur, Hoch/Runter/Fertig verlassen das Feld, Zurueck schliesst nur die Eingabe.
  Am Handy/Tablet unveraendert.
- Ersetzt alle Eingabefelder (Einstellungen inkl. KI/API-Felder, Zugang anlegen, VPN, Suche, Listen,
  Empfehlungen, Portiva Link)
- Anleitung 1.1.148

Co-Authored-By: Claude Opus 5.5 <noreply@anthropic.com>
Claude-Session: https://claude.ai/code/session_01CaJqjA6T7wr6qkboQBX5Ep
</commit_message>
<xml_diff>
--- a/docs/PowerIPTV-Anleitung.docx
+++ b/docs/PowerIPTV-Anleitung.docx
@@ -49,7 +49,7 @@
         <w:rPr>
           <w:color w:val="666666"/>
         </w:rPr>
-        <w:t xml:space="preserve">Stand: Version 1.1.146 · Oktober 2026</w:t>
+        <w:t xml:space="preserve">Stand: Version 1.1.148 · Oktober 2026</w:t>
       </w:r>
     </w:p>
     <w:p>
@@ -748,6 +748,26 @@
       </w:pPr>
       <w:r>
         <w:t xml:space="preserve">Playlist und TV-Guide werden ebenfalls automatisch alle 24 Stunden aktualisiert – auch wenn die App länger geöffnet bleibt. Sofort geht es über die zwei Pfeile oben.</w:t>
+      </w:r>
+    </w:p>
+    <w:p>
+      <w:pPr>
+        <w:pBdr>
+          <w:left w:val="single" w:color="1E88B8" w:sz="18" w:space="8"/>
+        </w:pBdr>
+        <w:spacing w:after="160" w:before="80"/>
+        <w:ind w:left="240"/>
+      </w:pPr>
+      <w:r>
+        <w:rPr>
+          <w:b/>
+          <w:bCs/>
+          <w:color w:val="1E88B8"/>
+        </w:rPr>
+        <w:t xml:space="preserve">Tipp: </w:t>
+      </w:r>
+      <w:r>
+        <w:t xml:space="preserve">Eingabefelder am Fernseher (z.B. API-Schlüssel in den Einstellungen, Zugangsdaten): mit den Pfeilen wird ein Feld nur angewählt – die Bildschirmtastatur öffnet sich erst mit OK. „Fertig“ auf der Tastatur oder Pfeil hoch/runter beendet die Eingabe, Zurück schließt nur die Tastatur.</w:t>
       </w:r>
     </w:p>
     <w:p>

</xml_diff>

<commit_message>
Android TV: QR-, Bearbeiten- und Loeschen-Symbol bei den Zugaengen per Fernbedienung erreichbar
- Zugangs-Zeile: Pfeil rechts springt auf die Symbole (QR, Stift, Muelleimer), Pfeil links vom ersten
  Symbol zurueck auf die Zeile (Compose sprang von der fokussierten Zeile nicht in ihre Kinder)
- Gleiches fuer das Herz in der Senderliste
- Anleitung 1.1.149

Co-Authored-By: Claude Opus 5.5 <noreply@anthropic.com>
Claude-Session: https://claude.ai/code/session_01CaJqjA6T7wr6qkboQBX5Ep
</commit_message>
<xml_diff>
--- a/docs/PowerIPTV-Anleitung.docx
+++ b/docs/PowerIPTV-Anleitung.docx
@@ -49,7 +49,7 @@
         <w:rPr>
           <w:color w:val="666666"/>
         </w:rPr>
-        <w:t xml:space="preserve">Stand: Version 1.1.148 · Oktober 2026</w:t>
+        <w:t xml:space="preserve">Stand: Version 1.1.149 · Oktober 2026</w:t>
       </w:r>
     </w:p>
     <w:p>
@@ -748,6 +748,26 @@
       </w:pPr>
       <w:r>
         <w:t xml:space="preserve">Playlist und TV-Guide werden ebenfalls automatisch alle 24 Stunden aktualisiert – auch wenn die App länger geöffnet bleibt. Sofort geht es über die zwei Pfeile oben.</w:t>
+      </w:r>
+    </w:p>
+    <w:p>
+      <w:pPr>
+        <w:pBdr>
+          <w:left w:val="single" w:color="1E88B8" w:sz="18" w:space="8"/>
+        </w:pBdr>
+        <w:spacing w:after="160" w:before="80"/>
+        <w:ind w:left="240"/>
+      </w:pPr>
+      <w:r>
+        <w:rPr>
+          <w:b/>
+          <w:bCs/>
+          <w:color w:val="1E88B8"/>
+        </w:rPr>
+        <w:t xml:space="preserve">Tipp: </w:t>
+      </w:r>
+      <w:r>
+        <w:t xml:space="preserve">Symbole in einer Zeile am Fernseher (QR-Code, Bearbeiten und Löschen bei den Zugängen, Herz in der Senderliste): Zeile anwählen → Pfeil rechts springt auf die Symbole, Pfeil links zurück auf die Zeile.</w:t>
       </w:r>
     </w:p>
     <w:p>

</xml_diff>

<commit_message>
Multi-View: Senderauswahl neu – grosses Fenster mit Spalten Sprache | Kategorie | Sender
- Statt schmalem Dialog mit seitlich scrollenden Chips (Fokus kaum sichtbar, von den Sprachen kam man
  nicht nach unten): drei senkrechte Listen nebeneinander, deutlicher Fokus-Rahmen, Auswahl farbig
- Kategorie zeigt beim Anwaehlen sofort ihre Sender; Sprache per OK (passt die Kategorie nicht mehr,
  wird die erste der Sprache genommen); ohne Favoriten startet die Auswahl mit der ersten Kategorie
- Anleitung 1.1.150

Co-Authored-By: Claude Opus 5.5 <noreply@anthropic.com>
Claude-Session: https://claude.ai/code/session_01CaJqjA6T7wr6qkboQBX5Ep
</commit_message>
<xml_diff>
--- a/docs/PowerIPTV-Anleitung.docx
+++ b/docs/PowerIPTV-Anleitung.docx
@@ -49,7 +49,7 @@
         <w:rPr>
           <w:color w:val="666666"/>
         </w:rPr>
-        <w:t xml:space="preserve">Stand: Version 1.1.149 · Oktober 2026</w:t>
+        <w:t xml:space="preserve">Stand: Version 1.1.150 · Oktober 2026</w:t>
       </w:r>
     </w:p>
     <w:p>
@@ -3119,6 +3119,26 @@
       </w:r>
       <w:r>
         <w:t xml:space="preserve">Bis zu 4 Sender gleichzeitig (Kachel „Multi-View“). Leeres Fenster antippen = Sender wählen; Fenster antippen = dessen Ton hören (blauer Rahmen); lange drücken = Sender wechseln. Die Bedienknöpfe blenden sich nach 4 Sekunden aus und kommen mit einem Tipp zurück. Unten: Umschalten zwischen 2 und 4 Fenstern. Die App erkennt, wie viele Streams dein Zugang gleichzeitig erlaubt (Anzeige „Streams: x / y“): Reicht das Limit nicht für alle Fenster, laufen nur die zuletzt angetippten – die übrigen zeigen „Pausiert (Limit des Zugangs)“ mit dem letzten Bild und starten beim Antippen. Laufende Aufnahmen zählen mit. Hinweis: 4 Sender in Full-HD brauchen eine schnelle Internetleitung (ca. 40 MBit/s).</w:t>
+      </w:r>
+    </w:p>
+    <w:p>
+      <w:pPr>
+        <w:pStyle w:val="ListParagraph"/>
+        <w:numPr>
+          <w:ilvl w:val="0"/>
+          <w:numId w:val="6"/>
+        </w:numPr>
+        <w:spacing w:after="60"/>
+      </w:pPr>
+      <w:r>
+        <w:rPr>
+          <w:b/>
+          <w:bCs/>
+        </w:rPr>
+        <w:t xml:space="preserve">Multi-View – Sender wählen: </w:t>
+      </w:r>
+      <w:r>
+        <w:t xml:space="preserve">großes Fenster mit drei Spalten: Sprache | Kategorie | Sender. Mit der Fernbedienung hoch/runter in einer Spalte, links/rechts zwischen den Spalten. Eine angewählte Kategorie zeigt sofort ihre Sender; die Sprache wird mit OK gewählt. Ohne Favoriten startet die Auswahl direkt mit der ersten Kategorie.</w:t>
       </w:r>
     </w:p>
     <w:p>

</xml_diff>